<commit_message>
personal library (ver-2) update-141
</commit_message>
<xml_diff>
--- a/resources/Courses/GPT/Courses.docx
+++ b/resources/Courses/GPT/Courses.docx
@@ -2262,10 +2262,7 @@
           </w:tcPr>
           <w:p>
             <w:r>
-              <w:t>0</w:t>
-            </w:r>
-            <w:r>
-              <w:t>2</w:t>
+              <w:t>02</w:t>
             </w:r>
           </w:p>
         </w:tc>
@@ -3859,10 +3856,7 @@
           </w:tcPr>
           <w:p>
             <w:r>
-              <w:t>0</w:t>
-            </w:r>
-            <w:r>
-              <w:t>2</w:t>
+              <w:t>02</w:t>
             </w:r>
           </w:p>
         </w:tc>
@@ -4397,7 +4391,14 @@
                 <w:b/>
                 <w:bCs/>
               </w:rPr>
-              <w:t xml:space="preserve">DevOps and Requirements </w:t>
+              <w:t xml:space="preserve">Project Management &amp; </w:t>
+            </w:r>
+            <w:r>
+              <w:rPr>
+                <w:b/>
+                <w:bCs/>
+              </w:rPr>
+              <w:t>DevOps</w:t>
             </w:r>
           </w:p>
         </w:tc>
@@ -4447,7 +4448,7 @@
           </w:tcPr>
           <w:p>
             <w:r>
-              <w:t>Software Testing: Reference-1</w:t>
+              <w:t>Software Project Management: Reference-1</w:t>
             </w:r>
           </w:p>
         </w:tc>
@@ -4458,7 +4459,7 @@
           </w:tcPr>
           <w:p>
             <w:r>
-              <w:t>T-H3 + S-H2</w:t>
+              <w:t>T-H3 + S-H4</w:t>
             </w:r>
           </w:p>
         </w:tc>
@@ -4469,7 +4470,7 @@
           </w:tcPr>
           <w:p>
             <w:r>
-              <w:t>19</w:t>
+              <w:t>12</w:t>
             </w:r>
           </w:p>
         </w:tc>
@@ -4480,7 +4481,7 @@
           </w:tcPr>
           <w:p>
             <w:r>
-              <w:t>112</w:t>
+              <w:t>290</w:t>
             </w:r>
           </w:p>
         </w:tc>
@@ -4491,7 +4492,7 @@
           </w:tcPr>
           <w:p>
             <w:r>
-              <w:t>629</w:t>
+              <w:t>718</w:t>
             </w:r>
           </w:p>
         </w:tc>
@@ -4511,7 +4512,7 @@
           </w:tcPr>
           <w:p>
             <w:r>
-              <w:t>Software Testing: Reference-2</w:t>
+              <w:t>Software Project Management: Reference-2</w:t>
             </w:r>
           </w:p>
         </w:tc>
@@ -4529,7 +4530,7 @@
           </w:tcPr>
           <w:p>
             <w:r>
-              <w:t>21</w:t>
+              <w:t>23</w:t>
             </w:r>
           </w:p>
         </w:tc>
@@ -4540,7 +4541,7 @@
           </w:tcPr>
           <w:p>
             <w:r>
-              <w:t>285</w:t>
+              <w:t>364</w:t>
             </w:r>
           </w:p>
         </w:tc>
@@ -4551,7 +4552,7 @@
           </w:tcPr>
           <w:p>
             <w:r>
-              <w:t>573</w:t>
+              <w:t>498</w:t>
             </w:r>
           </w:p>
         </w:tc>
@@ -4564,10 +4565,7 @@
           </w:tcPr>
           <w:p>
             <w:r>
-              <w:t>0</w:t>
-            </w:r>
-            <w:r>
-              <w:t>2</w:t>
+              <w:t>02</w:t>
             </w:r>
           </w:p>
         </w:tc>
@@ -4695,10 +4693,7 @@
           </w:tcPr>
           <w:p>
             <w:r>
-              <w:t>0</w:t>
-            </w:r>
-            <w:r>
-              <w:t>3</w:t>
+              <w:t>03</w:t>
             </w:r>
           </w:p>
         </w:tc>
@@ -4960,22 +4955,6 @@
                 <w:color w:val="C00000"/>
               </w:rPr>
             </w:pPr>
-            <w:r>
-              <w:rPr>
-                <w:b/>
-                <w:bCs/>
-                <w:color w:val="C00000"/>
-              </w:rPr>
-              <w:t>0</w:t>
-            </w:r>
-            <w:r>
-              <w:rPr>
-                <w:b/>
-                <w:bCs/>
-                <w:color w:val="C00000"/>
-              </w:rPr>
-              <w:t>5</w:t>
-            </w:r>
           </w:p>
         </w:tc>
         <w:tc>
@@ -5102,6 +5081,139 @@
         <w:tc>
           <w:tcPr>
             <w:tcW w:w="522" w:type="pct"/>
+            <w:shd w:val="clear" w:color="auto" w:fill="E7E6E6" w:themeFill="background2"/>
+          </w:tcPr>
+          <w:p>
+            <w:r>
+              <w:rPr>
+                <w:b/>
+                <w:bCs/>
+                <w:color w:val="C00000"/>
+              </w:rPr>
+              <w:t>05</w:t>
+            </w:r>
+          </w:p>
+        </w:tc>
+        <w:tc>
+          <w:tcPr>
+            <w:tcW w:w="2369" w:type="pct"/>
+            <w:shd w:val="clear" w:color="auto" w:fill="E7E6E6" w:themeFill="background2"/>
+          </w:tcPr>
+          <w:p>
+            <w:r>
+              <w:t>Software Testing: Reference-1</w:t>
+            </w:r>
+          </w:p>
+        </w:tc>
+        <w:tc>
+          <w:tcPr>
+            <w:tcW w:w="735" w:type="pct"/>
+            <w:shd w:val="clear" w:color="auto" w:fill="E7E6E6" w:themeFill="background2"/>
+          </w:tcPr>
+          <w:p>
+            <w:r>
+              <w:t>T-H3 + S-H2</w:t>
+            </w:r>
+          </w:p>
+        </w:tc>
+        <w:tc>
+          <w:tcPr>
+            <w:tcW w:w="371" w:type="pct"/>
+            <w:shd w:val="clear" w:color="auto" w:fill="E7E6E6" w:themeFill="background2"/>
+          </w:tcPr>
+          <w:p>
+            <w:r>
+              <w:t>19</w:t>
+            </w:r>
+          </w:p>
+        </w:tc>
+        <w:tc>
+          <w:tcPr>
+            <w:tcW w:w="559" w:type="pct"/>
+            <w:shd w:val="clear" w:color="auto" w:fill="E7E6E6" w:themeFill="background2"/>
+          </w:tcPr>
+          <w:p>
+            <w:r>
+              <w:t>112</w:t>
+            </w:r>
+          </w:p>
+        </w:tc>
+        <w:tc>
+          <w:tcPr>
+            <w:tcW w:w="444" w:type="pct"/>
+            <w:shd w:val="clear" w:color="auto" w:fill="E7E6E6" w:themeFill="background2"/>
+          </w:tcPr>
+          <w:p>
+            <w:r>
+              <w:t>629</w:t>
+            </w:r>
+          </w:p>
+        </w:tc>
+      </w:tr>
+      <w:tr>
+        <w:tc>
+          <w:tcPr>
+            <w:tcW w:w="522" w:type="pct"/>
+            <w:shd w:val="clear" w:color="auto" w:fill="E7E6E6" w:themeFill="background2"/>
+          </w:tcPr>
+          <w:p/>
+        </w:tc>
+        <w:tc>
+          <w:tcPr>
+            <w:tcW w:w="2369" w:type="pct"/>
+            <w:shd w:val="clear" w:color="auto" w:fill="E7E6E6" w:themeFill="background2"/>
+          </w:tcPr>
+          <w:p>
+            <w:r>
+              <w:t>Software Testing: Reference-2</w:t>
+            </w:r>
+          </w:p>
+        </w:tc>
+        <w:tc>
+          <w:tcPr>
+            <w:tcW w:w="735" w:type="pct"/>
+            <w:shd w:val="clear" w:color="auto" w:fill="E7E6E6" w:themeFill="background2"/>
+          </w:tcPr>
+          <w:p/>
+        </w:tc>
+        <w:tc>
+          <w:tcPr>
+            <w:tcW w:w="371" w:type="pct"/>
+            <w:shd w:val="clear" w:color="auto" w:fill="E7E6E6" w:themeFill="background2"/>
+          </w:tcPr>
+          <w:p>
+            <w:r>
+              <w:t>21</w:t>
+            </w:r>
+          </w:p>
+        </w:tc>
+        <w:tc>
+          <w:tcPr>
+            <w:tcW w:w="559" w:type="pct"/>
+            <w:shd w:val="clear" w:color="auto" w:fill="E7E6E6" w:themeFill="background2"/>
+          </w:tcPr>
+          <w:p>
+            <w:r>
+              <w:t>285</w:t>
+            </w:r>
+          </w:p>
+        </w:tc>
+        <w:tc>
+          <w:tcPr>
+            <w:tcW w:w="444" w:type="pct"/>
+            <w:shd w:val="clear" w:color="auto" w:fill="E7E6E6" w:themeFill="background2"/>
+          </w:tcPr>
+          <w:p>
+            <w:r>
+              <w:t>573</w:t>
+            </w:r>
+          </w:p>
+        </w:tc>
+      </w:tr>
+      <w:tr>
+        <w:tc>
+          <w:tcPr>
+            <w:tcW w:w="522" w:type="pct"/>
             <w:shd w:val="clear" w:color="auto" w:fill="002060"/>
           </w:tcPr>
           <w:p>
@@ -5206,7 +5318,10 @@
           </w:tcPr>
           <w:p>
             <w:r>
-              <w:t>01</w:t>
+              <w:t>0</w:t>
+            </w:r>
+            <w:r>
+              <w:t>1</w:t>
             </w:r>
           </w:p>
         </w:tc>
@@ -5217,7 +5332,7 @@
           </w:tcPr>
           <w:p>
             <w:r>
-              <w:t>Calculus and Analytical Geometry: Reference-1</w:t>
+              <w:t xml:space="preserve">Cloud Computing and Virtualization </w:t>
             </w:r>
           </w:p>
         </w:tc>
@@ -5228,7 +5343,7 @@
           </w:tcPr>
           <w:p>
             <w:r>
-              <w:t>T-H3</w:t>
+              <w:t>T-H3 + S-H2</w:t>
             </w:r>
           </w:p>
         </w:tc>
@@ -5239,7 +5354,7 @@
           </w:tcPr>
           <w:p>
             <w:r>
-              <w:t>15</w:t>
+              <w:t>16</w:t>
             </w:r>
           </w:p>
         </w:tc>
@@ -5250,7 +5365,7 @@
           </w:tcPr>
           <w:p>
             <w:r>
-              <w:t>120</w:t>
+              <w:t>257</w:t>
             </w:r>
           </w:p>
         </w:tc>
@@ -5261,7 +5376,7 @@
           </w:tcPr>
           <w:p>
             <w:r>
-              <w:t>1281</w:t>
+              <w:t>558</w:t>
             </w:r>
           </w:p>
         </w:tc>
@@ -5272,58 +5387,50 @@
             <w:tcW w:w="522" w:type="pct"/>
             <w:shd w:val="clear" w:color="auto" w:fill="E7E6E6" w:themeFill="background2"/>
           </w:tcPr>
+          <w:p>
+            <w:r>
+              <w:t>02</w:t>
+            </w:r>
+          </w:p>
+        </w:tc>
+        <w:tc>
+          <w:tcPr>
+            <w:tcW w:w="2369" w:type="pct"/>
+            <w:shd w:val="clear" w:color="auto" w:fill="E7E6E6" w:themeFill="background2"/>
+          </w:tcPr>
+          <w:p>
+            <w:r>
+              <w:t>Linux Operating and DevOps Tools</w:t>
+            </w:r>
+          </w:p>
+        </w:tc>
+        <w:tc>
+          <w:tcPr>
+            <w:tcW w:w="735" w:type="pct"/>
+            <w:shd w:val="clear" w:color="auto" w:fill="E7E6E6" w:themeFill="background2"/>
+          </w:tcPr>
           <w:p/>
         </w:tc>
         <w:tc>
           <w:tcPr>
-            <w:tcW w:w="2369" w:type="pct"/>
-            <w:shd w:val="clear" w:color="auto" w:fill="E7E6E6" w:themeFill="background2"/>
-          </w:tcPr>
-          <w:p>
-            <w:r>
-              <w:t>Calculus and Analytical Geometry: Reference-2</w:t>
-            </w:r>
-          </w:p>
-        </w:tc>
-        <w:tc>
-          <w:tcPr>
-            <w:tcW w:w="735" w:type="pct"/>
+            <w:tcW w:w="371" w:type="pct"/>
             <w:shd w:val="clear" w:color="auto" w:fill="E7E6E6" w:themeFill="background2"/>
           </w:tcPr>
           <w:p/>
         </w:tc>
         <w:tc>
           <w:tcPr>
-            <w:tcW w:w="371" w:type="pct"/>
-            <w:shd w:val="clear" w:color="auto" w:fill="E7E6E6" w:themeFill="background2"/>
-          </w:tcPr>
-          <w:p>
-            <w:r>
-              <w:t>25</w:t>
-            </w:r>
-          </w:p>
-        </w:tc>
-        <w:tc>
-          <w:tcPr>
             <w:tcW w:w="559" w:type="pct"/>
             <w:shd w:val="clear" w:color="auto" w:fill="E7E6E6" w:themeFill="background2"/>
           </w:tcPr>
-          <w:p>
-            <w:r>
-              <w:t>178</w:t>
-            </w:r>
-          </w:p>
+          <w:p/>
         </w:tc>
         <w:tc>
           <w:tcPr>
             <w:tcW w:w="444" w:type="pct"/>
             <w:shd w:val="clear" w:color="auto" w:fill="E7E6E6" w:themeFill="background2"/>
           </w:tcPr>
-          <w:p>
-            <w:r>
-              <w:t>1283</w:t>
-            </w:r>
-          </w:p>
+          <w:p/>
         </w:tc>
       </w:tr>
       <w:tr>
@@ -5334,7 +5441,10 @@
           </w:tcPr>
           <w:p>
             <w:r>
-              <w:t>02</w:t>
+              <w:t>0</w:t>
+            </w:r>
+            <w:r>
+              <w:t>3</w:t>
             </w:r>
           </w:p>
         </w:tc>
@@ -5345,7 +5455,7 @@
           </w:tcPr>
           <w:p>
             <w:r>
-              <w:t>Software Maintenance</w:t>
+              <w:t>Calculus and Analytical Geometry: Reference-1</w:t>
             </w:r>
           </w:p>
         </w:tc>
@@ -5356,7 +5466,7 @@
           </w:tcPr>
           <w:p>
             <w:r>
-              <w:t>T-H3 + S-H2</w:t>
+              <w:t>T-H3</w:t>
             </w:r>
           </w:p>
         </w:tc>
@@ -5367,7 +5477,7 @@
           </w:tcPr>
           <w:p>
             <w:r>
-              <w:t>16</w:t>
+              <w:t>15</w:t>
             </w:r>
           </w:p>
         </w:tc>
@@ -5378,7 +5488,7 @@
           </w:tcPr>
           <w:p>
             <w:r>
-              <w:t>160</w:t>
+              <w:t>120</w:t>
             </w:r>
           </w:p>
         </w:tc>
@@ -5389,7 +5499,7 @@
           </w:tcPr>
           <w:p>
             <w:r>
-              <w:t>420</w:t>
+              <w:t>1281</w:t>
             </w:r>
           </w:p>
         </w:tc>
@@ -5400,11 +5510,7 @@
             <w:tcW w:w="522" w:type="pct"/>
             <w:shd w:val="clear" w:color="auto" w:fill="E7E6E6" w:themeFill="background2"/>
           </w:tcPr>
-          <w:p>
-            <w:r>
-              <w:t>03</w:t>
-            </w:r>
-          </w:p>
+          <w:p/>
         </w:tc>
         <w:tc>
           <w:tcPr>
@@ -5413,7 +5519,7 @@
           </w:tcPr>
           <w:p>
             <w:r>
-              <w:t xml:space="preserve">Cloud Computing and Virtualization </w:t>
+              <w:t>Calculus and Analytical Geometry: Reference-2</w:t>
             </w:r>
           </w:p>
         </w:tc>
@@ -5422,11 +5528,7 @@
             <w:tcW w:w="735" w:type="pct"/>
             <w:shd w:val="clear" w:color="auto" w:fill="E7E6E6" w:themeFill="background2"/>
           </w:tcPr>
-          <w:p>
-            <w:r>
-              <w:t>T-H3 + S-H2</w:t>
-            </w:r>
-          </w:p>
+          <w:p/>
         </w:tc>
         <w:tc>
           <w:tcPr>
@@ -5435,7 +5537,7 @@
           </w:tcPr>
           <w:p>
             <w:r>
-              <w:t>16</w:t>
+              <w:t>25</w:t>
             </w:r>
           </w:p>
         </w:tc>
@@ -5446,7 +5548,7 @@
           </w:tcPr>
           <w:p>
             <w:r>
-              <w:t>257</w:t>
+              <w:t>178</w:t>
             </w:r>
           </w:p>
         </w:tc>
@@ -5457,7 +5559,7 @@
           </w:tcPr>
           <w:p>
             <w:r>
-              <w:t>558</w:t>
+              <w:t>1283</w:t>
             </w:r>
           </w:p>
         </w:tc>
@@ -5707,7 +5809,7 @@
         <w:spacing w:after="0"/>
       </w:pPr>
       <w:r>
-        <w:t xml:space="preserve">Application of DevOps Engineering </w:t>
+        <w:t xml:space="preserve">Application of Project Management   </w:t>
       </w:r>
     </w:p>
     <w:p>
@@ -5720,13 +5822,7 @@
         <w:spacing w:after="0"/>
       </w:pPr>
       <w:r>
-        <w:t xml:space="preserve">Application of </w:t>
-      </w:r>
-      <w:r>
-        <w:t xml:space="preserve">Software Testing </w:t>
-      </w:r>
-      <w:r>
-        <w:t xml:space="preserve">  </w:t>
+        <w:t xml:space="preserve">Application of DevOps Engineering </w:t>
       </w:r>
     </w:p>
     <w:p>
@@ -5742,10 +5838,10 @@
         <w:t xml:space="preserve">Application of </w:t>
       </w:r>
       <w:r>
-        <w:t xml:space="preserve">Software Maintenance </w:t>
-      </w:r>
-      <w:r>
-        <w:t xml:space="preserve"> </w:t>
+        <w:t xml:space="preserve">Software Testing </w:t>
+      </w:r>
+      <w:r>
+        <w:t xml:space="preserve">  </w:t>
       </w:r>
     </w:p>
     <w:p>
@@ -5756,8 +5852,6 @@
         <w:t xml:space="preserve">  </w:t>
       </w:r>
     </w:p>
-    <w:p/>
-    <w:p/>
     <w:p>
       <w:pPr>
         <w:pStyle w:val="Heading2"/>
@@ -5839,7 +5933,14 @@
                 <w:b/>
                 <w:bCs/>
               </w:rPr>
-              <w:t xml:space="preserve">Course-4: System Design and Project Management </w:t>
+              <w:t xml:space="preserve">Course-4: System Design and </w:t>
+            </w:r>
+            <w:r>
+              <w:rPr>
+                <w:b/>
+                <w:bCs/>
+              </w:rPr>
+              <w:t>UI-UX</w:t>
             </w:r>
           </w:p>
         </w:tc>
@@ -6020,7 +6121,7 @@
           </w:tcPr>
           <w:p>
             <w:r>
-              <w:t>Software Project Management: Reference-1</w:t>
+              <w:t xml:space="preserve">Human-Computer Interaction </w:t>
             </w:r>
           </w:p>
         </w:tc>
@@ -6031,7 +6132,7 @@
           </w:tcPr>
           <w:p>
             <w:r>
-              <w:t>T-H3 + S-H4</w:t>
+              <w:t>T-H3 + S-H2</w:t>
             </w:r>
           </w:p>
         </w:tc>
@@ -6042,7 +6143,7 @@
           </w:tcPr>
           <w:p>
             <w:r>
-              <w:t>12</w:t>
+              <w:t>21</w:t>
             </w:r>
           </w:p>
         </w:tc>
@@ -6053,7 +6154,7 @@
           </w:tcPr>
           <w:p>
             <w:r>
-              <w:t>290</w:t>
+              <w:t>516</w:t>
             </w:r>
           </w:p>
         </w:tc>
@@ -6064,7 +6165,7 @@
           </w:tcPr>
           <w:p>
             <w:r>
-              <w:t>718</w:t>
+              <w:t>861</w:t>
             </w:r>
           </w:p>
         </w:tc>
@@ -6075,7 +6176,14 @@
             <w:tcW w:w="522" w:type="pct"/>
             <w:shd w:val="clear" w:color="auto" w:fill="E7E6E6" w:themeFill="background2"/>
           </w:tcPr>
-          <w:p/>
+          <w:p>
+            <w:r>
+              <w:t>0</w:t>
+            </w:r>
+            <w:r>
+              <w:t>3</w:t>
+            </w:r>
+          </w:p>
         </w:tc>
         <w:tc>
           <w:tcPr>
@@ -6084,7 +6192,7 @@
           </w:tcPr>
           <w:p>
             <w:r>
-              <w:t>Software Project Management: Reference-2</w:t>
+              <w:t xml:space="preserve">Data Visualization </w:t>
             </w:r>
           </w:p>
         </w:tc>
@@ -6093,7 +6201,11 @@
             <w:tcW w:w="735" w:type="pct"/>
             <w:shd w:val="clear" w:color="auto" w:fill="E7E6E6" w:themeFill="background2"/>
           </w:tcPr>
-          <w:p/>
+          <w:p>
+            <w:r>
+              <w:t>T-H3 + S-H4</w:t>
+            </w:r>
+          </w:p>
         </w:tc>
         <w:tc>
           <w:tcPr>
@@ -6102,7 +6214,7 @@
           </w:tcPr>
           <w:p>
             <w:r>
-              <w:t>23</w:t>
+              <w:t>29</w:t>
             </w:r>
           </w:p>
         </w:tc>
@@ -6113,7 +6225,7 @@
           </w:tcPr>
           <w:p>
             <w:r>
-              <w:t>364</w:t>
+              <w:t>87</w:t>
             </w:r>
           </w:p>
         </w:tc>
@@ -6124,78 +6236,7 @@
           </w:tcPr>
           <w:p>
             <w:r>
-              <w:t>498</w:t>
-            </w:r>
-          </w:p>
-        </w:tc>
-      </w:tr>
-      <w:tr>
-        <w:tc>
-          <w:tcPr>
-            <w:tcW w:w="522" w:type="pct"/>
-            <w:shd w:val="clear" w:color="auto" w:fill="E7E6E6" w:themeFill="background2"/>
-          </w:tcPr>
-          <w:p>
-            <w:r>
-              <w:t>0</w:t>
-            </w:r>
-            <w:r>
-              <w:t>3</w:t>
-            </w:r>
-          </w:p>
-        </w:tc>
-        <w:tc>
-          <w:tcPr>
-            <w:tcW w:w="2369" w:type="pct"/>
-            <w:shd w:val="clear" w:color="auto" w:fill="E7E6E6" w:themeFill="background2"/>
-          </w:tcPr>
-          <w:p>
-            <w:r>
-              <w:t xml:space="preserve">Human-Computer Interaction </w:t>
-            </w:r>
-          </w:p>
-        </w:tc>
-        <w:tc>
-          <w:tcPr>
-            <w:tcW w:w="735" w:type="pct"/>
-            <w:shd w:val="clear" w:color="auto" w:fill="E7E6E6" w:themeFill="background2"/>
-          </w:tcPr>
-          <w:p>
-            <w:r>
-              <w:t>T-H3 + S-H2</w:t>
-            </w:r>
-          </w:p>
-        </w:tc>
-        <w:tc>
-          <w:tcPr>
-            <w:tcW w:w="371" w:type="pct"/>
-            <w:shd w:val="clear" w:color="auto" w:fill="E7E6E6" w:themeFill="background2"/>
-          </w:tcPr>
-          <w:p>
-            <w:r>
-              <w:t>21</w:t>
-            </w:r>
-          </w:p>
-        </w:tc>
-        <w:tc>
-          <w:tcPr>
-            <w:tcW w:w="559" w:type="pct"/>
-            <w:shd w:val="clear" w:color="auto" w:fill="E7E6E6" w:themeFill="background2"/>
-          </w:tcPr>
-          <w:p>
-            <w:r>
-              <w:t>516</w:t>
-            </w:r>
-          </w:p>
-        </w:tc>
-        <w:tc>
-          <w:tcPr>
-            <w:tcW w:w="444" w:type="pct"/>
-            <w:shd w:val="clear" w:color="auto" w:fill="E7E6E6" w:themeFill="background2"/>
-          </w:tcPr>
-          <w:p>
-            <w:r>
-              <w:t>861</w:t>
+              <w:t>389</w:t>
             </w:r>
           </w:p>
         </w:tc>
@@ -6750,7 +6791,7 @@
           </w:tcPr>
           <w:p>
             <w:r>
-              <w:t xml:space="preserve">Data Visualization </w:t>
+              <w:t>Software Quality Assurance</w:t>
             </w:r>
           </w:p>
         </w:tc>
@@ -6761,7 +6802,7 @@
           </w:tcPr>
           <w:p>
             <w:r>
-              <w:t>T-H3 + S-H4</w:t>
+              <w:t>T-H3 + S-H2</w:t>
             </w:r>
           </w:p>
         </w:tc>
@@ -6772,7 +6813,7 @@
           </w:tcPr>
           <w:p>
             <w:r>
-              <w:t>29</w:t>
+              <w:t>26</w:t>
             </w:r>
           </w:p>
         </w:tc>
@@ -6783,7 +6824,10 @@
           </w:tcPr>
           <w:p>
             <w:r>
-              <w:t>87</w:t>
+              <w:t>15</w:t>
+            </w:r>
+            <w:r>
+              <w:t>9</w:t>
             </w:r>
           </w:p>
         </w:tc>
@@ -6794,7 +6838,7 @@
           </w:tcPr>
           <w:p>
             <w:r>
-              <w:t>389</w:t>
+              <w:t>617</w:t>
             </w:r>
           </w:p>
         </w:tc>
@@ -6821,7 +6865,7 @@
           </w:tcPr>
           <w:p>
             <w:r>
-              <w:t>Software Quality Assurance</w:t>
+              <w:t>Software Maintenance</w:t>
             </w:r>
           </w:p>
         </w:tc>
@@ -6843,7 +6887,7 @@
           </w:tcPr>
           <w:p>
             <w:r>
-              <w:t>26</w:t>
+              <w:t>16</w:t>
             </w:r>
           </w:p>
         </w:tc>
@@ -6854,10 +6898,7 @@
           </w:tcPr>
           <w:p>
             <w:r>
-              <w:t>15</w:t>
-            </w:r>
-            <w:r>
-              <w:t>9</w:t>
+              <w:t>160</w:t>
             </w:r>
           </w:p>
         </w:tc>
@@ -6868,7 +6909,7 @@
           </w:tcPr>
           <w:p>
             <w:r>
-              <w:t>617</w:t>
+              <w:t>420</w:t>
             </w:r>
           </w:p>
         </w:tc>
@@ -7187,12 +7228,16 @@
         <w:spacing w:after="0"/>
       </w:pPr>
       <w:r>
-        <w:t xml:space="preserve">Application of Project Management </w:t>
-      </w:r>
-      <w:r>
-        <w:t xml:space="preserve">  </w:t>
-      </w:r>
-    </w:p>
+        <w:t>Software Quality Assurance</w:t>
+      </w:r>
+      <w:r>
+        <w:t xml:space="preserve"> &amp; </w:t>
+      </w:r>
+      <w:r>
+        <w:t>Maintenance</w:t>
+      </w:r>
+    </w:p>
+    <w:p/>
     <w:p/>
     <w:p>
       <w:pPr>
@@ -10781,10 +10826,7 @@
           </w:tcPr>
           <w:p>
             <w:r>
-              <w:t>0</w:t>
-            </w:r>
-            <w:r>
-              <w:t>3</w:t>
+              <w:t>03</w:t>
             </w:r>
           </w:p>
         </w:tc>
@@ -11697,10 +11739,7 @@
               </w:rPr>
             </w:pPr>
             <w:r>
-              <w:t>0</w:t>
-            </w:r>
-            <w:r>
-              <w:t>3</w:t>
+              <w:t>03</w:t>
             </w:r>
           </w:p>
         </w:tc>

</xml_diff>

<commit_message>
personal library (ver-2) update-142
</commit_message>
<xml_diff>
--- a/resources/Courses/GPT/Courses.docx
+++ b/resources/Courses/GPT/Courses.docx
@@ -4434,10 +4434,7 @@
           </w:tcPr>
           <w:p>
             <w:r>
-              <w:t>0</w:t>
-            </w:r>
-            <w:r>
-              <w:t>1</w:t>
+              <w:t>01</w:t>
             </w:r>
           </w:p>
         </w:tc>
@@ -5318,10 +5315,7 @@
           </w:tcPr>
           <w:p>
             <w:r>
-              <w:t>0</w:t>
-            </w:r>
-            <w:r>
-              <w:t>1</w:t>
+              <w:t>01</w:t>
             </w:r>
           </w:p>
         </w:tc>
@@ -6649,7 +6643,10 @@
           </w:tcPr>
           <w:p>
             <w:r>
-              <w:t>01</w:t>
+              <w:t>0</w:t>
+            </w:r>
+            <w:r>
+              <w:t>1</w:t>
             </w:r>
           </w:p>
         </w:tc>
@@ -6660,7 +6657,7 @@
           </w:tcPr>
           <w:p>
             <w:r>
-              <w:t>Ordinary Differential Equation : Reference-1</w:t>
+              <w:t>Software Quality Assurance</w:t>
             </w:r>
           </w:p>
         </w:tc>
@@ -6671,7 +6668,7 @@
           </w:tcPr>
           <w:p>
             <w:r>
-              <w:t>T-H3</w:t>
+              <w:t>T-H3 + S-H2</w:t>
             </w:r>
           </w:p>
         </w:tc>
@@ -6682,7 +6679,7 @@
           </w:tcPr>
           <w:p>
             <w:r>
-              <w:t>07</w:t>
+              <w:t>26</w:t>
             </w:r>
           </w:p>
         </w:tc>
@@ -6693,7 +6690,10 @@
           </w:tcPr>
           <w:p>
             <w:r>
-              <w:t>61</w:t>
+              <w:t>15</w:t>
+            </w:r>
+            <w:r>
+              <w:t>9</w:t>
             </w:r>
           </w:p>
         </w:tc>
@@ -6704,7 +6704,7 @@
           </w:tcPr>
           <w:p>
             <w:r>
-              <w:t>275</w:t>
+              <w:t>617</w:t>
             </w:r>
           </w:p>
         </w:tc>
@@ -6715,7 +6715,14 @@
             <w:tcW w:w="522" w:type="pct"/>
             <w:shd w:val="clear" w:color="auto" w:fill="E7E6E6" w:themeFill="background2"/>
           </w:tcPr>
-          <w:p/>
+          <w:p>
+            <w:r>
+              <w:t>0</w:t>
+            </w:r>
+            <w:r>
+              <w:t>2</w:t>
+            </w:r>
+          </w:p>
         </w:tc>
         <w:tc>
           <w:tcPr>
@@ -6724,7 +6731,7 @@
           </w:tcPr>
           <w:p>
             <w:r>
-              <w:t>Ordinary Differential Equation : Reference-1</w:t>
+              <w:t>Software Maintenance</w:t>
             </w:r>
           </w:p>
         </w:tc>
@@ -6733,7 +6740,11 @@
             <w:tcW w:w="735" w:type="pct"/>
             <w:shd w:val="clear" w:color="auto" w:fill="E7E6E6" w:themeFill="background2"/>
           </w:tcPr>
-          <w:p/>
+          <w:p>
+            <w:r>
+              <w:t>T-H3 + S-H2</w:t>
+            </w:r>
+          </w:p>
         </w:tc>
         <w:tc>
           <w:tcPr>
@@ -6742,7 +6753,7 @@
           </w:tcPr>
           <w:p>
             <w:r>
-              <w:t>12</w:t>
+              <w:t>16</w:t>
             </w:r>
           </w:p>
         </w:tc>
@@ -6753,7 +6764,7 @@
           </w:tcPr>
           <w:p>
             <w:r>
-              <w:t>177</w:t>
+              <w:t>160</w:t>
             </w:r>
           </w:p>
         </w:tc>
@@ -6764,7 +6775,7 @@
           </w:tcPr>
           <w:p>
             <w:r>
-              <w:t>819</w:t>
+              <w:t>420</w:t>
             </w:r>
           </w:p>
         </w:tc>
@@ -6780,7 +6791,7 @@
               <w:t>0</w:t>
             </w:r>
             <w:r>
-              <w:t>2</w:t>
+              <w:t>3</w:t>
             </w:r>
           </w:p>
         </w:tc>
@@ -6791,7 +6802,7 @@
           </w:tcPr>
           <w:p>
             <w:r>
-              <w:t>Software Quality Assurance</w:t>
+              <w:t>Ordinary Differential Equation : Reference-1</w:t>
             </w:r>
           </w:p>
         </w:tc>
@@ -6802,7 +6813,7 @@
           </w:tcPr>
           <w:p>
             <w:r>
-              <w:t>T-H3 + S-H2</w:t>
+              <w:t>T-H3</w:t>
             </w:r>
           </w:p>
         </w:tc>
@@ -6813,7 +6824,7 @@
           </w:tcPr>
           <w:p>
             <w:r>
-              <w:t>26</w:t>
+              <w:t>07</w:t>
             </w:r>
           </w:p>
         </w:tc>
@@ -6824,10 +6835,7 @@
           </w:tcPr>
           <w:p>
             <w:r>
-              <w:t>15</w:t>
-            </w:r>
-            <w:r>
-              <w:t>9</w:t>
+              <w:t>61</w:t>
             </w:r>
           </w:p>
         </w:tc>
@@ -6838,7 +6846,7 @@
           </w:tcPr>
           <w:p>
             <w:r>
-              <w:t>617</w:t>
+              <w:t>275</w:t>
             </w:r>
           </w:p>
         </w:tc>
@@ -6849,14 +6857,7 @@
             <w:tcW w:w="522" w:type="pct"/>
             <w:shd w:val="clear" w:color="auto" w:fill="E7E6E6" w:themeFill="background2"/>
           </w:tcPr>
-          <w:p>
-            <w:r>
-              <w:t>0</w:t>
-            </w:r>
-            <w:r>
-              <w:t>3</w:t>
-            </w:r>
-          </w:p>
+          <w:p/>
         </w:tc>
         <w:tc>
           <w:tcPr>
@@ -6865,7 +6866,7 @@
           </w:tcPr>
           <w:p>
             <w:r>
-              <w:t>Software Maintenance</w:t>
+              <w:t>Ordinary Differential Equation : Reference-1</w:t>
             </w:r>
           </w:p>
         </w:tc>
@@ -6874,11 +6875,7 @@
             <w:tcW w:w="735" w:type="pct"/>
             <w:shd w:val="clear" w:color="auto" w:fill="E7E6E6" w:themeFill="background2"/>
           </w:tcPr>
-          <w:p>
-            <w:r>
-              <w:t>T-H3 + S-H2</w:t>
-            </w:r>
-          </w:p>
+          <w:p/>
         </w:tc>
         <w:tc>
           <w:tcPr>
@@ -6887,7 +6884,7 @@
           </w:tcPr>
           <w:p>
             <w:r>
-              <w:t>16</w:t>
+              <w:t>12</w:t>
             </w:r>
           </w:p>
         </w:tc>
@@ -6898,7 +6895,7 @@
           </w:tcPr>
           <w:p>
             <w:r>
-              <w:t>160</w:t>
+              <w:t>177</w:t>
             </w:r>
           </w:p>
         </w:tc>
@@ -6909,7 +6906,7 @@
           </w:tcPr>
           <w:p>
             <w:r>
-              <w:t>420</w:t>
+              <w:t>819</w:t>
             </w:r>
           </w:p>
         </w:tc>
@@ -7228,13 +7225,7 @@
         <w:spacing w:after="0"/>
       </w:pPr>
       <w:r>
-        <w:t>Software Quality Assurance</w:t>
-      </w:r>
-      <w:r>
-        <w:t xml:space="preserve"> &amp; </w:t>
-      </w:r>
-      <w:r>
-        <w:t>Maintenance</w:t>
+        <w:t>Software Quality Assurance &amp; Maintenance</w:t>
       </w:r>
     </w:p>
     <w:p/>
@@ -8144,7 +8135,10 @@
           </w:tcPr>
           <w:p>
             <w:r>
-              <w:t>01</w:t>
+              <w:t>0</w:t>
+            </w:r>
+            <w:r>
+              <w:t>1</w:t>
             </w:r>
           </w:p>
         </w:tc>
@@ -8155,7 +8149,7 @@
           </w:tcPr>
           <w:p>
             <w:r>
-              <w:t>Combinatorial Optimization</w:t>
+              <w:t xml:space="preserve">Data Mining </w:t>
             </w:r>
           </w:p>
         </w:tc>
@@ -8166,7 +8160,7 @@
           </w:tcPr>
           <w:p>
             <w:r>
-              <w:t>T-H3</w:t>
+              <w:t>T-H3 + S-H2</w:t>
             </w:r>
           </w:p>
         </w:tc>
@@ -8177,7 +8171,7 @@
           </w:tcPr>
           <w:p>
             <w:r>
-              <w:t>21</w:t>
+              <w:t>13</w:t>
             </w:r>
           </w:p>
         </w:tc>
@@ -8188,7 +8182,7 @@
           </w:tcPr>
           <w:p>
             <w:r>
-              <w:t>125</w:t>
+              <w:t>245</w:t>
             </w:r>
           </w:p>
         </w:tc>
@@ -8199,7 +8193,7 @@
           </w:tcPr>
           <w:p>
             <w:r>
-              <w:t>545</w:t>
+              <w:t>740</w:t>
             </w:r>
           </w:p>
         </w:tc>
@@ -8226,7 +8220,7 @@
           </w:tcPr>
           <w:p>
             <w:r>
-              <w:t xml:space="preserve">Data Mining </w:t>
+              <w:t xml:space="preserve">Data Warehouse </w:t>
             </w:r>
           </w:p>
         </w:tc>
@@ -8248,7 +8242,7 @@
           </w:tcPr>
           <w:p>
             <w:r>
-              <w:t>13</w:t>
+              <w:t>18</w:t>
             </w:r>
           </w:p>
         </w:tc>
@@ -8259,7 +8253,7 @@
           </w:tcPr>
           <w:p>
             <w:r>
-              <w:t>245</w:t>
+              <w:t>257</w:t>
             </w:r>
           </w:p>
         </w:tc>
@@ -8270,7 +8264,7 @@
           </w:tcPr>
           <w:p>
             <w:r>
-              <w:t>740</w:t>
+              <w:t>576</w:t>
             </w:r>
           </w:p>
         </w:tc>
@@ -8297,7 +8291,7 @@
           </w:tcPr>
           <w:p>
             <w:r>
-              <w:t xml:space="preserve">Data Warehouse </w:t>
+              <w:t>Combinatorial Optimization</w:t>
             </w:r>
           </w:p>
         </w:tc>
@@ -8308,7 +8302,7 @@
           </w:tcPr>
           <w:p>
             <w:r>
-              <w:t>T-H3 + S-H2</w:t>
+              <w:t>T-H3</w:t>
             </w:r>
           </w:p>
         </w:tc>
@@ -8319,7 +8313,7 @@
           </w:tcPr>
           <w:p>
             <w:r>
-              <w:t>18</w:t>
+              <w:t>21</w:t>
             </w:r>
           </w:p>
         </w:tc>
@@ -8330,7 +8324,7 @@
           </w:tcPr>
           <w:p>
             <w:r>
-              <w:t>257</w:t>
+              <w:t>125</w:t>
             </w:r>
           </w:p>
         </w:tc>
@@ -8341,7 +8335,7 @@
           </w:tcPr>
           <w:p>
             <w:r>
-              <w:t>576</w:t>
+              <w:t>545</w:t>
             </w:r>
           </w:p>
         </w:tc>
@@ -9310,7 +9304,10 @@
           </w:tcPr>
           <w:p>
             <w:r>
-              <w:t>01</w:t>
+              <w:t>0</w:t>
+            </w:r>
+            <w:r>
+              <w:t>1</w:t>
             </w:r>
           </w:p>
         </w:tc>
@@ -9321,10 +9318,7 @@
           </w:tcPr>
           <w:p>
             <w:r>
-              <w:t>Numerical Analysis</w:t>
-            </w:r>
-            <w:r>
-              <w:t xml:space="preserve"> of Engineers </w:t>
+              <w:t xml:space="preserve">Ethics of Information System </w:t>
             </w:r>
           </w:p>
         </w:tc>
@@ -9357,7 +9351,7 @@
           </w:tcPr>
           <w:p>
             <w:r>
-              <w:t>131</w:t>
+              <w:t>123</w:t>
             </w:r>
           </w:p>
         </w:tc>
@@ -9368,7 +9362,7 @@
           </w:tcPr>
           <w:p>
             <w:r>
-              <w:t>615</w:t>
+              <w:t>482</w:t>
             </w:r>
           </w:p>
         </w:tc>
@@ -9395,7 +9389,7 @@
           </w:tcPr>
           <w:p>
             <w:r>
-              <w:t xml:space="preserve">Ethics of Information System </w:t>
+              <w:t>Software Security: Reference-1</w:t>
             </w:r>
           </w:p>
         </w:tc>
@@ -9406,7 +9400,7 @@
           </w:tcPr>
           <w:p>
             <w:r>
-              <w:t>T-H3</w:t>
+              <w:t>T-H3 + S-H4</w:t>
             </w:r>
           </w:p>
         </w:tc>
@@ -9417,7 +9411,7 @@
           </w:tcPr>
           <w:p>
             <w:r>
-              <w:t>11</w:t>
+              <w:t>13</w:t>
             </w:r>
           </w:p>
         </w:tc>
@@ -9428,7 +9422,7 @@
           </w:tcPr>
           <w:p>
             <w:r>
-              <w:t>123</w:t>
+              <w:t>319</w:t>
             </w:r>
           </w:p>
         </w:tc>
@@ -9439,7 +9433,7 @@
           </w:tcPr>
           <w:p>
             <w:r>
-              <w:t>482</w:t>
+              <w:t>1043</w:t>
             </w:r>
           </w:p>
         </w:tc>
@@ -9450,14 +9444,7 @@
             <w:tcW w:w="250" w:type="pct"/>
             <w:shd w:val="clear" w:color="auto" w:fill="E7E6E6" w:themeFill="background2"/>
           </w:tcPr>
-          <w:p>
-            <w:r>
-              <w:t>0</w:t>
-            </w:r>
-            <w:r>
-              <w:t>3</w:t>
-            </w:r>
-          </w:p>
+          <w:p/>
         </w:tc>
         <w:tc>
           <w:tcPr>
@@ -9466,7 +9453,7 @@
           </w:tcPr>
           <w:p>
             <w:r>
-              <w:t>Software Security: Reference-1</w:t>
+              <w:t>Software Security: Reference-2</w:t>
             </w:r>
           </w:p>
         </w:tc>
@@ -9475,11 +9462,7 @@
             <w:tcW w:w="720" w:type="pct"/>
             <w:shd w:val="clear" w:color="auto" w:fill="E7E6E6" w:themeFill="background2"/>
           </w:tcPr>
-          <w:p>
-            <w:r>
-              <w:t>T-H3 + S-H4</w:t>
-            </w:r>
-          </w:p>
+          <w:p/>
         </w:tc>
         <w:tc>
           <w:tcPr>
@@ -9488,7 +9471,7 @@
           </w:tcPr>
           <w:p>
             <w:r>
-              <w:t>13</w:t>
+              <w:t>14</w:t>
             </w:r>
           </w:p>
         </w:tc>
@@ -9499,7 +9482,7 @@
           </w:tcPr>
           <w:p>
             <w:r>
-              <w:t>319</w:t>
+              <w:t>189</w:t>
             </w:r>
           </w:p>
         </w:tc>
@@ -9510,7 +9493,7 @@
           </w:tcPr>
           <w:p>
             <w:r>
-              <w:t>1043</w:t>
+              <w:t>413</w:t>
             </w:r>
           </w:p>
         </w:tc>
@@ -9530,7 +9513,7 @@
           </w:tcPr>
           <w:p>
             <w:r>
-              <w:t>Software Security: Reference-2</w:t>
+              <w:t>Software Security: Reference-3</w:t>
             </w:r>
           </w:p>
         </w:tc>
@@ -9548,7 +9531,7 @@
           </w:tcPr>
           <w:p>
             <w:r>
-              <w:t>14</w:t>
+              <w:t>21</w:t>
             </w:r>
           </w:p>
         </w:tc>
@@ -9559,7 +9542,7 @@
           </w:tcPr>
           <w:p>
             <w:r>
-              <w:t>189</w:t>
+              <w:t>400</w:t>
             </w:r>
           </w:p>
         </w:tc>
@@ -9570,7 +9553,7 @@
           </w:tcPr>
           <w:p>
             <w:r>
-              <w:t>413</w:t>
+              <w:t>914</w:t>
             </w:r>
           </w:p>
         </w:tc>
@@ -9581,7 +9564,14 @@
             <w:tcW w:w="250" w:type="pct"/>
             <w:shd w:val="clear" w:color="auto" w:fill="E7E6E6" w:themeFill="background2"/>
           </w:tcPr>
-          <w:p/>
+          <w:p>
+            <w:r>
+              <w:t>0</w:t>
+            </w:r>
+            <w:r>
+              <w:t>3</w:t>
+            </w:r>
+          </w:p>
         </w:tc>
         <w:tc>
           <w:tcPr>
@@ -9590,7 +9580,10 @@
           </w:tcPr>
           <w:p>
             <w:r>
-              <w:t>Software Security: Reference-3</w:t>
+              <w:t>Numerical Analysis</w:t>
+            </w:r>
+            <w:r>
+              <w:t xml:space="preserve"> of Engineers </w:t>
             </w:r>
           </w:p>
         </w:tc>
@@ -9599,7 +9592,11 @@
             <w:tcW w:w="720" w:type="pct"/>
             <w:shd w:val="clear" w:color="auto" w:fill="E7E6E6" w:themeFill="background2"/>
           </w:tcPr>
-          <w:p/>
+          <w:p>
+            <w:r>
+              <w:t>T-H3</w:t>
+            </w:r>
+          </w:p>
         </w:tc>
         <w:tc>
           <w:tcPr>
@@ -9608,7 +9605,7 @@
           </w:tcPr>
           <w:p>
             <w:r>
-              <w:t>21</w:t>
+              <w:t>11</w:t>
             </w:r>
           </w:p>
         </w:tc>
@@ -9619,7 +9616,7 @@
           </w:tcPr>
           <w:p>
             <w:r>
-              <w:t>400</w:t>
+              <w:t>131</w:t>
             </w:r>
           </w:p>
         </w:tc>
@@ -9630,7 +9627,7 @@
           </w:tcPr>
           <w:p>
             <w:r>
-              <w:t>914</w:t>
+              <w:t>615</w:t>
             </w:r>
           </w:p>
         </w:tc>

</xml_diff>

<commit_message>
personal library (ver-2) update-146
</commit_message>
<xml_diff>
--- a/resources/Courses/GPT/Courses.docx
+++ b/resources/Courses/GPT/Courses.docx
@@ -135,7 +135,11 @@
               <w:t xml:space="preserve">3 Hours </w:t>
             </w:r>
             <w:r>
-              <w:t>(Evening)</w:t>
+              <w:t>(</w:t>
+            </w:r>
+            <w:proofErr w:type="gramStart"/>
+            <w:r>
+              <w:t>Evening)</w:t>
             </w:r>
             <w:r>
               <w:t xml:space="preserve"> </w:t>
@@ -144,7 +148,11 @@
               <w:t xml:space="preserve"> </w:t>
             </w:r>
             <w:r>
-              <w:t>= 15 Hours</w:t>
+              <w:t>=</w:t>
+            </w:r>
+            <w:proofErr w:type="gramEnd"/>
+            <w:r>
+              <w:t xml:space="preserve"> 15 Hours</w:t>
             </w:r>
           </w:p>
         </w:tc>
@@ -261,7 +269,15 @@
           </w:tcPr>
           <w:p>
             <w:r>
-              <w:t>5 Days x 6 Hours (Full Day)  = 30 Hours</w:t>
+              <w:t xml:space="preserve">5 Days x 6 Hours (Full </w:t>
+            </w:r>
+            <w:proofErr w:type="gramStart"/>
+            <w:r>
+              <w:t>Day)  =</w:t>
+            </w:r>
+            <w:proofErr w:type="gramEnd"/>
+            <w:r>
+              <w:t xml:space="preserve"> 30 Hours</w:t>
             </w:r>
           </w:p>
         </w:tc>
@@ -298,8 +314,17 @@
                 <w:b/>
                 <w:bCs/>
               </w:rPr>
-              <w:t>Review and Test</w:t>
-            </w:r>
+              <w:t xml:space="preserve">Review and </w:t>
+            </w:r>
+            <w:proofErr w:type="gramStart"/>
+            <w:r>
+              <w:rPr>
+                <w:b/>
+                <w:bCs/>
+              </w:rPr>
+              <w:t>Test</w:t>
+            </w:r>
+            <w:proofErr w:type="gramEnd"/>
           </w:p>
         </w:tc>
         <w:tc>
@@ -315,10 +340,18 @@
               <w:t xml:space="preserve"> </w:t>
             </w:r>
             <w:r>
-              <w:t xml:space="preserve">(Full Day)  </w:t>
-            </w:r>
-            <w:r>
-              <w:t xml:space="preserve">= </w:t>
+              <w:t xml:space="preserve">(Full </w:t>
+            </w:r>
+            <w:proofErr w:type="gramStart"/>
+            <w:r>
+              <w:t xml:space="preserve">Day)  </w:t>
+            </w:r>
+            <w:r>
+              <w:t>=</w:t>
+            </w:r>
+            <w:proofErr w:type="gramEnd"/>
+            <w:r>
+              <w:t xml:space="preserve"> </w:t>
             </w:r>
             <w:r>
               <w:t>0</w:t>
@@ -386,10 +419,18 @@
               <w:t xml:space="preserve"> </w:t>
             </w:r>
             <w:r>
-              <w:t xml:space="preserve">(Full Day)  </w:t>
-            </w:r>
-            <w:r>
-              <w:t xml:space="preserve">= </w:t>
+              <w:t xml:space="preserve">(Full </w:t>
+            </w:r>
+            <w:proofErr w:type="gramStart"/>
+            <w:r>
+              <w:t xml:space="preserve">Day)  </w:t>
+            </w:r>
+            <w:r>
+              <w:t>=</w:t>
+            </w:r>
+            <w:proofErr w:type="gramEnd"/>
+            <w:r>
+              <w:t xml:space="preserve"> </w:t>
             </w:r>
             <w:r>
               <w:t>0</w:t>
@@ -453,7 +494,15 @@
           </w:tcPr>
           <w:p>
             <w:r>
-              <w:t>2 Days x 6 Hours (Full Day)  = 12 Hours</w:t>
+              <w:t xml:space="preserve">2 Days x 6 Hours (Full </w:t>
+            </w:r>
+            <w:proofErr w:type="gramStart"/>
+            <w:r>
+              <w:t>Day)  =</w:t>
+            </w:r>
+            <w:proofErr w:type="gramEnd"/>
+            <w:r>
+              <w:t xml:space="preserve"> 12 Hours</w:t>
             </w:r>
           </w:p>
         </w:tc>
@@ -495,6 +544,7 @@
         </w:rPr>
         <w:t xml:space="preserve">Additional </w:t>
       </w:r>
+      <w:proofErr w:type="gramStart"/>
       <w:r>
         <w:rPr>
           <w:b/>
@@ -505,6 +555,7 @@
         </w:rPr>
         <w:t>Resources:-</w:t>
       </w:r>
+      <w:proofErr w:type="gramEnd"/>
     </w:p>
     <w:p>
       <w:pPr>
@@ -542,8 +593,13 @@
         <w:spacing w:after="0"/>
       </w:pPr>
       <w:r>
-        <w:t>Certification: MIT, Harvard, Oxford, Microsoft, Google, OpenAI, IBM, Etc</w:t>
-      </w:r>
+        <w:t xml:space="preserve">Certification: MIT, Harvard, Oxford, Microsoft, Google, OpenAI, IBM, </w:t>
+      </w:r>
+      <w:proofErr w:type="spellStart"/>
+      <w:r>
+        <w:t>Etc</w:t>
+      </w:r>
+      <w:proofErr w:type="spellEnd"/>
     </w:p>
     <w:p>
       <w:pPr>
@@ -565,8 +621,9 @@
           <w:szCs w:val="24"/>
           <w:u w:val="single"/>
         </w:rPr>
-        <w:t>Practice (5 Days of Evening Shift)</w:t>
-      </w:r>
+        <w:t>Practice (5 Days of Evening Shift</w:t>
+      </w:r>
+      <w:proofErr w:type="gramStart"/>
       <w:r>
         <w:rPr>
           <w:b/>
@@ -575,8 +632,19 @@
           <w:szCs w:val="24"/>
           <w:u w:val="single"/>
         </w:rPr>
+        <w:t>)</w:t>
+      </w:r>
+      <w:r>
+        <w:rPr>
+          <w:b/>
+          <w:bCs/>
+          <w:sz w:val="24"/>
+          <w:szCs w:val="24"/>
+          <w:u w:val="single"/>
+        </w:rPr>
         <w:t>:-</w:t>
       </w:r>
+      <w:proofErr w:type="gramEnd"/>
     </w:p>
     <w:p>
       <w:pPr>
@@ -662,8 +730,9 @@
           <w:szCs w:val="24"/>
           <w:u w:val="single"/>
         </w:rPr>
-        <w:t>(5 Days of Morning Shift)</w:t>
-      </w:r>
+        <w:t>(5 Days of Morning Shift</w:t>
+      </w:r>
+      <w:proofErr w:type="gramStart"/>
       <w:r>
         <w:rPr>
           <w:b/>
@@ -672,8 +741,19 @@
           <w:szCs w:val="24"/>
           <w:u w:val="single"/>
         </w:rPr>
+        <w:t>)</w:t>
+      </w:r>
+      <w:r>
+        <w:rPr>
+          <w:b/>
+          <w:bCs/>
+          <w:sz w:val="24"/>
+          <w:szCs w:val="24"/>
+          <w:u w:val="single"/>
+        </w:rPr>
         <w:t>:-</w:t>
       </w:r>
+      <w:proofErr w:type="gramEnd"/>
     </w:p>
     <w:p>
       <w:pPr>
@@ -722,8 +802,9 @@
           <w:szCs w:val="24"/>
           <w:u w:val="single"/>
         </w:rPr>
-        <w:t>(Off Days of Evening Shift)</w:t>
-      </w:r>
+        <w:t>(Off Days of Evening Shift</w:t>
+      </w:r>
+      <w:proofErr w:type="gramStart"/>
       <w:r>
         <w:rPr>
           <w:b/>
@@ -732,7 +813,28 @@
           <w:szCs w:val="24"/>
           <w:u w:val="single"/>
         </w:rPr>
-        <w:t xml:space="preserve">:- </w:t>
+        <w:t>)</w:t>
+      </w:r>
+      <w:r>
+        <w:rPr>
+          <w:b/>
+          <w:bCs/>
+          <w:sz w:val="24"/>
+          <w:szCs w:val="24"/>
+          <w:u w:val="single"/>
+        </w:rPr>
+        <w:t>:-</w:t>
+      </w:r>
+      <w:proofErr w:type="gramEnd"/>
+      <w:r>
+        <w:rPr>
+          <w:b/>
+          <w:bCs/>
+          <w:sz w:val="24"/>
+          <w:szCs w:val="24"/>
+          <w:u w:val="single"/>
+        </w:rPr>
+        <w:t xml:space="preserve"> </w:t>
       </w:r>
     </w:p>
     <w:p>
@@ -788,8 +890,9 @@
           <w:szCs w:val="24"/>
           <w:u w:val="single"/>
         </w:rPr>
-        <w:t>(Off Days of Morning Shift)</w:t>
-      </w:r>
+        <w:t>(Off Days of Morning Shift</w:t>
+      </w:r>
+      <w:proofErr w:type="gramStart"/>
       <w:r>
         <w:rPr>
           <w:b/>
@@ -798,8 +901,19 @@
           <w:szCs w:val="24"/>
           <w:u w:val="single"/>
         </w:rPr>
+        <w:t>)</w:t>
+      </w:r>
+      <w:r>
+        <w:rPr>
+          <w:b/>
+          <w:bCs/>
+          <w:sz w:val="24"/>
+          <w:szCs w:val="24"/>
+          <w:u w:val="single"/>
+        </w:rPr>
         <w:t>:-</w:t>
       </w:r>
+      <w:proofErr w:type="gramEnd"/>
     </w:p>
     <w:p>
       <w:pPr>
@@ -953,7 +1067,21 @@
                 <w:b/>
                 <w:bCs/>
               </w:rPr>
-              <w:t xml:space="preserve">Course-1: Fundamentals of Software Engineering </w:t>
+              <w:t>Course-</w:t>
+            </w:r>
+            <w:r>
+              <w:rPr>
+                <w:b/>
+                <w:bCs/>
+              </w:rPr>
+              <w:t>0</w:t>
+            </w:r>
+            <w:r>
+              <w:rPr>
+                <w:b/>
+                <w:bCs/>
+              </w:rPr>
+              <w:t xml:space="preserve">1: Fundamentals of Software Engineering </w:t>
             </w:r>
           </w:p>
         </w:tc>
@@ -2542,8 +2670,19 @@
           <w:color w:val="C00000"/>
           <w:sz w:val="28"/>
         </w:rPr>
-        <w:t>Course Outcomes:-</w:t>
-      </w:r>
+        <w:t xml:space="preserve">Course </w:t>
+      </w:r>
+      <w:proofErr w:type="gramStart"/>
+      <w:r>
+        <w:rPr>
+          <w:b/>
+          <w:bCs/>
+          <w:color w:val="C00000"/>
+          <w:sz w:val="28"/>
+        </w:rPr>
+        <w:t>Outcomes:-</w:t>
+      </w:r>
+      <w:proofErr w:type="gramEnd"/>
     </w:p>
     <w:p>
       <w:pPr>
@@ -2776,7 +2915,21 @@
                 <w:b/>
                 <w:bCs/>
               </w:rPr>
-              <w:t xml:space="preserve">Course-2: </w:t>
+              <w:t>Course-</w:t>
+            </w:r>
+            <w:r>
+              <w:rPr>
+                <w:b/>
+                <w:bCs/>
+              </w:rPr>
+              <w:t>0</w:t>
+            </w:r>
+            <w:r>
+              <w:rPr>
+                <w:b/>
+                <w:bCs/>
+              </w:rPr>
+              <w:t xml:space="preserve">2: </w:t>
             </w:r>
             <w:r>
               <w:rPr>
@@ -4104,8 +4257,19 @@
           <w:color w:val="C00000"/>
           <w:sz w:val="28"/>
         </w:rPr>
-        <w:t>Course Outcomes:-</w:t>
-      </w:r>
+        <w:t xml:space="preserve">Course </w:t>
+      </w:r>
+      <w:proofErr w:type="gramStart"/>
+      <w:r>
+        <w:rPr>
+          <w:b/>
+          <w:bCs/>
+          <w:color w:val="C00000"/>
+          <w:sz w:val="28"/>
+        </w:rPr>
+        <w:t>Outcomes:-</w:t>
+      </w:r>
+      <w:proofErr w:type="gramEnd"/>
     </w:p>
     <w:p>
       <w:pPr>
@@ -4384,7 +4548,21 @@
                 <w:b/>
                 <w:bCs/>
               </w:rPr>
-              <w:t xml:space="preserve">Course-3: </w:t>
+              <w:t>Course-</w:t>
+            </w:r>
+            <w:r>
+              <w:rPr>
+                <w:b/>
+                <w:bCs/>
+              </w:rPr>
+              <w:t>0</w:t>
+            </w:r>
+            <w:r>
+              <w:rPr>
+                <w:b/>
+                <w:bCs/>
+              </w:rPr>
+              <w:t xml:space="preserve">3: </w:t>
             </w:r>
             <w:r>
               <w:rPr>
@@ -5693,8 +5871,19 @@
           <w:color w:val="C00000"/>
           <w:sz w:val="28"/>
         </w:rPr>
-        <w:t>Course Outcomes:-</w:t>
-      </w:r>
+        <w:t xml:space="preserve">Course </w:t>
+      </w:r>
+      <w:proofErr w:type="gramStart"/>
+      <w:r>
+        <w:rPr>
+          <w:b/>
+          <w:bCs/>
+          <w:color w:val="C00000"/>
+          <w:sz w:val="28"/>
+        </w:rPr>
+        <w:t>Outcomes:-</w:t>
+      </w:r>
+      <w:proofErr w:type="gramEnd"/>
     </w:p>
     <w:p>
       <w:pPr>
@@ -5927,7 +6116,21 @@
                 <w:b/>
                 <w:bCs/>
               </w:rPr>
-              <w:t xml:space="preserve">Course-4: System Design and </w:t>
+              <w:t>Course-</w:t>
+            </w:r>
+            <w:r>
+              <w:rPr>
+                <w:b/>
+                <w:bCs/>
+              </w:rPr>
+              <w:t>0</w:t>
+            </w:r>
+            <w:r>
+              <w:rPr>
+                <w:b/>
+                <w:bCs/>
+              </w:rPr>
+              <w:t xml:space="preserve">4: System Design and </w:t>
             </w:r>
             <w:r>
               <w:rPr>
@@ -6643,10 +6846,7 @@
           </w:tcPr>
           <w:p>
             <w:r>
-              <w:t>0</w:t>
-            </w:r>
-            <w:r>
-              <w:t>1</w:t>
+              <w:t>01</w:t>
             </w:r>
           </w:p>
         </w:tc>
@@ -6717,10 +6917,7 @@
           </w:tcPr>
           <w:p>
             <w:r>
-              <w:t>0</w:t>
-            </w:r>
-            <w:r>
-              <w:t>2</w:t>
+              <w:t>02</w:t>
             </w:r>
           </w:p>
         </w:tc>
@@ -6802,7 +6999,15 @@
           </w:tcPr>
           <w:p>
             <w:r>
-              <w:t>Ordinary Differential Equation : Reference-1</w:t>
+              <w:t xml:space="preserve">Ordinary Differential </w:t>
+            </w:r>
+            <w:proofErr w:type="gramStart"/>
+            <w:r>
+              <w:t>Equation :</w:t>
+            </w:r>
+            <w:proofErr w:type="gramEnd"/>
+            <w:r>
+              <w:t xml:space="preserve"> Reference-1</w:t>
             </w:r>
           </w:p>
         </w:tc>
@@ -6866,7 +7071,15 @@
           </w:tcPr>
           <w:p>
             <w:r>
-              <w:t>Ordinary Differential Equation : Reference-1</w:t>
+              <w:t xml:space="preserve">Ordinary Differential </w:t>
+            </w:r>
+            <w:proofErr w:type="gramStart"/>
+            <w:r>
+              <w:t>Equation :</w:t>
+            </w:r>
+            <w:proofErr w:type="gramEnd"/>
+            <w:r>
+              <w:t xml:space="preserve"> Reference-1</w:t>
             </w:r>
           </w:p>
         </w:tc>
@@ -7039,8 +7252,19 @@
           <w:color w:val="C00000"/>
           <w:sz w:val="28"/>
         </w:rPr>
-        <w:t>Course Outcomes:-</w:t>
-      </w:r>
+        <w:t xml:space="preserve">Course </w:t>
+      </w:r>
+      <w:proofErr w:type="gramStart"/>
+      <w:r>
+        <w:rPr>
+          <w:b/>
+          <w:bCs/>
+          <w:color w:val="C00000"/>
+          <w:sz w:val="28"/>
+        </w:rPr>
+        <w:t>Outcomes:-</w:t>
+      </w:r>
+      <w:proofErr w:type="gramEnd"/>
     </w:p>
     <w:p>
       <w:pPr>
@@ -7327,7 +7551,21 @@
                 <w:b/>
                 <w:bCs/>
               </w:rPr>
-              <w:t xml:space="preserve">Course-5: Intelligent System and Data Science </w:t>
+              <w:t>Course-</w:t>
+            </w:r>
+            <w:r>
+              <w:rPr>
+                <w:b/>
+                <w:bCs/>
+              </w:rPr>
+              <w:t>0</w:t>
+            </w:r>
+            <w:r>
+              <w:rPr>
+                <w:b/>
+                <w:bCs/>
+              </w:rPr>
+              <w:t xml:space="preserve">5: Intelligent System and Data Science </w:t>
             </w:r>
           </w:p>
         </w:tc>
@@ -8135,10 +8373,7 @@
           </w:tcPr>
           <w:p>
             <w:r>
-              <w:t>0</w:t>
-            </w:r>
-            <w:r>
-              <w:t>1</w:t>
+              <w:t>01</w:t>
             </w:r>
           </w:p>
         </w:tc>
@@ -8206,10 +8441,7 @@
           </w:tcPr>
           <w:p>
             <w:r>
-              <w:t>0</w:t>
-            </w:r>
-            <w:r>
-              <w:t>2</w:t>
+              <w:t>02</w:t>
             </w:r>
           </w:p>
         </w:tc>
@@ -8468,8 +8700,19 @@
           <w:color w:val="C00000"/>
           <w:sz w:val="28"/>
         </w:rPr>
-        <w:t>Course Outcomes:-</w:t>
-      </w:r>
+        <w:t xml:space="preserve">Course </w:t>
+      </w:r>
+      <w:proofErr w:type="gramStart"/>
+      <w:r>
+        <w:rPr>
+          <w:b/>
+          <w:bCs/>
+          <w:color w:val="C00000"/>
+          <w:sz w:val="28"/>
+        </w:rPr>
+        <w:t>Outcomes:-</w:t>
+      </w:r>
+      <w:proofErr w:type="gramEnd"/>
     </w:p>
     <w:p>
       <w:pPr>
@@ -8754,7 +8997,21 @@
                 <w:b/>
                 <w:bCs/>
               </w:rPr>
-              <w:t>Course-7: Industrial Training and Business</w:t>
+              <w:t>Course-</w:t>
+            </w:r>
+            <w:r>
+              <w:rPr>
+                <w:b/>
+                <w:bCs/>
+              </w:rPr>
+              <w:t>06</w:t>
+            </w:r>
+            <w:r>
+              <w:rPr>
+                <w:b/>
+                <w:bCs/>
+              </w:rPr>
+              <w:t>: Industrial Training and Business</w:t>
             </w:r>
           </w:p>
         </w:tc>
@@ -9566,10 +9823,7 @@
           </w:tcPr>
           <w:p>
             <w:r>
-              <w:t>0</w:t>
-            </w:r>
-            <w:r>
-              <w:t>3</w:t>
+              <w:t>03</w:t>
             </w:r>
           </w:p>
         </w:tc>
@@ -9753,8 +10007,19 @@
           <w:color w:val="C00000"/>
           <w:sz w:val="28"/>
         </w:rPr>
-        <w:t>Course Outcomes:-</w:t>
-      </w:r>
+        <w:t xml:space="preserve">Course </w:t>
+      </w:r>
+      <w:proofErr w:type="gramStart"/>
+      <w:r>
+        <w:rPr>
+          <w:b/>
+          <w:bCs/>
+          <w:color w:val="C00000"/>
+          <w:sz w:val="28"/>
+        </w:rPr>
+        <w:t>Outcomes:-</w:t>
+      </w:r>
+      <w:proofErr w:type="gramEnd"/>
     </w:p>
     <w:p>
       <w:pPr>
@@ -10083,7 +10348,21 @@
                 <w:b/>
                 <w:bCs/>
               </w:rPr>
-              <w:t>Course-6: System and Communication</w:t>
+              <w:t>Course-</w:t>
+            </w:r>
+            <w:r>
+              <w:rPr>
+                <w:b/>
+                <w:bCs/>
+              </w:rPr>
+              <w:t>07</w:t>
+            </w:r>
+            <w:r>
+              <w:rPr>
+                <w:b/>
+                <w:bCs/>
+              </w:rPr>
+              <w:t>: System and Communication</w:t>
             </w:r>
           </w:p>
         </w:tc>
@@ -11070,7 +11349,21 @@
                 <w:b/>
                 <w:bCs/>
               </w:rPr>
-              <w:t xml:space="preserve">Course-8: Digital System and Interfacing </w:t>
+              <w:t>Course-</w:t>
+            </w:r>
+            <w:r>
+              <w:rPr>
+                <w:b/>
+                <w:bCs/>
+              </w:rPr>
+              <w:t>0</w:t>
+            </w:r>
+            <w:r>
+              <w:rPr>
+                <w:b/>
+                <w:bCs/>
+              </w:rPr>
+              <w:t xml:space="preserve">8: Digital System and Interfacing </w:t>
             </w:r>
           </w:p>
         </w:tc>
@@ -11610,6 +11903,13 @@
             <w:shd w:val="clear" w:color="auto" w:fill="E7E6E6" w:themeFill="background2"/>
           </w:tcPr>
           <w:p>
+            <w:pPr>
+              <w:rPr>
+                <w:b/>
+                <w:bCs/>
+                <w:color w:val="C00000"/>
+              </w:rPr>
+            </w:pPr>
             <w:r>
               <w:t>0</w:t>
             </w:r>
@@ -11625,7 +11925,7 @@
           </w:tcPr>
           <w:p>
             <w:r>
-              <w:t>Computer Graphics and Multimedia</w:t>
+              <w:t>Compiler Design</w:t>
             </w:r>
           </w:p>
         </w:tc>
@@ -11636,7 +11936,7 @@
           </w:tcPr>
           <w:p>
             <w:r>
-              <w:t>T-H3 + S-H4</w:t>
+              <w:t>T-H3</w:t>
             </w:r>
           </w:p>
         </w:tc>
@@ -11684,7 +11984,7 @@
           </w:tcPr>
           <w:p>
             <w:r>
-              <w:t xml:space="preserve">Pattern Recognizing and Image Processing </w:t>
+              <w:t>Computer Graphics and Multimedia</w:t>
             </w:r>
           </w:p>
         </w:tc>
@@ -11728,15 +12028,11 @@
             <w:shd w:val="clear" w:color="auto" w:fill="E7E6E6" w:themeFill="background2"/>
           </w:tcPr>
           <w:p>
-            <w:pPr>
-              <w:rPr>
-                <w:b/>
-                <w:bCs/>
-                <w:color w:val="C00000"/>
-              </w:rPr>
-            </w:pPr>
-            <w:r>
-              <w:t>03</w:t>
+            <w:r>
+              <w:t>0</w:t>
+            </w:r>
+            <w:r>
+              <w:t>3</w:t>
             </w:r>
           </w:p>
         </w:tc>
@@ -11747,7 +12043,7 @@
           </w:tcPr>
           <w:p>
             <w:r>
-              <w:t xml:space="preserve">Strategic Management  </w:t>
+              <w:t xml:space="preserve">Pattern Recognizing and Image Processing </w:t>
             </w:r>
           </w:p>
         </w:tc>
@@ -11758,7 +12054,7 @@
           </w:tcPr>
           <w:p>
             <w:r>
-              <w:t>T-H3</w:t>
+              <w:t>T-H3 + S-H4</w:t>
             </w:r>
           </w:p>
         </w:tc>
@@ -11878,6 +12174,1935 @@
         </w:tc>
       </w:tr>
     </w:tbl>
+    <w:p>
+      <w:pPr>
+        <w:spacing w:after="0"/>
+      </w:pPr>
+    </w:p>
+    <w:p>
+      <w:pPr>
+        <w:pStyle w:val="Heading2"/>
+        <w:rPr>
+          <w:b/>
+          <w:bCs/>
+          <w:color w:val="C00000"/>
+        </w:rPr>
+      </w:pPr>
+      <w:r>
+        <w:rPr>
+          <w:b/>
+          <w:bCs/>
+          <w:color w:val="C00000"/>
+        </w:rPr>
+        <w:lastRenderedPageBreak/>
+        <w:t>Year-0</w:t>
+      </w:r>
+      <w:r>
+        <w:rPr>
+          <w:b/>
+          <w:bCs/>
+          <w:color w:val="C00000"/>
+        </w:rPr>
+        <w:t>5</w:t>
+      </w:r>
+      <w:r>
+        <w:rPr>
+          <w:b/>
+          <w:bCs/>
+          <w:color w:val="C00000"/>
+        </w:rPr>
+        <w:t>.</w:t>
+      </w:r>
+      <w:r>
+        <w:rPr>
+          <w:b/>
+          <w:bCs/>
+          <w:color w:val="C00000"/>
+        </w:rPr>
+        <w:t>1</w:t>
+      </w:r>
+      <w:r>
+        <w:rPr>
+          <w:b/>
+          <w:bCs/>
+          <w:color w:val="C00000"/>
+        </w:rPr>
+        <w:t xml:space="preserve">: </w:t>
+      </w:r>
+      <w:r>
+        <w:rPr>
+          <w:b/>
+          <w:bCs/>
+          <w:color w:val="C00000"/>
+        </w:rPr>
+        <w:t xml:space="preserve">Electronics and Robotics </w:t>
+      </w:r>
+    </w:p>
+    <w:p/>
+    <w:tbl>
+      <w:tblPr>
+        <w:tblStyle w:val="TableGrid"/>
+        <w:tblW w:w="5000" w:type="pct"/>
+        <w:shd w:val="clear" w:color="auto" w:fill="E7E6E6" w:themeFill="background2"/>
+        <w:tblLook w:val="04A0" w:firstRow="1" w:lastRow="0" w:firstColumn="1" w:lastColumn="0" w:noHBand="0" w:noVBand="1"/>
+      </w:tblPr>
+      <w:tblGrid>
+        <w:gridCol w:w="769"/>
+        <w:gridCol w:w="8079"/>
+        <w:gridCol w:w="2216"/>
+        <w:gridCol w:w="1545"/>
+        <w:gridCol w:w="1234"/>
+        <w:gridCol w:w="1545"/>
+      </w:tblGrid>
+      <w:tr>
+        <w:trPr>
+          <w:trHeight w:val="547"/>
+        </w:trPr>
+        <w:tc>
+          <w:tcPr>
+            <w:tcW w:w="250" w:type="pct"/>
+            <w:shd w:val="clear" w:color="auto" w:fill="002060"/>
+            <w:vAlign w:val="center"/>
+          </w:tcPr>
+          <w:p>
+            <w:pPr>
+              <w:rPr>
+                <w:b/>
+                <w:bCs/>
+              </w:rPr>
+            </w:pPr>
+          </w:p>
+        </w:tc>
+        <w:tc>
+          <w:tcPr>
+            <w:tcW w:w="3345" w:type="pct"/>
+            <w:gridSpan w:val="2"/>
+            <w:shd w:val="clear" w:color="auto" w:fill="002060"/>
+            <w:vAlign w:val="center"/>
+          </w:tcPr>
+          <w:p>
+            <w:pPr>
+              <w:rPr>
+                <w:b/>
+                <w:bCs/>
+              </w:rPr>
+            </w:pPr>
+            <w:r>
+              <w:rPr>
+                <w:b/>
+                <w:bCs/>
+              </w:rPr>
+              <w:t>Course-</w:t>
+            </w:r>
+            <w:r>
+              <w:rPr>
+                <w:b/>
+                <w:bCs/>
+              </w:rPr>
+              <w:t>09</w:t>
+            </w:r>
+            <w:r>
+              <w:rPr>
+                <w:b/>
+                <w:bCs/>
+              </w:rPr>
+              <w:t xml:space="preserve">: </w:t>
+            </w:r>
+            <w:r>
+              <w:rPr>
+                <w:b/>
+                <w:bCs/>
+              </w:rPr>
+              <w:t xml:space="preserve">Electronics and Computer </w:t>
+            </w:r>
+            <w:r>
+              <w:rPr>
+                <w:b/>
+                <w:bCs/>
+              </w:rPr>
+              <w:t xml:space="preserve"> </w:t>
+            </w:r>
+          </w:p>
+        </w:tc>
+        <w:tc>
+          <w:tcPr>
+            <w:tcW w:w="1405" w:type="pct"/>
+            <w:gridSpan w:val="3"/>
+            <w:shd w:val="clear" w:color="auto" w:fill="002060"/>
+            <w:vAlign w:val="center"/>
+          </w:tcPr>
+          <w:p>
+            <w:pPr>
+              <w:rPr>
+                <w:b/>
+                <w:bCs/>
+              </w:rPr>
+            </w:pPr>
+            <w:r>
+              <w:rPr>
+                <w:b/>
+                <w:bCs/>
+              </w:rPr>
+              <w:t xml:space="preserve">Duration: (4 + 2) Months </w:t>
+            </w:r>
+          </w:p>
+        </w:tc>
+      </w:tr>
+      <w:tr>
+        <w:tc>
+          <w:tcPr>
+            <w:tcW w:w="250" w:type="pct"/>
+            <w:shd w:val="clear" w:color="auto" w:fill="E7E6E6" w:themeFill="background2"/>
+          </w:tcPr>
+          <w:p>
+            <w:r>
+              <w:t>01</w:t>
+            </w:r>
+          </w:p>
+        </w:tc>
+        <w:tc>
+          <w:tcPr>
+            <w:tcW w:w="2625" w:type="pct"/>
+            <w:shd w:val="clear" w:color="auto" w:fill="E7E6E6" w:themeFill="background2"/>
+          </w:tcPr>
+          <w:p>
+            <w:r>
+              <w:t xml:space="preserve">Fundamental of Electrical Engineering </w:t>
+            </w:r>
+          </w:p>
+        </w:tc>
+        <w:tc>
+          <w:tcPr>
+            <w:tcW w:w="720" w:type="pct"/>
+            <w:shd w:val="clear" w:color="auto" w:fill="E7E6E6" w:themeFill="background2"/>
+          </w:tcPr>
+          <w:p>
+            <w:r>
+              <w:t>T-H3 + S-H4</w:t>
+            </w:r>
+          </w:p>
+        </w:tc>
+        <w:tc>
+          <w:tcPr>
+            <w:tcW w:w="502" w:type="pct"/>
+            <w:shd w:val="clear" w:color="auto" w:fill="E7E6E6" w:themeFill="background2"/>
+          </w:tcPr>
+          <w:p/>
+        </w:tc>
+        <w:tc>
+          <w:tcPr>
+            <w:tcW w:w="401" w:type="pct"/>
+            <w:shd w:val="clear" w:color="auto" w:fill="E7E6E6" w:themeFill="background2"/>
+          </w:tcPr>
+          <w:p/>
+        </w:tc>
+        <w:tc>
+          <w:tcPr>
+            <w:tcW w:w="502" w:type="pct"/>
+            <w:shd w:val="clear" w:color="auto" w:fill="E7E6E6" w:themeFill="background2"/>
+          </w:tcPr>
+          <w:p/>
+        </w:tc>
+      </w:tr>
+      <w:tr>
+        <w:tc>
+          <w:tcPr>
+            <w:tcW w:w="250" w:type="pct"/>
+            <w:shd w:val="clear" w:color="auto" w:fill="E7E6E6" w:themeFill="background2"/>
+          </w:tcPr>
+          <w:p>
+            <w:r>
+              <w:t>02</w:t>
+            </w:r>
+          </w:p>
+        </w:tc>
+        <w:tc>
+          <w:tcPr>
+            <w:tcW w:w="2625" w:type="pct"/>
+            <w:shd w:val="clear" w:color="auto" w:fill="E7E6E6" w:themeFill="background2"/>
+          </w:tcPr>
+          <w:p>
+            <w:r>
+              <w:t xml:space="preserve">Fundamental of Electronics </w:t>
+            </w:r>
+          </w:p>
+        </w:tc>
+        <w:tc>
+          <w:tcPr>
+            <w:tcW w:w="720" w:type="pct"/>
+            <w:shd w:val="clear" w:color="auto" w:fill="E7E6E6" w:themeFill="background2"/>
+          </w:tcPr>
+          <w:p>
+            <w:r>
+              <w:t>T-H3</w:t>
+            </w:r>
+          </w:p>
+        </w:tc>
+        <w:tc>
+          <w:tcPr>
+            <w:tcW w:w="502" w:type="pct"/>
+            <w:shd w:val="clear" w:color="auto" w:fill="E7E6E6" w:themeFill="background2"/>
+          </w:tcPr>
+          <w:p/>
+        </w:tc>
+        <w:tc>
+          <w:tcPr>
+            <w:tcW w:w="401" w:type="pct"/>
+            <w:shd w:val="clear" w:color="auto" w:fill="E7E6E6" w:themeFill="background2"/>
+          </w:tcPr>
+          <w:p/>
+        </w:tc>
+        <w:tc>
+          <w:tcPr>
+            <w:tcW w:w="502" w:type="pct"/>
+            <w:shd w:val="clear" w:color="auto" w:fill="E7E6E6" w:themeFill="background2"/>
+          </w:tcPr>
+          <w:p/>
+        </w:tc>
+      </w:tr>
+      <w:tr>
+        <w:tc>
+          <w:tcPr>
+            <w:tcW w:w="250" w:type="pct"/>
+            <w:shd w:val="clear" w:color="auto" w:fill="E7E6E6" w:themeFill="background2"/>
+          </w:tcPr>
+          <w:p>
+            <w:r>
+              <w:t>03</w:t>
+            </w:r>
+          </w:p>
+        </w:tc>
+        <w:tc>
+          <w:tcPr>
+            <w:tcW w:w="2625" w:type="pct"/>
+            <w:shd w:val="clear" w:color="auto" w:fill="E7E6E6" w:themeFill="background2"/>
+          </w:tcPr>
+          <w:p>
+            <w:r>
+              <w:t xml:space="preserve">Digital Signal Procession </w:t>
+            </w:r>
+            <w:r>
+              <w:t xml:space="preserve"> </w:t>
+            </w:r>
+          </w:p>
+        </w:tc>
+        <w:tc>
+          <w:tcPr>
+            <w:tcW w:w="720" w:type="pct"/>
+            <w:shd w:val="clear" w:color="auto" w:fill="E7E6E6" w:themeFill="background2"/>
+          </w:tcPr>
+          <w:p>
+            <w:r>
+              <w:t>T-H3 + S-H2</w:t>
+            </w:r>
+          </w:p>
+        </w:tc>
+        <w:tc>
+          <w:tcPr>
+            <w:tcW w:w="502" w:type="pct"/>
+            <w:shd w:val="clear" w:color="auto" w:fill="E7E6E6" w:themeFill="background2"/>
+          </w:tcPr>
+          <w:p/>
+        </w:tc>
+        <w:tc>
+          <w:tcPr>
+            <w:tcW w:w="401" w:type="pct"/>
+            <w:shd w:val="clear" w:color="auto" w:fill="E7E6E6" w:themeFill="background2"/>
+          </w:tcPr>
+          <w:p/>
+        </w:tc>
+        <w:tc>
+          <w:tcPr>
+            <w:tcW w:w="502" w:type="pct"/>
+            <w:shd w:val="clear" w:color="auto" w:fill="E7E6E6" w:themeFill="background2"/>
+          </w:tcPr>
+          <w:p/>
+        </w:tc>
+      </w:tr>
+      <w:tr>
+        <w:tc>
+          <w:tcPr>
+            <w:tcW w:w="250" w:type="pct"/>
+            <w:shd w:val="clear" w:color="auto" w:fill="FFF2CC" w:themeFill="accent4" w:themeFillTint="33"/>
+          </w:tcPr>
+          <w:p>
+            <w:pPr>
+              <w:rPr>
+                <w:b/>
+                <w:bCs/>
+              </w:rPr>
+            </w:pPr>
+          </w:p>
+        </w:tc>
+        <w:tc>
+          <w:tcPr>
+            <w:tcW w:w="2625" w:type="pct"/>
+            <w:shd w:val="clear" w:color="auto" w:fill="FFF2CC" w:themeFill="accent4" w:themeFillTint="33"/>
+          </w:tcPr>
+          <w:p>
+            <w:pPr>
+              <w:rPr>
+                <w:b/>
+                <w:bCs/>
+              </w:rPr>
+            </w:pPr>
+            <w:r>
+              <w:rPr>
+                <w:b/>
+                <w:bCs/>
+              </w:rPr>
+              <w:t xml:space="preserve">Theoretical Subjects </w:t>
+            </w:r>
+          </w:p>
+        </w:tc>
+        <w:tc>
+          <w:tcPr>
+            <w:tcW w:w="720" w:type="pct"/>
+            <w:shd w:val="clear" w:color="auto" w:fill="FFF2CC" w:themeFill="accent4" w:themeFillTint="33"/>
+          </w:tcPr>
+          <w:p>
+            <w:pPr>
+              <w:rPr>
+                <w:b/>
+                <w:bCs/>
+              </w:rPr>
+            </w:pPr>
+          </w:p>
+        </w:tc>
+        <w:tc>
+          <w:tcPr>
+            <w:tcW w:w="502" w:type="pct"/>
+            <w:shd w:val="clear" w:color="auto" w:fill="FFF2CC" w:themeFill="accent4" w:themeFillTint="33"/>
+          </w:tcPr>
+          <w:p>
+            <w:pPr>
+              <w:rPr>
+                <w:b/>
+                <w:bCs/>
+              </w:rPr>
+            </w:pPr>
+          </w:p>
+        </w:tc>
+        <w:tc>
+          <w:tcPr>
+            <w:tcW w:w="401" w:type="pct"/>
+            <w:shd w:val="clear" w:color="auto" w:fill="FFF2CC" w:themeFill="accent4" w:themeFillTint="33"/>
+          </w:tcPr>
+          <w:p>
+            <w:pPr>
+              <w:rPr>
+                <w:b/>
+                <w:bCs/>
+              </w:rPr>
+            </w:pPr>
+          </w:p>
+        </w:tc>
+        <w:tc>
+          <w:tcPr>
+            <w:tcW w:w="502" w:type="pct"/>
+            <w:shd w:val="clear" w:color="auto" w:fill="FFF2CC" w:themeFill="accent4" w:themeFillTint="33"/>
+          </w:tcPr>
+          <w:p>
+            <w:pPr>
+              <w:rPr>
+                <w:b/>
+                <w:bCs/>
+              </w:rPr>
+            </w:pPr>
+          </w:p>
+        </w:tc>
+      </w:tr>
+      <w:tr>
+        <w:tc>
+          <w:tcPr>
+            <w:tcW w:w="250" w:type="pct"/>
+            <w:shd w:val="clear" w:color="auto" w:fill="E7E6E6" w:themeFill="background2"/>
+          </w:tcPr>
+          <w:p>
+            <w:pPr>
+              <w:rPr>
+                <w:b/>
+                <w:bCs/>
+                <w:color w:val="C00000"/>
+              </w:rPr>
+            </w:pPr>
+            <w:r>
+              <w:rPr>
+                <w:b/>
+                <w:bCs/>
+                <w:color w:val="C00000"/>
+              </w:rPr>
+              <w:t>0</w:t>
+            </w:r>
+            <w:r>
+              <w:rPr>
+                <w:b/>
+                <w:bCs/>
+                <w:color w:val="C00000"/>
+              </w:rPr>
+              <w:t>4</w:t>
+            </w:r>
+          </w:p>
+        </w:tc>
+        <w:tc>
+          <w:tcPr>
+            <w:tcW w:w="2625" w:type="pct"/>
+            <w:shd w:val="clear" w:color="auto" w:fill="E7E6E6" w:themeFill="background2"/>
+          </w:tcPr>
+          <w:p>
+            <w:r>
+              <w:t xml:space="preserve">Instrumentation and Measurement </w:t>
+            </w:r>
+          </w:p>
+        </w:tc>
+        <w:tc>
+          <w:tcPr>
+            <w:tcW w:w="720" w:type="pct"/>
+            <w:shd w:val="clear" w:color="auto" w:fill="E7E6E6" w:themeFill="background2"/>
+          </w:tcPr>
+          <w:p>
+            <w:r>
+              <w:t>T-H3 + S-H4</w:t>
+            </w:r>
+          </w:p>
+        </w:tc>
+        <w:tc>
+          <w:tcPr>
+            <w:tcW w:w="502" w:type="pct"/>
+            <w:shd w:val="clear" w:color="auto" w:fill="E7E6E6" w:themeFill="background2"/>
+          </w:tcPr>
+          <w:p/>
+        </w:tc>
+        <w:tc>
+          <w:tcPr>
+            <w:tcW w:w="401" w:type="pct"/>
+            <w:shd w:val="clear" w:color="auto" w:fill="E7E6E6" w:themeFill="background2"/>
+          </w:tcPr>
+          <w:p/>
+        </w:tc>
+        <w:tc>
+          <w:tcPr>
+            <w:tcW w:w="502" w:type="pct"/>
+            <w:shd w:val="clear" w:color="auto" w:fill="E7E6E6" w:themeFill="background2"/>
+          </w:tcPr>
+          <w:p/>
+        </w:tc>
+      </w:tr>
+      <w:tr>
+        <w:tc>
+          <w:tcPr>
+            <w:tcW w:w="250" w:type="pct"/>
+            <w:shd w:val="clear" w:color="auto" w:fill="E7E6E6" w:themeFill="background2"/>
+          </w:tcPr>
+          <w:p>
+            <w:r>
+              <w:rPr>
+                <w:b/>
+                <w:bCs/>
+                <w:color w:val="C00000"/>
+              </w:rPr>
+              <w:t>0</w:t>
+            </w:r>
+            <w:r>
+              <w:rPr>
+                <w:b/>
+                <w:bCs/>
+                <w:color w:val="C00000"/>
+              </w:rPr>
+              <w:t>5</w:t>
+            </w:r>
+          </w:p>
+        </w:tc>
+        <w:tc>
+          <w:tcPr>
+            <w:tcW w:w="2625" w:type="pct"/>
+            <w:shd w:val="clear" w:color="auto" w:fill="E7E6E6" w:themeFill="background2"/>
+          </w:tcPr>
+          <w:p>
+            <w:r>
+              <w:t xml:space="preserve">Mathematics for Computer Science  </w:t>
+            </w:r>
+          </w:p>
+        </w:tc>
+        <w:tc>
+          <w:tcPr>
+            <w:tcW w:w="720" w:type="pct"/>
+            <w:shd w:val="clear" w:color="auto" w:fill="E7E6E6" w:themeFill="background2"/>
+          </w:tcPr>
+          <w:p>
+            <w:r>
+              <w:t>T-H3 + S-H2</w:t>
+            </w:r>
+          </w:p>
+        </w:tc>
+        <w:tc>
+          <w:tcPr>
+            <w:tcW w:w="502" w:type="pct"/>
+            <w:shd w:val="clear" w:color="auto" w:fill="E7E6E6" w:themeFill="background2"/>
+          </w:tcPr>
+          <w:p/>
+        </w:tc>
+        <w:tc>
+          <w:tcPr>
+            <w:tcW w:w="401" w:type="pct"/>
+            <w:shd w:val="clear" w:color="auto" w:fill="E7E6E6" w:themeFill="background2"/>
+          </w:tcPr>
+          <w:p/>
+        </w:tc>
+        <w:tc>
+          <w:tcPr>
+            <w:tcW w:w="502" w:type="pct"/>
+            <w:shd w:val="clear" w:color="auto" w:fill="E7E6E6" w:themeFill="background2"/>
+          </w:tcPr>
+          <w:p/>
+        </w:tc>
+      </w:tr>
+      <w:tr>
+        <w:trPr>
+          <w:trHeight w:val="288"/>
+        </w:trPr>
+        <w:tc>
+          <w:tcPr>
+            <w:tcW w:w="250" w:type="pct"/>
+            <w:shd w:val="clear" w:color="auto" w:fill="002060"/>
+          </w:tcPr>
+          <w:p>
+            <w:pPr>
+              <w:rPr>
+                <w:b/>
+                <w:bCs/>
+              </w:rPr>
+            </w:pPr>
+          </w:p>
+        </w:tc>
+        <w:tc>
+          <w:tcPr>
+            <w:tcW w:w="2625" w:type="pct"/>
+            <w:shd w:val="clear" w:color="auto" w:fill="002060"/>
+          </w:tcPr>
+          <w:p>
+            <w:pPr>
+              <w:rPr>
+                <w:b/>
+                <w:bCs/>
+              </w:rPr>
+            </w:pPr>
+            <w:r>
+              <w:rPr>
+                <w:b/>
+                <w:bCs/>
+              </w:rPr>
+              <w:t>Lab Subjects</w:t>
+            </w:r>
+          </w:p>
+        </w:tc>
+        <w:tc>
+          <w:tcPr>
+            <w:tcW w:w="720" w:type="pct"/>
+            <w:shd w:val="clear" w:color="auto" w:fill="002060"/>
+          </w:tcPr>
+          <w:p>
+            <w:pPr>
+              <w:rPr>
+                <w:b/>
+                <w:bCs/>
+              </w:rPr>
+            </w:pPr>
+          </w:p>
+        </w:tc>
+        <w:tc>
+          <w:tcPr>
+            <w:tcW w:w="502" w:type="pct"/>
+            <w:shd w:val="clear" w:color="auto" w:fill="002060"/>
+          </w:tcPr>
+          <w:p>
+            <w:pPr>
+              <w:rPr>
+                <w:b/>
+                <w:bCs/>
+              </w:rPr>
+            </w:pPr>
+          </w:p>
+        </w:tc>
+        <w:tc>
+          <w:tcPr>
+            <w:tcW w:w="401" w:type="pct"/>
+            <w:shd w:val="clear" w:color="auto" w:fill="002060"/>
+          </w:tcPr>
+          <w:p>
+            <w:pPr>
+              <w:rPr>
+                <w:b/>
+                <w:bCs/>
+              </w:rPr>
+            </w:pPr>
+          </w:p>
+        </w:tc>
+        <w:tc>
+          <w:tcPr>
+            <w:tcW w:w="502" w:type="pct"/>
+            <w:shd w:val="clear" w:color="auto" w:fill="002060"/>
+          </w:tcPr>
+          <w:p>
+            <w:pPr>
+              <w:rPr>
+                <w:b/>
+                <w:bCs/>
+              </w:rPr>
+            </w:pPr>
+          </w:p>
+        </w:tc>
+      </w:tr>
+      <w:tr>
+        <w:tc>
+          <w:tcPr>
+            <w:tcW w:w="250" w:type="pct"/>
+            <w:shd w:val="clear" w:color="auto" w:fill="E7E6E6" w:themeFill="background2"/>
+          </w:tcPr>
+          <w:p>
+            <w:pPr>
+              <w:rPr>
+                <w:b/>
+                <w:bCs/>
+                <w:color w:val="C00000"/>
+              </w:rPr>
+            </w:pPr>
+            <w:r>
+              <w:t>01</w:t>
+            </w:r>
+          </w:p>
+        </w:tc>
+        <w:tc>
+          <w:tcPr>
+            <w:tcW w:w="2625" w:type="pct"/>
+            <w:shd w:val="clear" w:color="auto" w:fill="E7E6E6" w:themeFill="background2"/>
+          </w:tcPr>
+          <w:p>
+            <w:r>
+              <w:t xml:space="preserve">Microprocessor and Microcontroller </w:t>
+            </w:r>
+          </w:p>
+        </w:tc>
+        <w:tc>
+          <w:tcPr>
+            <w:tcW w:w="720" w:type="pct"/>
+            <w:shd w:val="clear" w:color="auto" w:fill="E7E6E6" w:themeFill="background2"/>
+          </w:tcPr>
+          <w:p>
+            <w:r>
+              <w:t>T-H3</w:t>
+            </w:r>
+          </w:p>
+        </w:tc>
+        <w:tc>
+          <w:tcPr>
+            <w:tcW w:w="502" w:type="pct"/>
+            <w:shd w:val="clear" w:color="auto" w:fill="E7E6E6" w:themeFill="background2"/>
+          </w:tcPr>
+          <w:p/>
+        </w:tc>
+        <w:tc>
+          <w:tcPr>
+            <w:tcW w:w="401" w:type="pct"/>
+            <w:shd w:val="clear" w:color="auto" w:fill="E7E6E6" w:themeFill="background2"/>
+          </w:tcPr>
+          <w:p/>
+        </w:tc>
+        <w:tc>
+          <w:tcPr>
+            <w:tcW w:w="502" w:type="pct"/>
+            <w:shd w:val="clear" w:color="auto" w:fill="E7E6E6" w:themeFill="background2"/>
+          </w:tcPr>
+          <w:p/>
+        </w:tc>
+      </w:tr>
+      <w:tr>
+        <w:tc>
+          <w:tcPr>
+            <w:tcW w:w="250" w:type="pct"/>
+            <w:shd w:val="clear" w:color="auto" w:fill="E7E6E6" w:themeFill="background2"/>
+          </w:tcPr>
+          <w:p>
+            <w:r>
+              <w:t>02</w:t>
+            </w:r>
+          </w:p>
+        </w:tc>
+        <w:tc>
+          <w:tcPr>
+            <w:tcW w:w="2625" w:type="pct"/>
+            <w:shd w:val="clear" w:color="auto" w:fill="E7E6E6" w:themeFill="background2"/>
+          </w:tcPr>
+          <w:p>
+            <w:r>
+              <w:t xml:space="preserve">Digital System Design  </w:t>
+            </w:r>
+          </w:p>
+        </w:tc>
+        <w:tc>
+          <w:tcPr>
+            <w:tcW w:w="720" w:type="pct"/>
+            <w:shd w:val="clear" w:color="auto" w:fill="E7E6E6" w:themeFill="background2"/>
+          </w:tcPr>
+          <w:p>
+            <w:r>
+              <w:t>T-H3 + S-H4</w:t>
+            </w:r>
+          </w:p>
+        </w:tc>
+        <w:tc>
+          <w:tcPr>
+            <w:tcW w:w="502" w:type="pct"/>
+            <w:shd w:val="clear" w:color="auto" w:fill="E7E6E6" w:themeFill="background2"/>
+          </w:tcPr>
+          <w:p/>
+        </w:tc>
+        <w:tc>
+          <w:tcPr>
+            <w:tcW w:w="401" w:type="pct"/>
+            <w:shd w:val="clear" w:color="auto" w:fill="E7E6E6" w:themeFill="background2"/>
+          </w:tcPr>
+          <w:p/>
+        </w:tc>
+        <w:tc>
+          <w:tcPr>
+            <w:tcW w:w="502" w:type="pct"/>
+            <w:shd w:val="clear" w:color="auto" w:fill="E7E6E6" w:themeFill="background2"/>
+          </w:tcPr>
+          <w:p/>
+        </w:tc>
+      </w:tr>
+      <w:tr>
+        <w:tc>
+          <w:tcPr>
+            <w:tcW w:w="250" w:type="pct"/>
+            <w:shd w:val="clear" w:color="auto" w:fill="E7E6E6" w:themeFill="background2"/>
+          </w:tcPr>
+          <w:p>
+            <w:r>
+              <w:t>03</w:t>
+            </w:r>
+          </w:p>
+        </w:tc>
+        <w:tc>
+          <w:tcPr>
+            <w:tcW w:w="2625" w:type="pct"/>
+            <w:shd w:val="clear" w:color="auto" w:fill="E7E6E6" w:themeFill="background2"/>
+          </w:tcPr>
+          <w:p>
+            <w:r>
+              <w:t xml:space="preserve">VLSI Design </w:t>
+            </w:r>
+          </w:p>
+        </w:tc>
+        <w:tc>
+          <w:tcPr>
+            <w:tcW w:w="720" w:type="pct"/>
+            <w:shd w:val="clear" w:color="auto" w:fill="E7E6E6" w:themeFill="background2"/>
+          </w:tcPr>
+          <w:p>
+            <w:r>
+              <w:t>T-H3 + S-H4</w:t>
+            </w:r>
+          </w:p>
+        </w:tc>
+        <w:tc>
+          <w:tcPr>
+            <w:tcW w:w="502" w:type="pct"/>
+            <w:shd w:val="clear" w:color="auto" w:fill="E7E6E6" w:themeFill="background2"/>
+          </w:tcPr>
+          <w:p/>
+        </w:tc>
+        <w:tc>
+          <w:tcPr>
+            <w:tcW w:w="401" w:type="pct"/>
+            <w:shd w:val="clear" w:color="auto" w:fill="E7E6E6" w:themeFill="background2"/>
+          </w:tcPr>
+          <w:p/>
+        </w:tc>
+        <w:tc>
+          <w:tcPr>
+            <w:tcW w:w="502" w:type="pct"/>
+            <w:shd w:val="clear" w:color="auto" w:fill="E7E6E6" w:themeFill="background2"/>
+          </w:tcPr>
+          <w:p/>
+        </w:tc>
+      </w:tr>
+      <w:tr>
+        <w:tc>
+          <w:tcPr>
+            <w:tcW w:w="250" w:type="pct"/>
+            <w:shd w:val="clear" w:color="auto" w:fill="AEAAAA" w:themeFill="background2" w:themeFillShade="BF"/>
+          </w:tcPr>
+          <w:p>
+            <w:pPr>
+              <w:rPr>
+                <w:b/>
+                <w:bCs/>
+              </w:rPr>
+            </w:pPr>
+          </w:p>
+        </w:tc>
+        <w:tc>
+          <w:tcPr>
+            <w:tcW w:w="2625" w:type="pct"/>
+            <w:shd w:val="clear" w:color="auto" w:fill="AEAAAA" w:themeFill="background2" w:themeFillShade="BF"/>
+          </w:tcPr>
+          <w:p>
+            <w:pPr>
+              <w:rPr>
+                <w:b/>
+                <w:bCs/>
+              </w:rPr>
+            </w:pPr>
+            <w:r>
+              <w:rPr>
+                <w:b/>
+                <w:bCs/>
+              </w:rPr>
+              <w:t>Elective Subjects</w:t>
+            </w:r>
+          </w:p>
+        </w:tc>
+        <w:tc>
+          <w:tcPr>
+            <w:tcW w:w="720" w:type="pct"/>
+            <w:shd w:val="clear" w:color="auto" w:fill="AEAAAA" w:themeFill="background2" w:themeFillShade="BF"/>
+          </w:tcPr>
+          <w:p>
+            <w:pPr>
+              <w:rPr>
+                <w:b/>
+                <w:bCs/>
+              </w:rPr>
+            </w:pPr>
+          </w:p>
+        </w:tc>
+        <w:tc>
+          <w:tcPr>
+            <w:tcW w:w="502" w:type="pct"/>
+            <w:shd w:val="clear" w:color="auto" w:fill="AEAAAA" w:themeFill="background2" w:themeFillShade="BF"/>
+          </w:tcPr>
+          <w:p>
+            <w:pPr>
+              <w:rPr>
+                <w:b/>
+                <w:bCs/>
+              </w:rPr>
+            </w:pPr>
+          </w:p>
+        </w:tc>
+        <w:tc>
+          <w:tcPr>
+            <w:tcW w:w="401" w:type="pct"/>
+            <w:shd w:val="clear" w:color="auto" w:fill="AEAAAA" w:themeFill="background2" w:themeFillShade="BF"/>
+          </w:tcPr>
+          <w:p>
+            <w:pPr>
+              <w:rPr>
+                <w:b/>
+                <w:bCs/>
+              </w:rPr>
+            </w:pPr>
+          </w:p>
+        </w:tc>
+        <w:tc>
+          <w:tcPr>
+            <w:tcW w:w="502" w:type="pct"/>
+            <w:shd w:val="clear" w:color="auto" w:fill="AEAAAA" w:themeFill="background2" w:themeFillShade="BF"/>
+          </w:tcPr>
+          <w:p>
+            <w:pPr>
+              <w:rPr>
+                <w:b/>
+                <w:bCs/>
+              </w:rPr>
+            </w:pPr>
+          </w:p>
+        </w:tc>
+      </w:tr>
+    </w:tbl>
+    <w:p>
+      <w:pPr>
+        <w:spacing w:after="0"/>
+      </w:pPr>
+    </w:p>
+    <w:p>
+      <w:pPr>
+        <w:spacing w:after="0"/>
+      </w:pPr>
+    </w:p>
+    <w:p>
+      <w:pPr>
+        <w:spacing w:after="0"/>
+      </w:pPr>
+    </w:p>
+    <w:p>
+      <w:pPr>
+        <w:pStyle w:val="Heading2"/>
+        <w:rPr>
+          <w:b/>
+          <w:bCs/>
+          <w:color w:val="C00000"/>
+        </w:rPr>
+      </w:pPr>
+      <w:r>
+        <w:rPr>
+          <w:b/>
+          <w:bCs/>
+          <w:color w:val="C00000"/>
+        </w:rPr>
+        <w:t>Year-0</w:t>
+      </w:r>
+      <w:r>
+        <w:rPr>
+          <w:b/>
+          <w:bCs/>
+          <w:color w:val="C00000"/>
+        </w:rPr>
+        <w:t>5</w:t>
+      </w:r>
+      <w:r>
+        <w:rPr>
+          <w:b/>
+          <w:bCs/>
+          <w:color w:val="C00000"/>
+        </w:rPr>
+        <w:t>.</w:t>
+      </w:r>
+      <w:r>
+        <w:rPr>
+          <w:b/>
+          <w:bCs/>
+          <w:color w:val="C00000"/>
+        </w:rPr>
+        <w:t>2</w:t>
+      </w:r>
+      <w:r>
+        <w:rPr>
+          <w:b/>
+          <w:bCs/>
+          <w:color w:val="C00000"/>
+        </w:rPr>
+        <w:t xml:space="preserve">: </w:t>
+      </w:r>
+      <w:r>
+        <w:rPr>
+          <w:b/>
+          <w:bCs/>
+          <w:color w:val="C00000"/>
+        </w:rPr>
+        <w:t xml:space="preserve">Electronics and Robotics </w:t>
+      </w:r>
+    </w:p>
+    <w:p/>
+    <w:tbl>
+      <w:tblPr>
+        <w:tblStyle w:val="TableGrid"/>
+        <w:tblW w:w="5000" w:type="pct"/>
+        <w:shd w:val="clear" w:color="auto" w:fill="E7E6E6" w:themeFill="background2"/>
+        <w:tblLook w:val="04A0" w:firstRow="1" w:lastRow="0" w:firstColumn="1" w:lastColumn="0" w:noHBand="0" w:noVBand="1"/>
+      </w:tblPr>
+      <w:tblGrid>
+        <w:gridCol w:w="769"/>
+        <w:gridCol w:w="8079"/>
+        <w:gridCol w:w="2216"/>
+        <w:gridCol w:w="1545"/>
+        <w:gridCol w:w="1234"/>
+        <w:gridCol w:w="1545"/>
+      </w:tblGrid>
+      <w:tr>
+        <w:trPr>
+          <w:trHeight w:val="547"/>
+        </w:trPr>
+        <w:tc>
+          <w:tcPr>
+            <w:tcW w:w="250" w:type="pct"/>
+            <w:shd w:val="clear" w:color="auto" w:fill="002060"/>
+            <w:vAlign w:val="center"/>
+          </w:tcPr>
+          <w:p>
+            <w:pPr>
+              <w:rPr>
+                <w:b/>
+                <w:bCs/>
+              </w:rPr>
+            </w:pPr>
+          </w:p>
+        </w:tc>
+        <w:tc>
+          <w:tcPr>
+            <w:tcW w:w="3345" w:type="pct"/>
+            <w:gridSpan w:val="2"/>
+            <w:shd w:val="clear" w:color="auto" w:fill="002060"/>
+            <w:vAlign w:val="center"/>
+          </w:tcPr>
+          <w:p>
+            <w:pPr>
+              <w:rPr>
+                <w:b/>
+                <w:bCs/>
+              </w:rPr>
+            </w:pPr>
+            <w:r>
+              <w:rPr>
+                <w:b/>
+                <w:bCs/>
+              </w:rPr>
+              <w:t>Course-</w:t>
+            </w:r>
+            <w:r>
+              <w:rPr>
+                <w:b/>
+                <w:bCs/>
+              </w:rPr>
+              <w:t>10</w:t>
+            </w:r>
+            <w:r>
+              <w:rPr>
+                <w:b/>
+                <w:bCs/>
+              </w:rPr>
+              <w:t xml:space="preserve">: </w:t>
+            </w:r>
+            <w:r>
+              <w:rPr>
+                <w:b/>
+                <w:bCs/>
+              </w:rPr>
+              <w:t>Mechanical and Robotics</w:t>
+            </w:r>
+            <w:r>
+              <w:rPr>
+                <w:b/>
+                <w:bCs/>
+              </w:rPr>
+              <w:t xml:space="preserve"> </w:t>
+            </w:r>
+          </w:p>
+        </w:tc>
+        <w:tc>
+          <w:tcPr>
+            <w:tcW w:w="1405" w:type="pct"/>
+            <w:gridSpan w:val="3"/>
+            <w:shd w:val="clear" w:color="auto" w:fill="002060"/>
+            <w:vAlign w:val="center"/>
+          </w:tcPr>
+          <w:p>
+            <w:pPr>
+              <w:rPr>
+                <w:b/>
+                <w:bCs/>
+              </w:rPr>
+            </w:pPr>
+            <w:r>
+              <w:rPr>
+                <w:b/>
+                <w:bCs/>
+              </w:rPr>
+              <w:t xml:space="preserve">Duration: (4 + 2) Months </w:t>
+            </w:r>
+          </w:p>
+        </w:tc>
+      </w:tr>
+      <w:tr>
+        <w:tc>
+          <w:tcPr>
+            <w:tcW w:w="250" w:type="pct"/>
+            <w:shd w:val="clear" w:color="auto" w:fill="E7E6E6" w:themeFill="background2"/>
+          </w:tcPr>
+          <w:p>
+            <w:r>
+              <w:t>01</w:t>
+            </w:r>
+          </w:p>
+        </w:tc>
+        <w:tc>
+          <w:tcPr>
+            <w:tcW w:w="2625" w:type="pct"/>
+            <w:shd w:val="clear" w:color="auto" w:fill="E7E6E6" w:themeFill="background2"/>
+          </w:tcPr>
+          <w:p>
+            <w:r>
+              <w:t>Physics – 1 (Mechanics)</w:t>
+            </w:r>
+          </w:p>
+        </w:tc>
+        <w:tc>
+          <w:tcPr>
+            <w:tcW w:w="720" w:type="pct"/>
+            <w:shd w:val="clear" w:color="auto" w:fill="E7E6E6" w:themeFill="background2"/>
+          </w:tcPr>
+          <w:p>
+            <w:r>
+              <w:t>T-H3 + S-H4</w:t>
+            </w:r>
+          </w:p>
+        </w:tc>
+        <w:tc>
+          <w:tcPr>
+            <w:tcW w:w="502" w:type="pct"/>
+            <w:shd w:val="clear" w:color="auto" w:fill="E7E6E6" w:themeFill="background2"/>
+          </w:tcPr>
+          <w:p/>
+        </w:tc>
+        <w:tc>
+          <w:tcPr>
+            <w:tcW w:w="401" w:type="pct"/>
+            <w:shd w:val="clear" w:color="auto" w:fill="E7E6E6" w:themeFill="background2"/>
+          </w:tcPr>
+          <w:p/>
+        </w:tc>
+        <w:tc>
+          <w:tcPr>
+            <w:tcW w:w="502" w:type="pct"/>
+            <w:shd w:val="clear" w:color="auto" w:fill="E7E6E6" w:themeFill="background2"/>
+          </w:tcPr>
+          <w:p/>
+        </w:tc>
+      </w:tr>
+      <w:tr>
+        <w:tc>
+          <w:tcPr>
+            <w:tcW w:w="250" w:type="pct"/>
+            <w:shd w:val="clear" w:color="auto" w:fill="E7E6E6" w:themeFill="background2"/>
+          </w:tcPr>
+          <w:p>
+            <w:r>
+              <w:t>02</w:t>
+            </w:r>
+          </w:p>
+        </w:tc>
+        <w:tc>
+          <w:tcPr>
+            <w:tcW w:w="2625" w:type="pct"/>
+            <w:shd w:val="clear" w:color="auto" w:fill="E7E6E6" w:themeFill="background2"/>
+          </w:tcPr>
+          <w:p>
+            <w:r>
+              <w:t xml:space="preserve">Physics – </w:t>
+            </w:r>
+            <w:proofErr w:type="gramStart"/>
+            <w:r>
+              <w:t xml:space="preserve">2 </w:t>
+            </w:r>
+            <w:r>
+              <w:t xml:space="preserve"> </w:t>
+            </w:r>
+            <w:r>
+              <w:t>(</w:t>
+            </w:r>
+            <w:proofErr w:type="gramEnd"/>
+            <w:r>
+              <w:t>Thermal)</w:t>
+            </w:r>
+          </w:p>
+        </w:tc>
+        <w:tc>
+          <w:tcPr>
+            <w:tcW w:w="720" w:type="pct"/>
+            <w:shd w:val="clear" w:color="auto" w:fill="E7E6E6" w:themeFill="background2"/>
+          </w:tcPr>
+          <w:p>
+            <w:r>
+              <w:t>T-H3</w:t>
+            </w:r>
+          </w:p>
+        </w:tc>
+        <w:tc>
+          <w:tcPr>
+            <w:tcW w:w="502" w:type="pct"/>
+            <w:shd w:val="clear" w:color="auto" w:fill="E7E6E6" w:themeFill="background2"/>
+          </w:tcPr>
+          <w:p/>
+        </w:tc>
+        <w:tc>
+          <w:tcPr>
+            <w:tcW w:w="401" w:type="pct"/>
+            <w:shd w:val="clear" w:color="auto" w:fill="E7E6E6" w:themeFill="background2"/>
+          </w:tcPr>
+          <w:p/>
+        </w:tc>
+        <w:tc>
+          <w:tcPr>
+            <w:tcW w:w="502" w:type="pct"/>
+            <w:shd w:val="clear" w:color="auto" w:fill="E7E6E6" w:themeFill="background2"/>
+          </w:tcPr>
+          <w:p/>
+        </w:tc>
+      </w:tr>
+      <w:tr>
+        <w:tc>
+          <w:tcPr>
+            <w:tcW w:w="250" w:type="pct"/>
+            <w:shd w:val="clear" w:color="auto" w:fill="E7E6E6" w:themeFill="background2"/>
+          </w:tcPr>
+          <w:p>
+            <w:r>
+              <w:t>03</w:t>
+            </w:r>
+          </w:p>
+        </w:tc>
+        <w:tc>
+          <w:tcPr>
+            <w:tcW w:w="2625" w:type="pct"/>
+            <w:shd w:val="clear" w:color="auto" w:fill="E7E6E6" w:themeFill="background2"/>
+          </w:tcPr>
+          <w:p>
+            <w:r>
+              <w:t xml:space="preserve">Physics – 3 (Web and Optics) </w:t>
+            </w:r>
+            <w:r>
+              <w:t xml:space="preserve"> </w:t>
+            </w:r>
+          </w:p>
+        </w:tc>
+        <w:tc>
+          <w:tcPr>
+            <w:tcW w:w="720" w:type="pct"/>
+            <w:shd w:val="clear" w:color="auto" w:fill="E7E6E6" w:themeFill="background2"/>
+          </w:tcPr>
+          <w:p>
+            <w:r>
+              <w:t>T-H3 + S-H2</w:t>
+            </w:r>
+          </w:p>
+        </w:tc>
+        <w:tc>
+          <w:tcPr>
+            <w:tcW w:w="502" w:type="pct"/>
+            <w:shd w:val="clear" w:color="auto" w:fill="E7E6E6" w:themeFill="background2"/>
+          </w:tcPr>
+          <w:p/>
+        </w:tc>
+        <w:tc>
+          <w:tcPr>
+            <w:tcW w:w="401" w:type="pct"/>
+            <w:shd w:val="clear" w:color="auto" w:fill="E7E6E6" w:themeFill="background2"/>
+          </w:tcPr>
+          <w:p/>
+        </w:tc>
+        <w:tc>
+          <w:tcPr>
+            <w:tcW w:w="502" w:type="pct"/>
+            <w:shd w:val="clear" w:color="auto" w:fill="E7E6E6" w:themeFill="background2"/>
+          </w:tcPr>
+          <w:p/>
+        </w:tc>
+      </w:tr>
+      <w:tr>
+        <w:tc>
+          <w:tcPr>
+            <w:tcW w:w="250" w:type="pct"/>
+            <w:shd w:val="clear" w:color="auto" w:fill="FFF2CC" w:themeFill="accent4" w:themeFillTint="33"/>
+          </w:tcPr>
+          <w:p>
+            <w:pPr>
+              <w:rPr>
+                <w:b/>
+                <w:bCs/>
+              </w:rPr>
+            </w:pPr>
+          </w:p>
+        </w:tc>
+        <w:tc>
+          <w:tcPr>
+            <w:tcW w:w="2625" w:type="pct"/>
+            <w:shd w:val="clear" w:color="auto" w:fill="FFF2CC" w:themeFill="accent4" w:themeFillTint="33"/>
+          </w:tcPr>
+          <w:p>
+            <w:pPr>
+              <w:rPr>
+                <w:b/>
+                <w:bCs/>
+              </w:rPr>
+            </w:pPr>
+            <w:r>
+              <w:rPr>
+                <w:b/>
+                <w:bCs/>
+              </w:rPr>
+              <w:t xml:space="preserve">Theoretical Subjects </w:t>
+            </w:r>
+          </w:p>
+        </w:tc>
+        <w:tc>
+          <w:tcPr>
+            <w:tcW w:w="720" w:type="pct"/>
+            <w:shd w:val="clear" w:color="auto" w:fill="FFF2CC" w:themeFill="accent4" w:themeFillTint="33"/>
+          </w:tcPr>
+          <w:p>
+            <w:pPr>
+              <w:rPr>
+                <w:b/>
+                <w:bCs/>
+              </w:rPr>
+            </w:pPr>
+          </w:p>
+        </w:tc>
+        <w:tc>
+          <w:tcPr>
+            <w:tcW w:w="502" w:type="pct"/>
+            <w:shd w:val="clear" w:color="auto" w:fill="FFF2CC" w:themeFill="accent4" w:themeFillTint="33"/>
+          </w:tcPr>
+          <w:p>
+            <w:pPr>
+              <w:rPr>
+                <w:b/>
+                <w:bCs/>
+              </w:rPr>
+            </w:pPr>
+          </w:p>
+        </w:tc>
+        <w:tc>
+          <w:tcPr>
+            <w:tcW w:w="401" w:type="pct"/>
+            <w:shd w:val="clear" w:color="auto" w:fill="FFF2CC" w:themeFill="accent4" w:themeFillTint="33"/>
+          </w:tcPr>
+          <w:p>
+            <w:pPr>
+              <w:rPr>
+                <w:b/>
+                <w:bCs/>
+              </w:rPr>
+            </w:pPr>
+          </w:p>
+        </w:tc>
+        <w:tc>
+          <w:tcPr>
+            <w:tcW w:w="502" w:type="pct"/>
+            <w:shd w:val="clear" w:color="auto" w:fill="FFF2CC" w:themeFill="accent4" w:themeFillTint="33"/>
+          </w:tcPr>
+          <w:p>
+            <w:pPr>
+              <w:rPr>
+                <w:b/>
+                <w:bCs/>
+              </w:rPr>
+            </w:pPr>
+          </w:p>
+        </w:tc>
+      </w:tr>
+      <w:tr>
+        <w:tc>
+          <w:tcPr>
+            <w:tcW w:w="250" w:type="pct"/>
+            <w:shd w:val="clear" w:color="auto" w:fill="E7E6E6" w:themeFill="background2"/>
+          </w:tcPr>
+          <w:p>
+            <w:pPr>
+              <w:rPr>
+                <w:b/>
+                <w:bCs/>
+                <w:color w:val="C00000"/>
+              </w:rPr>
+            </w:pPr>
+            <w:r>
+              <w:rPr>
+                <w:b/>
+                <w:bCs/>
+                <w:color w:val="C00000"/>
+              </w:rPr>
+              <w:t>0</w:t>
+            </w:r>
+            <w:r>
+              <w:rPr>
+                <w:b/>
+                <w:bCs/>
+                <w:color w:val="C00000"/>
+              </w:rPr>
+              <w:t>4</w:t>
+            </w:r>
+          </w:p>
+        </w:tc>
+        <w:tc>
+          <w:tcPr>
+            <w:tcW w:w="2625" w:type="pct"/>
+            <w:shd w:val="clear" w:color="auto" w:fill="E7E6E6" w:themeFill="background2"/>
+          </w:tcPr>
+          <w:p>
+            <w:r>
+              <w:t xml:space="preserve">Simulation and Modeling   </w:t>
+            </w:r>
+          </w:p>
+        </w:tc>
+        <w:tc>
+          <w:tcPr>
+            <w:tcW w:w="720" w:type="pct"/>
+            <w:shd w:val="clear" w:color="auto" w:fill="E7E6E6" w:themeFill="background2"/>
+          </w:tcPr>
+          <w:p>
+            <w:r>
+              <w:t>T-H3 + S-H4</w:t>
+            </w:r>
+          </w:p>
+        </w:tc>
+        <w:tc>
+          <w:tcPr>
+            <w:tcW w:w="502" w:type="pct"/>
+            <w:shd w:val="clear" w:color="auto" w:fill="E7E6E6" w:themeFill="background2"/>
+          </w:tcPr>
+          <w:p/>
+        </w:tc>
+        <w:tc>
+          <w:tcPr>
+            <w:tcW w:w="401" w:type="pct"/>
+            <w:shd w:val="clear" w:color="auto" w:fill="E7E6E6" w:themeFill="background2"/>
+          </w:tcPr>
+          <w:p/>
+        </w:tc>
+        <w:tc>
+          <w:tcPr>
+            <w:tcW w:w="502" w:type="pct"/>
+            <w:shd w:val="clear" w:color="auto" w:fill="E7E6E6" w:themeFill="background2"/>
+          </w:tcPr>
+          <w:p/>
+        </w:tc>
+      </w:tr>
+      <w:tr>
+        <w:tc>
+          <w:tcPr>
+            <w:tcW w:w="250" w:type="pct"/>
+            <w:shd w:val="clear" w:color="auto" w:fill="E7E6E6" w:themeFill="background2"/>
+          </w:tcPr>
+          <w:p>
+            <w:r>
+              <w:rPr>
+                <w:b/>
+                <w:bCs/>
+                <w:color w:val="C00000"/>
+              </w:rPr>
+              <w:t>0</w:t>
+            </w:r>
+            <w:r>
+              <w:rPr>
+                <w:b/>
+                <w:bCs/>
+                <w:color w:val="C00000"/>
+              </w:rPr>
+              <w:t>5</w:t>
+            </w:r>
+          </w:p>
+        </w:tc>
+        <w:tc>
+          <w:tcPr>
+            <w:tcW w:w="2625" w:type="pct"/>
+            <w:shd w:val="clear" w:color="auto" w:fill="E7E6E6" w:themeFill="background2"/>
+          </w:tcPr>
+          <w:p>
+            <w:r>
+              <w:t>Chemistry</w:t>
+            </w:r>
+          </w:p>
+        </w:tc>
+        <w:tc>
+          <w:tcPr>
+            <w:tcW w:w="720" w:type="pct"/>
+            <w:shd w:val="clear" w:color="auto" w:fill="E7E6E6" w:themeFill="background2"/>
+          </w:tcPr>
+          <w:p>
+            <w:r>
+              <w:t>T-H3 + S-H2</w:t>
+            </w:r>
+          </w:p>
+        </w:tc>
+        <w:tc>
+          <w:tcPr>
+            <w:tcW w:w="502" w:type="pct"/>
+            <w:shd w:val="clear" w:color="auto" w:fill="E7E6E6" w:themeFill="background2"/>
+          </w:tcPr>
+          <w:p/>
+        </w:tc>
+        <w:tc>
+          <w:tcPr>
+            <w:tcW w:w="401" w:type="pct"/>
+            <w:shd w:val="clear" w:color="auto" w:fill="E7E6E6" w:themeFill="background2"/>
+          </w:tcPr>
+          <w:p/>
+        </w:tc>
+        <w:tc>
+          <w:tcPr>
+            <w:tcW w:w="502" w:type="pct"/>
+            <w:shd w:val="clear" w:color="auto" w:fill="E7E6E6" w:themeFill="background2"/>
+          </w:tcPr>
+          <w:p/>
+        </w:tc>
+      </w:tr>
+      <w:tr>
+        <w:trPr>
+          <w:trHeight w:val="288"/>
+        </w:trPr>
+        <w:tc>
+          <w:tcPr>
+            <w:tcW w:w="250" w:type="pct"/>
+            <w:shd w:val="clear" w:color="auto" w:fill="002060"/>
+          </w:tcPr>
+          <w:p>
+            <w:pPr>
+              <w:rPr>
+                <w:b/>
+                <w:bCs/>
+              </w:rPr>
+            </w:pPr>
+          </w:p>
+        </w:tc>
+        <w:tc>
+          <w:tcPr>
+            <w:tcW w:w="2625" w:type="pct"/>
+            <w:shd w:val="clear" w:color="auto" w:fill="002060"/>
+          </w:tcPr>
+          <w:p>
+            <w:pPr>
+              <w:rPr>
+                <w:b/>
+                <w:bCs/>
+              </w:rPr>
+            </w:pPr>
+            <w:r>
+              <w:rPr>
+                <w:b/>
+                <w:bCs/>
+              </w:rPr>
+              <w:t>Lab Subjects</w:t>
+            </w:r>
+          </w:p>
+        </w:tc>
+        <w:tc>
+          <w:tcPr>
+            <w:tcW w:w="720" w:type="pct"/>
+            <w:shd w:val="clear" w:color="auto" w:fill="002060"/>
+          </w:tcPr>
+          <w:p>
+            <w:pPr>
+              <w:rPr>
+                <w:b/>
+                <w:bCs/>
+              </w:rPr>
+            </w:pPr>
+          </w:p>
+        </w:tc>
+        <w:tc>
+          <w:tcPr>
+            <w:tcW w:w="502" w:type="pct"/>
+            <w:shd w:val="clear" w:color="auto" w:fill="002060"/>
+          </w:tcPr>
+          <w:p>
+            <w:pPr>
+              <w:rPr>
+                <w:b/>
+                <w:bCs/>
+              </w:rPr>
+            </w:pPr>
+          </w:p>
+        </w:tc>
+        <w:tc>
+          <w:tcPr>
+            <w:tcW w:w="401" w:type="pct"/>
+            <w:shd w:val="clear" w:color="auto" w:fill="002060"/>
+          </w:tcPr>
+          <w:p>
+            <w:pPr>
+              <w:rPr>
+                <w:b/>
+                <w:bCs/>
+              </w:rPr>
+            </w:pPr>
+          </w:p>
+        </w:tc>
+        <w:tc>
+          <w:tcPr>
+            <w:tcW w:w="502" w:type="pct"/>
+            <w:shd w:val="clear" w:color="auto" w:fill="002060"/>
+          </w:tcPr>
+          <w:p>
+            <w:pPr>
+              <w:rPr>
+                <w:b/>
+                <w:bCs/>
+              </w:rPr>
+            </w:pPr>
+          </w:p>
+        </w:tc>
+      </w:tr>
+      <w:tr>
+        <w:tc>
+          <w:tcPr>
+            <w:tcW w:w="250" w:type="pct"/>
+            <w:shd w:val="clear" w:color="auto" w:fill="E7E6E6" w:themeFill="background2"/>
+          </w:tcPr>
+          <w:p>
+            <w:pPr>
+              <w:rPr>
+                <w:b/>
+                <w:bCs/>
+                <w:color w:val="C00000"/>
+              </w:rPr>
+            </w:pPr>
+            <w:r>
+              <w:t>01</w:t>
+            </w:r>
+          </w:p>
+        </w:tc>
+        <w:tc>
+          <w:tcPr>
+            <w:tcW w:w="2625" w:type="pct"/>
+            <w:shd w:val="clear" w:color="auto" w:fill="E7E6E6" w:themeFill="background2"/>
+          </w:tcPr>
+          <w:p>
+            <w:r>
+              <w:t xml:space="preserve">Fundamental of Mechanical Engineering </w:t>
+            </w:r>
+          </w:p>
+        </w:tc>
+        <w:tc>
+          <w:tcPr>
+            <w:tcW w:w="720" w:type="pct"/>
+            <w:shd w:val="clear" w:color="auto" w:fill="E7E6E6" w:themeFill="background2"/>
+          </w:tcPr>
+          <w:p>
+            <w:r>
+              <w:t>T-H3</w:t>
+            </w:r>
+          </w:p>
+        </w:tc>
+        <w:tc>
+          <w:tcPr>
+            <w:tcW w:w="502" w:type="pct"/>
+            <w:shd w:val="clear" w:color="auto" w:fill="E7E6E6" w:themeFill="background2"/>
+          </w:tcPr>
+          <w:p/>
+        </w:tc>
+        <w:tc>
+          <w:tcPr>
+            <w:tcW w:w="401" w:type="pct"/>
+            <w:shd w:val="clear" w:color="auto" w:fill="E7E6E6" w:themeFill="background2"/>
+          </w:tcPr>
+          <w:p/>
+        </w:tc>
+        <w:tc>
+          <w:tcPr>
+            <w:tcW w:w="502" w:type="pct"/>
+            <w:shd w:val="clear" w:color="auto" w:fill="E7E6E6" w:themeFill="background2"/>
+          </w:tcPr>
+          <w:p/>
+        </w:tc>
+      </w:tr>
+      <w:tr>
+        <w:tc>
+          <w:tcPr>
+            <w:tcW w:w="250" w:type="pct"/>
+            <w:shd w:val="clear" w:color="auto" w:fill="E7E6E6" w:themeFill="background2"/>
+          </w:tcPr>
+          <w:p>
+            <w:r>
+              <w:t>02</w:t>
+            </w:r>
+          </w:p>
+        </w:tc>
+        <w:tc>
+          <w:tcPr>
+            <w:tcW w:w="2625" w:type="pct"/>
+            <w:shd w:val="clear" w:color="auto" w:fill="E7E6E6" w:themeFill="background2"/>
+          </w:tcPr>
+          <w:p>
+            <w:r>
+              <w:t xml:space="preserve">Robotics </w:t>
+            </w:r>
+          </w:p>
+        </w:tc>
+        <w:tc>
+          <w:tcPr>
+            <w:tcW w:w="720" w:type="pct"/>
+            <w:shd w:val="clear" w:color="auto" w:fill="E7E6E6" w:themeFill="background2"/>
+          </w:tcPr>
+          <w:p>
+            <w:r>
+              <w:t>T-H3 + S-H4</w:t>
+            </w:r>
+          </w:p>
+        </w:tc>
+        <w:tc>
+          <w:tcPr>
+            <w:tcW w:w="502" w:type="pct"/>
+            <w:shd w:val="clear" w:color="auto" w:fill="E7E6E6" w:themeFill="background2"/>
+          </w:tcPr>
+          <w:p/>
+        </w:tc>
+        <w:tc>
+          <w:tcPr>
+            <w:tcW w:w="401" w:type="pct"/>
+            <w:shd w:val="clear" w:color="auto" w:fill="E7E6E6" w:themeFill="background2"/>
+          </w:tcPr>
+          <w:p/>
+        </w:tc>
+        <w:tc>
+          <w:tcPr>
+            <w:tcW w:w="502" w:type="pct"/>
+            <w:shd w:val="clear" w:color="auto" w:fill="E7E6E6" w:themeFill="background2"/>
+          </w:tcPr>
+          <w:p/>
+        </w:tc>
+      </w:tr>
+      <w:tr>
+        <w:tc>
+          <w:tcPr>
+            <w:tcW w:w="250" w:type="pct"/>
+            <w:shd w:val="clear" w:color="auto" w:fill="E7E6E6" w:themeFill="background2"/>
+          </w:tcPr>
+          <w:p>
+            <w:r>
+              <w:t>03</w:t>
+            </w:r>
+          </w:p>
+        </w:tc>
+        <w:tc>
+          <w:tcPr>
+            <w:tcW w:w="2625" w:type="pct"/>
+            <w:shd w:val="clear" w:color="auto" w:fill="E7E6E6" w:themeFill="background2"/>
+          </w:tcPr>
+          <w:p>
+            <w:r>
+              <w:t xml:space="preserve">Computer Vision </w:t>
+            </w:r>
+          </w:p>
+        </w:tc>
+        <w:tc>
+          <w:tcPr>
+            <w:tcW w:w="720" w:type="pct"/>
+            <w:shd w:val="clear" w:color="auto" w:fill="E7E6E6" w:themeFill="background2"/>
+          </w:tcPr>
+          <w:p>
+            <w:r>
+              <w:t>T-H3 + S-H4</w:t>
+            </w:r>
+          </w:p>
+        </w:tc>
+        <w:tc>
+          <w:tcPr>
+            <w:tcW w:w="502" w:type="pct"/>
+            <w:shd w:val="clear" w:color="auto" w:fill="E7E6E6" w:themeFill="background2"/>
+          </w:tcPr>
+          <w:p/>
+        </w:tc>
+        <w:tc>
+          <w:tcPr>
+            <w:tcW w:w="401" w:type="pct"/>
+            <w:shd w:val="clear" w:color="auto" w:fill="E7E6E6" w:themeFill="background2"/>
+          </w:tcPr>
+          <w:p/>
+        </w:tc>
+        <w:tc>
+          <w:tcPr>
+            <w:tcW w:w="502" w:type="pct"/>
+            <w:shd w:val="clear" w:color="auto" w:fill="E7E6E6" w:themeFill="background2"/>
+          </w:tcPr>
+          <w:p/>
+        </w:tc>
+      </w:tr>
+      <w:tr>
+        <w:tc>
+          <w:tcPr>
+            <w:tcW w:w="250" w:type="pct"/>
+            <w:shd w:val="clear" w:color="auto" w:fill="AEAAAA" w:themeFill="background2" w:themeFillShade="BF"/>
+          </w:tcPr>
+          <w:p>
+            <w:pPr>
+              <w:rPr>
+                <w:b/>
+                <w:bCs/>
+              </w:rPr>
+            </w:pPr>
+          </w:p>
+        </w:tc>
+        <w:tc>
+          <w:tcPr>
+            <w:tcW w:w="2625" w:type="pct"/>
+            <w:shd w:val="clear" w:color="auto" w:fill="AEAAAA" w:themeFill="background2" w:themeFillShade="BF"/>
+          </w:tcPr>
+          <w:p>
+            <w:pPr>
+              <w:rPr>
+                <w:b/>
+                <w:bCs/>
+              </w:rPr>
+            </w:pPr>
+            <w:r>
+              <w:rPr>
+                <w:b/>
+                <w:bCs/>
+              </w:rPr>
+              <w:t>Elective Subjects</w:t>
+            </w:r>
+          </w:p>
+        </w:tc>
+        <w:tc>
+          <w:tcPr>
+            <w:tcW w:w="720" w:type="pct"/>
+            <w:shd w:val="clear" w:color="auto" w:fill="AEAAAA" w:themeFill="background2" w:themeFillShade="BF"/>
+          </w:tcPr>
+          <w:p>
+            <w:pPr>
+              <w:rPr>
+                <w:b/>
+                <w:bCs/>
+              </w:rPr>
+            </w:pPr>
+          </w:p>
+        </w:tc>
+        <w:tc>
+          <w:tcPr>
+            <w:tcW w:w="502" w:type="pct"/>
+            <w:shd w:val="clear" w:color="auto" w:fill="AEAAAA" w:themeFill="background2" w:themeFillShade="BF"/>
+          </w:tcPr>
+          <w:p>
+            <w:pPr>
+              <w:rPr>
+                <w:b/>
+                <w:bCs/>
+              </w:rPr>
+            </w:pPr>
+          </w:p>
+        </w:tc>
+        <w:tc>
+          <w:tcPr>
+            <w:tcW w:w="401" w:type="pct"/>
+            <w:shd w:val="clear" w:color="auto" w:fill="AEAAAA" w:themeFill="background2" w:themeFillShade="BF"/>
+          </w:tcPr>
+          <w:p>
+            <w:pPr>
+              <w:rPr>
+                <w:b/>
+                <w:bCs/>
+              </w:rPr>
+            </w:pPr>
+          </w:p>
+        </w:tc>
+        <w:tc>
+          <w:tcPr>
+            <w:tcW w:w="502" w:type="pct"/>
+            <w:shd w:val="clear" w:color="auto" w:fill="AEAAAA" w:themeFill="background2" w:themeFillShade="BF"/>
+          </w:tcPr>
+          <w:p>
+            <w:pPr>
+              <w:rPr>
+                <w:b/>
+                <w:bCs/>
+              </w:rPr>
+            </w:pPr>
+          </w:p>
+        </w:tc>
+      </w:tr>
+    </w:tbl>
+    <w:p>
+      <w:pPr>
+        <w:spacing w:after="0"/>
+      </w:pPr>
+    </w:p>
+    <w:p>
+      <w:pPr>
+        <w:spacing w:after="0"/>
+      </w:pPr>
+    </w:p>
     <w:p>
       <w:pPr>
         <w:spacing w:after="0"/>
@@ -12599,7 +14824,15 @@
           </w:tcPr>
           <w:p>
             <w:r>
-              <w:t>API, Authentication (JWT|QAuth) and Advanced JavaScript</w:t>
+              <w:t>API, Authentication (</w:t>
+            </w:r>
+            <w:proofErr w:type="spellStart"/>
+            <w:r>
+              <w:t>JWT|QAuth</w:t>
+            </w:r>
+            <w:proofErr w:type="spellEnd"/>
+            <w:r>
+              <w:t>) and Advanced JavaScript</w:t>
             </w:r>
           </w:p>
         </w:tc>
@@ -12910,7 +15143,23 @@
           </w:tcPr>
           <w:p>
             <w:r>
-              <w:t xml:space="preserve">Test Framework (Cypress|Appium), Perofrmance Testing </w:t>
+              <w:t>Test Framework (</w:t>
+            </w:r>
+            <w:proofErr w:type="spellStart"/>
+            <w:r>
+              <w:t>Cypress|Appium</w:t>
+            </w:r>
+            <w:proofErr w:type="spellEnd"/>
+            <w:r>
+              <w:t xml:space="preserve">), </w:t>
+            </w:r>
+            <w:proofErr w:type="spellStart"/>
+            <w:r>
+              <w:t>Perofrmance</w:t>
+            </w:r>
+            <w:proofErr w:type="spellEnd"/>
+            <w:r>
+              <w:t xml:space="preserve"> Testing </w:t>
             </w:r>
           </w:p>
         </w:tc>
@@ -14759,8 +17008,13 @@
               </w:numPr>
               <w:ind w:left="211" w:hanging="240"/>
             </w:pPr>
-            <w:r>
-              <w:t xml:space="preserve">FreeCodeCamp Web Dev Guide </w:t>
+            <w:proofErr w:type="spellStart"/>
+            <w:r>
+              <w:t>FreeCodeCamp</w:t>
+            </w:r>
+            <w:proofErr w:type="spellEnd"/>
+            <w:r>
+              <w:t xml:space="preserve"> Web Dev Guide </w:t>
             </w:r>
           </w:p>
         </w:tc>
@@ -14982,7 +17236,15 @@
               <w:ind w:left="211" w:hanging="240"/>
             </w:pPr>
             <w:r>
-              <w:t xml:space="preserve">Frontend Mastery by Codecademy </w:t>
+              <w:t xml:space="preserve">Frontend Mastery by </w:t>
+            </w:r>
+            <w:proofErr w:type="spellStart"/>
+            <w:r>
+              <w:t>Codecademy</w:t>
+            </w:r>
+            <w:proofErr w:type="spellEnd"/>
+            <w:r>
+              <w:t xml:space="preserve"> </w:t>
             </w:r>
           </w:p>
         </w:tc>
@@ -15382,7 +17644,15 @@
               <w:ind w:left="211" w:hanging="240"/>
             </w:pPr>
             <w:r>
-              <w:t xml:space="preserve">Continuous Testing for DevOps Professionals by Katrina Clokie </w:t>
+              <w:t xml:space="preserve">Continuous Testing for DevOps Professionals by Katrina </w:t>
+            </w:r>
+            <w:proofErr w:type="spellStart"/>
+            <w:r>
+              <w:t>Clokie</w:t>
+            </w:r>
+            <w:proofErr w:type="spellEnd"/>
+            <w:r>
+              <w:t xml:space="preserve"> </w:t>
             </w:r>
           </w:p>
         </w:tc>
@@ -15712,7 +17982,23 @@
               <w:ind w:left="211" w:hanging="240"/>
             </w:pPr>
             <w:r>
-              <w:t xml:space="preserve">Mentorship Programs (linkedIn Learnig) </w:t>
+              <w:t>Mentorship Programs (</w:t>
+            </w:r>
+            <w:proofErr w:type="spellStart"/>
+            <w:r>
+              <w:t>linkedIn</w:t>
+            </w:r>
+            <w:proofErr w:type="spellEnd"/>
+            <w:r>
+              <w:t xml:space="preserve"> </w:t>
+            </w:r>
+            <w:proofErr w:type="spellStart"/>
+            <w:r>
+              <w:t>Learnig</w:t>
+            </w:r>
+            <w:proofErr w:type="spellEnd"/>
+            <w:r>
+              <w:t xml:space="preserve">) </w:t>
             </w:r>
           </w:p>
           <w:p>
@@ -17744,7 +20030,25 @@
                 <w:sz w:val="24"/>
                 <w:szCs w:val="24"/>
               </w:rPr>
-              <w:t>- Learn objects, arrays, and data structures - Asynchronous JavaScript (callbacks, promises, async/await) - Introduction to basic JavaScript libraries (e.g., Lodash)</w:t>
+              <w:t xml:space="preserve">- Learn objects, arrays, and data structures - Asynchronous JavaScript (callbacks, promises, async/await) - Introduction to basic JavaScript libraries (e.g., </w:t>
+            </w:r>
+            <w:proofErr w:type="spellStart"/>
+            <w:r>
+              <w:rPr>
+                <w:rFonts w:eastAsia="Times New Roman" w:cstheme="minorHAnsi"/>
+                <w:sz w:val="24"/>
+                <w:szCs w:val="24"/>
+              </w:rPr>
+              <w:t>Lodash</w:t>
+            </w:r>
+            <w:proofErr w:type="spellEnd"/>
+            <w:r>
+              <w:rPr>
+                <w:rFonts w:eastAsia="Times New Roman" w:cstheme="minorHAnsi"/>
+                <w:sz w:val="24"/>
+                <w:szCs w:val="24"/>
+              </w:rPr>
+              <w:t>)</w:t>
             </w:r>
           </w:p>
         </w:tc>
@@ -17769,8 +20073,36 @@
                 <w:sz w:val="24"/>
                 <w:szCs w:val="24"/>
               </w:rPr>
-              <w:t>- Build a simple interactive app (e.g., to-do list) - Complete JavaScript practice exercises on platforms like FreeCodeCamp or Codecademy</w:t>
-            </w:r>
+              <w:t xml:space="preserve">- Build a simple interactive app (e.g., to-do list) - Complete JavaScript practice exercises on platforms like </w:t>
+            </w:r>
+            <w:proofErr w:type="spellStart"/>
+            <w:r>
+              <w:rPr>
+                <w:rFonts w:eastAsia="Times New Roman" w:cstheme="minorHAnsi"/>
+                <w:sz w:val="24"/>
+                <w:szCs w:val="24"/>
+              </w:rPr>
+              <w:t>FreeCodeCamp</w:t>
+            </w:r>
+            <w:proofErr w:type="spellEnd"/>
+            <w:r>
+              <w:rPr>
+                <w:rFonts w:eastAsia="Times New Roman" w:cstheme="minorHAnsi"/>
+                <w:sz w:val="24"/>
+                <w:szCs w:val="24"/>
+              </w:rPr>
+              <w:t xml:space="preserve"> or </w:t>
+            </w:r>
+            <w:proofErr w:type="spellStart"/>
+            <w:r>
+              <w:rPr>
+                <w:rFonts w:eastAsia="Times New Roman" w:cstheme="minorHAnsi"/>
+                <w:sz w:val="24"/>
+                <w:szCs w:val="24"/>
+              </w:rPr>
+              <w:t>Codecademy</w:t>
+            </w:r>
+            <w:proofErr w:type="spellEnd"/>
           </w:p>
         </w:tc>
       </w:tr>
@@ -17853,7 +20185,25 @@
                 <w:sz w:val="24"/>
                 <w:szCs w:val="24"/>
               </w:rPr>
-              <w:t>- Learn ES6+ features (arrow functions, destructuring, modules) - Learn to use Web APIs (local storage, fetch API)</w:t>
+              <w:t xml:space="preserve">- Learn ES6+ features (arrow functions, </w:t>
+            </w:r>
+            <w:proofErr w:type="spellStart"/>
+            <w:r>
+              <w:rPr>
+                <w:rFonts w:eastAsia="Times New Roman" w:cstheme="minorHAnsi"/>
+                <w:sz w:val="24"/>
+                <w:szCs w:val="24"/>
+              </w:rPr>
+              <w:t>destructuring</w:t>
+            </w:r>
+            <w:proofErr w:type="spellEnd"/>
+            <w:r>
+              <w:rPr>
+                <w:rFonts w:eastAsia="Times New Roman" w:cstheme="minorHAnsi"/>
+                <w:sz w:val="24"/>
+                <w:szCs w:val="24"/>
+              </w:rPr>
+              <w:t>, modules) - Learn to use Web APIs (local storage, fetch API)</w:t>
             </w:r>
           </w:p>
         </w:tc>
@@ -17878,7 +20228,25 @@
                 <w:sz w:val="24"/>
                 <w:szCs w:val="24"/>
               </w:rPr>
-              <w:t>- Refactor existing projects with ES6+ features - Build a project that interacts with a Web API (e.g., weather app using OpenWeather API)</w:t>
+              <w:t xml:space="preserve">- Refactor existing projects with ES6+ features - Build a project that interacts with a Web API (e.g., weather app using </w:t>
+            </w:r>
+            <w:proofErr w:type="spellStart"/>
+            <w:r>
+              <w:rPr>
+                <w:rFonts w:eastAsia="Times New Roman" w:cstheme="minorHAnsi"/>
+                <w:sz w:val="24"/>
+                <w:szCs w:val="24"/>
+              </w:rPr>
+              <w:t>OpenWeather</w:t>
+            </w:r>
+            <w:proofErr w:type="spellEnd"/>
+            <w:r>
+              <w:rPr>
+                <w:rFonts w:eastAsia="Times New Roman" w:cstheme="minorHAnsi"/>
+                <w:sz w:val="24"/>
+                <w:szCs w:val="24"/>
+              </w:rPr>
+              <w:t xml:space="preserve"> API)</w:t>
             </w:r>
           </w:p>
         </w:tc>
@@ -19924,7 +22292,25 @@
           <w:sz w:val="24"/>
           <w:szCs w:val="24"/>
         </w:rPr>
-        <w:t>: Typically, students use an Integrated Development Environment (IDE) like Code::Blocks, Visual Studio, or any other relevant programming tools provided by the department.</w:t>
+        <w:t xml:space="preserve">: Typically, students use an Integrated Development Environment (IDE) like </w:t>
+      </w:r>
+      <w:proofErr w:type="gramStart"/>
+      <w:r>
+        <w:rPr>
+          <w:rFonts w:ascii="Times New Roman" w:eastAsia="Times New Roman" w:hAnsi="Times New Roman" w:cs="Times New Roman"/>
+          <w:sz w:val="24"/>
+          <w:szCs w:val="24"/>
+        </w:rPr>
+        <w:t>Code::</w:t>
+      </w:r>
+      <w:proofErr w:type="gramEnd"/>
+      <w:r>
+        <w:rPr>
+          <w:rFonts w:ascii="Times New Roman" w:eastAsia="Times New Roman" w:hAnsi="Times New Roman" w:cs="Times New Roman"/>
+          <w:sz w:val="24"/>
+          <w:szCs w:val="24"/>
+        </w:rPr>
+        <w:t>Blocks, Visual Studio, or any other relevant programming tools provided by the department.</w:t>
       </w:r>
     </w:p>
     <w:p>
@@ -26123,13 +28509,23 @@
               </w:rPr>
               <w:t xml:space="preserve"> statements, </w:t>
             </w:r>
+            <w:proofErr w:type="gramStart"/>
             <w:r>
               <w:rPr>
                 <w:rFonts w:ascii="Courier New" w:eastAsia="Times New Roman" w:hAnsi="Courier New" w:cs="Courier New"/>
                 <w:sz w:val="20"/>
                 <w:szCs w:val="20"/>
               </w:rPr>
-              <w:t>main()</w:t>
+              <w:t>main(</w:t>
+            </w:r>
+            <w:proofErr w:type="gramEnd"/>
+            <w:r>
+              <w:rPr>
+                <w:rFonts w:ascii="Courier New" w:eastAsia="Times New Roman" w:hAnsi="Courier New" w:cs="Courier New"/>
+                <w:sz w:val="20"/>
+                <w:szCs w:val="20"/>
+              </w:rPr>
+              <w:t>)</w:t>
             </w:r>
             <w:r>
               <w:rPr>
@@ -26374,29 +28770,69 @@
               </w:rPr>
               <w:t xml:space="preserve">Introduction to basic input/output functions in C such as </w:t>
             </w:r>
+            <w:proofErr w:type="spellStart"/>
+            <w:proofErr w:type="gramStart"/>
             <w:r>
               <w:rPr>
                 <w:rFonts w:ascii="Courier New" w:eastAsia="Times New Roman" w:hAnsi="Courier New" w:cs="Courier New"/>
                 <w:sz w:val="20"/>
                 <w:szCs w:val="20"/>
               </w:rPr>
-              <w:t>printf()</w:t>
-            </w:r>
-            <w:r>
-              <w:rPr>
-                <w:rFonts w:ascii="Times New Roman" w:eastAsia="Times New Roman" w:hAnsi="Times New Roman" w:cs="Times New Roman"/>
-                <w:sz w:val="24"/>
-                <w:szCs w:val="24"/>
-              </w:rPr>
-              <w:t xml:space="preserve">, </w:t>
-            </w:r>
+              <w:t>printf</w:t>
+            </w:r>
+            <w:proofErr w:type="spellEnd"/>
             <w:r>
               <w:rPr>
                 <w:rFonts w:ascii="Courier New" w:eastAsia="Times New Roman" w:hAnsi="Courier New" w:cs="Courier New"/>
                 <w:sz w:val="20"/>
                 <w:szCs w:val="20"/>
               </w:rPr>
-              <w:t>scanf()</w:t>
+              <w:t>(</w:t>
+            </w:r>
+            <w:proofErr w:type="gramEnd"/>
+            <w:r>
+              <w:rPr>
+                <w:rFonts w:ascii="Courier New" w:eastAsia="Times New Roman" w:hAnsi="Courier New" w:cs="Courier New"/>
+                <w:sz w:val="20"/>
+                <w:szCs w:val="20"/>
+              </w:rPr>
+              <w:t>)</w:t>
+            </w:r>
+            <w:r>
+              <w:rPr>
+                <w:rFonts w:ascii="Times New Roman" w:eastAsia="Times New Roman" w:hAnsi="Times New Roman" w:cs="Times New Roman"/>
+                <w:sz w:val="24"/>
+                <w:szCs w:val="24"/>
+              </w:rPr>
+              <w:t xml:space="preserve">, </w:t>
+            </w:r>
+            <w:proofErr w:type="spellStart"/>
+            <w:proofErr w:type="gramStart"/>
+            <w:r>
+              <w:rPr>
+                <w:rFonts w:ascii="Courier New" w:eastAsia="Times New Roman" w:hAnsi="Courier New" w:cs="Courier New"/>
+                <w:sz w:val="20"/>
+                <w:szCs w:val="20"/>
+              </w:rPr>
+              <w:t>scanf</w:t>
+            </w:r>
+            <w:proofErr w:type="spellEnd"/>
+            <w:r>
+              <w:rPr>
+                <w:rFonts w:ascii="Courier New" w:eastAsia="Times New Roman" w:hAnsi="Courier New" w:cs="Courier New"/>
+                <w:sz w:val="20"/>
+                <w:szCs w:val="20"/>
+              </w:rPr>
+              <w:t>(</w:t>
+            </w:r>
+            <w:proofErr w:type="gramEnd"/>
+            <w:r>
+              <w:rPr>
+                <w:rFonts w:ascii="Courier New" w:eastAsia="Times New Roman" w:hAnsi="Courier New" w:cs="Courier New"/>
+                <w:sz w:val="20"/>
+                <w:szCs w:val="20"/>
+              </w:rPr>
+              <w:t>)</w:t>
             </w:r>
             <w:r>
               <w:rPr>
@@ -26625,13 +29061,23 @@
               </w:rPr>
               <w:t xml:space="preserve">Discussion on how the program flows from top to bottom, the role of the </w:t>
             </w:r>
+            <w:proofErr w:type="gramStart"/>
             <w:r>
               <w:rPr>
                 <w:rFonts w:ascii="Courier New" w:eastAsia="Times New Roman" w:hAnsi="Courier New" w:cs="Courier New"/>
                 <w:sz w:val="20"/>
                 <w:szCs w:val="20"/>
               </w:rPr>
-              <w:t>main()</w:t>
+              <w:t>main(</w:t>
+            </w:r>
+            <w:proofErr w:type="gramEnd"/>
+            <w:r>
+              <w:rPr>
+                <w:rFonts w:ascii="Courier New" w:eastAsia="Times New Roman" w:hAnsi="Courier New" w:cs="Courier New"/>
+                <w:sz w:val="20"/>
+                <w:szCs w:val="20"/>
+              </w:rPr>
+              <w:t>)</w:t>
             </w:r>
             <w:r>
               <w:rPr>
@@ -27192,6 +29638,7 @@
               </w:rPr>
               <w:t xml:space="preserve">Explanation of </w:t>
             </w:r>
+            <w:proofErr w:type="spellStart"/>
             <w:r>
               <w:rPr>
                 <w:rFonts w:ascii="Courier New" w:eastAsia="Times New Roman" w:hAnsi="Courier New" w:cs="Courier New"/>
@@ -27200,6 +29647,7 @@
               </w:rPr>
               <w:t>if</w:t>
             </w:r>
+            <w:proofErr w:type="spellEnd"/>
             <w:r>
               <w:rPr>
                 <w:rFonts w:ascii="Times New Roman" w:eastAsia="Times New Roman" w:hAnsi="Times New Roman" w:cs="Times New Roman"/>
@@ -27289,6 +29737,7 @@
               </w:rPr>
               <w:t>==</w:t>
             </w:r>
+            <w:proofErr w:type="gramStart"/>
             <w:r>
               <w:rPr>
                 <w:rFonts w:ascii="Times New Roman" w:eastAsia="Times New Roman" w:hAnsi="Times New Roman" w:cs="Times New Roman"/>
@@ -27303,7 +29752,16 @@
                 <w:sz w:val="20"/>
                 <w:szCs w:val="20"/>
               </w:rPr>
-              <w:t>!=</w:t>
+              <w:t>!</w:t>
+            </w:r>
+            <w:proofErr w:type="gramEnd"/>
+            <w:r>
+              <w:rPr>
+                <w:rFonts w:ascii="Courier New" w:eastAsia="Times New Roman" w:hAnsi="Courier New" w:cs="Courier New"/>
+                <w:sz w:val="20"/>
+                <w:szCs w:val="20"/>
+              </w:rPr>
+              <w:t>=</w:t>
             </w:r>
             <w:r>
               <w:rPr>
@@ -29261,15 +31719,43 @@
                 <w:sz w:val="20"/>
                 <w:szCs w:val="20"/>
               </w:rPr>
-              <w:t>int arr[5];</w:t>
-            </w:r>
-            <w:r>
-              <w:rPr>
-                <w:rFonts w:ascii="Times New Roman" w:eastAsia="Times New Roman" w:hAnsi="Times New Roman" w:cs="Times New Roman"/>
-                <w:sz w:val="24"/>
-                <w:szCs w:val="24"/>
-              </w:rPr>
-              <w:t>) and initializing at the time of declaration.</w:t>
+              <w:t xml:space="preserve">int </w:t>
+            </w:r>
+            <w:proofErr w:type="spellStart"/>
+            <w:proofErr w:type="gramStart"/>
+            <w:r>
+              <w:rPr>
+                <w:rFonts w:ascii="Courier New" w:eastAsia="Times New Roman" w:hAnsi="Courier New" w:cs="Courier New"/>
+                <w:sz w:val="20"/>
+                <w:szCs w:val="20"/>
+              </w:rPr>
+              <w:t>arr</w:t>
+            </w:r>
+            <w:proofErr w:type="spellEnd"/>
+            <w:r>
+              <w:rPr>
+                <w:rFonts w:ascii="Courier New" w:eastAsia="Times New Roman" w:hAnsi="Courier New" w:cs="Courier New"/>
+                <w:sz w:val="20"/>
+                <w:szCs w:val="20"/>
+              </w:rPr>
+              <w:t>[5];</w:t>
+            </w:r>
+            <w:r>
+              <w:rPr>
+                <w:rFonts w:ascii="Times New Roman" w:eastAsia="Times New Roman" w:hAnsi="Times New Roman" w:cs="Times New Roman"/>
+                <w:sz w:val="24"/>
+                <w:szCs w:val="24"/>
+              </w:rPr>
+              <w:t>)</w:t>
+            </w:r>
+            <w:proofErr w:type="gramEnd"/>
+            <w:r>
+              <w:rPr>
+                <w:rFonts w:ascii="Times New Roman" w:eastAsia="Times New Roman" w:hAnsi="Times New Roman" w:cs="Times New Roman"/>
+                <w:sz w:val="24"/>
+                <w:szCs w:val="24"/>
+              </w:rPr>
+              <w:t xml:space="preserve"> and initializing at the time of declaration.</w:t>
             </w:r>
           </w:p>
         </w:tc>
@@ -29385,13 +31871,33 @@
               </w:rPr>
               <w:t xml:space="preserve">Introduction to multidimensional arrays (e.g., 2D arrays). Explanation of how to declare, initialize, and access elements in a 2D array (e.g., </w:t>
             </w:r>
+            <w:proofErr w:type="spellStart"/>
+            <w:proofErr w:type="gramStart"/>
             <w:r>
               <w:rPr>
                 <w:rFonts w:ascii="Courier New" w:eastAsia="Times New Roman" w:hAnsi="Courier New" w:cs="Courier New"/>
                 <w:sz w:val="20"/>
                 <w:szCs w:val="20"/>
               </w:rPr>
-              <w:t>arr[2][3]</w:t>
+              <w:t>arr</w:t>
+            </w:r>
+            <w:proofErr w:type="spellEnd"/>
+            <w:r>
+              <w:rPr>
+                <w:rFonts w:ascii="Courier New" w:eastAsia="Times New Roman" w:hAnsi="Courier New" w:cs="Courier New"/>
+                <w:sz w:val="20"/>
+                <w:szCs w:val="20"/>
+              </w:rPr>
+              <w:t>[</w:t>
+            </w:r>
+            <w:proofErr w:type="gramEnd"/>
+            <w:r>
+              <w:rPr>
+                <w:rFonts w:ascii="Courier New" w:eastAsia="Times New Roman" w:hAnsi="Courier New" w:cs="Courier New"/>
+                <w:sz w:val="20"/>
+                <w:szCs w:val="20"/>
+              </w:rPr>
+              <w:t>2][3]</w:t>
             </w:r>
             <w:r>
               <w:rPr>

</xml_diff>

<commit_message>
personal library (ver-2) update-147
</commit_message>
<xml_diff>
--- a/resources/Courses/GPT/Courses.docx
+++ b/resources/Courses/GPT/Courses.docx
@@ -135,11 +135,7 @@
               <w:t xml:space="preserve">3 Hours </w:t>
             </w:r>
             <w:r>
-              <w:t>(</w:t>
-            </w:r>
-            <w:proofErr w:type="gramStart"/>
-            <w:r>
-              <w:t>Evening)</w:t>
+              <w:t>(Evening)</w:t>
             </w:r>
             <w:r>
               <w:t xml:space="preserve"> </w:t>
@@ -148,11 +144,7 @@
               <w:t xml:space="preserve"> </w:t>
             </w:r>
             <w:r>
-              <w:t>=</w:t>
-            </w:r>
-            <w:proofErr w:type="gramEnd"/>
-            <w:r>
-              <w:t xml:space="preserve"> 15 Hours</w:t>
+              <w:t>= 15 Hours</w:t>
             </w:r>
           </w:p>
         </w:tc>
@@ -269,15 +261,7 @@
           </w:tcPr>
           <w:p>
             <w:r>
-              <w:t xml:space="preserve">5 Days x 6 Hours (Full </w:t>
-            </w:r>
-            <w:proofErr w:type="gramStart"/>
-            <w:r>
-              <w:t>Day)  =</w:t>
-            </w:r>
-            <w:proofErr w:type="gramEnd"/>
-            <w:r>
-              <w:t xml:space="preserve"> 30 Hours</w:t>
+              <w:t>5 Days x 6 Hours (Full Day)  = 30 Hours</w:t>
             </w:r>
           </w:p>
         </w:tc>
@@ -314,17 +298,8 @@
                 <w:b/>
                 <w:bCs/>
               </w:rPr>
-              <w:t xml:space="preserve">Review and </w:t>
-            </w:r>
-            <w:proofErr w:type="gramStart"/>
-            <w:r>
-              <w:rPr>
-                <w:b/>
-                <w:bCs/>
-              </w:rPr>
-              <w:t>Test</w:t>
-            </w:r>
-            <w:proofErr w:type="gramEnd"/>
+              <w:t>Review and Test</w:t>
+            </w:r>
           </w:p>
         </w:tc>
         <w:tc>
@@ -340,18 +315,10 @@
               <w:t xml:space="preserve"> </w:t>
             </w:r>
             <w:r>
-              <w:t xml:space="preserve">(Full </w:t>
-            </w:r>
-            <w:proofErr w:type="gramStart"/>
-            <w:r>
-              <w:t xml:space="preserve">Day)  </w:t>
-            </w:r>
-            <w:r>
-              <w:t>=</w:t>
-            </w:r>
-            <w:proofErr w:type="gramEnd"/>
-            <w:r>
-              <w:t xml:space="preserve"> </w:t>
+              <w:t xml:space="preserve">(Full Day)  </w:t>
+            </w:r>
+            <w:r>
+              <w:t xml:space="preserve">= </w:t>
             </w:r>
             <w:r>
               <w:t>0</w:t>
@@ -419,18 +386,10 @@
               <w:t xml:space="preserve"> </w:t>
             </w:r>
             <w:r>
-              <w:t xml:space="preserve">(Full </w:t>
-            </w:r>
-            <w:proofErr w:type="gramStart"/>
-            <w:r>
-              <w:t xml:space="preserve">Day)  </w:t>
-            </w:r>
-            <w:r>
-              <w:t>=</w:t>
-            </w:r>
-            <w:proofErr w:type="gramEnd"/>
-            <w:r>
-              <w:t xml:space="preserve"> </w:t>
+              <w:t xml:space="preserve">(Full Day)  </w:t>
+            </w:r>
+            <w:r>
+              <w:t xml:space="preserve">= </w:t>
             </w:r>
             <w:r>
               <w:t>0</w:t>
@@ -494,15 +453,7 @@
           </w:tcPr>
           <w:p>
             <w:r>
-              <w:t xml:space="preserve">2 Days x 6 Hours (Full </w:t>
-            </w:r>
-            <w:proofErr w:type="gramStart"/>
-            <w:r>
-              <w:t>Day)  =</w:t>
-            </w:r>
-            <w:proofErr w:type="gramEnd"/>
-            <w:r>
-              <w:t xml:space="preserve"> 12 Hours</w:t>
+              <w:t>2 Days x 6 Hours (Full Day)  = 12 Hours</w:t>
             </w:r>
           </w:p>
         </w:tc>
@@ -544,7 +495,6 @@
         </w:rPr>
         <w:t xml:space="preserve">Additional </w:t>
       </w:r>
-      <w:proofErr w:type="gramStart"/>
       <w:r>
         <w:rPr>
           <w:b/>
@@ -555,7 +505,6 @@
         </w:rPr>
         <w:t>Resources:-</w:t>
       </w:r>
-      <w:proofErr w:type="gramEnd"/>
     </w:p>
     <w:p>
       <w:pPr>
@@ -593,13 +542,8 @@
         <w:spacing w:after="0"/>
       </w:pPr>
       <w:r>
-        <w:t xml:space="preserve">Certification: MIT, Harvard, Oxford, Microsoft, Google, OpenAI, IBM, </w:t>
-      </w:r>
-      <w:proofErr w:type="spellStart"/>
-      <w:r>
-        <w:t>Etc</w:t>
-      </w:r>
-      <w:proofErr w:type="spellEnd"/>
+        <w:t>Certification: MIT, Harvard, Oxford, Microsoft, Google, OpenAI, IBM, Etc</w:t>
+      </w:r>
     </w:p>
     <w:p>
       <w:pPr>
@@ -621,9 +565,8 @@
           <w:szCs w:val="24"/>
           <w:u w:val="single"/>
         </w:rPr>
-        <w:t>Practice (5 Days of Evening Shift</w:t>
-      </w:r>
-      <w:proofErr w:type="gramStart"/>
+        <w:t>Practice (5 Days of Evening Shift)</w:t>
+      </w:r>
       <w:r>
         <w:rPr>
           <w:b/>
@@ -632,19 +575,8 @@
           <w:szCs w:val="24"/>
           <w:u w:val="single"/>
         </w:rPr>
-        <w:t>)</w:t>
-      </w:r>
-      <w:r>
-        <w:rPr>
-          <w:b/>
-          <w:bCs/>
-          <w:sz w:val="24"/>
-          <w:szCs w:val="24"/>
-          <w:u w:val="single"/>
-        </w:rPr>
         <w:t>:-</w:t>
       </w:r>
-      <w:proofErr w:type="gramEnd"/>
     </w:p>
     <w:p>
       <w:pPr>
@@ -730,9 +662,8 @@
           <w:szCs w:val="24"/>
           <w:u w:val="single"/>
         </w:rPr>
-        <w:t>(5 Days of Morning Shift</w:t>
-      </w:r>
-      <w:proofErr w:type="gramStart"/>
+        <w:t>(5 Days of Morning Shift)</w:t>
+      </w:r>
       <w:r>
         <w:rPr>
           <w:b/>
@@ -741,19 +672,8 @@
           <w:szCs w:val="24"/>
           <w:u w:val="single"/>
         </w:rPr>
-        <w:t>)</w:t>
-      </w:r>
-      <w:r>
-        <w:rPr>
-          <w:b/>
-          <w:bCs/>
-          <w:sz w:val="24"/>
-          <w:szCs w:val="24"/>
-          <w:u w:val="single"/>
-        </w:rPr>
         <w:t>:-</w:t>
       </w:r>
-      <w:proofErr w:type="gramEnd"/>
     </w:p>
     <w:p>
       <w:pPr>
@@ -802,9 +722,8 @@
           <w:szCs w:val="24"/>
           <w:u w:val="single"/>
         </w:rPr>
-        <w:t>(Off Days of Evening Shift</w:t>
-      </w:r>
-      <w:proofErr w:type="gramStart"/>
+        <w:t>(Off Days of Evening Shift)</w:t>
+      </w:r>
       <w:r>
         <w:rPr>
           <w:b/>
@@ -813,28 +732,7 @@
           <w:szCs w:val="24"/>
           <w:u w:val="single"/>
         </w:rPr>
-        <w:t>)</w:t>
-      </w:r>
-      <w:r>
-        <w:rPr>
-          <w:b/>
-          <w:bCs/>
-          <w:sz w:val="24"/>
-          <w:szCs w:val="24"/>
-          <w:u w:val="single"/>
-        </w:rPr>
-        <w:t>:-</w:t>
-      </w:r>
-      <w:proofErr w:type="gramEnd"/>
-      <w:r>
-        <w:rPr>
-          <w:b/>
-          <w:bCs/>
-          <w:sz w:val="24"/>
-          <w:szCs w:val="24"/>
-          <w:u w:val="single"/>
-        </w:rPr>
-        <w:t xml:space="preserve"> </w:t>
+        <w:t xml:space="preserve">:- </w:t>
       </w:r>
     </w:p>
     <w:p>
@@ -890,9 +788,8 @@
           <w:szCs w:val="24"/>
           <w:u w:val="single"/>
         </w:rPr>
-        <w:t>(Off Days of Morning Shift</w:t>
-      </w:r>
-      <w:proofErr w:type="gramStart"/>
+        <w:t>(Off Days of Morning Shift)</w:t>
+      </w:r>
       <w:r>
         <w:rPr>
           <w:b/>
@@ -901,19 +798,8 @@
           <w:szCs w:val="24"/>
           <w:u w:val="single"/>
         </w:rPr>
-        <w:t>)</w:t>
-      </w:r>
-      <w:r>
-        <w:rPr>
-          <w:b/>
-          <w:bCs/>
-          <w:sz w:val="24"/>
-          <w:szCs w:val="24"/>
-          <w:u w:val="single"/>
-        </w:rPr>
         <w:t>:-</w:t>
       </w:r>
-      <w:proofErr w:type="gramEnd"/>
     </w:p>
     <w:p>
       <w:pPr>
@@ -1009,7 +895,39 @@
           <w:bCs/>
           <w:color w:val="C00000"/>
         </w:rPr>
-        <w:t xml:space="preserve">: Fundamental and Development  </w:t>
+        <w:t xml:space="preserve">: </w:t>
+      </w:r>
+      <w:r>
+        <w:rPr>
+          <w:b/>
+          <w:bCs/>
+          <w:color w:val="C00000"/>
+        </w:rPr>
+        <w:t>Software Engineering</w:t>
+      </w:r>
+      <w:r>
+        <w:rPr>
+          <w:b/>
+          <w:bCs/>
+          <w:color w:val="C00000"/>
+        </w:rPr>
+        <w:t xml:space="preserve"> and </w:t>
+      </w:r>
+      <w:r>
+        <w:rPr>
+          <w:b/>
+          <w:bCs/>
+          <w:color w:val="C00000"/>
+        </w:rPr>
+        <w:t>DevOps</w:t>
+      </w:r>
+      <w:r>
+        <w:rPr>
+          <w:b/>
+          <w:bCs/>
+          <w:color w:val="C00000"/>
+        </w:rPr>
+        <w:t xml:space="preserve">  </w:t>
       </w:r>
     </w:p>
     <w:p/>
@@ -2670,19 +2588,8 @@
           <w:color w:val="C00000"/>
           <w:sz w:val="28"/>
         </w:rPr>
-        <w:t xml:space="preserve">Course </w:t>
-      </w:r>
-      <w:proofErr w:type="gramStart"/>
-      <w:r>
-        <w:rPr>
-          <w:b/>
-          <w:bCs/>
-          <w:color w:val="C00000"/>
-          <w:sz w:val="28"/>
-        </w:rPr>
-        <w:t>Outcomes:-</w:t>
-      </w:r>
-      <w:proofErr w:type="gramEnd"/>
+        <w:t>Course Outcomes:-</w:t>
+      </w:r>
     </w:p>
     <w:p>
       <w:pPr>
@@ -2858,7 +2765,1607 @@
           <w:bCs/>
           <w:color w:val="C00000"/>
         </w:rPr>
-        <w:t xml:space="preserve">: Fundamental and Development  </w:t>
+        <w:t xml:space="preserve">: </w:t>
+      </w:r>
+      <w:r>
+        <w:rPr>
+          <w:b/>
+          <w:bCs/>
+          <w:color w:val="C00000"/>
+        </w:rPr>
+        <w:t>Software Engineering</w:t>
+      </w:r>
+      <w:r>
+        <w:rPr>
+          <w:b/>
+          <w:bCs/>
+          <w:color w:val="C00000"/>
+        </w:rPr>
+        <w:t xml:space="preserve"> and </w:t>
+      </w:r>
+      <w:r>
+        <w:rPr>
+          <w:b/>
+          <w:bCs/>
+          <w:color w:val="C00000"/>
+        </w:rPr>
+        <w:t>DevOps</w:t>
+      </w:r>
+      <w:r>
+        <w:rPr>
+          <w:b/>
+          <w:bCs/>
+          <w:color w:val="C00000"/>
+        </w:rPr>
+        <w:t xml:space="preserve">  </w:t>
+      </w:r>
+    </w:p>
+    <w:p>
+      <w:pPr>
+        <w:tabs>
+          <w:tab w:val="left" w:pos="9120"/>
+        </w:tabs>
+      </w:pPr>
+      <w:r>
+        <w:tab/>
+      </w:r>
+    </w:p>
+    <w:tbl>
+      <w:tblPr>
+        <w:tblStyle w:val="TableGrid"/>
+        <w:tblW w:w="5000" w:type="pct"/>
+        <w:shd w:val="clear" w:color="auto" w:fill="E7E6E6" w:themeFill="background2"/>
+        <w:tblLook w:val="04A0" w:firstRow="1" w:lastRow="0" w:firstColumn="1" w:lastColumn="0" w:noHBand="0" w:noVBand="1"/>
+      </w:tblPr>
+      <w:tblGrid>
+        <w:gridCol w:w="1607"/>
+        <w:gridCol w:w="7291"/>
+        <w:gridCol w:w="2262"/>
+        <w:gridCol w:w="1142"/>
+        <w:gridCol w:w="1720"/>
+        <w:gridCol w:w="1366"/>
+      </w:tblGrid>
+      <w:tr>
+        <w:trPr>
+          <w:trHeight w:val="547"/>
+        </w:trPr>
+        <w:tc>
+          <w:tcPr>
+            <w:tcW w:w="522" w:type="pct"/>
+            <w:shd w:val="clear" w:color="auto" w:fill="002060"/>
+            <w:vAlign w:val="center"/>
+          </w:tcPr>
+          <w:p>
+            <w:pPr>
+              <w:rPr>
+                <w:b/>
+                <w:bCs/>
+              </w:rPr>
+            </w:pPr>
+            <w:r>
+              <w:tab/>
+            </w:r>
+          </w:p>
+        </w:tc>
+        <w:tc>
+          <w:tcPr>
+            <w:tcW w:w="3104" w:type="pct"/>
+            <w:gridSpan w:val="2"/>
+            <w:shd w:val="clear" w:color="auto" w:fill="002060"/>
+            <w:vAlign w:val="center"/>
+          </w:tcPr>
+          <w:p>
+            <w:pPr>
+              <w:rPr>
+                <w:b/>
+                <w:bCs/>
+              </w:rPr>
+            </w:pPr>
+            <w:r>
+              <w:rPr>
+                <w:b/>
+                <w:bCs/>
+              </w:rPr>
+              <w:t xml:space="preserve">Course-03: Project Management &amp; </w:t>
+            </w:r>
+            <w:r>
+              <w:rPr>
+                <w:b/>
+                <w:bCs/>
+              </w:rPr>
+              <w:t>DevOps</w:t>
+            </w:r>
+          </w:p>
+        </w:tc>
+        <w:tc>
+          <w:tcPr>
+            <w:tcW w:w="1374" w:type="pct"/>
+            <w:gridSpan w:val="3"/>
+            <w:shd w:val="clear" w:color="auto" w:fill="002060"/>
+            <w:vAlign w:val="center"/>
+          </w:tcPr>
+          <w:p>
+            <w:pPr>
+              <w:rPr>
+                <w:b/>
+                <w:bCs/>
+              </w:rPr>
+            </w:pPr>
+            <w:r>
+              <w:rPr>
+                <w:b/>
+                <w:bCs/>
+              </w:rPr>
+              <w:t xml:space="preserve">Duration: (4 + 2) Months </w:t>
+            </w:r>
+          </w:p>
+        </w:tc>
+      </w:tr>
+      <w:tr>
+        <w:tc>
+          <w:tcPr>
+            <w:tcW w:w="522" w:type="pct"/>
+            <w:shd w:val="clear" w:color="auto" w:fill="E7E6E6" w:themeFill="background2"/>
+          </w:tcPr>
+          <w:p>
+            <w:r>
+              <w:t>01</w:t>
+            </w:r>
+          </w:p>
+        </w:tc>
+        <w:tc>
+          <w:tcPr>
+            <w:tcW w:w="2369" w:type="pct"/>
+            <w:shd w:val="clear" w:color="auto" w:fill="E7E6E6" w:themeFill="background2"/>
+          </w:tcPr>
+          <w:p>
+            <w:r>
+              <w:t>Software Project Management: Reference-1</w:t>
+            </w:r>
+          </w:p>
+        </w:tc>
+        <w:tc>
+          <w:tcPr>
+            <w:tcW w:w="735" w:type="pct"/>
+            <w:shd w:val="clear" w:color="auto" w:fill="E7E6E6" w:themeFill="background2"/>
+          </w:tcPr>
+          <w:p>
+            <w:r>
+              <w:t>T-H3 + S-H4</w:t>
+            </w:r>
+          </w:p>
+        </w:tc>
+        <w:tc>
+          <w:tcPr>
+            <w:tcW w:w="371" w:type="pct"/>
+            <w:shd w:val="clear" w:color="auto" w:fill="E7E6E6" w:themeFill="background2"/>
+          </w:tcPr>
+          <w:p>
+            <w:r>
+              <w:t>12</w:t>
+            </w:r>
+          </w:p>
+        </w:tc>
+        <w:tc>
+          <w:tcPr>
+            <w:tcW w:w="559" w:type="pct"/>
+            <w:shd w:val="clear" w:color="auto" w:fill="E7E6E6" w:themeFill="background2"/>
+          </w:tcPr>
+          <w:p>
+            <w:r>
+              <w:t>290</w:t>
+            </w:r>
+          </w:p>
+        </w:tc>
+        <w:tc>
+          <w:tcPr>
+            <w:tcW w:w="444" w:type="pct"/>
+            <w:shd w:val="clear" w:color="auto" w:fill="E7E6E6" w:themeFill="background2"/>
+          </w:tcPr>
+          <w:p>
+            <w:r>
+              <w:t>718</w:t>
+            </w:r>
+          </w:p>
+        </w:tc>
+      </w:tr>
+      <w:tr>
+        <w:tc>
+          <w:tcPr>
+            <w:tcW w:w="522" w:type="pct"/>
+            <w:shd w:val="clear" w:color="auto" w:fill="E7E6E6" w:themeFill="background2"/>
+          </w:tcPr>
+          <w:p/>
+        </w:tc>
+        <w:tc>
+          <w:tcPr>
+            <w:tcW w:w="2369" w:type="pct"/>
+            <w:shd w:val="clear" w:color="auto" w:fill="E7E6E6" w:themeFill="background2"/>
+          </w:tcPr>
+          <w:p>
+            <w:r>
+              <w:t>Software Project Management: Reference-2</w:t>
+            </w:r>
+          </w:p>
+        </w:tc>
+        <w:tc>
+          <w:tcPr>
+            <w:tcW w:w="735" w:type="pct"/>
+            <w:shd w:val="clear" w:color="auto" w:fill="E7E6E6" w:themeFill="background2"/>
+          </w:tcPr>
+          <w:p/>
+        </w:tc>
+        <w:tc>
+          <w:tcPr>
+            <w:tcW w:w="371" w:type="pct"/>
+            <w:shd w:val="clear" w:color="auto" w:fill="E7E6E6" w:themeFill="background2"/>
+          </w:tcPr>
+          <w:p>
+            <w:r>
+              <w:t>23</w:t>
+            </w:r>
+          </w:p>
+        </w:tc>
+        <w:tc>
+          <w:tcPr>
+            <w:tcW w:w="559" w:type="pct"/>
+            <w:shd w:val="clear" w:color="auto" w:fill="E7E6E6" w:themeFill="background2"/>
+          </w:tcPr>
+          <w:p>
+            <w:r>
+              <w:t>364</w:t>
+            </w:r>
+          </w:p>
+        </w:tc>
+        <w:tc>
+          <w:tcPr>
+            <w:tcW w:w="444" w:type="pct"/>
+            <w:shd w:val="clear" w:color="auto" w:fill="E7E6E6" w:themeFill="background2"/>
+          </w:tcPr>
+          <w:p>
+            <w:r>
+              <w:t>498</w:t>
+            </w:r>
+          </w:p>
+        </w:tc>
+      </w:tr>
+      <w:tr>
+        <w:tc>
+          <w:tcPr>
+            <w:tcW w:w="522" w:type="pct"/>
+            <w:shd w:val="clear" w:color="auto" w:fill="E7E6E6" w:themeFill="background2"/>
+          </w:tcPr>
+          <w:p>
+            <w:r>
+              <w:t>02</w:t>
+            </w:r>
+          </w:p>
+        </w:tc>
+        <w:tc>
+          <w:tcPr>
+            <w:tcW w:w="2369" w:type="pct"/>
+            <w:shd w:val="clear" w:color="auto" w:fill="E7E6E6" w:themeFill="background2"/>
+          </w:tcPr>
+          <w:p>
+            <w:r>
+              <w:t>Software Metrics: Reference-1</w:t>
+            </w:r>
+          </w:p>
+        </w:tc>
+        <w:tc>
+          <w:tcPr>
+            <w:tcW w:w="735" w:type="pct"/>
+            <w:shd w:val="clear" w:color="auto" w:fill="E7E6E6" w:themeFill="background2"/>
+          </w:tcPr>
+          <w:p>
+            <w:r>
+              <w:t>T-H3 + S-H2</w:t>
+            </w:r>
+          </w:p>
+        </w:tc>
+        <w:tc>
+          <w:tcPr>
+            <w:tcW w:w="371" w:type="pct"/>
+            <w:shd w:val="clear" w:color="auto" w:fill="E7E6E6" w:themeFill="background2"/>
+          </w:tcPr>
+          <w:p>
+            <w:r>
+              <w:t>15</w:t>
+            </w:r>
+          </w:p>
+        </w:tc>
+        <w:tc>
+          <w:tcPr>
+            <w:tcW w:w="559" w:type="pct"/>
+            <w:shd w:val="clear" w:color="auto" w:fill="E7E6E6" w:themeFill="background2"/>
+          </w:tcPr>
+          <w:p>
+            <w:r>
+              <w:t>390</w:t>
+            </w:r>
+          </w:p>
+        </w:tc>
+        <w:tc>
+          <w:tcPr>
+            <w:tcW w:w="444" w:type="pct"/>
+            <w:shd w:val="clear" w:color="auto" w:fill="E7E6E6" w:themeFill="background2"/>
+          </w:tcPr>
+          <w:p>
+            <w:r>
+              <w:t>651</w:t>
+            </w:r>
+          </w:p>
+        </w:tc>
+      </w:tr>
+      <w:tr>
+        <w:tc>
+          <w:tcPr>
+            <w:tcW w:w="522" w:type="pct"/>
+            <w:shd w:val="clear" w:color="auto" w:fill="E7E6E6" w:themeFill="background2"/>
+          </w:tcPr>
+          <w:p/>
+        </w:tc>
+        <w:tc>
+          <w:tcPr>
+            <w:tcW w:w="2369" w:type="pct"/>
+            <w:shd w:val="clear" w:color="auto" w:fill="E7E6E6" w:themeFill="background2"/>
+          </w:tcPr>
+          <w:p>
+            <w:r>
+              <w:t>Software Metrics: Reference-2</w:t>
+            </w:r>
+          </w:p>
+        </w:tc>
+        <w:tc>
+          <w:tcPr>
+            <w:tcW w:w="735" w:type="pct"/>
+            <w:shd w:val="clear" w:color="auto" w:fill="E7E6E6" w:themeFill="background2"/>
+          </w:tcPr>
+          <w:p/>
+        </w:tc>
+        <w:tc>
+          <w:tcPr>
+            <w:tcW w:w="371" w:type="pct"/>
+            <w:shd w:val="clear" w:color="auto" w:fill="E7E6E6" w:themeFill="background2"/>
+          </w:tcPr>
+          <w:p>
+            <w:r>
+              <w:t>14</w:t>
+            </w:r>
+          </w:p>
+        </w:tc>
+        <w:tc>
+          <w:tcPr>
+            <w:tcW w:w="559" w:type="pct"/>
+            <w:shd w:val="clear" w:color="auto" w:fill="E7E6E6" w:themeFill="background2"/>
+          </w:tcPr>
+          <w:p>
+            <w:r>
+              <w:t>169</w:t>
+            </w:r>
+          </w:p>
+        </w:tc>
+        <w:tc>
+          <w:tcPr>
+            <w:tcW w:w="444" w:type="pct"/>
+            <w:shd w:val="clear" w:color="auto" w:fill="E7E6E6" w:themeFill="background2"/>
+          </w:tcPr>
+          <w:p>
+            <w:r>
+              <w:t>276</w:t>
+            </w:r>
+          </w:p>
+        </w:tc>
+      </w:tr>
+      <w:tr>
+        <w:tc>
+          <w:tcPr>
+            <w:tcW w:w="522" w:type="pct"/>
+            <w:shd w:val="clear" w:color="auto" w:fill="E7E6E6" w:themeFill="background2"/>
+          </w:tcPr>
+          <w:p>
+            <w:r>
+              <w:t>03</w:t>
+            </w:r>
+          </w:p>
+        </w:tc>
+        <w:tc>
+          <w:tcPr>
+            <w:tcW w:w="2369" w:type="pct"/>
+            <w:shd w:val="clear" w:color="auto" w:fill="E7E6E6" w:themeFill="background2"/>
+          </w:tcPr>
+          <w:p>
+            <w:r>
+              <w:t>Software Requirements</w:t>
+            </w:r>
+          </w:p>
+        </w:tc>
+        <w:tc>
+          <w:tcPr>
+            <w:tcW w:w="735" w:type="pct"/>
+            <w:shd w:val="clear" w:color="auto" w:fill="E7E6E6" w:themeFill="background2"/>
+          </w:tcPr>
+          <w:p>
+            <w:r>
+              <w:t>T-H3 + S-H2</w:t>
+            </w:r>
+          </w:p>
+        </w:tc>
+        <w:tc>
+          <w:tcPr>
+            <w:tcW w:w="371" w:type="pct"/>
+            <w:shd w:val="clear" w:color="auto" w:fill="E7E6E6" w:themeFill="background2"/>
+          </w:tcPr>
+          <w:p>
+            <w:r>
+              <w:t>11</w:t>
+            </w:r>
+          </w:p>
+        </w:tc>
+        <w:tc>
+          <w:tcPr>
+            <w:tcW w:w="559" w:type="pct"/>
+            <w:shd w:val="clear" w:color="auto" w:fill="E7E6E6" w:themeFill="background2"/>
+          </w:tcPr>
+          <w:p>
+            <w:r>
+              <w:t>126</w:t>
+            </w:r>
+          </w:p>
+        </w:tc>
+        <w:tc>
+          <w:tcPr>
+            <w:tcW w:w="444" w:type="pct"/>
+            <w:shd w:val="clear" w:color="auto" w:fill="E7E6E6" w:themeFill="background2"/>
+          </w:tcPr>
+          <w:p>
+            <w:r>
+              <w:t>399</w:t>
+            </w:r>
+          </w:p>
+        </w:tc>
+      </w:tr>
+      <w:tr>
+        <w:tc>
+          <w:tcPr>
+            <w:tcW w:w="522" w:type="pct"/>
+            <w:shd w:val="clear" w:color="auto" w:fill="FFF2CC" w:themeFill="accent4" w:themeFillTint="33"/>
+          </w:tcPr>
+          <w:p>
+            <w:pPr>
+              <w:rPr>
+                <w:b/>
+                <w:bCs/>
+              </w:rPr>
+            </w:pPr>
+          </w:p>
+        </w:tc>
+        <w:tc>
+          <w:tcPr>
+            <w:tcW w:w="2369" w:type="pct"/>
+            <w:shd w:val="clear" w:color="auto" w:fill="FFF2CC" w:themeFill="accent4" w:themeFillTint="33"/>
+          </w:tcPr>
+          <w:p>
+            <w:pPr>
+              <w:rPr>
+                <w:b/>
+                <w:bCs/>
+              </w:rPr>
+            </w:pPr>
+            <w:r>
+              <w:rPr>
+                <w:b/>
+                <w:bCs/>
+              </w:rPr>
+              <w:t xml:space="preserve">Theoretical Subjects </w:t>
+            </w:r>
+          </w:p>
+        </w:tc>
+        <w:tc>
+          <w:tcPr>
+            <w:tcW w:w="735" w:type="pct"/>
+            <w:shd w:val="clear" w:color="auto" w:fill="FFF2CC" w:themeFill="accent4" w:themeFillTint="33"/>
+          </w:tcPr>
+          <w:p>
+            <w:pPr>
+              <w:rPr>
+                <w:b/>
+                <w:bCs/>
+              </w:rPr>
+            </w:pPr>
+          </w:p>
+        </w:tc>
+        <w:tc>
+          <w:tcPr>
+            <w:tcW w:w="371" w:type="pct"/>
+            <w:shd w:val="clear" w:color="auto" w:fill="FFF2CC" w:themeFill="accent4" w:themeFillTint="33"/>
+          </w:tcPr>
+          <w:p>
+            <w:pPr>
+              <w:rPr>
+                <w:b/>
+                <w:bCs/>
+              </w:rPr>
+            </w:pPr>
+          </w:p>
+        </w:tc>
+        <w:tc>
+          <w:tcPr>
+            <w:tcW w:w="559" w:type="pct"/>
+            <w:shd w:val="clear" w:color="auto" w:fill="FFF2CC" w:themeFill="accent4" w:themeFillTint="33"/>
+          </w:tcPr>
+          <w:p>
+            <w:pPr>
+              <w:rPr>
+                <w:b/>
+                <w:bCs/>
+              </w:rPr>
+            </w:pPr>
+          </w:p>
+        </w:tc>
+        <w:tc>
+          <w:tcPr>
+            <w:tcW w:w="444" w:type="pct"/>
+            <w:shd w:val="clear" w:color="auto" w:fill="FFF2CC" w:themeFill="accent4" w:themeFillTint="33"/>
+          </w:tcPr>
+          <w:p>
+            <w:pPr>
+              <w:rPr>
+                <w:b/>
+                <w:bCs/>
+              </w:rPr>
+            </w:pPr>
+            <w:r>
+              <w:rPr>
+                <w:b/>
+                <w:bCs/>
+              </w:rPr>
+              <w:t>3930</w:t>
+            </w:r>
+          </w:p>
+        </w:tc>
+      </w:tr>
+      <w:tr>
+        <w:tc>
+          <w:tcPr>
+            <w:tcW w:w="522" w:type="pct"/>
+            <w:shd w:val="clear" w:color="auto" w:fill="E7E6E6" w:themeFill="background2"/>
+          </w:tcPr>
+          <w:p>
+            <w:pPr>
+              <w:rPr>
+                <w:b/>
+                <w:bCs/>
+                <w:color w:val="C00000"/>
+              </w:rPr>
+            </w:pPr>
+            <w:r>
+              <w:rPr>
+                <w:b/>
+                <w:bCs/>
+                <w:color w:val="C00000"/>
+              </w:rPr>
+              <w:t>0</w:t>
+            </w:r>
+            <w:r>
+              <w:rPr>
+                <w:b/>
+                <w:bCs/>
+                <w:color w:val="C00000"/>
+              </w:rPr>
+              <w:t>4</w:t>
+            </w:r>
+          </w:p>
+        </w:tc>
+        <w:tc>
+          <w:tcPr>
+            <w:tcW w:w="2369" w:type="pct"/>
+            <w:shd w:val="clear" w:color="auto" w:fill="E7E6E6" w:themeFill="background2"/>
+          </w:tcPr>
+          <w:p>
+            <w:r>
+              <w:t>DevOps Engineering: Reference-1</w:t>
+            </w:r>
+          </w:p>
+        </w:tc>
+        <w:tc>
+          <w:tcPr>
+            <w:tcW w:w="735" w:type="pct"/>
+            <w:shd w:val="clear" w:color="auto" w:fill="E7E6E6" w:themeFill="background2"/>
+          </w:tcPr>
+          <w:p>
+            <w:r>
+              <w:t>T-H3 + S-H4</w:t>
+            </w:r>
+          </w:p>
+        </w:tc>
+        <w:tc>
+          <w:tcPr>
+            <w:tcW w:w="371" w:type="pct"/>
+            <w:shd w:val="clear" w:color="auto" w:fill="E7E6E6" w:themeFill="background2"/>
+          </w:tcPr>
+          <w:p>
+            <w:r>
+              <w:t>28</w:t>
+            </w:r>
+          </w:p>
+        </w:tc>
+        <w:tc>
+          <w:tcPr>
+            <w:tcW w:w="559" w:type="pct"/>
+            <w:shd w:val="clear" w:color="auto" w:fill="E7E6E6" w:themeFill="background2"/>
+          </w:tcPr>
+          <w:p>
+            <w:r>
+              <w:t>165</w:t>
+            </w:r>
+          </w:p>
+        </w:tc>
+        <w:tc>
+          <w:tcPr>
+            <w:tcW w:w="444" w:type="pct"/>
+            <w:shd w:val="clear" w:color="auto" w:fill="E7E6E6" w:themeFill="background2"/>
+          </w:tcPr>
+          <w:p>
+            <w:r>
+              <w:t>435</w:t>
+            </w:r>
+          </w:p>
+        </w:tc>
+      </w:tr>
+      <w:tr>
+        <w:tc>
+          <w:tcPr>
+            <w:tcW w:w="522" w:type="pct"/>
+            <w:shd w:val="clear" w:color="auto" w:fill="E7E6E6" w:themeFill="background2"/>
+          </w:tcPr>
+          <w:p>
+            <w:pPr>
+              <w:rPr>
+                <w:b/>
+                <w:bCs/>
+                <w:color w:val="C00000"/>
+              </w:rPr>
+            </w:pPr>
+          </w:p>
+        </w:tc>
+        <w:tc>
+          <w:tcPr>
+            <w:tcW w:w="2369" w:type="pct"/>
+            <w:shd w:val="clear" w:color="auto" w:fill="E7E6E6" w:themeFill="background2"/>
+          </w:tcPr>
+          <w:p>
+            <w:r>
+              <w:t>DevOps Engineering: Reference-2</w:t>
+            </w:r>
+          </w:p>
+        </w:tc>
+        <w:tc>
+          <w:tcPr>
+            <w:tcW w:w="735" w:type="pct"/>
+            <w:shd w:val="clear" w:color="auto" w:fill="E7E6E6" w:themeFill="background2"/>
+          </w:tcPr>
+          <w:p/>
+        </w:tc>
+        <w:tc>
+          <w:tcPr>
+            <w:tcW w:w="371" w:type="pct"/>
+            <w:shd w:val="clear" w:color="auto" w:fill="E7E6E6" w:themeFill="background2"/>
+          </w:tcPr>
+          <w:p>
+            <w:r>
+              <w:t>15</w:t>
+            </w:r>
+          </w:p>
+        </w:tc>
+        <w:tc>
+          <w:tcPr>
+            <w:tcW w:w="559" w:type="pct"/>
+            <w:shd w:val="clear" w:color="auto" w:fill="E7E6E6" w:themeFill="background2"/>
+          </w:tcPr>
+          <w:p>
+            <w:r>
+              <w:t>241</w:t>
+            </w:r>
+          </w:p>
+        </w:tc>
+        <w:tc>
+          <w:tcPr>
+            <w:tcW w:w="444" w:type="pct"/>
+            <w:shd w:val="clear" w:color="auto" w:fill="E7E6E6" w:themeFill="background2"/>
+          </w:tcPr>
+          <w:p>
+            <w:r>
+              <w:t>489</w:t>
+            </w:r>
+          </w:p>
+        </w:tc>
+      </w:tr>
+      <w:tr>
+        <w:tc>
+          <w:tcPr>
+            <w:tcW w:w="522" w:type="pct"/>
+            <w:shd w:val="clear" w:color="auto" w:fill="E7E6E6" w:themeFill="background2"/>
+          </w:tcPr>
+          <w:p>
+            <w:pPr>
+              <w:rPr>
+                <w:b/>
+                <w:bCs/>
+                <w:color w:val="C00000"/>
+              </w:rPr>
+            </w:pPr>
+          </w:p>
+        </w:tc>
+        <w:tc>
+          <w:tcPr>
+            <w:tcW w:w="2369" w:type="pct"/>
+            <w:shd w:val="clear" w:color="auto" w:fill="E7E6E6" w:themeFill="background2"/>
+          </w:tcPr>
+          <w:p>
+            <w:r>
+              <w:t>DevOps Engineering: Reference-3</w:t>
+            </w:r>
+          </w:p>
+        </w:tc>
+        <w:tc>
+          <w:tcPr>
+            <w:tcW w:w="735" w:type="pct"/>
+            <w:shd w:val="clear" w:color="auto" w:fill="E7E6E6" w:themeFill="background2"/>
+          </w:tcPr>
+          <w:p/>
+        </w:tc>
+        <w:tc>
+          <w:tcPr>
+            <w:tcW w:w="371" w:type="pct"/>
+            <w:shd w:val="clear" w:color="auto" w:fill="E7E6E6" w:themeFill="background2"/>
+          </w:tcPr>
+          <w:p>
+            <w:r>
+              <w:t>09</w:t>
+            </w:r>
+          </w:p>
+        </w:tc>
+        <w:tc>
+          <w:tcPr>
+            <w:tcW w:w="559" w:type="pct"/>
+            <w:shd w:val="clear" w:color="auto" w:fill="E7E6E6" w:themeFill="background2"/>
+          </w:tcPr>
+          <w:p>
+            <w:r>
+              <w:t>96</w:t>
+            </w:r>
+          </w:p>
+        </w:tc>
+        <w:tc>
+          <w:tcPr>
+            <w:tcW w:w="444" w:type="pct"/>
+            <w:shd w:val="clear" w:color="auto" w:fill="E7E6E6" w:themeFill="background2"/>
+          </w:tcPr>
+          <w:p>
+            <w:r>
+              <w:t>148</w:t>
+            </w:r>
+          </w:p>
+        </w:tc>
+      </w:tr>
+      <w:tr>
+        <w:tc>
+          <w:tcPr>
+            <w:tcW w:w="522" w:type="pct"/>
+            <w:shd w:val="clear" w:color="auto" w:fill="E7E6E6" w:themeFill="background2"/>
+          </w:tcPr>
+          <w:p>
+            <w:r>
+              <w:rPr>
+                <w:b/>
+                <w:bCs/>
+                <w:color w:val="C00000"/>
+              </w:rPr>
+              <w:t>05</w:t>
+            </w:r>
+          </w:p>
+        </w:tc>
+        <w:tc>
+          <w:tcPr>
+            <w:tcW w:w="2369" w:type="pct"/>
+            <w:shd w:val="clear" w:color="auto" w:fill="E7E6E6" w:themeFill="background2"/>
+          </w:tcPr>
+          <w:p>
+            <w:r>
+              <w:t>Software Testing: Reference-1</w:t>
+            </w:r>
+          </w:p>
+        </w:tc>
+        <w:tc>
+          <w:tcPr>
+            <w:tcW w:w="735" w:type="pct"/>
+            <w:shd w:val="clear" w:color="auto" w:fill="E7E6E6" w:themeFill="background2"/>
+          </w:tcPr>
+          <w:p>
+            <w:r>
+              <w:t>T-H3 + S-H2</w:t>
+            </w:r>
+          </w:p>
+        </w:tc>
+        <w:tc>
+          <w:tcPr>
+            <w:tcW w:w="371" w:type="pct"/>
+            <w:shd w:val="clear" w:color="auto" w:fill="E7E6E6" w:themeFill="background2"/>
+          </w:tcPr>
+          <w:p>
+            <w:r>
+              <w:t>19</w:t>
+            </w:r>
+          </w:p>
+        </w:tc>
+        <w:tc>
+          <w:tcPr>
+            <w:tcW w:w="559" w:type="pct"/>
+            <w:shd w:val="clear" w:color="auto" w:fill="E7E6E6" w:themeFill="background2"/>
+          </w:tcPr>
+          <w:p>
+            <w:r>
+              <w:t>112</w:t>
+            </w:r>
+          </w:p>
+        </w:tc>
+        <w:tc>
+          <w:tcPr>
+            <w:tcW w:w="444" w:type="pct"/>
+            <w:shd w:val="clear" w:color="auto" w:fill="E7E6E6" w:themeFill="background2"/>
+          </w:tcPr>
+          <w:p>
+            <w:r>
+              <w:t>629</w:t>
+            </w:r>
+          </w:p>
+        </w:tc>
+      </w:tr>
+      <w:tr>
+        <w:tc>
+          <w:tcPr>
+            <w:tcW w:w="522" w:type="pct"/>
+            <w:shd w:val="clear" w:color="auto" w:fill="E7E6E6" w:themeFill="background2"/>
+          </w:tcPr>
+          <w:p/>
+        </w:tc>
+        <w:tc>
+          <w:tcPr>
+            <w:tcW w:w="2369" w:type="pct"/>
+            <w:shd w:val="clear" w:color="auto" w:fill="E7E6E6" w:themeFill="background2"/>
+          </w:tcPr>
+          <w:p>
+            <w:r>
+              <w:t>Software Testing: Reference-2</w:t>
+            </w:r>
+          </w:p>
+        </w:tc>
+        <w:tc>
+          <w:tcPr>
+            <w:tcW w:w="735" w:type="pct"/>
+            <w:shd w:val="clear" w:color="auto" w:fill="E7E6E6" w:themeFill="background2"/>
+          </w:tcPr>
+          <w:p/>
+        </w:tc>
+        <w:tc>
+          <w:tcPr>
+            <w:tcW w:w="371" w:type="pct"/>
+            <w:shd w:val="clear" w:color="auto" w:fill="E7E6E6" w:themeFill="background2"/>
+          </w:tcPr>
+          <w:p>
+            <w:r>
+              <w:t>21</w:t>
+            </w:r>
+          </w:p>
+        </w:tc>
+        <w:tc>
+          <w:tcPr>
+            <w:tcW w:w="559" w:type="pct"/>
+            <w:shd w:val="clear" w:color="auto" w:fill="E7E6E6" w:themeFill="background2"/>
+          </w:tcPr>
+          <w:p>
+            <w:r>
+              <w:t>285</w:t>
+            </w:r>
+          </w:p>
+        </w:tc>
+        <w:tc>
+          <w:tcPr>
+            <w:tcW w:w="444" w:type="pct"/>
+            <w:shd w:val="clear" w:color="auto" w:fill="E7E6E6" w:themeFill="background2"/>
+          </w:tcPr>
+          <w:p>
+            <w:r>
+              <w:t>573</w:t>
+            </w:r>
+          </w:p>
+        </w:tc>
+      </w:tr>
+      <w:tr>
+        <w:tc>
+          <w:tcPr>
+            <w:tcW w:w="522" w:type="pct"/>
+            <w:shd w:val="clear" w:color="auto" w:fill="002060"/>
+          </w:tcPr>
+          <w:p>
+            <w:pPr>
+              <w:rPr>
+                <w:b/>
+                <w:bCs/>
+              </w:rPr>
+            </w:pPr>
+          </w:p>
+        </w:tc>
+        <w:tc>
+          <w:tcPr>
+            <w:tcW w:w="2369" w:type="pct"/>
+            <w:shd w:val="clear" w:color="auto" w:fill="002060"/>
+          </w:tcPr>
+          <w:p>
+            <w:pPr>
+              <w:rPr>
+                <w:b/>
+                <w:bCs/>
+              </w:rPr>
+            </w:pPr>
+            <w:r>
+              <w:rPr>
+                <w:b/>
+                <w:bCs/>
+              </w:rPr>
+              <w:t>Lab Subjects</w:t>
+            </w:r>
+          </w:p>
+        </w:tc>
+        <w:tc>
+          <w:tcPr>
+            <w:tcW w:w="735" w:type="pct"/>
+            <w:shd w:val="clear" w:color="auto" w:fill="002060"/>
+          </w:tcPr>
+          <w:p>
+            <w:pPr>
+              <w:rPr>
+                <w:b/>
+                <w:bCs/>
+              </w:rPr>
+            </w:pPr>
+          </w:p>
+        </w:tc>
+        <w:tc>
+          <w:tcPr>
+            <w:tcW w:w="371" w:type="pct"/>
+            <w:shd w:val="clear" w:color="auto" w:fill="002060"/>
+          </w:tcPr>
+          <w:p>
+            <w:pPr>
+              <w:rPr>
+                <w:b/>
+                <w:bCs/>
+              </w:rPr>
+            </w:pPr>
+          </w:p>
+        </w:tc>
+        <w:tc>
+          <w:tcPr>
+            <w:tcW w:w="559" w:type="pct"/>
+            <w:shd w:val="clear" w:color="auto" w:fill="002060"/>
+          </w:tcPr>
+          <w:p>
+            <w:pPr>
+              <w:rPr>
+                <w:b/>
+                <w:bCs/>
+              </w:rPr>
+            </w:pPr>
+          </w:p>
+        </w:tc>
+        <w:tc>
+          <w:tcPr>
+            <w:tcW w:w="444" w:type="pct"/>
+            <w:shd w:val="clear" w:color="auto" w:fill="002060"/>
+          </w:tcPr>
+          <w:p>
+            <w:pPr>
+              <w:rPr>
+                <w:b/>
+                <w:bCs/>
+              </w:rPr>
+            </w:pPr>
+            <w:r>
+              <w:rPr>
+                <w:b/>
+                <w:bCs/>
+              </w:rPr>
+              <w:t>1072</w:t>
+            </w:r>
+          </w:p>
+        </w:tc>
+      </w:tr>
+      <w:tr>
+        <w:tc>
+          <w:tcPr>
+            <w:tcW w:w="522" w:type="pct"/>
+            <w:shd w:val="clear" w:color="auto" w:fill="E7E6E6" w:themeFill="background2"/>
+          </w:tcPr>
+          <w:p>
+            <w:r>
+              <w:t>01</w:t>
+            </w:r>
+          </w:p>
+        </w:tc>
+        <w:tc>
+          <w:tcPr>
+            <w:tcW w:w="2369" w:type="pct"/>
+            <w:shd w:val="clear" w:color="auto" w:fill="E7E6E6" w:themeFill="background2"/>
+          </w:tcPr>
+          <w:p>
+            <w:r>
+              <w:t xml:space="preserve">Cloud Computing and Virtualization </w:t>
+            </w:r>
+          </w:p>
+        </w:tc>
+        <w:tc>
+          <w:tcPr>
+            <w:tcW w:w="735" w:type="pct"/>
+            <w:shd w:val="clear" w:color="auto" w:fill="E7E6E6" w:themeFill="background2"/>
+          </w:tcPr>
+          <w:p>
+            <w:r>
+              <w:t>T-H3 + S-H2</w:t>
+            </w:r>
+          </w:p>
+        </w:tc>
+        <w:tc>
+          <w:tcPr>
+            <w:tcW w:w="371" w:type="pct"/>
+            <w:shd w:val="clear" w:color="auto" w:fill="E7E6E6" w:themeFill="background2"/>
+          </w:tcPr>
+          <w:p>
+            <w:r>
+              <w:t>16</w:t>
+            </w:r>
+          </w:p>
+        </w:tc>
+        <w:tc>
+          <w:tcPr>
+            <w:tcW w:w="559" w:type="pct"/>
+            <w:shd w:val="clear" w:color="auto" w:fill="E7E6E6" w:themeFill="background2"/>
+          </w:tcPr>
+          <w:p>
+            <w:r>
+              <w:t>257</w:t>
+            </w:r>
+          </w:p>
+        </w:tc>
+        <w:tc>
+          <w:tcPr>
+            <w:tcW w:w="444" w:type="pct"/>
+            <w:shd w:val="clear" w:color="auto" w:fill="E7E6E6" w:themeFill="background2"/>
+          </w:tcPr>
+          <w:p>
+            <w:r>
+              <w:t>558</w:t>
+            </w:r>
+          </w:p>
+        </w:tc>
+      </w:tr>
+      <w:tr>
+        <w:tc>
+          <w:tcPr>
+            <w:tcW w:w="522" w:type="pct"/>
+            <w:shd w:val="clear" w:color="auto" w:fill="E7E6E6" w:themeFill="background2"/>
+          </w:tcPr>
+          <w:p>
+            <w:r>
+              <w:t>02</w:t>
+            </w:r>
+          </w:p>
+        </w:tc>
+        <w:tc>
+          <w:tcPr>
+            <w:tcW w:w="2369" w:type="pct"/>
+            <w:shd w:val="clear" w:color="auto" w:fill="E7E6E6" w:themeFill="background2"/>
+          </w:tcPr>
+          <w:p>
+            <w:r>
+              <w:t>Linux Operating and DevOps Tools</w:t>
+            </w:r>
+          </w:p>
+        </w:tc>
+        <w:tc>
+          <w:tcPr>
+            <w:tcW w:w="735" w:type="pct"/>
+            <w:shd w:val="clear" w:color="auto" w:fill="E7E6E6" w:themeFill="background2"/>
+          </w:tcPr>
+          <w:p/>
+        </w:tc>
+        <w:tc>
+          <w:tcPr>
+            <w:tcW w:w="371" w:type="pct"/>
+            <w:shd w:val="clear" w:color="auto" w:fill="E7E6E6" w:themeFill="background2"/>
+          </w:tcPr>
+          <w:p/>
+        </w:tc>
+        <w:tc>
+          <w:tcPr>
+            <w:tcW w:w="559" w:type="pct"/>
+            <w:shd w:val="clear" w:color="auto" w:fill="E7E6E6" w:themeFill="background2"/>
+          </w:tcPr>
+          <w:p/>
+        </w:tc>
+        <w:tc>
+          <w:tcPr>
+            <w:tcW w:w="444" w:type="pct"/>
+            <w:shd w:val="clear" w:color="auto" w:fill="E7E6E6" w:themeFill="background2"/>
+          </w:tcPr>
+          <w:p/>
+        </w:tc>
+      </w:tr>
+      <w:tr>
+        <w:tc>
+          <w:tcPr>
+            <w:tcW w:w="522" w:type="pct"/>
+            <w:shd w:val="clear" w:color="auto" w:fill="E7E6E6" w:themeFill="background2"/>
+          </w:tcPr>
+          <w:p>
+            <w:r>
+              <w:t>03</w:t>
+            </w:r>
+          </w:p>
+        </w:tc>
+        <w:tc>
+          <w:tcPr>
+            <w:tcW w:w="2369" w:type="pct"/>
+            <w:shd w:val="clear" w:color="auto" w:fill="E7E6E6" w:themeFill="background2"/>
+          </w:tcPr>
+          <w:p>
+            <w:r>
+              <w:t>Calculus and Analytical Geometry: Reference-1</w:t>
+            </w:r>
+          </w:p>
+        </w:tc>
+        <w:tc>
+          <w:tcPr>
+            <w:tcW w:w="735" w:type="pct"/>
+            <w:shd w:val="clear" w:color="auto" w:fill="E7E6E6" w:themeFill="background2"/>
+          </w:tcPr>
+          <w:p>
+            <w:r>
+              <w:t>T-H3</w:t>
+            </w:r>
+          </w:p>
+        </w:tc>
+        <w:tc>
+          <w:tcPr>
+            <w:tcW w:w="371" w:type="pct"/>
+            <w:shd w:val="clear" w:color="auto" w:fill="E7E6E6" w:themeFill="background2"/>
+          </w:tcPr>
+          <w:p>
+            <w:r>
+              <w:t>15</w:t>
+            </w:r>
+          </w:p>
+        </w:tc>
+        <w:tc>
+          <w:tcPr>
+            <w:tcW w:w="559" w:type="pct"/>
+            <w:shd w:val="clear" w:color="auto" w:fill="E7E6E6" w:themeFill="background2"/>
+          </w:tcPr>
+          <w:p>
+            <w:r>
+              <w:t>120</w:t>
+            </w:r>
+          </w:p>
+        </w:tc>
+        <w:tc>
+          <w:tcPr>
+            <w:tcW w:w="444" w:type="pct"/>
+            <w:shd w:val="clear" w:color="auto" w:fill="E7E6E6" w:themeFill="background2"/>
+          </w:tcPr>
+          <w:p>
+            <w:r>
+              <w:t>1281</w:t>
+            </w:r>
+          </w:p>
+        </w:tc>
+      </w:tr>
+      <w:tr>
+        <w:tc>
+          <w:tcPr>
+            <w:tcW w:w="522" w:type="pct"/>
+            <w:shd w:val="clear" w:color="auto" w:fill="E7E6E6" w:themeFill="background2"/>
+          </w:tcPr>
+          <w:p/>
+        </w:tc>
+        <w:tc>
+          <w:tcPr>
+            <w:tcW w:w="2369" w:type="pct"/>
+            <w:shd w:val="clear" w:color="auto" w:fill="E7E6E6" w:themeFill="background2"/>
+          </w:tcPr>
+          <w:p>
+            <w:r>
+              <w:t>Calculus and Analytical Geometry: Reference-2</w:t>
+            </w:r>
+          </w:p>
+        </w:tc>
+        <w:tc>
+          <w:tcPr>
+            <w:tcW w:w="735" w:type="pct"/>
+            <w:shd w:val="clear" w:color="auto" w:fill="E7E6E6" w:themeFill="background2"/>
+          </w:tcPr>
+          <w:p/>
+        </w:tc>
+        <w:tc>
+          <w:tcPr>
+            <w:tcW w:w="371" w:type="pct"/>
+            <w:shd w:val="clear" w:color="auto" w:fill="E7E6E6" w:themeFill="background2"/>
+          </w:tcPr>
+          <w:p>
+            <w:r>
+              <w:t>25</w:t>
+            </w:r>
+          </w:p>
+        </w:tc>
+        <w:tc>
+          <w:tcPr>
+            <w:tcW w:w="559" w:type="pct"/>
+            <w:shd w:val="clear" w:color="auto" w:fill="E7E6E6" w:themeFill="background2"/>
+          </w:tcPr>
+          <w:p>
+            <w:r>
+              <w:t>178</w:t>
+            </w:r>
+          </w:p>
+        </w:tc>
+        <w:tc>
+          <w:tcPr>
+            <w:tcW w:w="444" w:type="pct"/>
+            <w:shd w:val="clear" w:color="auto" w:fill="E7E6E6" w:themeFill="background2"/>
+          </w:tcPr>
+          <w:p>
+            <w:r>
+              <w:t>1283</w:t>
+            </w:r>
+          </w:p>
+        </w:tc>
+      </w:tr>
+      <w:tr>
+        <w:tc>
+          <w:tcPr>
+            <w:tcW w:w="522" w:type="pct"/>
+            <w:shd w:val="clear" w:color="auto" w:fill="AEAAAA" w:themeFill="background2" w:themeFillShade="BF"/>
+          </w:tcPr>
+          <w:p>
+            <w:pPr>
+              <w:rPr>
+                <w:b/>
+                <w:bCs/>
+              </w:rPr>
+            </w:pPr>
+          </w:p>
+        </w:tc>
+        <w:tc>
+          <w:tcPr>
+            <w:tcW w:w="2369" w:type="pct"/>
+            <w:shd w:val="clear" w:color="auto" w:fill="AEAAAA" w:themeFill="background2" w:themeFillShade="BF"/>
+          </w:tcPr>
+          <w:p>
+            <w:pPr>
+              <w:rPr>
+                <w:b/>
+                <w:bCs/>
+              </w:rPr>
+            </w:pPr>
+            <w:r>
+              <w:rPr>
+                <w:b/>
+                <w:bCs/>
+              </w:rPr>
+              <w:t>Elective Subjects</w:t>
+            </w:r>
+          </w:p>
+        </w:tc>
+        <w:tc>
+          <w:tcPr>
+            <w:tcW w:w="735" w:type="pct"/>
+            <w:shd w:val="clear" w:color="auto" w:fill="AEAAAA" w:themeFill="background2" w:themeFillShade="BF"/>
+          </w:tcPr>
+          <w:p>
+            <w:pPr>
+              <w:rPr>
+                <w:b/>
+                <w:bCs/>
+              </w:rPr>
+            </w:pPr>
+          </w:p>
+        </w:tc>
+        <w:tc>
+          <w:tcPr>
+            <w:tcW w:w="371" w:type="pct"/>
+            <w:shd w:val="clear" w:color="auto" w:fill="AEAAAA" w:themeFill="background2" w:themeFillShade="BF"/>
+          </w:tcPr>
+          <w:p>
+            <w:pPr>
+              <w:rPr>
+                <w:b/>
+                <w:bCs/>
+              </w:rPr>
+            </w:pPr>
+          </w:p>
+        </w:tc>
+        <w:tc>
+          <w:tcPr>
+            <w:tcW w:w="559" w:type="pct"/>
+            <w:shd w:val="clear" w:color="auto" w:fill="AEAAAA" w:themeFill="background2" w:themeFillShade="BF"/>
+          </w:tcPr>
+          <w:p>
+            <w:pPr>
+              <w:rPr>
+                <w:b/>
+                <w:bCs/>
+              </w:rPr>
+            </w:pPr>
+            <w:r>
+              <w:rPr>
+                <w:b/>
+                <w:bCs/>
+              </w:rPr>
+              <w:t>257</w:t>
+            </w:r>
+          </w:p>
+        </w:tc>
+        <w:tc>
+          <w:tcPr>
+            <w:tcW w:w="444" w:type="pct"/>
+            <w:shd w:val="clear" w:color="auto" w:fill="AEAAAA" w:themeFill="background2" w:themeFillShade="BF"/>
+          </w:tcPr>
+          <w:p>
+            <w:pPr>
+              <w:rPr>
+                <w:b/>
+                <w:bCs/>
+              </w:rPr>
+            </w:pPr>
+            <w:r>
+              <w:rPr>
+                <w:b/>
+                <w:bCs/>
+              </w:rPr>
+              <w:t>978</w:t>
+            </w:r>
+          </w:p>
+        </w:tc>
+      </w:tr>
+    </w:tbl>
+    <w:p>
+      <w:pPr>
+        <w:spacing w:after="0"/>
+      </w:pPr>
+    </w:p>
+    <w:p>
+      <w:pPr>
+        <w:spacing w:after="0"/>
+      </w:pPr>
+    </w:p>
+    <w:p>
+      <w:pPr>
+        <w:spacing w:after="0"/>
+        <w:rPr>
+          <w:b/>
+          <w:bCs/>
+          <w:color w:val="C00000"/>
+          <w:sz w:val="28"/>
+        </w:rPr>
+      </w:pPr>
+      <w:r>
+        <w:rPr>
+          <w:b/>
+          <w:bCs/>
+          <w:color w:val="C00000"/>
+          <w:sz w:val="28"/>
+        </w:rPr>
+        <w:t>Course Outcomes:-</w:t>
+      </w:r>
+    </w:p>
+    <w:p>
+      <w:pPr>
+        <w:pStyle w:val="ListParagraph"/>
+        <w:spacing w:after="0"/>
+      </w:pPr>
+    </w:p>
+    <w:p>
+      <w:pPr>
+        <w:pStyle w:val="ListParagraph"/>
+        <w:numPr>
+          <w:ilvl w:val="0"/>
+          <w:numId w:val="3"/>
+        </w:numPr>
+        <w:spacing w:after="0"/>
+      </w:pPr>
+      <w:r>
+        <w:t xml:space="preserve">Understanding all the Necessary Concept with Its – </w:t>
+      </w:r>
+    </w:p>
+    <w:p>
+      <w:pPr>
+        <w:pStyle w:val="ListParagraph"/>
+        <w:numPr>
+          <w:ilvl w:val="1"/>
+          <w:numId w:val="3"/>
+        </w:numPr>
+        <w:spacing w:after="0"/>
+      </w:pPr>
+      <w:r>
+        <w:t xml:space="preserve">Real-Life Professional Application and Problems </w:t>
+      </w:r>
+    </w:p>
+    <w:p>
+      <w:pPr>
+        <w:pStyle w:val="ListParagraph"/>
+        <w:numPr>
+          <w:ilvl w:val="1"/>
+          <w:numId w:val="3"/>
+        </w:numPr>
+        <w:spacing w:after="0"/>
+      </w:pPr>
+      <w:r>
+        <w:t xml:space="preserve">Comparison with Related Technology </w:t>
+      </w:r>
+    </w:p>
+    <w:p>
+      <w:pPr>
+        <w:pStyle w:val="ListParagraph"/>
+        <w:numPr>
+          <w:ilvl w:val="1"/>
+          <w:numId w:val="3"/>
+        </w:numPr>
+        <w:spacing w:after="0"/>
+      </w:pPr>
+      <w:r>
+        <w:t xml:space="preserve">Range, Domains and Classification  </w:t>
+      </w:r>
+    </w:p>
+    <w:p>
+      <w:pPr>
+        <w:pStyle w:val="ListParagraph"/>
+        <w:numPr>
+          <w:ilvl w:val="1"/>
+          <w:numId w:val="3"/>
+        </w:numPr>
+        <w:spacing w:after="0"/>
+      </w:pPr>
+      <w:r>
+        <w:t>Invention and Evolution</w:t>
+      </w:r>
+    </w:p>
+    <w:p>
+      <w:pPr>
+        <w:pStyle w:val="ListParagraph"/>
+        <w:numPr>
+          <w:ilvl w:val="0"/>
+          <w:numId w:val="3"/>
+        </w:numPr>
+        <w:spacing w:after="0"/>
+      </w:pPr>
+      <w:r>
+        <w:t xml:space="preserve">Fundamental Software Development Life-Cycle </w:t>
+      </w:r>
+    </w:p>
+    <w:p>
+      <w:pPr>
+        <w:pStyle w:val="ListParagraph"/>
+        <w:numPr>
+          <w:ilvl w:val="0"/>
+          <w:numId w:val="3"/>
+        </w:numPr>
+        <w:spacing w:after="0"/>
+      </w:pPr>
+      <w:r>
+        <w:t xml:space="preserve">Fundamental of Development Process </w:t>
+      </w:r>
+    </w:p>
+    <w:p>
+      <w:pPr>
+        <w:pStyle w:val="ListParagraph"/>
+        <w:numPr>
+          <w:ilvl w:val="0"/>
+          <w:numId w:val="3"/>
+        </w:numPr>
+        <w:spacing w:after="0"/>
+      </w:pPr>
+      <w:r>
+        <w:t xml:space="preserve">Application of Project Management   </w:t>
+      </w:r>
+    </w:p>
+    <w:p>
+      <w:pPr>
+        <w:pStyle w:val="ListParagraph"/>
+        <w:numPr>
+          <w:ilvl w:val="0"/>
+          <w:numId w:val="3"/>
+        </w:numPr>
+        <w:spacing w:after="0"/>
+      </w:pPr>
+      <w:r>
+        <w:t xml:space="preserve">Application of DevOps Engineering </w:t>
+      </w:r>
+    </w:p>
+    <w:p>
+      <w:pPr>
+        <w:pStyle w:val="ListParagraph"/>
+        <w:numPr>
+          <w:ilvl w:val="0"/>
+          <w:numId w:val="3"/>
+        </w:numPr>
+        <w:spacing w:after="0"/>
+      </w:pPr>
+      <w:r>
+        <w:t xml:space="preserve">Application of Software Testing   </w:t>
+      </w:r>
+    </w:p>
+    <w:p>
+      <w:pPr>
+        <w:spacing w:after="0"/>
+      </w:pPr>
+    </w:p>
+    <w:p>
+      <w:pPr>
+        <w:pStyle w:val="Heading2"/>
+        <w:rPr>
+          <w:b/>
+          <w:bCs/>
+          <w:color w:val="C00000"/>
+        </w:rPr>
+      </w:pPr>
+      <w:r>
+        <w:rPr>
+          <w:b/>
+          <w:bCs/>
+          <w:color w:val="C00000"/>
+        </w:rPr>
+        <w:lastRenderedPageBreak/>
+        <w:t>Year-02</w:t>
+      </w:r>
+      <w:r>
+        <w:rPr>
+          <w:b/>
+          <w:bCs/>
+          <w:color w:val="C00000"/>
+        </w:rPr>
+        <w:t>.1</w:t>
+      </w:r>
+      <w:r>
+        <w:rPr>
+          <w:b/>
+          <w:bCs/>
+          <w:color w:val="C00000"/>
+        </w:rPr>
+        <w:t xml:space="preserve">: </w:t>
+      </w:r>
+      <w:r>
+        <w:rPr>
+          <w:b/>
+          <w:bCs/>
+          <w:color w:val="C00000"/>
+        </w:rPr>
+        <w:t>Development</w:t>
+      </w:r>
+      <w:r>
+        <w:rPr>
+          <w:b/>
+          <w:bCs/>
+          <w:color w:val="C00000"/>
+        </w:rPr>
+        <w:t xml:space="preserve"> and Design </w:t>
+      </w:r>
+      <w:r>
+        <w:rPr>
+          <w:b/>
+          <w:bCs/>
+          <w:color w:val="C00000"/>
+        </w:rPr>
+        <w:t xml:space="preserve"> </w:t>
       </w:r>
     </w:p>
     <w:p/>
@@ -2915,21 +4422,7 @@
                 <w:b/>
                 <w:bCs/>
               </w:rPr>
-              <w:t>Course-</w:t>
-            </w:r>
-            <w:r>
-              <w:rPr>
-                <w:b/>
-                <w:bCs/>
-              </w:rPr>
-              <w:t>0</w:t>
-            </w:r>
-            <w:r>
-              <w:rPr>
-                <w:b/>
-                <w:bCs/>
-              </w:rPr>
-              <w:t xml:space="preserve">2: </w:t>
+              <w:t xml:space="preserve">Course-02: </w:t>
             </w:r>
             <w:r>
               <w:rPr>
@@ -2979,10 +4472,7 @@
           </w:tcPr>
           <w:p>
             <w:r>
-              <w:t>0</w:t>
-            </w:r>
-            <w:r>
-              <w:t>1</w:t>
+              <w:t>01</w:t>
             </w:r>
           </w:p>
         </w:tc>
@@ -3170,10 +4660,7 @@
           </w:tcPr>
           <w:p>
             <w:r>
-              <w:t>0</w:t>
-            </w:r>
-            <w:r>
-              <w:t>2</w:t>
+              <w:t>02</w:t>
             </w:r>
           </w:p>
         </w:tc>
@@ -3241,10 +4728,7 @@
           </w:tcPr>
           <w:p>
             <w:r>
-              <w:t>0</w:t>
-            </w:r>
-            <w:r>
-              <w:t>3</w:t>
+              <w:t>03</w:t>
             </w:r>
           </w:p>
         </w:tc>
@@ -3938,10 +5422,7 @@
           </w:tcPr>
           <w:p>
             <w:r>
-              <w:t>0</w:t>
-            </w:r>
-            <w:r>
-              <w:t>1</w:t>
+              <w:t>01</w:t>
             </w:r>
           </w:p>
         </w:tc>
@@ -4257,19 +5738,8 @@
           <w:color w:val="C00000"/>
           <w:sz w:val="28"/>
         </w:rPr>
-        <w:t xml:space="preserve">Course </w:t>
-      </w:r>
-      <w:proofErr w:type="gramStart"/>
-      <w:r>
-        <w:rPr>
-          <w:b/>
-          <w:bCs/>
-          <w:color w:val="C00000"/>
-          <w:sz w:val="28"/>
-        </w:rPr>
-        <w:t>Outcomes:-</w:t>
-      </w:r>
-      <w:proofErr w:type="gramEnd"/>
+        <w:t>Course Outcomes:-</w:t>
+      </w:r>
     </w:p>
     <w:p>
       <w:pPr>
@@ -4352,10 +5822,7 @@
         <w:spacing w:after="0"/>
       </w:pPr>
       <w:r>
-        <w:t xml:space="preserve">Fundamental of </w:t>
-      </w:r>
-      <w:r>
-        <w:t>Web Technology</w:t>
+        <w:t>Fundamental of Web Technology</w:t>
       </w:r>
     </w:p>
     <w:p>
@@ -4381,16 +5848,7 @@
         <w:spacing w:after="0"/>
       </w:pPr>
       <w:r>
-        <w:t xml:space="preserve">Application of </w:t>
-      </w:r>
-      <w:r>
-        <w:t>Web</w:t>
-      </w:r>
-      <w:r>
-        <w:t xml:space="preserve"> Design and Development</w:t>
-      </w:r>
-      <w:r>
-        <w:t xml:space="preserve">  </w:t>
+        <w:t xml:space="preserve">Application of Web Design and Development  </w:t>
       </w:r>
     </w:p>
     <w:p>
@@ -4403,13 +5861,7 @@
         <w:spacing w:after="0"/>
       </w:pPr>
       <w:r>
-        <w:t xml:space="preserve">Application of </w:t>
-      </w:r>
-      <w:r>
-        <w:t>Database Design and Administration</w:t>
-      </w:r>
-      <w:r>
-        <w:t xml:space="preserve"> </w:t>
+        <w:t xml:space="preserve">Application of Database Design and Administration </w:t>
       </w:r>
     </w:p>
     <w:p>
@@ -4422,22 +5874,16 @@
         <w:spacing w:after="0"/>
       </w:pPr>
       <w:r>
-        <w:t xml:space="preserve">Application of </w:t>
-      </w:r>
-      <w:r>
-        <w:t>Software Architecture and Design</w:t>
-      </w:r>
-      <w:r>
-        <w:t xml:space="preserve"> Pattern </w:t>
-      </w:r>
-      <w:r>
-        <w:t xml:space="preserve"> </w:t>
+        <w:t xml:space="preserve">Application of Software Architecture and Design Pattern  </w:t>
       </w:r>
     </w:p>
     <w:p>
       <w:pPr>
         <w:spacing w:after="0"/>
       </w:pPr>
+      <w:r>
+        <w:t xml:space="preserve">  </w:t>
+      </w:r>
     </w:p>
     <w:p>
       <w:pPr>
@@ -4455,7 +5901,7 @@
           <w:color w:val="C00000"/>
         </w:rPr>
         <w:lastRenderedPageBreak/>
-        <w:t>Year-02</w:t>
+        <w:t>Year-02.2: D</w:t>
       </w:r>
       <w:r>
         <w:rPr>
@@ -4463,7 +5909,7 @@
           <w:bCs/>
           <w:color w:val="C00000"/>
         </w:rPr>
-        <w:t>.1</w:t>
+        <w:t>evelopment</w:t>
       </w:r>
       <w:r>
         <w:rPr>
@@ -4471,1587 +5917,7 @@
           <w:bCs/>
           <w:color w:val="C00000"/>
         </w:rPr>
-        <w:t xml:space="preserve">: DevOps and Design </w:t>
-      </w:r>
-      <w:r>
-        <w:rPr>
-          <w:b/>
-          <w:bCs/>
-          <w:color w:val="C00000"/>
-        </w:rPr>
-        <w:t xml:space="preserve"> </w:t>
-      </w:r>
-    </w:p>
-    <w:p>
-      <w:pPr>
-        <w:tabs>
-          <w:tab w:val="left" w:pos="9120"/>
-        </w:tabs>
-      </w:pPr>
-      <w:r>
-        <w:tab/>
-      </w:r>
-    </w:p>
-    <w:tbl>
-      <w:tblPr>
-        <w:tblStyle w:val="TableGrid"/>
-        <w:tblW w:w="5000" w:type="pct"/>
-        <w:shd w:val="clear" w:color="auto" w:fill="E7E6E6" w:themeFill="background2"/>
-        <w:tblLook w:val="04A0" w:firstRow="1" w:lastRow="0" w:firstColumn="1" w:lastColumn="0" w:noHBand="0" w:noVBand="1"/>
-      </w:tblPr>
-      <w:tblGrid>
-        <w:gridCol w:w="1607"/>
-        <w:gridCol w:w="7291"/>
-        <w:gridCol w:w="2262"/>
-        <w:gridCol w:w="1142"/>
-        <w:gridCol w:w="1720"/>
-        <w:gridCol w:w="1366"/>
-      </w:tblGrid>
-      <w:tr>
-        <w:trPr>
-          <w:trHeight w:val="547"/>
-        </w:trPr>
-        <w:tc>
-          <w:tcPr>
-            <w:tcW w:w="522" w:type="pct"/>
-            <w:shd w:val="clear" w:color="auto" w:fill="002060"/>
-            <w:vAlign w:val="center"/>
-          </w:tcPr>
-          <w:p>
-            <w:pPr>
-              <w:rPr>
-                <w:b/>
-                <w:bCs/>
-              </w:rPr>
-            </w:pPr>
-            <w:r>
-              <w:tab/>
-            </w:r>
-          </w:p>
-        </w:tc>
-        <w:tc>
-          <w:tcPr>
-            <w:tcW w:w="3104" w:type="pct"/>
-            <w:gridSpan w:val="2"/>
-            <w:shd w:val="clear" w:color="auto" w:fill="002060"/>
-            <w:vAlign w:val="center"/>
-          </w:tcPr>
-          <w:p>
-            <w:pPr>
-              <w:rPr>
-                <w:b/>
-                <w:bCs/>
-              </w:rPr>
-            </w:pPr>
-            <w:r>
-              <w:rPr>
-                <w:b/>
-                <w:bCs/>
-              </w:rPr>
-              <w:t>Course-</w:t>
-            </w:r>
-            <w:r>
-              <w:rPr>
-                <w:b/>
-                <w:bCs/>
-              </w:rPr>
-              <w:t>0</w:t>
-            </w:r>
-            <w:r>
-              <w:rPr>
-                <w:b/>
-                <w:bCs/>
-              </w:rPr>
-              <w:t xml:space="preserve">3: </w:t>
-            </w:r>
-            <w:r>
-              <w:rPr>
-                <w:b/>
-                <w:bCs/>
-              </w:rPr>
-              <w:t xml:space="preserve">Project Management &amp; </w:t>
-            </w:r>
-            <w:r>
-              <w:rPr>
-                <w:b/>
-                <w:bCs/>
-              </w:rPr>
-              <w:t>DevOps</w:t>
-            </w:r>
-          </w:p>
-        </w:tc>
-        <w:tc>
-          <w:tcPr>
-            <w:tcW w:w="1374" w:type="pct"/>
-            <w:gridSpan w:val="3"/>
-            <w:shd w:val="clear" w:color="auto" w:fill="002060"/>
-            <w:vAlign w:val="center"/>
-          </w:tcPr>
-          <w:p>
-            <w:pPr>
-              <w:rPr>
-                <w:b/>
-                <w:bCs/>
-              </w:rPr>
-            </w:pPr>
-            <w:r>
-              <w:rPr>
-                <w:b/>
-                <w:bCs/>
-              </w:rPr>
-              <w:t xml:space="preserve">Duration: (4 + 2) Months </w:t>
-            </w:r>
-          </w:p>
-        </w:tc>
-      </w:tr>
-      <w:tr>
-        <w:tc>
-          <w:tcPr>
-            <w:tcW w:w="522" w:type="pct"/>
-            <w:shd w:val="clear" w:color="auto" w:fill="E7E6E6" w:themeFill="background2"/>
-          </w:tcPr>
-          <w:p>
-            <w:r>
-              <w:t>01</w:t>
-            </w:r>
-          </w:p>
-        </w:tc>
-        <w:tc>
-          <w:tcPr>
-            <w:tcW w:w="2369" w:type="pct"/>
-            <w:shd w:val="clear" w:color="auto" w:fill="E7E6E6" w:themeFill="background2"/>
-          </w:tcPr>
-          <w:p>
-            <w:r>
-              <w:t>Software Project Management: Reference-1</w:t>
-            </w:r>
-          </w:p>
-        </w:tc>
-        <w:tc>
-          <w:tcPr>
-            <w:tcW w:w="735" w:type="pct"/>
-            <w:shd w:val="clear" w:color="auto" w:fill="E7E6E6" w:themeFill="background2"/>
-          </w:tcPr>
-          <w:p>
-            <w:r>
-              <w:t>T-H3 + S-H4</w:t>
-            </w:r>
-          </w:p>
-        </w:tc>
-        <w:tc>
-          <w:tcPr>
-            <w:tcW w:w="371" w:type="pct"/>
-            <w:shd w:val="clear" w:color="auto" w:fill="E7E6E6" w:themeFill="background2"/>
-          </w:tcPr>
-          <w:p>
-            <w:r>
-              <w:t>12</w:t>
-            </w:r>
-          </w:p>
-        </w:tc>
-        <w:tc>
-          <w:tcPr>
-            <w:tcW w:w="559" w:type="pct"/>
-            <w:shd w:val="clear" w:color="auto" w:fill="E7E6E6" w:themeFill="background2"/>
-          </w:tcPr>
-          <w:p>
-            <w:r>
-              <w:t>290</w:t>
-            </w:r>
-          </w:p>
-        </w:tc>
-        <w:tc>
-          <w:tcPr>
-            <w:tcW w:w="444" w:type="pct"/>
-            <w:shd w:val="clear" w:color="auto" w:fill="E7E6E6" w:themeFill="background2"/>
-          </w:tcPr>
-          <w:p>
-            <w:r>
-              <w:t>718</w:t>
-            </w:r>
-          </w:p>
-        </w:tc>
-      </w:tr>
-      <w:tr>
-        <w:tc>
-          <w:tcPr>
-            <w:tcW w:w="522" w:type="pct"/>
-            <w:shd w:val="clear" w:color="auto" w:fill="E7E6E6" w:themeFill="background2"/>
-          </w:tcPr>
-          <w:p/>
-        </w:tc>
-        <w:tc>
-          <w:tcPr>
-            <w:tcW w:w="2369" w:type="pct"/>
-            <w:shd w:val="clear" w:color="auto" w:fill="E7E6E6" w:themeFill="background2"/>
-          </w:tcPr>
-          <w:p>
-            <w:r>
-              <w:t>Software Project Management: Reference-2</w:t>
-            </w:r>
-          </w:p>
-        </w:tc>
-        <w:tc>
-          <w:tcPr>
-            <w:tcW w:w="735" w:type="pct"/>
-            <w:shd w:val="clear" w:color="auto" w:fill="E7E6E6" w:themeFill="background2"/>
-          </w:tcPr>
-          <w:p/>
-        </w:tc>
-        <w:tc>
-          <w:tcPr>
-            <w:tcW w:w="371" w:type="pct"/>
-            <w:shd w:val="clear" w:color="auto" w:fill="E7E6E6" w:themeFill="background2"/>
-          </w:tcPr>
-          <w:p>
-            <w:r>
-              <w:t>23</w:t>
-            </w:r>
-          </w:p>
-        </w:tc>
-        <w:tc>
-          <w:tcPr>
-            <w:tcW w:w="559" w:type="pct"/>
-            <w:shd w:val="clear" w:color="auto" w:fill="E7E6E6" w:themeFill="background2"/>
-          </w:tcPr>
-          <w:p>
-            <w:r>
-              <w:t>364</w:t>
-            </w:r>
-          </w:p>
-        </w:tc>
-        <w:tc>
-          <w:tcPr>
-            <w:tcW w:w="444" w:type="pct"/>
-            <w:shd w:val="clear" w:color="auto" w:fill="E7E6E6" w:themeFill="background2"/>
-          </w:tcPr>
-          <w:p>
-            <w:r>
-              <w:t>498</w:t>
-            </w:r>
-          </w:p>
-        </w:tc>
-      </w:tr>
-      <w:tr>
-        <w:tc>
-          <w:tcPr>
-            <w:tcW w:w="522" w:type="pct"/>
-            <w:shd w:val="clear" w:color="auto" w:fill="E7E6E6" w:themeFill="background2"/>
-          </w:tcPr>
-          <w:p>
-            <w:r>
-              <w:t>02</w:t>
-            </w:r>
-          </w:p>
-        </w:tc>
-        <w:tc>
-          <w:tcPr>
-            <w:tcW w:w="2369" w:type="pct"/>
-            <w:shd w:val="clear" w:color="auto" w:fill="E7E6E6" w:themeFill="background2"/>
-          </w:tcPr>
-          <w:p>
-            <w:r>
-              <w:t>Software Metrics: Reference-1</w:t>
-            </w:r>
-          </w:p>
-        </w:tc>
-        <w:tc>
-          <w:tcPr>
-            <w:tcW w:w="735" w:type="pct"/>
-            <w:shd w:val="clear" w:color="auto" w:fill="E7E6E6" w:themeFill="background2"/>
-          </w:tcPr>
-          <w:p>
-            <w:r>
-              <w:t>T-H3 + S-H2</w:t>
-            </w:r>
-          </w:p>
-        </w:tc>
-        <w:tc>
-          <w:tcPr>
-            <w:tcW w:w="371" w:type="pct"/>
-            <w:shd w:val="clear" w:color="auto" w:fill="E7E6E6" w:themeFill="background2"/>
-          </w:tcPr>
-          <w:p>
-            <w:r>
-              <w:t>15</w:t>
-            </w:r>
-          </w:p>
-        </w:tc>
-        <w:tc>
-          <w:tcPr>
-            <w:tcW w:w="559" w:type="pct"/>
-            <w:shd w:val="clear" w:color="auto" w:fill="E7E6E6" w:themeFill="background2"/>
-          </w:tcPr>
-          <w:p>
-            <w:r>
-              <w:t>390</w:t>
-            </w:r>
-          </w:p>
-        </w:tc>
-        <w:tc>
-          <w:tcPr>
-            <w:tcW w:w="444" w:type="pct"/>
-            <w:shd w:val="clear" w:color="auto" w:fill="E7E6E6" w:themeFill="background2"/>
-          </w:tcPr>
-          <w:p>
-            <w:r>
-              <w:t>651</w:t>
-            </w:r>
-          </w:p>
-        </w:tc>
-      </w:tr>
-      <w:tr>
-        <w:tc>
-          <w:tcPr>
-            <w:tcW w:w="522" w:type="pct"/>
-            <w:shd w:val="clear" w:color="auto" w:fill="E7E6E6" w:themeFill="background2"/>
-          </w:tcPr>
-          <w:p/>
-        </w:tc>
-        <w:tc>
-          <w:tcPr>
-            <w:tcW w:w="2369" w:type="pct"/>
-            <w:shd w:val="clear" w:color="auto" w:fill="E7E6E6" w:themeFill="background2"/>
-          </w:tcPr>
-          <w:p>
-            <w:r>
-              <w:t>Software Metrics: Reference-2</w:t>
-            </w:r>
-          </w:p>
-        </w:tc>
-        <w:tc>
-          <w:tcPr>
-            <w:tcW w:w="735" w:type="pct"/>
-            <w:shd w:val="clear" w:color="auto" w:fill="E7E6E6" w:themeFill="background2"/>
-          </w:tcPr>
-          <w:p/>
-        </w:tc>
-        <w:tc>
-          <w:tcPr>
-            <w:tcW w:w="371" w:type="pct"/>
-            <w:shd w:val="clear" w:color="auto" w:fill="E7E6E6" w:themeFill="background2"/>
-          </w:tcPr>
-          <w:p>
-            <w:r>
-              <w:t>14</w:t>
-            </w:r>
-          </w:p>
-        </w:tc>
-        <w:tc>
-          <w:tcPr>
-            <w:tcW w:w="559" w:type="pct"/>
-            <w:shd w:val="clear" w:color="auto" w:fill="E7E6E6" w:themeFill="background2"/>
-          </w:tcPr>
-          <w:p>
-            <w:r>
-              <w:t>169</w:t>
-            </w:r>
-          </w:p>
-        </w:tc>
-        <w:tc>
-          <w:tcPr>
-            <w:tcW w:w="444" w:type="pct"/>
-            <w:shd w:val="clear" w:color="auto" w:fill="E7E6E6" w:themeFill="background2"/>
-          </w:tcPr>
-          <w:p>
-            <w:r>
-              <w:t>276</w:t>
-            </w:r>
-          </w:p>
-        </w:tc>
-      </w:tr>
-      <w:tr>
-        <w:tc>
-          <w:tcPr>
-            <w:tcW w:w="522" w:type="pct"/>
-            <w:shd w:val="clear" w:color="auto" w:fill="E7E6E6" w:themeFill="background2"/>
-          </w:tcPr>
-          <w:p>
-            <w:r>
-              <w:t>03</w:t>
-            </w:r>
-          </w:p>
-        </w:tc>
-        <w:tc>
-          <w:tcPr>
-            <w:tcW w:w="2369" w:type="pct"/>
-            <w:shd w:val="clear" w:color="auto" w:fill="E7E6E6" w:themeFill="background2"/>
-          </w:tcPr>
-          <w:p>
-            <w:r>
-              <w:t>Software Requirements</w:t>
-            </w:r>
-          </w:p>
-        </w:tc>
-        <w:tc>
-          <w:tcPr>
-            <w:tcW w:w="735" w:type="pct"/>
-            <w:shd w:val="clear" w:color="auto" w:fill="E7E6E6" w:themeFill="background2"/>
-          </w:tcPr>
-          <w:p>
-            <w:r>
-              <w:t>T-H3 + S-H2</w:t>
-            </w:r>
-          </w:p>
-        </w:tc>
-        <w:tc>
-          <w:tcPr>
-            <w:tcW w:w="371" w:type="pct"/>
-            <w:shd w:val="clear" w:color="auto" w:fill="E7E6E6" w:themeFill="background2"/>
-          </w:tcPr>
-          <w:p>
-            <w:r>
-              <w:t>11</w:t>
-            </w:r>
-          </w:p>
-        </w:tc>
-        <w:tc>
-          <w:tcPr>
-            <w:tcW w:w="559" w:type="pct"/>
-            <w:shd w:val="clear" w:color="auto" w:fill="E7E6E6" w:themeFill="background2"/>
-          </w:tcPr>
-          <w:p>
-            <w:r>
-              <w:t>126</w:t>
-            </w:r>
-          </w:p>
-        </w:tc>
-        <w:tc>
-          <w:tcPr>
-            <w:tcW w:w="444" w:type="pct"/>
-            <w:shd w:val="clear" w:color="auto" w:fill="E7E6E6" w:themeFill="background2"/>
-          </w:tcPr>
-          <w:p>
-            <w:r>
-              <w:t>399</w:t>
-            </w:r>
-          </w:p>
-        </w:tc>
-      </w:tr>
-      <w:tr>
-        <w:tc>
-          <w:tcPr>
-            <w:tcW w:w="522" w:type="pct"/>
-            <w:shd w:val="clear" w:color="auto" w:fill="FFF2CC" w:themeFill="accent4" w:themeFillTint="33"/>
-          </w:tcPr>
-          <w:p>
-            <w:pPr>
-              <w:rPr>
-                <w:b/>
-                <w:bCs/>
-              </w:rPr>
-            </w:pPr>
-          </w:p>
-        </w:tc>
-        <w:tc>
-          <w:tcPr>
-            <w:tcW w:w="2369" w:type="pct"/>
-            <w:shd w:val="clear" w:color="auto" w:fill="FFF2CC" w:themeFill="accent4" w:themeFillTint="33"/>
-          </w:tcPr>
-          <w:p>
-            <w:pPr>
-              <w:rPr>
-                <w:b/>
-                <w:bCs/>
-              </w:rPr>
-            </w:pPr>
-            <w:r>
-              <w:rPr>
-                <w:b/>
-                <w:bCs/>
-              </w:rPr>
-              <w:t xml:space="preserve">Theoretical Subjects </w:t>
-            </w:r>
-          </w:p>
-        </w:tc>
-        <w:tc>
-          <w:tcPr>
-            <w:tcW w:w="735" w:type="pct"/>
-            <w:shd w:val="clear" w:color="auto" w:fill="FFF2CC" w:themeFill="accent4" w:themeFillTint="33"/>
-          </w:tcPr>
-          <w:p>
-            <w:pPr>
-              <w:rPr>
-                <w:b/>
-                <w:bCs/>
-              </w:rPr>
-            </w:pPr>
-          </w:p>
-        </w:tc>
-        <w:tc>
-          <w:tcPr>
-            <w:tcW w:w="371" w:type="pct"/>
-            <w:shd w:val="clear" w:color="auto" w:fill="FFF2CC" w:themeFill="accent4" w:themeFillTint="33"/>
-          </w:tcPr>
-          <w:p>
-            <w:pPr>
-              <w:rPr>
-                <w:b/>
-                <w:bCs/>
-              </w:rPr>
-            </w:pPr>
-          </w:p>
-        </w:tc>
-        <w:tc>
-          <w:tcPr>
-            <w:tcW w:w="559" w:type="pct"/>
-            <w:shd w:val="clear" w:color="auto" w:fill="FFF2CC" w:themeFill="accent4" w:themeFillTint="33"/>
-          </w:tcPr>
-          <w:p>
-            <w:pPr>
-              <w:rPr>
-                <w:b/>
-                <w:bCs/>
-              </w:rPr>
-            </w:pPr>
-          </w:p>
-        </w:tc>
-        <w:tc>
-          <w:tcPr>
-            <w:tcW w:w="444" w:type="pct"/>
-            <w:shd w:val="clear" w:color="auto" w:fill="FFF2CC" w:themeFill="accent4" w:themeFillTint="33"/>
-          </w:tcPr>
-          <w:p>
-            <w:pPr>
-              <w:rPr>
-                <w:b/>
-                <w:bCs/>
-              </w:rPr>
-            </w:pPr>
-            <w:r>
-              <w:rPr>
-                <w:b/>
-                <w:bCs/>
-              </w:rPr>
-              <w:t>3930</w:t>
-            </w:r>
-          </w:p>
-        </w:tc>
-      </w:tr>
-      <w:tr>
-        <w:tc>
-          <w:tcPr>
-            <w:tcW w:w="522" w:type="pct"/>
-            <w:shd w:val="clear" w:color="auto" w:fill="E7E6E6" w:themeFill="background2"/>
-          </w:tcPr>
-          <w:p>
-            <w:pPr>
-              <w:rPr>
-                <w:b/>
-                <w:bCs/>
-                <w:color w:val="C00000"/>
-              </w:rPr>
-            </w:pPr>
-            <w:r>
-              <w:rPr>
-                <w:b/>
-                <w:bCs/>
-                <w:color w:val="C00000"/>
-              </w:rPr>
-              <w:t>0</w:t>
-            </w:r>
-            <w:r>
-              <w:rPr>
-                <w:b/>
-                <w:bCs/>
-                <w:color w:val="C00000"/>
-              </w:rPr>
-              <w:t>4</w:t>
-            </w:r>
-          </w:p>
-        </w:tc>
-        <w:tc>
-          <w:tcPr>
-            <w:tcW w:w="2369" w:type="pct"/>
-            <w:shd w:val="clear" w:color="auto" w:fill="E7E6E6" w:themeFill="background2"/>
-          </w:tcPr>
-          <w:p>
-            <w:r>
-              <w:t>DevOps Engineering: Reference-1</w:t>
-            </w:r>
-          </w:p>
-        </w:tc>
-        <w:tc>
-          <w:tcPr>
-            <w:tcW w:w="735" w:type="pct"/>
-            <w:shd w:val="clear" w:color="auto" w:fill="E7E6E6" w:themeFill="background2"/>
-          </w:tcPr>
-          <w:p>
-            <w:r>
-              <w:t>T-H3 + S-H4</w:t>
-            </w:r>
-          </w:p>
-        </w:tc>
-        <w:tc>
-          <w:tcPr>
-            <w:tcW w:w="371" w:type="pct"/>
-            <w:shd w:val="clear" w:color="auto" w:fill="E7E6E6" w:themeFill="background2"/>
-          </w:tcPr>
-          <w:p>
-            <w:r>
-              <w:t>28</w:t>
-            </w:r>
-          </w:p>
-        </w:tc>
-        <w:tc>
-          <w:tcPr>
-            <w:tcW w:w="559" w:type="pct"/>
-            <w:shd w:val="clear" w:color="auto" w:fill="E7E6E6" w:themeFill="background2"/>
-          </w:tcPr>
-          <w:p>
-            <w:r>
-              <w:t>165</w:t>
-            </w:r>
-          </w:p>
-        </w:tc>
-        <w:tc>
-          <w:tcPr>
-            <w:tcW w:w="444" w:type="pct"/>
-            <w:shd w:val="clear" w:color="auto" w:fill="E7E6E6" w:themeFill="background2"/>
-          </w:tcPr>
-          <w:p>
-            <w:r>
-              <w:t>435</w:t>
-            </w:r>
-          </w:p>
-        </w:tc>
-      </w:tr>
-      <w:tr>
-        <w:tc>
-          <w:tcPr>
-            <w:tcW w:w="522" w:type="pct"/>
-            <w:shd w:val="clear" w:color="auto" w:fill="E7E6E6" w:themeFill="background2"/>
-          </w:tcPr>
-          <w:p>
-            <w:pPr>
-              <w:rPr>
-                <w:b/>
-                <w:bCs/>
-                <w:color w:val="C00000"/>
-              </w:rPr>
-            </w:pPr>
-          </w:p>
-        </w:tc>
-        <w:tc>
-          <w:tcPr>
-            <w:tcW w:w="2369" w:type="pct"/>
-            <w:shd w:val="clear" w:color="auto" w:fill="E7E6E6" w:themeFill="background2"/>
-          </w:tcPr>
-          <w:p>
-            <w:r>
-              <w:t>DevOps Engineering: Reference-2</w:t>
-            </w:r>
-          </w:p>
-        </w:tc>
-        <w:tc>
-          <w:tcPr>
-            <w:tcW w:w="735" w:type="pct"/>
-            <w:shd w:val="clear" w:color="auto" w:fill="E7E6E6" w:themeFill="background2"/>
-          </w:tcPr>
-          <w:p/>
-        </w:tc>
-        <w:tc>
-          <w:tcPr>
-            <w:tcW w:w="371" w:type="pct"/>
-            <w:shd w:val="clear" w:color="auto" w:fill="E7E6E6" w:themeFill="background2"/>
-          </w:tcPr>
-          <w:p>
-            <w:r>
-              <w:t>15</w:t>
-            </w:r>
-          </w:p>
-        </w:tc>
-        <w:tc>
-          <w:tcPr>
-            <w:tcW w:w="559" w:type="pct"/>
-            <w:shd w:val="clear" w:color="auto" w:fill="E7E6E6" w:themeFill="background2"/>
-          </w:tcPr>
-          <w:p>
-            <w:r>
-              <w:t>241</w:t>
-            </w:r>
-          </w:p>
-        </w:tc>
-        <w:tc>
-          <w:tcPr>
-            <w:tcW w:w="444" w:type="pct"/>
-            <w:shd w:val="clear" w:color="auto" w:fill="E7E6E6" w:themeFill="background2"/>
-          </w:tcPr>
-          <w:p>
-            <w:r>
-              <w:t>489</w:t>
-            </w:r>
-          </w:p>
-        </w:tc>
-      </w:tr>
-      <w:tr>
-        <w:tc>
-          <w:tcPr>
-            <w:tcW w:w="522" w:type="pct"/>
-            <w:shd w:val="clear" w:color="auto" w:fill="E7E6E6" w:themeFill="background2"/>
-          </w:tcPr>
-          <w:p>
-            <w:pPr>
-              <w:rPr>
-                <w:b/>
-                <w:bCs/>
-                <w:color w:val="C00000"/>
-              </w:rPr>
-            </w:pPr>
-          </w:p>
-        </w:tc>
-        <w:tc>
-          <w:tcPr>
-            <w:tcW w:w="2369" w:type="pct"/>
-            <w:shd w:val="clear" w:color="auto" w:fill="E7E6E6" w:themeFill="background2"/>
-          </w:tcPr>
-          <w:p>
-            <w:r>
-              <w:t>DevOps Engineering: Reference-3</w:t>
-            </w:r>
-          </w:p>
-        </w:tc>
-        <w:tc>
-          <w:tcPr>
-            <w:tcW w:w="735" w:type="pct"/>
-            <w:shd w:val="clear" w:color="auto" w:fill="E7E6E6" w:themeFill="background2"/>
-          </w:tcPr>
-          <w:p/>
-        </w:tc>
-        <w:tc>
-          <w:tcPr>
-            <w:tcW w:w="371" w:type="pct"/>
-            <w:shd w:val="clear" w:color="auto" w:fill="E7E6E6" w:themeFill="background2"/>
-          </w:tcPr>
-          <w:p>
-            <w:r>
-              <w:t>09</w:t>
-            </w:r>
-          </w:p>
-        </w:tc>
-        <w:tc>
-          <w:tcPr>
-            <w:tcW w:w="559" w:type="pct"/>
-            <w:shd w:val="clear" w:color="auto" w:fill="E7E6E6" w:themeFill="background2"/>
-          </w:tcPr>
-          <w:p>
-            <w:r>
-              <w:t>96</w:t>
-            </w:r>
-          </w:p>
-        </w:tc>
-        <w:tc>
-          <w:tcPr>
-            <w:tcW w:w="444" w:type="pct"/>
-            <w:shd w:val="clear" w:color="auto" w:fill="E7E6E6" w:themeFill="background2"/>
-          </w:tcPr>
-          <w:p>
-            <w:r>
-              <w:t>148</w:t>
-            </w:r>
-          </w:p>
-        </w:tc>
-      </w:tr>
-      <w:tr>
-        <w:tc>
-          <w:tcPr>
-            <w:tcW w:w="522" w:type="pct"/>
-            <w:shd w:val="clear" w:color="auto" w:fill="E7E6E6" w:themeFill="background2"/>
-          </w:tcPr>
-          <w:p>
-            <w:r>
-              <w:rPr>
-                <w:b/>
-                <w:bCs/>
-                <w:color w:val="C00000"/>
-              </w:rPr>
-              <w:t>05</w:t>
-            </w:r>
-          </w:p>
-        </w:tc>
-        <w:tc>
-          <w:tcPr>
-            <w:tcW w:w="2369" w:type="pct"/>
-            <w:shd w:val="clear" w:color="auto" w:fill="E7E6E6" w:themeFill="background2"/>
-          </w:tcPr>
-          <w:p>
-            <w:r>
-              <w:t>Software Testing: Reference-1</w:t>
-            </w:r>
-          </w:p>
-        </w:tc>
-        <w:tc>
-          <w:tcPr>
-            <w:tcW w:w="735" w:type="pct"/>
-            <w:shd w:val="clear" w:color="auto" w:fill="E7E6E6" w:themeFill="background2"/>
-          </w:tcPr>
-          <w:p>
-            <w:r>
-              <w:t>T-H3 + S-H2</w:t>
-            </w:r>
-          </w:p>
-        </w:tc>
-        <w:tc>
-          <w:tcPr>
-            <w:tcW w:w="371" w:type="pct"/>
-            <w:shd w:val="clear" w:color="auto" w:fill="E7E6E6" w:themeFill="background2"/>
-          </w:tcPr>
-          <w:p>
-            <w:r>
-              <w:t>19</w:t>
-            </w:r>
-          </w:p>
-        </w:tc>
-        <w:tc>
-          <w:tcPr>
-            <w:tcW w:w="559" w:type="pct"/>
-            <w:shd w:val="clear" w:color="auto" w:fill="E7E6E6" w:themeFill="background2"/>
-          </w:tcPr>
-          <w:p>
-            <w:r>
-              <w:t>112</w:t>
-            </w:r>
-          </w:p>
-        </w:tc>
-        <w:tc>
-          <w:tcPr>
-            <w:tcW w:w="444" w:type="pct"/>
-            <w:shd w:val="clear" w:color="auto" w:fill="E7E6E6" w:themeFill="background2"/>
-          </w:tcPr>
-          <w:p>
-            <w:r>
-              <w:t>629</w:t>
-            </w:r>
-          </w:p>
-        </w:tc>
-      </w:tr>
-      <w:tr>
-        <w:tc>
-          <w:tcPr>
-            <w:tcW w:w="522" w:type="pct"/>
-            <w:shd w:val="clear" w:color="auto" w:fill="E7E6E6" w:themeFill="background2"/>
-          </w:tcPr>
-          <w:p/>
-        </w:tc>
-        <w:tc>
-          <w:tcPr>
-            <w:tcW w:w="2369" w:type="pct"/>
-            <w:shd w:val="clear" w:color="auto" w:fill="E7E6E6" w:themeFill="background2"/>
-          </w:tcPr>
-          <w:p>
-            <w:r>
-              <w:t>Software Testing: Reference-2</w:t>
-            </w:r>
-          </w:p>
-        </w:tc>
-        <w:tc>
-          <w:tcPr>
-            <w:tcW w:w="735" w:type="pct"/>
-            <w:shd w:val="clear" w:color="auto" w:fill="E7E6E6" w:themeFill="background2"/>
-          </w:tcPr>
-          <w:p/>
-        </w:tc>
-        <w:tc>
-          <w:tcPr>
-            <w:tcW w:w="371" w:type="pct"/>
-            <w:shd w:val="clear" w:color="auto" w:fill="E7E6E6" w:themeFill="background2"/>
-          </w:tcPr>
-          <w:p>
-            <w:r>
-              <w:t>21</w:t>
-            </w:r>
-          </w:p>
-        </w:tc>
-        <w:tc>
-          <w:tcPr>
-            <w:tcW w:w="559" w:type="pct"/>
-            <w:shd w:val="clear" w:color="auto" w:fill="E7E6E6" w:themeFill="background2"/>
-          </w:tcPr>
-          <w:p>
-            <w:r>
-              <w:t>285</w:t>
-            </w:r>
-          </w:p>
-        </w:tc>
-        <w:tc>
-          <w:tcPr>
-            <w:tcW w:w="444" w:type="pct"/>
-            <w:shd w:val="clear" w:color="auto" w:fill="E7E6E6" w:themeFill="background2"/>
-          </w:tcPr>
-          <w:p>
-            <w:r>
-              <w:t>573</w:t>
-            </w:r>
-          </w:p>
-        </w:tc>
-      </w:tr>
-      <w:tr>
-        <w:tc>
-          <w:tcPr>
-            <w:tcW w:w="522" w:type="pct"/>
-            <w:shd w:val="clear" w:color="auto" w:fill="002060"/>
-          </w:tcPr>
-          <w:p>
-            <w:pPr>
-              <w:rPr>
-                <w:b/>
-                <w:bCs/>
-              </w:rPr>
-            </w:pPr>
-          </w:p>
-        </w:tc>
-        <w:tc>
-          <w:tcPr>
-            <w:tcW w:w="2369" w:type="pct"/>
-            <w:shd w:val="clear" w:color="auto" w:fill="002060"/>
-          </w:tcPr>
-          <w:p>
-            <w:pPr>
-              <w:rPr>
-                <w:b/>
-                <w:bCs/>
-              </w:rPr>
-            </w:pPr>
-            <w:r>
-              <w:rPr>
-                <w:b/>
-                <w:bCs/>
-              </w:rPr>
-              <w:t>Lab Subjects</w:t>
-            </w:r>
-          </w:p>
-        </w:tc>
-        <w:tc>
-          <w:tcPr>
-            <w:tcW w:w="735" w:type="pct"/>
-            <w:shd w:val="clear" w:color="auto" w:fill="002060"/>
-          </w:tcPr>
-          <w:p>
-            <w:pPr>
-              <w:rPr>
-                <w:b/>
-                <w:bCs/>
-              </w:rPr>
-            </w:pPr>
-          </w:p>
-        </w:tc>
-        <w:tc>
-          <w:tcPr>
-            <w:tcW w:w="371" w:type="pct"/>
-            <w:shd w:val="clear" w:color="auto" w:fill="002060"/>
-          </w:tcPr>
-          <w:p>
-            <w:pPr>
-              <w:rPr>
-                <w:b/>
-                <w:bCs/>
-              </w:rPr>
-            </w:pPr>
-          </w:p>
-        </w:tc>
-        <w:tc>
-          <w:tcPr>
-            <w:tcW w:w="559" w:type="pct"/>
-            <w:shd w:val="clear" w:color="auto" w:fill="002060"/>
-          </w:tcPr>
-          <w:p>
-            <w:pPr>
-              <w:rPr>
-                <w:b/>
-                <w:bCs/>
-              </w:rPr>
-            </w:pPr>
-          </w:p>
-        </w:tc>
-        <w:tc>
-          <w:tcPr>
-            <w:tcW w:w="444" w:type="pct"/>
-            <w:shd w:val="clear" w:color="auto" w:fill="002060"/>
-          </w:tcPr>
-          <w:p>
-            <w:pPr>
-              <w:rPr>
-                <w:b/>
-                <w:bCs/>
-              </w:rPr>
-            </w:pPr>
-            <w:r>
-              <w:rPr>
-                <w:b/>
-                <w:bCs/>
-              </w:rPr>
-              <w:t>1072</w:t>
-            </w:r>
-          </w:p>
-        </w:tc>
-      </w:tr>
-      <w:tr>
-        <w:tc>
-          <w:tcPr>
-            <w:tcW w:w="522" w:type="pct"/>
-            <w:shd w:val="clear" w:color="auto" w:fill="E7E6E6" w:themeFill="background2"/>
-          </w:tcPr>
-          <w:p>
-            <w:r>
-              <w:t>01</w:t>
-            </w:r>
-          </w:p>
-        </w:tc>
-        <w:tc>
-          <w:tcPr>
-            <w:tcW w:w="2369" w:type="pct"/>
-            <w:shd w:val="clear" w:color="auto" w:fill="E7E6E6" w:themeFill="background2"/>
-          </w:tcPr>
-          <w:p>
-            <w:r>
-              <w:t xml:space="preserve">Cloud Computing and Virtualization </w:t>
-            </w:r>
-          </w:p>
-        </w:tc>
-        <w:tc>
-          <w:tcPr>
-            <w:tcW w:w="735" w:type="pct"/>
-            <w:shd w:val="clear" w:color="auto" w:fill="E7E6E6" w:themeFill="background2"/>
-          </w:tcPr>
-          <w:p>
-            <w:r>
-              <w:t>T-H3 + S-H2</w:t>
-            </w:r>
-          </w:p>
-        </w:tc>
-        <w:tc>
-          <w:tcPr>
-            <w:tcW w:w="371" w:type="pct"/>
-            <w:shd w:val="clear" w:color="auto" w:fill="E7E6E6" w:themeFill="background2"/>
-          </w:tcPr>
-          <w:p>
-            <w:r>
-              <w:t>16</w:t>
-            </w:r>
-          </w:p>
-        </w:tc>
-        <w:tc>
-          <w:tcPr>
-            <w:tcW w:w="559" w:type="pct"/>
-            <w:shd w:val="clear" w:color="auto" w:fill="E7E6E6" w:themeFill="background2"/>
-          </w:tcPr>
-          <w:p>
-            <w:r>
-              <w:t>257</w:t>
-            </w:r>
-          </w:p>
-        </w:tc>
-        <w:tc>
-          <w:tcPr>
-            <w:tcW w:w="444" w:type="pct"/>
-            <w:shd w:val="clear" w:color="auto" w:fill="E7E6E6" w:themeFill="background2"/>
-          </w:tcPr>
-          <w:p>
-            <w:r>
-              <w:t>558</w:t>
-            </w:r>
-          </w:p>
-        </w:tc>
-      </w:tr>
-      <w:tr>
-        <w:tc>
-          <w:tcPr>
-            <w:tcW w:w="522" w:type="pct"/>
-            <w:shd w:val="clear" w:color="auto" w:fill="E7E6E6" w:themeFill="background2"/>
-          </w:tcPr>
-          <w:p>
-            <w:r>
-              <w:t>02</w:t>
-            </w:r>
-          </w:p>
-        </w:tc>
-        <w:tc>
-          <w:tcPr>
-            <w:tcW w:w="2369" w:type="pct"/>
-            <w:shd w:val="clear" w:color="auto" w:fill="E7E6E6" w:themeFill="background2"/>
-          </w:tcPr>
-          <w:p>
-            <w:r>
-              <w:t>Linux Operating and DevOps Tools</w:t>
-            </w:r>
-          </w:p>
-        </w:tc>
-        <w:tc>
-          <w:tcPr>
-            <w:tcW w:w="735" w:type="pct"/>
-            <w:shd w:val="clear" w:color="auto" w:fill="E7E6E6" w:themeFill="background2"/>
-          </w:tcPr>
-          <w:p/>
-        </w:tc>
-        <w:tc>
-          <w:tcPr>
-            <w:tcW w:w="371" w:type="pct"/>
-            <w:shd w:val="clear" w:color="auto" w:fill="E7E6E6" w:themeFill="background2"/>
-          </w:tcPr>
-          <w:p/>
-        </w:tc>
-        <w:tc>
-          <w:tcPr>
-            <w:tcW w:w="559" w:type="pct"/>
-            <w:shd w:val="clear" w:color="auto" w:fill="E7E6E6" w:themeFill="background2"/>
-          </w:tcPr>
-          <w:p/>
-        </w:tc>
-        <w:tc>
-          <w:tcPr>
-            <w:tcW w:w="444" w:type="pct"/>
-            <w:shd w:val="clear" w:color="auto" w:fill="E7E6E6" w:themeFill="background2"/>
-          </w:tcPr>
-          <w:p/>
-        </w:tc>
-      </w:tr>
-      <w:tr>
-        <w:tc>
-          <w:tcPr>
-            <w:tcW w:w="522" w:type="pct"/>
-            <w:shd w:val="clear" w:color="auto" w:fill="E7E6E6" w:themeFill="background2"/>
-          </w:tcPr>
-          <w:p>
-            <w:r>
-              <w:t>0</w:t>
-            </w:r>
-            <w:r>
-              <w:t>3</w:t>
-            </w:r>
-          </w:p>
-        </w:tc>
-        <w:tc>
-          <w:tcPr>
-            <w:tcW w:w="2369" w:type="pct"/>
-            <w:shd w:val="clear" w:color="auto" w:fill="E7E6E6" w:themeFill="background2"/>
-          </w:tcPr>
-          <w:p>
-            <w:r>
-              <w:t>Calculus and Analytical Geometry: Reference-1</w:t>
-            </w:r>
-          </w:p>
-        </w:tc>
-        <w:tc>
-          <w:tcPr>
-            <w:tcW w:w="735" w:type="pct"/>
-            <w:shd w:val="clear" w:color="auto" w:fill="E7E6E6" w:themeFill="background2"/>
-          </w:tcPr>
-          <w:p>
-            <w:r>
-              <w:t>T-H3</w:t>
-            </w:r>
-          </w:p>
-        </w:tc>
-        <w:tc>
-          <w:tcPr>
-            <w:tcW w:w="371" w:type="pct"/>
-            <w:shd w:val="clear" w:color="auto" w:fill="E7E6E6" w:themeFill="background2"/>
-          </w:tcPr>
-          <w:p>
-            <w:r>
-              <w:t>15</w:t>
-            </w:r>
-          </w:p>
-        </w:tc>
-        <w:tc>
-          <w:tcPr>
-            <w:tcW w:w="559" w:type="pct"/>
-            <w:shd w:val="clear" w:color="auto" w:fill="E7E6E6" w:themeFill="background2"/>
-          </w:tcPr>
-          <w:p>
-            <w:r>
-              <w:t>120</w:t>
-            </w:r>
-          </w:p>
-        </w:tc>
-        <w:tc>
-          <w:tcPr>
-            <w:tcW w:w="444" w:type="pct"/>
-            <w:shd w:val="clear" w:color="auto" w:fill="E7E6E6" w:themeFill="background2"/>
-          </w:tcPr>
-          <w:p>
-            <w:r>
-              <w:t>1281</w:t>
-            </w:r>
-          </w:p>
-        </w:tc>
-      </w:tr>
-      <w:tr>
-        <w:tc>
-          <w:tcPr>
-            <w:tcW w:w="522" w:type="pct"/>
-            <w:shd w:val="clear" w:color="auto" w:fill="E7E6E6" w:themeFill="background2"/>
-          </w:tcPr>
-          <w:p/>
-        </w:tc>
-        <w:tc>
-          <w:tcPr>
-            <w:tcW w:w="2369" w:type="pct"/>
-            <w:shd w:val="clear" w:color="auto" w:fill="E7E6E6" w:themeFill="background2"/>
-          </w:tcPr>
-          <w:p>
-            <w:r>
-              <w:t>Calculus and Analytical Geometry: Reference-2</w:t>
-            </w:r>
-          </w:p>
-        </w:tc>
-        <w:tc>
-          <w:tcPr>
-            <w:tcW w:w="735" w:type="pct"/>
-            <w:shd w:val="clear" w:color="auto" w:fill="E7E6E6" w:themeFill="background2"/>
-          </w:tcPr>
-          <w:p/>
-        </w:tc>
-        <w:tc>
-          <w:tcPr>
-            <w:tcW w:w="371" w:type="pct"/>
-            <w:shd w:val="clear" w:color="auto" w:fill="E7E6E6" w:themeFill="background2"/>
-          </w:tcPr>
-          <w:p>
-            <w:r>
-              <w:t>25</w:t>
-            </w:r>
-          </w:p>
-        </w:tc>
-        <w:tc>
-          <w:tcPr>
-            <w:tcW w:w="559" w:type="pct"/>
-            <w:shd w:val="clear" w:color="auto" w:fill="E7E6E6" w:themeFill="background2"/>
-          </w:tcPr>
-          <w:p>
-            <w:r>
-              <w:t>178</w:t>
-            </w:r>
-          </w:p>
-        </w:tc>
-        <w:tc>
-          <w:tcPr>
-            <w:tcW w:w="444" w:type="pct"/>
-            <w:shd w:val="clear" w:color="auto" w:fill="E7E6E6" w:themeFill="background2"/>
-          </w:tcPr>
-          <w:p>
-            <w:r>
-              <w:t>1283</w:t>
-            </w:r>
-          </w:p>
-        </w:tc>
-      </w:tr>
-      <w:tr>
-        <w:tc>
-          <w:tcPr>
-            <w:tcW w:w="522" w:type="pct"/>
-            <w:shd w:val="clear" w:color="auto" w:fill="AEAAAA" w:themeFill="background2" w:themeFillShade="BF"/>
-          </w:tcPr>
-          <w:p>
-            <w:pPr>
-              <w:rPr>
-                <w:b/>
-                <w:bCs/>
-              </w:rPr>
-            </w:pPr>
-          </w:p>
-        </w:tc>
-        <w:tc>
-          <w:tcPr>
-            <w:tcW w:w="2369" w:type="pct"/>
-            <w:shd w:val="clear" w:color="auto" w:fill="AEAAAA" w:themeFill="background2" w:themeFillShade="BF"/>
-          </w:tcPr>
-          <w:p>
-            <w:pPr>
-              <w:rPr>
-                <w:b/>
-                <w:bCs/>
-              </w:rPr>
-            </w:pPr>
-            <w:r>
-              <w:rPr>
-                <w:b/>
-                <w:bCs/>
-              </w:rPr>
-              <w:t>Elective Subjects</w:t>
-            </w:r>
-          </w:p>
-        </w:tc>
-        <w:tc>
-          <w:tcPr>
-            <w:tcW w:w="735" w:type="pct"/>
-            <w:shd w:val="clear" w:color="auto" w:fill="AEAAAA" w:themeFill="background2" w:themeFillShade="BF"/>
-          </w:tcPr>
-          <w:p>
-            <w:pPr>
-              <w:rPr>
-                <w:b/>
-                <w:bCs/>
-              </w:rPr>
-            </w:pPr>
-          </w:p>
-        </w:tc>
-        <w:tc>
-          <w:tcPr>
-            <w:tcW w:w="371" w:type="pct"/>
-            <w:shd w:val="clear" w:color="auto" w:fill="AEAAAA" w:themeFill="background2" w:themeFillShade="BF"/>
-          </w:tcPr>
-          <w:p>
-            <w:pPr>
-              <w:rPr>
-                <w:b/>
-                <w:bCs/>
-              </w:rPr>
-            </w:pPr>
-          </w:p>
-        </w:tc>
-        <w:tc>
-          <w:tcPr>
-            <w:tcW w:w="559" w:type="pct"/>
-            <w:shd w:val="clear" w:color="auto" w:fill="AEAAAA" w:themeFill="background2" w:themeFillShade="BF"/>
-          </w:tcPr>
-          <w:p>
-            <w:pPr>
-              <w:rPr>
-                <w:b/>
-                <w:bCs/>
-              </w:rPr>
-            </w:pPr>
-            <w:r>
-              <w:rPr>
-                <w:b/>
-                <w:bCs/>
-              </w:rPr>
-              <w:t>257</w:t>
-            </w:r>
-          </w:p>
-        </w:tc>
-        <w:tc>
-          <w:tcPr>
-            <w:tcW w:w="444" w:type="pct"/>
-            <w:shd w:val="clear" w:color="auto" w:fill="AEAAAA" w:themeFill="background2" w:themeFillShade="BF"/>
-          </w:tcPr>
-          <w:p>
-            <w:pPr>
-              <w:rPr>
-                <w:b/>
-                <w:bCs/>
-              </w:rPr>
-            </w:pPr>
-            <w:r>
-              <w:rPr>
-                <w:b/>
-                <w:bCs/>
-              </w:rPr>
-              <w:t>978</w:t>
-            </w:r>
-          </w:p>
-        </w:tc>
-      </w:tr>
-    </w:tbl>
-    <w:p>
-      <w:pPr>
-        <w:spacing w:after="0"/>
-      </w:pPr>
-    </w:p>
-    <w:p>
-      <w:pPr>
-        <w:spacing w:after="0"/>
-      </w:pPr>
-    </w:p>
-    <w:p>
-      <w:pPr>
-        <w:spacing w:after="0"/>
-        <w:rPr>
-          <w:b/>
-          <w:bCs/>
-          <w:color w:val="C00000"/>
-          <w:sz w:val="28"/>
-        </w:rPr>
-      </w:pPr>
-      <w:r>
-        <w:rPr>
-          <w:b/>
-          <w:bCs/>
-          <w:color w:val="C00000"/>
-          <w:sz w:val="28"/>
-        </w:rPr>
-        <w:t xml:space="preserve">Course </w:t>
-      </w:r>
-      <w:proofErr w:type="gramStart"/>
-      <w:r>
-        <w:rPr>
-          <w:b/>
-          <w:bCs/>
-          <w:color w:val="C00000"/>
-          <w:sz w:val="28"/>
-        </w:rPr>
-        <w:t>Outcomes:-</w:t>
-      </w:r>
-      <w:proofErr w:type="gramEnd"/>
-    </w:p>
-    <w:p>
-      <w:pPr>
-        <w:pStyle w:val="ListParagraph"/>
-        <w:spacing w:after="0"/>
-      </w:pPr>
-    </w:p>
-    <w:p>
-      <w:pPr>
-        <w:pStyle w:val="ListParagraph"/>
-        <w:numPr>
-          <w:ilvl w:val="0"/>
-          <w:numId w:val="3"/>
-        </w:numPr>
-        <w:spacing w:after="0"/>
-      </w:pPr>
-      <w:r>
-        <w:t xml:space="preserve">Understanding all the Necessary Concept with Its – </w:t>
-      </w:r>
-    </w:p>
-    <w:p>
-      <w:pPr>
-        <w:pStyle w:val="ListParagraph"/>
-        <w:numPr>
-          <w:ilvl w:val="1"/>
-          <w:numId w:val="3"/>
-        </w:numPr>
-        <w:spacing w:after="0"/>
-      </w:pPr>
-      <w:r>
-        <w:t xml:space="preserve">Real-Life Professional Application and Problems </w:t>
-      </w:r>
-    </w:p>
-    <w:p>
-      <w:pPr>
-        <w:pStyle w:val="ListParagraph"/>
-        <w:numPr>
-          <w:ilvl w:val="1"/>
-          <w:numId w:val="3"/>
-        </w:numPr>
-        <w:spacing w:after="0"/>
-      </w:pPr>
-      <w:r>
-        <w:t xml:space="preserve">Comparison with Related Technology </w:t>
-      </w:r>
-    </w:p>
-    <w:p>
-      <w:pPr>
-        <w:pStyle w:val="ListParagraph"/>
-        <w:numPr>
-          <w:ilvl w:val="1"/>
-          <w:numId w:val="3"/>
-        </w:numPr>
-        <w:spacing w:after="0"/>
-      </w:pPr>
-      <w:r>
-        <w:t xml:space="preserve">Range, Domains and Classification  </w:t>
-      </w:r>
-    </w:p>
-    <w:p>
-      <w:pPr>
-        <w:pStyle w:val="ListParagraph"/>
-        <w:numPr>
-          <w:ilvl w:val="1"/>
-          <w:numId w:val="3"/>
-        </w:numPr>
-        <w:spacing w:after="0"/>
-      </w:pPr>
-      <w:r>
-        <w:t>Invention and Evolution</w:t>
-      </w:r>
-    </w:p>
-    <w:p>
-      <w:pPr>
-        <w:pStyle w:val="ListParagraph"/>
-        <w:numPr>
-          <w:ilvl w:val="0"/>
-          <w:numId w:val="3"/>
-        </w:numPr>
-        <w:spacing w:after="0"/>
-      </w:pPr>
-      <w:r>
-        <w:t xml:space="preserve">Fundamental Software Development Life-Cycle </w:t>
-      </w:r>
-    </w:p>
-    <w:p>
-      <w:pPr>
-        <w:pStyle w:val="ListParagraph"/>
-        <w:numPr>
-          <w:ilvl w:val="0"/>
-          <w:numId w:val="3"/>
-        </w:numPr>
-        <w:spacing w:after="0"/>
-      </w:pPr>
-      <w:r>
-        <w:t xml:space="preserve">Fundamental of Development Process </w:t>
-      </w:r>
-    </w:p>
-    <w:p>
-      <w:pPr>
-        <w:pStyle w:val="ListParagraph"/>
-        <w:numPr>
-          <w:ilvl w:val="0"/>
-          <w:numId w:val="3"/>
-        </w:numPr>
-        <w:spacing w:after="0"/>
-      </w:pPr>
-      <w:r>
-        <w:t xml:space="preserve">Application of Project Management   </w:t>
-      </w:r>
-    </w:p>
-    <w:p>
-      <w:pPr>
-        <w:pStyle w:val="ListParagraph"/>
-        <w:numPr>
-          <w:ilvl w:val="0"/>
-          <w:numId w:val="3"/>
-        </w:numPr>
-        <w:spacing w:after="0"/>
-      </w:pPr>
-      <w:r>
-        <w:t xml:space="preserve">Application of DevOps Engineering </w:t>
-      </w:r>
-    </w:p>
-    <w:p>
-      <w:pPr>
-        <w:pStyle w:val="ListParagraph"/>
-        <w:numPr>
-          <w:ilvl w:val="0"/>
-          <w:numId w:val="3"/>
-        </w:numPr>
-        <w:spacing w:after="0"/>
-      </w:pPr>
-      <w:r>
-        <w:t xml:space="preserve">Application of </w:t>
-      </w:r>
-      <w:r>
-        <w:t xml:space="preserve">Software Testing </w:t>
-      </w:r>
-      <w:r>
-        <w:t xml:space="preserve">  </w:t>
-      </w:r>
-    </w:p>
-    <w:p>
-      <w:pPr>
-        <w:spacing w:after="0"/>
-      </w:pPr>
-      <w:r>
-        <w:t xml:space="preserve">  </w:t>
-      </w:r>
-    </w:p>
-    <w:p>
-      <w:pPr>
-        <w:pStyle w:val="Heading2"/>
-        <w:rPr>
-          <w:b/>
-          <w:bCs/>
-          <w:color w:val="C00000"/>
-        </w:rPr>
-      </w:pPr>
-      <w:r>
-        <w:rPr>
-          <w:b/>
-          <w:bCs/>
-          <w:color w:val="C00000"/>
-        </w:rPr>
-        <w:lastRenderedPageBreak/>
-        <w:t xml:space="preserve">Year-02.2: DevOps and Design </w:t>
+        <w:t xml:space="preserve"> and Design </w:t>
       </w:r>
       <w:r>
         <w:rPr>
@@ -6999,15 +6865,7 @@
           </w:tcPr>
           <w:p>
             <w:r>
-              <w:t xml:space="preserve">Ordinary Differential </w:t>
-            </w:r>
-            <w:proofErr w:type="gramStart"/>
-            <w:r>
-              <w:t>Equation :</w:t>
-            </w:r>
-            <w:proofErr w:type="gramEnd"/>
-            <w:r>
-              <w:t xml:space="preserve"> Reference-1</w:t>
+              <w:t>Ordinary Differential Equation : Reference-1</w:t>
             </w:r>
           </w:p>
         </w:tc>
@@ -7071,15 +6929,7 @@
           </w:tcPr>
           <w:p>
             <w:r>
-              <w:t xml:space="preserve">Ordinary Differential </w:t>
-            </w:r>
-            <w:proofErr w:type="gramStart"/>
-            <w:r>
-              <w:t>Equation :</w:t>
-            </w:r>
-            <w:proofErr w:type="gramEnd"/>
-            <w:r>
-              <w:t xml:space="preserve"> Reference-1</w:t>
+              <w:t>Ordinary Differential Equation : Reference-1</w:t>
             </w:r>
           </w:p>
         </w:tc>
@@ -7252,19 +7102,8 @@
           <w:color w:val="C00000"/>
           <w:sz w:val="28"/>
         </w:rPr>
-        <w:t xml:space="preserve">Course </w:t>
-      </w:r>
-      <w:proofErr w:type="gramStart"/>
-      <w:r>
-        <w:rPr>
-          <w:b/>
-          <w:bCs/>
-          <w:color w:val="C00000"/>
-          <w:sz w:val="28"/>
-        </w:rPr>
-        <w:t>Outcomes:-</w:t>
-      </w:r>
-      <w:proofErr w:type="gramEnd"/>
+        <w:t>Course Outcomes:-</w:t>
+      </w:r>
     </w:p>
     <w:p>
       <w:pPr>
@@ -8700,19 +8539,8 @@
           <w:color w:val="C00000"/>
           <w:sz w:val="28"/>
         </w:rPr>
-        <w:t xml:space="preserve">Course </w:t>
-      </w:r>
-      <w:proofErr w:type="gramStart"/>
-      <w:r>
-        <w:rPr>
-          <w:b/>
-          <w:bCs/>
-          <w:color w:val="C00000"/>
-          <w:sz w:val="28"/>
-        </w:rPr>
-        <w:t>Outcomes:-</w:t>
-      </w:r>
-      <w:proofErr w:type="gramEnd"/>
+        <w:t>Course Outcomes:-</w:t>
+      </w:r>
     </w:p>
     <w:p>
       <w:pPr>
@@ -10007,19 +9835,8 @@
           <w:color w:val="C00000"/>
           <w:sz w:val="28"/>
         </w:rPr>
-        <w:t xml:space="preserve">Course </w:t>
-      </w:r>
-      <w:proofErr w:type="gramStart"/>
-      <w:r>
-        <w:rPr>
-          <w:b/>
-          <w:bCs/>
-          <w:color w:val="C00000"/>
-          <w:sz w:val="28"/>
-        </w:rPr>
-        <w:t>Outcomes:-</w:t>
-      </w:r>
-      <w:proofErr w:type="gramEnd"/>
+        <w:t>Course Outcomes:-</w:t>
+      </w:r>
     </w:p>
     <w:p>
       <w:pPr>
@@ -11911,10 +11728,7 @@
               </w:rPr>
             </w:pPr>
             <w:r>
-              <w:t>0</w:t>
-            </w:r>
-            <w:r>
-              <w:t>1</w:t>
+              <w:t>01</w:t>
             </w:r>
           </w:p>
         </w:tc>
@@ -12203,39 +12017,7 @@
           <w:bCs/>
           <w:color w:val="C00000"/>
         </w:rPr>
-        <w:t>5</w:t>
-      </w:r>
-      <w:r>
-        <w:rPr>
-          <w:b/>
-          <w:bCs/>
-          <w:color w:val="C00000"/>
-        </w:rPr>
-        <w:t>.</w:t>
-      </w:r>
-      <w:r>
-        <w:rPr>
-          <w:b/>
-          <w:bCs/>
-          <w:color w:val="C00000"/>
-        </w:rPr>
-        <w:t>1</w:t>
-      </w:r>
-      <w:r>
-        <w:rPr>
-          <w:b/>
-          <w:bCs/>
-          <w:color w:val="C00000"/>
-        </w:rPr>
-        <w:t xml:space="preserve">: </w:t>
-      </w:r>
-      <w:r>
-        <w:rPr>
-          <w:b/>
-          <w:bCs/>
-          <w:color w:val="C00000"/>
-        </w:rPr>
-        <w:t xml:space="preserve">Electronics and Robotics </w:t>
+        <w:t xml:space="preserve">5.1: Electronics and Robotics </w:t>
       </w:r>
     </w:p>
     <w:p/>
@@ -12479,10 +12261,7 @@
           </w:tcPr>
           <w:p>
             <w:r>
-              <w:t xml:space="preserve">Digital Signal Procession </w:t>
-            </w:r>
-            <w:r>
-              <w:t xml:space="preserve"> </w:t>
+              <w:t xml:space="preserve">Digital Signal Procession  </w:t>
             </w:r>
           </w:p>
         </w:tc>
@@ -13168,31 +12947,7 @@
           <w:bCs/>
           <w:color w:val="C00000"/>
         </w:rPr>
-        <w:t>.</w:t>
-      </w:r>
-      <w:r>
-        <w:rPr>
-          <w:b/>
-          <w:bCs/>
-          <w:color w:val="C00000"/>
-        </w:rPr>
-        <w:t>2</w:t>
-      </w:r>
-      <w:r>
-        <w:rPr>
-          <w:b/>
-          <w:bCs/>
-          <w:color w:val="C00000"/>
-        </w:rPr>
-        <w:t xml:space="preserve">: </w:t>
-      </w:r>
-      <w:r>
-        <w:rPr>
-          <w:b/>
-          <w:bCs/>
-          <w:color w:val="C00000"/>
-        </w:rPr>
-        <w:t xml:space="preserve">Electronics and Robotics </w:t>
+        <w:t xml:space="preserve">.2: Electronics and Robotics </w:t>
       </w:r>
     </w:p>
     <w:p/>
@@ -13380,21 +13135,7 @@
           </w:tcPr>
           <w:p>
             <w:r>
-              <w:t xml:space="preserve">Physics – </w:t>
-            </w:r>
-            <w:proofErr w:type="gramStart"/>
-            <w:r>
-              <w:t xml:space="preserve">2 </w:t>
-            </w:r>
-            <w:r>
-              <w:t xml:space="preserve"> </w:t>
-            </w:r>
-            <w:r>
-              <w:t>(</w:t>
-            </w:r>
-            <w:proofErr w:type="gramEnd"/>
-            <w:r>
-              <w:t>Thermal)</w:t>
+              <w:t>Physics – 2  (Thermal)</w:t>
             </w:r>
           </w:p>
         </w:tc>
@@ -13450,10 +13191,7 @@
           </w:tcPr>
           <w:p>
             <w:r>
-              <w:t xml:space="preserve">Physics – 3 (Web and Optics) </w:t>
-            </w:r>
-            <w:r>
-              <w:t xml:space="preserve"> </w:t>
+              <w:t xml:space="preserve">Physics – 3 (Web and Optics)  </w:t>
             </w:r>
           </w:p>
         </w:tc>
@@ -14824,15 +14562,7 @@
           </w:tcPr>
           <w:p>
             <w:r>
-              <w:t>API, Authentication (</w:t>
-            </w:r>
-            <w:proofErr w:type="spellStart"/>
-            <w:r>
-              <w:t>JWT|QAuth</w:t>
-            </w:r>
-            <w:proofErr w:type="spellEnd"/>
-            <w:r>
-              <w:t>) and Advanced JavaScript</w:t>
+              <w:t>API, Authentication (JWT|QAuth) and Advanced JavaScript</w:t>
             </w:r>
           </w:p>
         </w:tc>
@@ -15143,23 +14873,7 @@
           </w:tcPr>
           <w:p>
             <w:r>
-              <w:t>Test Framework (</w:t>
-            </w:r>
-            <w:proofErr w:type="spellStart"/>
-            <w:r>
-              <w:t>Cypress|Appium</w:t>
-            </w:r>
-            <w:proofErr w:type="spellEnd"/>
-            <w:r>
-              <w:t xml:space="preserve">), </w:t>
-            </w:r>
-            <w:proofErr w:type="spellStart"/>
-            <w:r>
-              <w:t>Perofrmance</w:t>
-            </w:r>
-            <w:proofErr w:type="spellEnd"/>
-            <w:r>
-              <w:t xml:space="preserve"> Testing </w:t>
+              <w:t xml:space="preserve">Test Framework (Cypress|Appium), Perofrmance Testing </w:t>
             </w:r>
           </w:p>
         </w:tc>
@@ -17008,13 +16722,8 @@
               </w:numPr>
               <w:ind w:left="211" w:hanging="240"/>
             </w:pPr>
-            <w:proofErr w:type="spellStart"/>
-            <w:r>
-              <w:t>FreeCodeCamp</w:t>
-            </w:r>
-            <w:proofErr w:type="spellEnd"/>
-            <w:r>
-              <w:t xml:space="preserve"> Web Dev Guide </w:t>
+            <w:r>
+              <w:t xml:space="preserve">FreeCodeCamp Web Dev Guide </w:t>
             </w:r>
           </w:p>
         </w:tc>
@@ -17236,15 +16945,7 @@
               <w:ind w:left="211" w:hanging="240"/>
             </w:pPr>
             <w:r>
-              <w:t xml:space="preserve">Frontend Mastery by </w:t>
-            </w:r>
-            <w:proofErr w:type="spellStart"/>
-            <w:r>
-              <w:t>Codecademy</w:t>
-            </w:r>
-            <w:proofErr w:type="spellEnd"/>
-            <w:r>
-              <w:t xml:space="preserve"> </w:t>
+              <w:t xml:space="preserve">Frontend Mastery by Codecademy </w:t>
             </w:r>
           </w:p>
         </w:tc>
@@ -17644,15 +17345,7 @@
               <w:ind w:left="211" w:hanging="240"/>
             </w:pPr>
             <w:r>
-              <w:t xml:space="preserve">Continuous Testing for DevOps Professionals by Katrina </w:t>
-            </w:r>
-            <w:proofErr w:type="spellStart"/>
-            <w:r>
-              <w:t>Clokie</w:t>
-            </w:r>
-            <w:proofErr w:type="spellEnd"/>
-            <w:r>
-              <w:t xml:space="preserve"> </w:t>
+              <w:t xml:space="preserve">Continuous Testing for DevOps Professionals by Katrina Clokie </w:t>
             </w:r>
           </w:p>
         </w:tc>
@@ -17982,23 +17675,7 @@
               <w:ind w:left="211" w:hanging="240"/>
             </w:pPr>
             <w:r>
-              <w:t>Mentorship Programs (</w:t>
-            </w:r>
-            <w:proofErr w:type="spellStart"/>
-            <w:r>
-              <w:t>linkedIn</w:t>
-            </w:r>
-            <w:proofErr w:type="spellEnd"/>
-            <w:r>
-              <w:t xml:space="preserve"> </w:t>
-            </w:r>
-            <w:proofErr w:type="spellStart"/>
-            <w:r>
-              <w:t>Learnig</w:t>
-            </w:r>
-            <w:proofErr w:type="spellEnd"/>
-            <w:r>
-              <w:t xml:space="preserve">) </w:t>
+              <w:t xml:space="preserve">Mentorship Programs (linkedIn Learnig) </w:t>
             </w:r>
           </w:p>
           <w:p>
@@ -20030,79 +19707,33 @@
                 <w:sz w:val="24"/>
                 <w:szCs w:val="24"/>
               </w:rPr>
-              <w:t xml:space="preserve">- Learn objects, arrays, and data structures - Asynchronous JavaScript (callbacks, promises, async/await) - Introduction to basic JavaScript libraries (e.g., </w:t>
-            </w:r>
-            <w:proofErr w:type="spellStart"/>
-            <w:r>
+              <w:t>- Learn objects, arrays, and data structures - Asynchronous JavaScript (callbacks, promises, async/await) - Introduction to basic JavaScript libraries (e.g., Lodash)</w:t>
+            </w:r>
+          </w:p>
+        </w:tc>
+        <w:tc>
+          <w:tcPr>
+            <w:tcW w:w="0" w:type="auto"/>
+            <w:vAlign w:val="center"/>
+            <w:hideMark/>
+          </w:tcPr>
+          <w:p>
+            <w:pPr>
+              <w:spacing w:after="0" w:line="240" w:lineRule="auto"/>
               <w:rPr>
                 <w:rFonts w:eastAsia="Times New Roman" w:cstheme="minorHAnsi"/>
                 <w:sz w:val="24"/>
                 <w:szCs w:val="24"/>
               </w:rPr>
-              <w:t>Lodash</w:t>
-            </w:r>
-            <w:proofErr w:type="spellEnd"/>
+            </w:pPr>
             <w:r>
               <w:rPr>
                 <w:rFonts w:eastAsia="Times New Roman" w:cstheme="minorHAnsi"/>
                 <w:sz w:val="24"/>
                 <w:szCs w:val="24"/>
               </w:rPr>
-              <w:t>)</w:t>
-            </w:r>
-          </w:p>
-        </w:tc>
-        <w:tc>
-          <w:tcPr>
-            <w:tcW w:w="0" w:type="auto"/>
-            <w:vAlign w:val="center"/>
-            <w:hideMark/>
-          </w:tcPr>
-          <w:p>
-            <w:pPr>
-              <w:spacing w:after="0" w:line="240" w:lineRule="auto"/>
-              <w:rPr>
-                <w:rFonts w:eastAsia="Times New Roman" w:cstheme="minorHAnsi"/>
-                <w:sz w:val="24"/>
-                <w:szCs w:val="24"/>
-              </w:rPr>
-            </w:pPr>
-            <w:r>
-              <w:rPr>
-                <w:rFonts w:eastAsia="Times New Roman" w:cstheme="minorHAnsi"/>
-                <w:sz w:val="24"/>
-                <w:szCs w:val="24"/>
-              </w:rPr>
-              <w:t xml:space="preserve">- Build a simple interactive app (e.g., to-do list) - Complete JavaScript practice exercises on platforms like </w:t>
-            </w:r>
-            <w:proofErr w:type="spellStart"/>
-            <w:r>
-              <w:rPr>
-                <w:rFonts w:eastAsia="Times New Roman" w:cstheme="minorHAnsi"/>
-                <w:sz w:val="24"/>
-                <w:szCs w:val="24"/>
-              </w:rPr>
-              <w:t>FreeCodeCamp</w:t>
-            </w:r>
-            <w:proofErr w:type="spellEnd"/>
-            <w:r>
-              <w:rPr>
-                <w:rFonts w:eastAsia="Times New Roman" w:cstheme="minorHAnsi"/>
-                <w:sz w:val="24"/>
-                <w:szCs w:val="24"/>
-              </w:rPr>
-              <w:t xml:space="preserve"> or </w:t>
-            </w:r>
-            <w:proofErr w:type="spellStart"/>
-            <w:r>
-              <w:rPr>
-                <w:rFonts w:eastAsia="Times New Roman" w:cstheme="minorHAnsi"/>
-                <w:sz w:val="24"/>
-                <w:szCs w:val="24"/>
-              </w:rPr>
-              <w:t>Codecademy</w:t>
-            </w:r>
-            <w:proofErr w:type="spellEnd"/>
+              <w:t>- Build a simple interactive app (e.g., to-do list) - Complete JavaScript practice exercises on platforms like FreeCodeCamp or Codecademy</w:t>
+            </w:r>
           </w:p>
         </w:tc>
       </w:tr>
@@ -20185,68 +19816,32 @@
                 <w:sz w:val="24"/>
                 <w:szCs w:val="24"/>
               </w:rPr>
-              <w:t xml:space="preserve">- Learn ES6+ features (arrow functions, </w:t>
-            </w:r>
-            <w:proofErr w:type="spellStart"/>
-            <w:r>
+              <w:t>- Learn ES6+ features (arrow functions, destructuring, modules) - Learn to use Web APIs (local storage, fetch API)</w:t>
+            </w:r>
+          </w:p>
+        </w:tc>
+        <w:tc>
+          <w:tcPr>
+            <w:tcW w:w="0" w:type="auto"/>
+            <w:vAlign w:val="center"/>
+            <w:hideMark/>
+          </w:tcPr>
+          <w:p>
+            <w:pPr>
+              <w:spacing w:after="0" w:line="240" w:lineRule="auto"/>
               <w:rPr>
                 <w:rFonts w:eastAsia="Times New Roman" w:cstheme="minorHAnsi"/>
                 <w:sz w:val="24"/>
                 <w:szCs w:val="24"/>
               </w:rPr>
-              <w:t>destructuring</w:t>
-            </w:r>
-            <w:proofErr w:type="spellEnd"/>
+            </w:pPr>
             <w:r>
               <w:rPr>
                 <w:rFonts w:eastAsia="Times New Roman" w:cstheme="minorHAnsi"/>
                 <w:sz w:val="24"/>
                 <w:szCs w:val="24"/>
               </w:rPr>
-              <w:t>, modules) - Learn to use Web APIs (local storage, fetch API)</w:t>
-            </w:r>
-          </w:p>
-        </w:tc>
-        <w:tc>
-          <w:tcPr>
-            <w:tcW w:w="0" w:type="auto"/>
-            <w:vAlign w:val="center"/>
-            <w:hideMark/>
-          </w:tcPr>
-          <w:p>
-            <w:pPr>
-              <w:spacing w:after="0" w:line="240" w:lineRule="auto"/>
-              <w:rPr>
-                <w:rFonts w:eastAsia="Times New Roman" w:cstheme="minorHAnsi"/>
-                <w:sz w:val="24"/>
-                <w:szCs w:val="24"/>
-              </w:rPr>
-            </w:pPr>
-            <w:r>
-              <w:rPr>
-                <w:rFonts w:eastAsia="Times New Roman" w:cstheme="minorHAnsi"/>
-                <w:sz w:val="24"/>
-                <w:szCs w:val="24"/>
-              </w:rPr>
-              <w:t xml:space="preserve">- Refactor existing projects with ES6+ features - Build a project that interacts with a Web API (e.g., weather app using </w:t>
-            </w:r>
-            <w:proofErr w:type="spellStart"/>
-            <w:r>
-              <w:rPr>
-                <w:rFonts w:eastAsia="Times New Roman" w:cstheme="minorHAnsi"/>
-                <w:sz w:val="24"/>
-                <w:szCs w:val="24"/>
-              </w:rPr>
-              <w:t>OpenWeather</w:t>
-            </w:r>
-            <w:proofErr w:type="spellEnd"/>
-            <w:r>
-              <w:rPr>
-                <w:rFonts w:eastAsia="Times New Roman" w:cstheme="minorHAnsi"/>
-                <w:sz w:val="24"/>
-                <w:szCs w:val="24"/>
-              </w:rPr>
-              <w:t xml:space="preserve"> API)</w:t>
+              <w:t>- Refactor existing projects with ES6+ features - Build a project that interacts with a Web API (e.g., weather app using OpenWeather API)</w:t>
             </w:r>
           </w:p>
         </w:tc>
@@ -22292,25 +21887,7 @@
           <w:sz w:val="24"/>
           <w:szCs w:val="24"/>
         </w:rPr>
-        <w:t xml:space="preserve">: Typically, students use an Integrated Development Environment (IDE) like </w:t>
-      </w:r>
-      <w:proofErr w:type="gramStart"/>
-      <w:r>
-        <w:rPr>
-          <w:rFonts w:ascii="Times New Roman" w:eastAsia="Times New Roman" w:hAnsi="Times New Roman" w:cs="Times New Roman"/>
-          <w:sz w:val="24"/>
-          <w:szCs w:val="24"/>
-        </w:rPr>
-        <w:t>Code::</w:t>
-      </w:r>
-      <w:proofErr w:type="gramEnd"/>
-      <w:r>
-        <w:rPr>
-          <w:rFonts w:ascii="Times New Roman" w:eastAsia="Times New Roman" w:hAnsi="Times New Roman" w:cs="Times New Roman"/>
-          <w:sz w:val="24"/>
-          <w:szCs w:val="24"/>
-        </w:rPr>
-        <w:t>Blocks, Visual Studio, or any other relevant programming tools provided by the department.</w:t>
+        <w:t>: Typically, students use an Integrated Development Environment (IDE) like Code::Blocks, Visual Studio, or any other relevant programming tools provided by the department.</w:t>
       </w:r>
     </w:p>
     <w:p>
@@ -28509,23 +28086,13 @@
               </w:rPr>
               <w:t xml:space="preserve"> statements, </w:t>
             </w:r>
-            <w:proofErr w:type="gramStart"/>
             <w:r>
               <w:rPr>
                 <w:rFonts w:ascii="Courier New" w:eastAsia="Times New Roman" w:hAnsi="Courier New" w:cs="Courier New"/>
                 <w:sz w:val="20"/>
                 <w:szCs w:val="20"/>
               </w:rPr>
-              <w:t>main(</w:t>
-            </w:r>
-            <w:proofErr w:type="gramEnd"/>
-            <w:r>
-              <w:rPr>
-                <w:rFonts w:ascii="Courier New" w:eastAsia="Times New Roman" w:hAnsi="Courier New" w:cs="Courier New"/>
-                <w:sz w:val="20"/>
-                <w:szCs w:val="20"/>
-              </w:rPr>
-              <w:t>)</w:t>
+              <w:t>main()</w:t>
             </w:r>
             <w:r>
               <w:rPr>
@@ -28770,69 +28337,29 @@
               </w:rPr>
               <w:t xml:space="preserve">Introduction to basic input/output functions in C such as </w:t>
             </w:r>
-            <w:proofErr w:type="spellStart"/>
-            <w:proofErr w:type="gramStart"/>
             <w:r>
               <w:rPr>
                 <w:rFonts w:ascii="Courier New" w:eastAsia="Times New Roman" w:hAnsi="Courier New" w:cs="Courier New"/>
                 <w:sz w:val="20"/>
                 <w:szCs w:val="20"/>
               </w:rPr>
-              <w:t>printf</w:t>
-            </w:r>
-            <w:proofErr w:type="spellEnd"/>
+              <w:t>printf()</w:t>
+            </w:r>
+            <w:r>
+              <w:rPr>
+                <w:rFonts w:ascii="Times New Roman" w:eastAsia="Times New Roman" w:hAnsi="Times New Roman" w:cs="Times New Roman"/>
+                <w:sz w:val="24"/>
+                <w:szCs w:val="24"/>
+              </w:rPr>
+              <w:t xml:space="preserve">, </w:t>
+            </w:r>
             <w:r>
               <w:rPr>
                 <w:rFonts w:ascii="Courier New" w:eastAsia="Times New Roman" w:hAnsi="Courier New" w:cs="Courier New"/>
                 <w:sz w:val="20"/>
                 <w:szCs w:val="20"/>
               </w:rPr>
-              <w:t>(</w:t>
-            </w:r>
-            <w:proofErr w:type="gramEnd"/>
-            <w:r>
-              <w:rPr>
-                <w:rFonts w:ascii="Courier New" w:eastAsia="Times New Roman" w:hAnsi="Courier New" w:cs="Courier New"/>
-                <w:sz w:val="20"/>
-                <w:szCs w:val="20"/>
-              </w:rPr>
-              <w:t>)</w:t>
-            </w:r>
-            <w:r>
-              <w:rPr>
-                <w:rFonts w:ascii="Times New Roman" w:eastAsia="Times New Roman" w:hAnsi="Times New Roman" w:cs="Times New Roman"/>
-                <w:sz w:val="24"/>
-                <w:szCs w:val="24"/>
-              </w:rPr>
-              <w:t xml:space="preserve">, </w:t>
-            </w:r>
-            <w:proofErr w:type="spellStart"/>
-            <w:proofErr w:type="gramStart"/>
-            <w:r>
-              <w:rPr>
-                <w:rFonts w:ascii="Courier New" w:eastAsia="Times New Roman" w:hAnsi="Courier New" w:cs="Courier New"/>
-                <w:sz w:val="20"/>
-                <w:szCs w:val="20"/>
-              </w:rPr>
-              <w:t>scanf</w:t>
-            </w:r>
-            <w:proofErr w:type="spellEnd"/>
-            <w:r>
-              <w:rPr>
-                <w:rFonts w:ascii="Courier New" w:eastAsia="Times New Roman" w:hAnsi="Courier New" w:cs="Courier New"/>
-                <w:sz w:val="20"/>
-                <w:szCs w:val="20"/>
-              </w:rPr>
-              <w:t>(</w:t>
-            </w:r>
-            <w:proofErr w:type="gramEnd"/>
-            <w:r>
-              <w:rPr>
-                <w:rFonts w:ascii="Courier New" w:eastAsia="Times New Roman" w:hAnsi="Courier New" w:cs="Courier New"/>
-                <w:sz w:val="20"/>
-                <w:szCs w:val="20"/>
-              </w:rPr>
-              <w:t>)</w:t>
+              <w:t>scanf()</w:t>
             </w:r>
             <w:r>
               <w:rPr>
@@ -29061,23 +28588,13 @@
               </w:rPr>
               <w:t xml:space="preserve">Discussion on how the program flows from top to bottom, the role of the </w:t>
             </w:r>
-            <w:proofErr w:type="gramStart"/>
             <w:r>
               <w:rPr>
                 <w:rFonts w:ascii="Courier New" w:eastAsia="Times New Roman" w:hAnsi="Courier New" w:cs="Courier New"/>
                 <w:sz w:val="20"/>
                 <w:szCs w:val="20"/>
               </w:rPr>
-              <w:t>main(</w:t>
-            </w:r>
-            <w:proofErr w:type="gramEnd"/>
-            <w:r>
-              <w:rPr>
-                <w:rFonts w:ascii="Courier New" w:eastAsia="Times New Roman" w:hAnsi="Courier New" w:cs="Courier New"/>
-                <w:sz w:val="20"/>
-                <w:szCs w:val="20"/>
-              </w:rPr>
-              <w:t>)</w:t>
+              <w:t>main()</w:t>
             </w:r>
             <w:r>
               <w:rPr>
@@ -29638,7 +29155,6 @@
               </w:rPr>
               <w:t xml:space="preserve">Explanation of </w:t>
             </w:r>
-            <w:proofErr w:type="spellStart"/>
             <w:r>
               <w:rPr>
                 <w:rFonts w:ascii="Courier New" w:eastAsia="Times New Roman" w:hAnsi="Courier New" w:cs="Courier New"/>
@@ -29647,7 +29163,6 @@
               </w:rPr>
               <w:t>if</w:t>
             </w:r>
-            <w:proofErr w:type="spellEnd"/>
             <w:r>
               <w:rPr>
                 <w:rFonts w:ascii="Times New Roman" w:eastAsia="Times New Roman" w:hAnsi="Times New Roman" w:cs="Times New Roman"/>
@@ -29737,7 +29252,6 @@
               </w:rPr>
               <w:t>==</w:t>
             </w:r>
-            <w:proofErr w:type="gramStart"/>
             <w:r>
               <w:rPr>
                 <w:rFonts w:ascii="Times New Roman" w:eastAsia="Times New Roman" w:hAnsi="Times New Roman" w:cs="Times New Roman"/>
@@ -29752,16 +29266,7 @@
                 <w:sz w:val="20"/>
                 <w:szCs w:val="20"/>
               </w:rPr>
-              <w:t>!</w:t>
-            </w:r>
-            <w:proofErr w:type="gramEnd"/>
-            <w:r>
-              <w:rPr>
-                <w:rFonts w:ascii="Courier New" w:eastAsia="Times New Roman" w:hAnsi="Courier New" w:cs="Courier New"/>
-                <w:sz w:val="20"/>
-                <w:szCs w:val="20"/>
-              </w:rPr>
-              <w:t>=</w:t>
+              <w:t>!=</w:t>
             </w:r>
             <w:r>
               <w:rPr>
@@ -31719,43 +31224,15 @@
                 <w:sz w:val="20"/>
                 <w:szCs w:val="20"/>
               </w:rPr>
-              <w:t xml:space="preserve">int </w:t>
-            </w:r>
-            <w:proofErr w:type="spellStart"/>
-            <w:proofErr w:type="gramStart"/>
-            <w:r>
-              <w:rPr>
-                <w:rFonts w:ascii="Courier New" w:eastAsia="Times New Roman" w:hAnsi="Courier New" w:cs="Courier New"/>
-                <w:sz w:val="20"/>
-                <w:szCs w:val="20"/>
-              </w:rPr>
-              <w:t>arr</w:t>
-            </w:r>
-            <w:proofErr w:type="spellEnd"/>
-            <w:r>
-              <w:rPr>
-                <w:rFonts w:ascii="Courier New" w:eastAsia="Times New Roman" w:hAnsi="Courier New" w:cs="Courier New"/>
-                <w:sz w:val="20"/>
-                <w:szCs w:val="20"/>
-              </w:rPr>
-              <w:t>[5];</w:t>
-            </w:r>
-            <w:r>
-              <w:rPr>
-                <w:rFonts w:ascii="Times New Roman" w:eastAsia="Times New Roman" w:hAnsi="Times New Roman" w:cs="Times New Roman"/>
-                <w:sz w:val="24"/>
-                <w:szCs w:val="24"/>
-              </w:rPr>
-              <w:t>)</w:t>
-            </w:r>
-            <w:proofErr w:type="gramEnd"/>
-            <w:r>
-              <w:rPr>
-                <w:rFonts w:ascii="Times New Roman" w:eastAsia="Times New Roman" w:hAnsi="Times New Roman" w:cs="Times New Roman"/>
-                <w:sz w:val="24"/>
-                <w:szCs w:val="24"/>
-              </w:rPr>
-              <w:t xml:space="preserve"> and initializing at the time of declaration.</w:t>
+              <w:t>int arr[5];</w:t>
+            </w:r>
+            <w:r>
+              <w:rPr>
+                <w:rFonts w:ascii="Times New Roman" w:eastAsia="Times New Roman" w:hAnsi="Times New Roman" w:cs="Times New Roman"/>
+                <w:sz w:val="24"/>
+                <w:szCs w:val="24"/>
+              </w:rPr>
+              <w:t>) and initializing at the time of declaration.</w:t>
             </w:r>
           </w:p>
         </w:tc>
@@ -31871,33 +31348,13 @@
               </w:rPr>
               <w:t xml:space="preserve">Introduction to multidimensional arrays (e.g., 2D arrays). Explanation of how to declare, initialize, and access elements in a 2D array (e.g., </w:t>
             </w:r>
-            <w:proofErr w:type="spellStart"/>
-            <w:proofErr w:type="gramStart"/>
             <w:r>
               <w:rPr>
                 <w:rFonts w:ascii="Courier New" w:eastAsia="Times New Roman" w:hAnsi="Courier New" w:cs="Courier New"/>
                 <w:sz w:val="20"/>
                 <w:szCs w:val="20"/>
               </w:rPr>
-              <w:t>arr</w:t>
-            </w:r>
-            <w:proofErr w:type="spellEnd"/>
-            <w:r>
-              <w:rPr>
-                <w:rFonts w:ascii="Courier New" w:eastAsia="Times New Roman" w:hAnsi="Courier New" w:cs="Courier New"/>
-                <w:sz w:val="20"/>
-                <w:szCs w:val="20"/>
-              </w:rPr>
-              <w:t>[</w:t>
-            </w:r>
-            <w:proofErr w:type="gramEnd"/>
-            <w:r>
-              <w:rPr>
-                <w:rFonts w:ascii="Courier New" w:eastAsia="Times New Roman" w:hAnsi="Courier New" w:cs="Courier New"/>
-                <w:sz w:val="20"/>
-                <w:szCs w:val="20"/>
-              </w:rPr>
-              <w:t>2][3]</w:t>
+              <w:t>arr[2][3]</w:t>
             </w:r>
             <w:r>
               <w:rPr>

</xml_diff>

<commit_message>
personal library (ver-2) update-148
</commit_message>
<xml_diff>
--- a/resources/Courses/GPT/Courses.docx
+++ b/resources/Courses/GPT/Courses.docx
@@ -135,7 +135,11 @@
               <w:t xml:space="preserve">3 Hours </w:t>
             </w:r>
             <w:r>
-              <w:t>(Evening)</w:t>
+              <w:t>(</w:t>
+            </w:r>
+            <w:proofErr w:type="gramStart"/>
+            <w:r>
+              <w:t>Evening)</w:t>
             </w:r>
             <w:r>
               <w:t xml:space="preserve"> </w:t>
@@ -144,7 +148,11 @@
               <w:t xml:space="preserve"> </w:t>
             </w:r>
             <w:r>
-              <w:t>= 15 Hours</w:t>
+              <w:t>=</w:t>
+            </w:r>
+            <w:proofErr w:type="gramEnd"/>
+            <w:r>
+              <w:t xml:space="preserve"> 15 Hours</w:t>
             </w:r>
           </w:p>
         </w:tc>
@@ -261,7 +269,15 @@
           </w:tcPr>
           <w:p>
             <w:r>
-              <w:t>5 Days x 6 Hours (Full Day)  = 30 Hours</w:t>
+              <w:t xml:space="preserve">5 Days x 6 Hours (Full </w:t>
+            </w:r>
+            <w:proofErr w:type="gramStart"/>
+            <w:r>
+              <w:t>Day)  =</w:t>
+            </w:r>
+            <w:proofErr w:type="gramEnd"/>
+            <w:r>
+              <w:t xml:space="preserve"> 30 Hours</w:t>
             </w:r>
           </w:p>
         </w:tc>
@@ -298,8 +314,17 @@
                 <w:b/>
                 <w:bCs/>
               </w:rPr>
-              <w:t>Review and Test</w:t>
-            </w:r>
+              <w:t xml:space="preserve">Review and </w:t>
+            </w:r>
+            <w:proofErr w:type="gramStart"/>
+            <w:r>
+              <w:rPr>
+                <w:b/>
+                <w:bCs/>
+              </w:rPr>
+              <w:t>Test</w:t>
+            </w:r>
+            <w:proofErr w:type="gramEnd"/>
           </w:p>
         </w:tc>
         <w:tc>
@@ -315,10 +340,18 @@
               <w:t xml:space="preserve"> </w:t>
             </w:r>
             <w:r>
-              <w:t xml:space="preserve">(Full Day)  </w:t>
-            </w:r>
-            <w:r>
-              <w:t xml:space="preserve">= </w:t>
+              <w:t xml:space="preserve">(Full </w:t>
+            </w:r>
+            <w:proofErr w:type="gramStart"/>
+            <w:r>
+              <w:t xml:space="preserve">Day)  </w:t>
+            </w:r>
+            <w:r>
+              <w:t>=</w:t>
+            </w:r>
+            <w:proofErr w:type="gramEnd"/>
+            <w:r>
+              <w:t xml:space="preserve"> </w:t>
             </w:r>
             <w:r>
               <w:t>0</w:t>
@@ -386,10 +419,18 @@
               <w:t xml:space="preserve"> </w:t>
             </w:r>
             <w:r>
-              <w:t xml:space="preserve">(Full Day)  </w:t>
-            </w:r>
-            <w:r>
-              <w:t xml:space="preserve">= </w:t>
+              <w:t xml:space="preserve">(Full </w:t>
+            </w:r>
+            <w:proofErr w:type="gramStart"/>
+            <w:r>
+              <w:t xml:space="preserve">Day)  </w:t>
+            </w:r>
+            <w:r>
+              <w:t>=</w:t>
+            </w:r>
+            <w:proofErr w:type="gramEnd"/>
+            <w:r>
+              <w:t xml:space="preserve"> </w:t>
             </w:r>
             <w:r>
               <w:t>0</w:t>
@@ -453,7 +494,15 @@
           </w:tcPr>
           <w:p>
             <w:r>
-              <w:t>2 Days x 6 Hours (Full Day)  = 12 Hours</w:t>
+              <w:t xml:space="preserve">2 Days x 6 Hours (Full </w:t>
+            </w:r>
+            <w:proofErr w:type="gramStart"/>
+            <w:r>
+              <w:t>Day)  =</w:t>
+            </w:r>
+            <w:proofErr w:type="gramEnd"/>
+            <w:r>
+              <w:t xml:space="preserve"> 12 Hours</w:t>
             </w:r>
           </w:p>
         </w:tc>
@@ -495,6 +544,7 @@
         </w:rPr>
         <w:t xml:space="preserve">Additional </w:t>
       </w:r>
+      <w:proofErr w:type="gramStart"/>
       <w:r>
         <w:rPr>
           <w:b/>
@@ -505,6 +555,7 @@
         </w:rPr>
         <w:t>Resources:-</w:t>
       </w:r>
+      <w:proofErr w:type="gramEnd"/>
     </w:p>
     <w:p>
       <w:pPr>
@@ -542,8 +593,13 @@
         <w:spacing w:after="0"/>
       </w:pPr>
       <w:r>
-        <w:t>Certification: MIT, Harvard, Oxford, Microsoft, Google, OpenAI, IBM, Etc</w:t>
-      </w:r>
+        <w:t xml:space="preserve">Certification: MIT, Harvard, Oxford, Microsoft, Google, OpenAI, IBM, </w:t>
+      </w:r>
+      <w:proofErr w:type="spellStart"/>
+      <w:r>
+        <w:t>Etc</w:t>
+      </w:r>
+      <w:proofErr w:type="spellEnd"/>
     </w:p>
     <w:p>
       <w:pPr>
@@ -565,8 +621,9 @@
           <w:szCs w:val="24"/>
           <w:u w:val="single"/>
         </w:rPr>
-        <w:t>Practice (5 Days of Evening Shift)</w:t>
-      </w:r>
+        <w:t>Practice (5 Days of Evening Shift</w:t>
+      </w:r>
+      <w:proofErr w:type="gramStart"/>
       <w:r>
         <w:rPr>
           <w:b/>
@@ -575,8 +632,19 @@
           <w:szCs w:val="24"/>
           <w:u w:val="single"/>
         </w:rPr>
+        <w:t>)</w:t>
+      </w:r>
+      <w:r>
+        <w:rPr>
+          <w:b/>
+          <w:bCs/>
+          <w:sz w:val="24"/>
+          <w:szCs w:val="24"/>
+          <w:u w:val="single"/>
+        </w:rPr>
         <w:t>:-</w:t>
       </w:r>
+      <w:proofErr w:type="gramEnd"/>
     </w:p>
     <w:p>
       <w:pPr>
@@ -662,8 +730,9 @@
           <w:szCs w:val="24"/>
           <w:u w:val="single"/>
         </w:rPr>
-        <w:t>(5 Days of Morning Shift)</w:t>
-      </w:r>
+        <w:t>(5 Days of Morning Shift</w:t>
+      </w:r>
+      <w:proofErr w:type="gramStart"/>
       <w:r>
         <w:rPr>
           <w:b/>
@@ -672,8 +741,19 @@
           <w:szCs w:val="24"/>
           <w:u w:val="single"/>
         </w:rPr>
+        <w:t>)</w:t>
+      </w:r>
+      <w:r>
+        <w:rPr>
+          <w:b/>
+          <w:bCs/>
+          <w:sz w:val="24"/>
+          <w:szCs w:val="24"/>
+          <w:u w:val="single"/>
+        </w:rPr>
         <w:t>:-</w:t>
       </w:r>
+      <w:proofErr w:type="gramEnd"/>
     </w:p>
     <w:p>
       <w:pPr>
@@ -722,8 +802,9 @@
           <w:szCs w:val="24"/>
           <w:u w:val="single"/>
         </w:rPr>
-        <w:t>(Off Days of Evening Shift)</w:t>
-      </w:r>
+        <w:t>(Off Days of Evening Shift</w:t>
+      </w:r>
+      <w:proofErr w:type="gramStart"/>
       <w:r>
         <w:rPr>
           <w:b/>
@@ -732,7 +813,28 @@
           <w:szCs w:val="24"/>
           <w:u w:val="single"/>
         </w:rPr>
-        <w:t xml:space="preserve">:- </w:t>
+        <w:t>)</w:t>
+      </w:r>
+      <w:r>
+        <w:rPr>
+          <w:b/>
+          <w:bCs/>
+          <w:sz w:val="24"/>
+          <w:szCs w:val="24"/>
+          <w:u w:val="single"/>
+        </w:rPr>
+        <w:t>:-</w:t>
+      </w:r>
+      <w:proofErr w:type="gramEnd"/>
+      <w:r>
+        <w:rPr>
+          <w:b/>
+          <w:bCs/>
+          <w:sz w:val="24"/>
+          <w:szCs w:val="24"/>
+          <w:u w:val="single"/>
+        </w:rPr>
+        <w:t xml:space="preserve"> </w:t>
       </w:r>
     </w:p>
     <w:p>
@@ -788,8 +890,9 @@
           <w:szCs w:val="24"/>
           <w:u w:val="single"/>
         </w:rPr>
-        <w:t>(Off Days of Morning Shift)</w:t>
-      </w:r>
+        <w:t>(Off Days of Morning Shift</w:t>
+      </w:r>
+      <w:proofErr w:type="gramStart"/>
       <w:r>
         <w:rPr>
           <w:b/>
@@ -798,8 +901,19 @@
           <w:szCs w:val="24"/>
           <w:u w:val="single"/>
         </w:rPr>
+        <w:t>)</w:t>
+      </w:r>
+      <w:r>
+        <w:rPr>
+          <w:b/>
+          <w:bCs/>
+          <w:sz w:val="24"/>
+          <w:szCs w:val="24"/>
+          <w:u w:val="single"/>
+        </w:rPr>
         <w:t>:-</w:t>
       </w:r>
+      <w:proofErr w:type="gramEnd"/>
     </w:p>
     <w:p>
       <w:pPr>
@@ -2588,8 +2702,19 @@
           <w:color w:val="C00000"/>
           <w:sz w:val="28"/>
         </w:rPr>
-        <w:t>Course Outcomes:-</w:t>
-      </w:r>
+        <w:t xml:space="preserve">Course </w:t>
+      </w:r>
+      <w:proofErr w:type="gramStart"/>
+      <w:r>
+        <w:rPr>
+          <w:b/>
+          <w:bCs/>
+          <w:color w:val="C00000"/>
+          <w:sz w:val="28"/>
+        </w:rPr>
+        <w:t>Outcomes:-</w:t>
+      </w:r>
+      <w:proofErr w:type="gramEnd"/>
     </w:p>
     <w:p>
       <w:pPr>
@@ -3048,7 +3173,7 @@
           </w:tcPr>
           <w:p>
             <w:r>
-              <w:t>Software Metrics: Reference-1</w:t>
+              <w:t>Software Requirements</w:t>
             </w:r>
           </w:p>
         </w:tc>
@@ -3070,7 +3195,7 @@
           </w:tcPr>
           <w:p>
             <w:r>
-              <w:t>15</w:t>
+              <w:t>11</w:t>
             </w:r>
           </w:p>
         </w:tc>
@@ -3081,7 +3206,7 @@
           </w:tcPr>
           <w:p>
             <w:r>
-              <w:t>390</w:t>
+              <w:t>126</w:t>
             </w:r>
           </w:p>
         </w:tc>
@@ -3092,7 +3217,7 @@
           </w:tcPr>
           <w:p>
             <w:r>
-              <w:t>651</w:t>
+              <w:t>399</w:t>
             </w:r>
           </w:p>
         </w:tc>
@@ -3103,7 +3228,11 @@
             <w:tcW w:w="522" w:type="pct"/>
             <w:shd w:val="clear" w:color="auto" w:fill="E7E6E6" w:themeFill="background2"/>
           </w:tcPr>
-          <w:p/>
+          <w:p>
+            <w:r>
+              <w:t>03</w:t>
+            </w:r>
+          </w:p>
         </w:tc>
         <w:tc>
           <w:tcPr>
@@ -3112,7 +3241,7 @@
           </w:tcPr>
           <w:p>
             <w:r>
-              <w:t>Software Metrics: Reference-2</w:t>
+              <w:t>Software Testing: Reference-1</w:t>
             </w:r>
           </w:p>
         </w:tc>
@@ -3121,7 +3250,11 @@
             <w:tcW w:w="735" w:type="pct"/>
             <w:shd w:val="clear" w:color="auto" w:fill="E7E6E6" w:themeFill="background2"/>
           </w:tcPr>
-          <w:p/>
+          <w:p>
+            <w:r>
+              <w:t>T-H3 + S-H2</w:t>
+            </w:r>
+          </w:p>
         </w:tc>
         <w:tc>
           <w:tcPr>
@@ -3130,7 +3263,7 @@
           </w:tcPr>
           <w:p>
             <w:r>
-              <w:t>14</w:t>
+              <w:t>19</w:t>
             </w:r>
           </w:p>
         </w:tc>
@@ -3141,7 +3274,7 @@
           </w:tcPr>
           <w:p>
             <w:r>
-              <w:t>169</w:t>
+              <w:t>112</w:t>
             </w:r>
           </w:p>
         </w:tc>
@@ -3152,7 +3285,7 @@
           </w:tcPr>
           <w:p>
             <w:r>
-              <w:t>276</w:t>
+              <w:t>629</w:t>
             </w:r>
           </w:p>
         </w:tc>
@@ -3163,11 +3296,7 @@
             <w:tcW w:w="522" w:type="pct"/>
             <w:shd w:val="clear" w:color="auto" w:fill="E7E6E6" w:themeFill="background2"/>
           </w:tcPr>
-          <w:p>
-            <w:r>
-              <w:t>03</w:t>
-            </w:r>
-          </w:p>
+          <w:p/>
         </w:tc>
         <w:tc>
           <w:tcPr>
@@ -3176,7 +3305,7 @@
           </w:tcPr>
           <w:p>
             <w:r>
-              <w:t>Software Requirements</w:t>
+              <w:t>Software Testing: Reference-2</w:t>
             </w:r>
           </w:p>
         </w:tc>
@@ -3185,11 +3314,7 @@
             <w:tcW w:w="735" w:type="pct"/>
             <w:shd w:val="clear" w:color="auto" w:fill="E7E6E6" w:themeFill="background2"/>
           </w:tcPr>
-          <w:p>
-            <w:r>
-              <w:t>T-H3 + S-H2</w:t>
-            </w:r>
-          </w:p>
+          <w:p/>
         </w:tc>
         <w:tc>
           <w:tcPr>
@@ -3198,7 +3323,7 @@
           </w:tcPr>
           <w:p>
             <w:r>
-              <w:t>11</w:t>
+              <w:t>21</w:t>
             </w:r>
           </w:p>
         </w:tc>
@@ -3209,7 +3334,7 @@
           </w:tcPr>
           <w:p>
             <w:r>
-              <w:t>126</w:t>
+              <w:t>285</w:t>
             </w:r>
           </w:p>
         </w:tc>
@@ -3220,7 +3345,7 @@
           </w:tcPr>
           <w:p>
             <w:r>
-              <w:t>399</w:t>
+              <w:t>573</w:t>
             </w:r>
           </w:p>
         </w:tc>
@@ -3556,12 +3681,19 @@
             <w:shd w:val="clear" w:color="auto" w:fill="E7E6E6" w:themeFill="background2"/>
           </w:tcPr>
           <w:p>
-            <w:r>
+            <w:pPr>
               <w:rPr>
                 <w:b/>
                 <w:bCs/>
                 <w:color w:val="C00000"/>
               </w:rPr>
+            </w:pPr>
+            <w:r>
+              <w:rPr>
+                <w:b/>
+                <w:bCs/>
+                <w:color w:val="C00000"/>
+              </w:rPr>
               <w:t>05</w:t>
             </w:r>
           </w:p>
@@ -3573,7 +3705,7 @@
           </w:tcPr>
           <w:p>
             <w:r>
-              <w:t>Software Testing: Reference-1</w:t>
+              <w:t>Linux Operating and DevOps Tools</w:t>
             </w:r>
           </w:p>
         </w:tc>
@@ -3582,102 +3714,126 @@
             <w:tcW w:w="735" w:type="pct"/>
             <w:shd w:val="clear" w:color="auto" w:fill="E7E6E6" w:themeFill="background2"/>
           </w:tcPr>
-          <w:p>
-            <w:r>
-              <w:t>T-H3 + S-H2</w:t>
-            </w:r>
-          </w:p>
+          <w:p/>
         </w:tc>
         <w:tc>
           <w:tcPr>
             <w:tcW w:w="371" w:type="pct"/>
             <w:shd w:val="clear" w:color="auto" w:fill="E7E6E6" w:themeFill="background2"/>
           </w:tcPr>
-          <w:p>
-            <w:r>
-              <w:t>19</w:t>
-            </w:r>
-          </w:p>
+          <w:p/>
         </w:tc>
         <w:tc>
           <w:tcPr>
             <w:tcW w:w="559" w:type="pct"/>
             <w:shd w:val="clear" w:color="auto" w:fill="E7E6E6" w:themeFill="background2"/>
           </w:tcPr>
-          <w:p>
-            <w:r>
-              <w:t>112</w:t>
-            </w:r>
-          </w:p>
+          <w:p/>
         </w:tc>
         <w:tc>
           <w:tcPr>
             <w:tcW w:w="444" w:type="pct"/>
             <w:shd w:val="clear" w:color="auto" w:fill="E7E6E6" w:themeFill="background2"/>
           </w:tcPr>
-          <w:p>
-            <w:r>
-              <w:t>629</w:t>
-            </w:r>
-          </w:p>
+          <w:p/>
         </w:tc>
       </w:tr>
       <w:tr>
         <w:tc>
           <w:tcPr>
             <w:tcW w:w="522" w:type="pct"/>
-            <w:shd w:val="clear" w:color="auto" w:fill="E7E6E6" w:themeFill="background2"/>
-          </w:tcPr>
-          <w:p/>
+            <w:shd w:val="clear" w:color="auto" w:fill="002060"/>
+          </w:tcPr>
+          <w:p>
+            <w:pPr>
+              <w:rPr>
+                <w:b/>
+                <w:bCs/>
+              </w:rPr>
+            </w:pPr>
+          </w:p>
         </w:tc>
         <w:tc>
           <w:tcPr>
             <w:tcW w:w="2369" w:type="pct"/>
-            <w:shd w:val="clear" w:color="auto" w:fill="E7E6E6" w:themeFill="background2"/>
-          </w:tcPr>
-          <w:p>
-            <w:r>
-              <w:t>Software Testing: Reference-2</w:t>
+            <w:shd w:val="clear" w:color="auto" w:fill="002060"/>
+          </w:tcPr>
+          <w:p>
+            <w:pPr>
+              <w:rPr>
+                <w:b/>
+                <w:bCs/>
+              </w:rPr>
+            </w:pPr>
+            <w:r>
+              <w:rPr>
+                <w:b/>
+                <w:bCs/>
+              </w:rPr>
+              <w:t>Lab Subjects</w:t>
             </w:r>
           </w:p>
         </w:tc>
         <w:tc>
           <w:tcPr>
             <w:tcW w:w="735" w:type="pct"/>
-            <w:shd w:val="clear" w:color="auto" w:fill="E7E6E6" w:themeFill="background2"/>
-          </w:tcPr>
-          <w:p/>
+            <w:shd w:val="clear" w:color="auto" w:fill="002060"/>
+          </w:tcPr>
+          <w:p>
+            <w:pPr>
+              <w:rPr>
+                <w:b/>
+                <w:bCs/>
+              </w:rPr>
+            </w:pPr>
+          </w:p>
         </w:tc>
         <w:tc>
           <w:tcPr>
             <w:tcW w:w="371" w:type="pct"/>
-            <w:shd w:val="clear" w:color="auto" w:fill="E7E6E6" w:themeFill="background2"/>
-          </w:tcPr>
-          <w:p>
-            <w:r>
-              <w:t>21</w:t>
-            </w:r>
+            <w:shd w:val="clear" w:color="auto" w:fill="002060"/>
+          </w:tcPr>
+          <w:p>
+            <w:pPr>
+              <w:rPr>
+                <w:b/>
+                <w:bCs/>
+              </w:rPr>
+            </w:pPr>
           </w:p>
         </w:tc>
         <w:tc>
           <w:tcPr>
             <w:tcW w:w="559" w:type="pct"/>
-            <w:shd w:val="clear" w:color="auto" w:fill="E7E6E6" w:themeFill="background2"/>
-          </w:tcPr>
-          <w:p>
-            <w:r>
-              <w:t>285</w:t>
-            </w:r>
+            <w:shd w:val="clear" w:color="auto" w:fill="002060"/>
+          </w:tcPr>
+          <w:p>
+            <w:pPr>
+              <w:rPr>
+                <w:b/>
+                <w:bCs/>
+              </w:rPr>
+            </w:pPr>
           </w:p>
         </w:tc>
         <w:tc>
           <w:tcPr>
             <w:tcW w:w="444" w:type="pct"/>
-            <w:shd w:val="clear" w:color="auto" w:fill="E7E6E6" w:themeFill="background2"/>
-          </w:tcPr>
-          <w:p>
-            <w:r>
-              <w:t>573</w:t>
+            <w:shd w:val="clear" w:color="auto" w:fill="002060"/>
+          </w:tcPr>
+          <w:p>
+            <w:pPr>
+              <w:rPr>
+                <w:b/>
+                <w:bCs/>
+              </w:rPr>
+            </w:pPr>
+            <w:r>
+              <w:rPr>
+                <w:b/>
+                <w:bCs/>
+              </w:rPr>
+              <w:t>1072</w:t>
             </w:r>
           </w:p>
         </w:tc>
@@ -3686,98 +3842,66 @@
         <w:tc>
           <w:tcPr>
             <w:tcW w:w="522" w:type="pct"/>
-            <w:shd w:val="clear" w:color="auto" w:fill="002060"/>
-          </w:tcPr>
-          <w:p>
-            <w:pPr>
-              <w:rPr>
-                <w:b/>
-                <w:bCs/>
-              </w:rPr>
-            </w:pPr>
+            <w:shd w:val="clear" w:color="auto" w:fill="E7E6E6" w:themeFill="background2"/>
+          </w:tcPr>
+          <w:p>
+            <w:r>
+              <w:t>01</w:t>
+            </w:r>
           </w:p>
         </w:tc>
         <w:tc>
           <w:tcPr>
             <w:tcW w:w="2369" w:type="pct"/>
-            <w:shd w:val="clear" w:color="auto" w:fill="002060"/>
-          </w:tcPr>
-          <w:p>
-            <w:pPr>
-              <w:rPr>
-                <w:b/>
-                <w:bCs/>
-              </w:rPr>
-            </w:pPr>
-            <w:r>
-              <w:rPr>
-                <w:b/>
-                <w:bCs/>
-              </w:rPr>
-              <w:t>Lab Subjects</w:t>
+            <w:shd w:val="clear" w:color="auto" w:fill="E7E6E6" w:themeFill="background2"/>
+          </w:tcPr>
+          <w:p>
+            <w:r>
+              <w:t>Software Metrics: Reference-1</w:t>
             </w:r>
           </w:p>
         </w:tc>
         <w:tc>
           <w:tcPr>
             <w:tcW w:w="735" w:type="pct"/>
-            <w:shd w:val="clear" w:color="auto" w:fill="002060"/>
-          </w:tcPr>
-          <w:p>
-            <w:pPr>
-              <w:rPr>
-                <w:b/>
-                <w:bCs/>
-              </w:rPr>
-            </w:pPr>
+            <w:shd w:val="clear" w:color="auto" w:fill="E7E6E6" w:themeFill="background2"/>
+          </w:tcPr>
+          <w:p>
+            <w:r>
+              <w:t>T-H3 + S-H2</w:t>
+            </w:r>
           </w:p>
         </w:tc>
         <w:tc>
           <w:tcPr>
             <w:tcW w:w="371" w:type="pct"/>
-            <w:shd w:val="clear" w:color="auto" w:fill="002060"/>
-          </w:tcPr>
-          <w:p>
-            <w:pPr>
-              <w:rPr>
-                <w:b/>
-                <w:bCs/>
-              </w:rPr>
-            </w:pPr>
+            <w:shd w:val="clear" w:color="auto" w:fill="E7E6E6" w:themeFill="background2"/>
+          </w:tcPr>
+          <w:p>
+            <w:r>
+              <w:t>15</w:t>
+            </w:r>
           </w:p>
         </w:tc>
         <w:tc>
           <w:tcPr>
             <w:tcW w:w="559" w:type="pct"/>
-            <w:shd w:val="clear" w:color="auto" w:fill="002060"/>
-          </w:tcPr>
-          <w:p>
-            <w:pPr>
-              <w:rPr>
-                <w:b/>
-                <w:bCs/>
-              </w:rPr>
-            </w:pPr>
+            <w:shd w:val="clear" w:color="auto" w:fill="E7E6E6" w:themeFill="background2"/>
+          </w:tcPr>
+          <w:p>
+            <w:r>
+              <w:t>390</w:t>
+            </w:r>
           </w:p>
         </w:tc>
         <w:tc>
           <w:tcPr>
             <w:tcW w:w="444" w:type="pct"/>
-            <w:shd w:val="clear" w:color="auto" w:fill="002060"/>
-          </w:tcPr>
-          <w:p>
-            <w:pPr>
-              <w:rPr>
-                <w:b/>
-                <w:bCs/>
-              </w:rPr>
-            </w:pPr>
-            <w:r>
-              <w:rPr>
-                <w:b/>
-                <w:bCs/>
-              </w:rPr>
-              <w:t>1072</w:t>
+            <w:shd w:val="clear" w:color="auto" w:fill="E7E6E6" w:themeFill="background2"/>
+          </w:tcPr>
+          <w:p>
+            <w:r>
+              <w:t>651</w:t>
             </w:r>
           </w:p>
         </w:tc>
@@ -3788,11 +3912,7 @@
             <w:tcW w:w="522" w:type="pct"/>
             <w:shd w:val="clear" w:color="auto" w:fill="E7E6E6" w:themeFill="background2"/>
           </w:tcPr>
-          <w:p>
-            <w:r>
-              <w:t>01</w:t>
-            </w:r>
-          </w:p>
+          <w:p/>
         </w:tc>
         <w:tc>
           <w:tcPr>
@@ -3801,7 +3921,7 @@
           </w:tcPr>
           <w:p>
             <w:r>
-              <w:t xml:space="preserve">Cloud Computing and Virtualization </w:t>
+              <w:t>Software Metrics: Reference-2</w:t>
             </w:r>
           </w:p>
         </w:tc>
@@ -3810,11 +3930,7 @@
             <w:tcW w:w="735" w:type="pct"/>
             <w:shd w:val="clear" w:color="auto" w:fill="E7E6E6" w:themeFill="background2"/>
           </w:tcPr>
-          <w:p>
-            <w:r>
-              <w:t>T-H3 + S-H2</w:t>
-            </w:r>
-          </w:p>
+          <w:p/>
         </w:tc>
         <w:tc>
           <w:tcPr>
@@ -3823,7 +3939,7 @@
           </w:tcPr>
           <w:p>
             <w:r>
-              <w:t>16</w:t>
+              <w:t>14</w:t>
             </w:r>
           </w:p>
         </w:tc>
@@ -3834,7 +3950,7 @@
           </w:tcPr>
           <w:p>
             <w:r>
-              <w:t>257</w:t>
+              <w:t>169</w:t>
             </w:r>
           </w:p>
         </w:tc>
@@ -3845,7 +3961,7 @@
           </w:tcPr>
           <w:p>
             <w:r>
-              <w:t>558</w:t>
+              <w:t>276</w:t>
             </w:r>
           </w:p>
         </w:tc>
@@ -3869,7 +3985,7 @@
           </w:tcPr>
           <w:p>
             <w:r>
-              <w:t>Linux Operating and DevOps Tools</w:t>
+              <w:t xml:space="preserve">Cloud Computing and Virtualization </w:t>
             </w:r>
           </w:p>
         </w:tc>
@@ -3878,28 +3994,44 @@
             <w:tcW w:w="735" w:type="pct"/>
             <w:shd w:val="clear" w:color="auto" w:fill="E7E6E6" w:themeFill="background2"/>
           </w:tcPr>
-          <w:p/>
+          <w:p>
+            <w:r>
+              <w:t>T-H3 + S-H2</w:t>
+            </w:r>
+          </w:p>
         </w:tc>
         <w:tc>
           <w:tcPr>
             <w:tcW w:w="371" w:type="pct"/>
             <w:shd w:val="clear" w:color="auto" w:fill="E7E6E6" w:themeFill="background2"/>
           </w:tcPr>
-          <w:p/>
+          <w:p>
+            <w:r>
+              <w:t>16</w:t>
+            </w:r>
+          </w:p>
         </w:tc>
         <w:tc>
           <w:tcPr>
             <w:tcW w:w="559" w:type="pct"/>
             <w:shd w:val="clear" w:color="auto" w:fill="E7E6E6" w:themeFill="background2"/>
           </w:tcPr>
-          <w:p/>
+          <w:p>
+            <w:r>
+              <w:t>257</w:t>
+            </w:r>
+          </w:p>
         </w:tc>
         <w:tc>
           <w:tcPr>
             <w:tcW w:w="444" w:type="pct"/>
             <w:shd w:val="clear" w:color="auto" w:fill="E7E6E6" w:themeFill="background2"/>
           </w:tcPr>
-          <w:p/>
+          <w:p>
+            <w:r>
+              <w:t>558</w:t>
+            </w:r>
+          </w:p>
         </w:tc>
       </w:tr>
       <w:tr>
@@ -4165,8 +4297,19 @@
           <w:color w:val="C00000"/>
           <w:sz w:val="28"/>
         </w:rPr>
-        <w:t>Course Outcomes:-</w:t>
-      </w:r>
+        <w:t xml:space="preserve">Course </w:t>
+      </w:r>
+      <w:proofErr w:type="gramStart"/>
+      <w:r>
+        <w:rPr>
+          <w:b/>
+          <w:bCs/>
+          <w:color w:val="C00000"/>
+          <w:sz w:val="28"/>
+        </w:rPr>
+        <w:t>Outcomes:-</w:t>
+      </w:r>
+      <w:proofErr w:type="gramEnd"/>
     </w:p>
     <w:p>
       <w:pPr>
@@ -5738,8 +5881,19 @@
           <w:color w:val="C00000"/>
           <w:sz w:val="28"/>
         </w:rPr>
-        <w:t>Course Outcomes:-</w:t>
-      </w:r>
+        <w:t xml:space="preserve">Course </w:t>
+      </w:r>
+      <w:proofErr w:type="gramStart"/>
+      <w:r>
+        <w:rPr>
+          <w:b/>
+          <w:bCs/>
+          <w:color w:val="C00000"/>
+          <w:sz w:val="28"/>
+        </w:rPr>
+        <w:t>Outcomes:-</w:t>
+      </w:r>
+      <w:proofErr w:type="gramEnd"/>
     </w:p>
     <w:p>
       <w:pPr>
@@ -6865,7 +7019,15 @@
           </w:tcPr>
           <w:p>
             <w:r>
-              <w:t>Ordinary Differential Equation : Reference-1</w:t>
+              <w:t xml:space="preserve">Ordinary Differential </w:t>
+            </w:r>
+            <w:proofErr w:type="gramStart"/>
+            <w:r>
+              <w:t>Equation :</w:t>
+            </w:r>
+            <w:proofErr w:type="gramEnd"/>
+            <w:r>
+              <w:t xml:space="preserve"> Reference-1</w:t>
             </w:r>
           </w:p>
         </w:tc>
@@ -6929,7 +7091,15 @@
           </w:tcPr>
           <w:p>
             <w:r>
-              <w:t>Ordinary Differential Equation : Reference-1</w:t>
+              <w:t xml:space="preserve">Ordinary Differential </w:t>
+            </w:r>
+            <w:proofErr w:type="gramStart"/>
+            <w:r>
+              <w:t>Equation :</w:t>
+            </w:r>
+            <w:proofErr w:type="gramEnd"/>
+            <w:r>
+              <w:t xml:space="preserve"> Reference-1</w:t>
             </w:r>
           </w:p>
         </w:tc>
@@ -7102,8 +7272,19 @@
           <w:color w:val="C00000"/>
           <w:sz w:val="28"/>
         </w:rPr>
-        <w:t>Course Outcomes:-</w:t>
-      </w:r>
+        <w:t xml:space="preserve">Course </w:t>
+      </w:r>
+      <w:proofErr w:type="gramStart"/>
+      <w:r>
+        <w:rPr>
+          <w:b/>
+          <w:bCs/>
+          <w:color w:val="C00000"/>
+          <w:sz w:val="28"/>
+        </w:rPr>
+        <w:t>Outcomes:-</w:t>
+      </w:r>
+      <w:proofErr w:type="gramEnd"/>
     </w:p>
     <w:p>
       <w:pPr>
@@ -8539,8 +8720,19 @@
           <w:color w:val="C00000"/>
           <w:sz w:val="28"/>
         </w:rPr>
-        <w:t>Course Outcomes:-</w:t>
-      </w:r>
+        <w:t xml:space="preserve">Course </w:t>
+      </w:r>
+      <w:proofErr w:type="gramStart"/>
+      <w:r>
+        <w:rPr>
+          <w:b/>
+          <w:bCs/>
+          <w:color w:val="C00000"/>
+          <w:sz w:val="28"/>
+        </w:rPr>
+        <w:t>Outcomes:-</w:t>
+      </w:r>
+      <w:proofErr w:type="gramEnd"/>
     </w:p>
     <w:p>
       <w:pPr>
@@ -9835,8 +10027,19 @@
           <w:color w:val="C00000"/>
           <w:sz w:val="28"/>
         </w:rPr>
-        <w:t>Course Outcomes:-</w:t>
-      </w:r>
+        <w:t xml:space="preserve">Course </w:t>
+      </w:r>
+      <w:proofErr w:type="gramStart"/>
+      <w:r>
+        <w:rPr>
+          <w:b/>
+          <w:bCs/>
+          <w:color w:val="C00000"/>
+          <w:sz w:val="28"/>
+        </w:rPr>
+        <w:t>Outcomes:-</w:t>
+      </w:r>
+      <w:proofErr w:type="gramEnd"/>
     </w:p>
     <w:p>
       <w:pPr>
@@ -13135,7 +13338,15 @@
           </w:tcPr>
           <w:p>
             <w:r>
-              <w:t>Physics – 2  (Thermal)</w:t>
+              <w:t xml:space="preserve">Physics – </w:t>
+            </w:r>
+            <w:proofErr w:type="gramStart"/>
+            <w:r>
+              <w:t>2  (</w:t>
+            </w:r>
+            <w:proofErr w:type="gramEnd"/>
+            <w:r>
+              <w:t>Thermal)</w:t>
             </w:r>
           </w:p>
         </w:tc>
@@ -14562,7 +14773,15 @@
           </w:tcPr>
           <w:p>
             <w:r>
-              <w:t>API, Authentication (JWT|QAuth) and Advanced JavaScript</w:t>
+              <w:t>API, Authentication (</w:t>
+            </w:r>
+            <w:proofErr w:type="spellStart"/>
+            <w:r>
+              <w:t>JWT|QAuth</w:t>
+            </w:r>
+            <w:proofErr w:type="spellEnd"/>
+            <w:r>
+              <w:t>) and Advanced JavaScript</w:t>
             </w:r>
           </w:p>
         </w:tc>
@@ -14873,7 +15092,23 @@
           </w:tcPr>
           <w:p>
             <w:r>
-              <w:t xml:space="preserve">Test Framework (Cypress|Appium), Perofrmance Testing </w:t>
+              <w:t>Test Framework (</w:t>
+            </w:r>
+            <w:proofErr w:type="spellStart"/>
+            <w:r>
+              <w:t>Cypress|Appium</w:t>
+            </w:r>
+            <w:proofErr w:type="spellEnd"/>
+            <w:r>
+              <w:t xml:space="preserve">), </w:t>
+            </w:r>
+            <w:proofErr w:type="spellStart"/>
+            <w:r>
+              <w:t>Perofrmance</w:t>
+            </w:r>
+            <w:proofErr w:type="spellEnd"/>
+            <w:r>
+              <w:t xml:space="preserve"> Testing </w:t>
             </w:r>
           </w:p>
         </w:tc>
@@ -16722,8 +16957,13 @@
               </w:numPr>
               <w:ind w:left="211" w:hanging="240"/>
             </w:pPr>
-            <w:r>
-              <w:t xml:space="preserve">FreeCodeCamp Web Dev Guide </w:t>
+            <w:proofErr w:type="spellStart"/>
+            <w:r>
+              <w:t>FreeCodeCamp</w:t>
+            </w:r>
+            <w:proofErr w:type="spellEnd"/>
+            <w:r>
+              <w:t xml:space="preserve"> Web Dev Guide </w:t>
             </w:r>
           </w:p>
         </w:tc>
@@ -16945,7 +17185,15 @@
               <w:ind w:left="211" w:hanging="240"/>
             </w:pPr>
             <w:r>
-              <w:t xml:space="preserve">Frontend Mastery by Codecademy </w:t>
+              <w:t xml:space="preserve">Frontend Mastery by </w:t>
+            </w:r>
+            <w:proofErr w:type="spellStart"/>
+            <w:r>
+              <w:t>Codecademy</w:t>
+            </w:r>
+            <w:proofErr w:type="spellEnd"/>
+            <w:r>
+              <w:t xml:space="preserve"> </w:t>
             </w:r>
           </w:p>
         </w:tc>
@@ -17345,7 +17593,15 @@
               <w:ind w:left="211" w:hanging="240"/>
             </w:pPr>
             <w:r>
-              <w:t xml:space="preserve">Continuous Testing for DevOps Professionals by Katrina Clokie </w:t>
+              <w:t xml:space="preserve">Continuous Testing for DevOps Professionals by Katrina </w:t>
+            </w:r>
+            <w:proofErr w:type="spellStart"/>
+            <w:r>
+              <w:t>Clokie</w:t>
+            </w:r>
+            <w:proofErr w:type="spellEnd"/>
+            <w:r>
+              <w:t xml:space="preserve"> </w:t>
             </w:r>
           </w:p>
         </w:tc>
@@ -17675,7 +17931,23 @@
               <w:ind w:left="211" w:hanging="240"/>
             </w:pPr>
             <w:r>
-              <w:t xml:space="preserve">Mentorship Programs (linkedIn Learnig) </w:t>
+              <w:t>Mentorship Programs (</w:t>
+            </w:r>
+            <w:proofErr w:type="spellStart"/>
+            <w:r>
+              <w:t>linkedIn</w:t>
+            </w:r>
+            <w:proofErr w:type="spellEnd"/>
+            <w:r>
+              <w:t xml:space="preserve"> </w:t>
+            </w:r>
+            <w:proofErr w:type="spellStart"/>
+            <w:r>
+              <w:t>Learnig</w:t>
+            </w:r>
+            <w:proofErr w:type="spellEnd"/>
+            <w:r>
+              <w:t xml:space="preserve">) </w:t>
             </w:r>
           </w:p>
           <w:p>
@@ -19707,7 +19979,25 @@
                 <w:sz w:val="24"/>
                 <w:szCs w:val="24"/>
               </w:rPr>
-              <w:t>- Learn objects, arrays, and data structures - Asynchronous JavaScript (callbacks, promises, async/await) - Introduction to basic JavaScript libraries (e.g., Lodash)</w:t>
+              <w:t xml:space="preserve">- Learn objects, arrays, and data structures - Asynchronous JavaScript (callbacks, promises, async/await) - Introduction to basic JavaScript libraries (e.g., </w:t>
+            </w:r>
+            <w:proofErr w:type="spellStart"/>
+            <w:r>
+              <w:rPr>
+                <w:rFonts w:eastAsia="Times New Roman" w:cstheme="minorHAnsi"/>
+                <w:sz w:val="24"/>
+                <w:szCs w:val="24"/>
+              </w:rPr>
+              <w:t>Lodash</w:t>
+            </w:r>
+            <w:proofErr w:type="spellEnd"/>
+            <w:r>
+              <w:rPr>
+                <w:rFonts w:eastAsia="Times New Roman" w:cstheme="minorHAnsi"/>
+                <w:sz w:val="24"/>
+                <w:szCs w:val="24"/>
+              </w:rPr>
+              <w:t>)</w:t>
             </w:r>
           </w:p>
         </w:tc>
@@ -19732,8 +20022,36 @@
                 <w:sz w:val="24"/>
                 <w:szCs w:val="24"/>
               </w:rPr>
-              <w:t>- Build a simple interactive app (e.g., to-do list) - Complete JavaScript practice exercises on platforms like FreeCodeCamp or Codecademy</w:t>
-            </w:r>
+              <w:t xml:space="preserve">- Build a simple interactive app (e.g., to-do list) - Complete JavaScript practice exercises on platforms like </w:t>
+            </w:r>
+            <w:proofErr w:type="spellStart"/>
+            <w:r>
+              <w:rPr>
+                <w:rFonts w:eastAsia="Times New Roman" w:cstheme="minorHAnsi"/>
+                <w:sz w:val="24"/>
+                <w:szCs w:val="24"/>
+              </w:rPr>
+              <w:t>FreeCodeCamp</w:t>
+            </w:r>
+            <w:proofErr w:type="spellEnd"/>
+            <w:r>
+              <w:rPr>
+                <w:rFonts w:eastAsia="Times New Roman" w:cstheme="minorHAnsi"/>
+                <w:sz w:val="24"/>
+                <w:szCs w:val="24"/>
+              </w:rPr>
+              <w:t xml:space="preserve"> or </w:t>
+            </w:r>
+            <w:proofErr w:type="spellStart"/>
+            <w:r>
+              <w:rPr>
+                <w:rFonts w:eastAsia="Times New Roman" w:cstheme="minorHAnsi"/>
+                <w:sz w:val="24"/>
+                <w:szCs w:val="24"/>
+              </w:rPr>
+              <w:t>Codecademy</w:t>
+            </w:r>
+            <w:proofErr w:type="spellEnd"/>
           </w:p>
         </w:tc>
       </w:tr>
@@ -19816,7 +20134,25 @@
                 <w:sz w:val="24"/>
                 <w:szCs w:val="24"/>
               </w:rPr>
-              <w:t>- Learn ES6+ features (arrow functions, destructuring, modules) - Learn to use Web APIs (local storage, fetch API)</w:t>
+              <w:t xml:space="preserve">- Learn ES6+ features (arrow functions, </w:t>
+            </w:r>
+            <w:proofErr w:type="spellStart"/>
+            <w:r>
+              <w:rPr>
+                <w:rFonts w:eastAsia="Times New Roman" w:cstheme="minorHAnsi"/>
+                <w:sz w:val="24"/>
+                <w:szCs w:val="24"/>
+              </w:rPr>
+              <w:t>destructuring</w:t>
+            </w:r>
+            <w:proofErr w:type="spellEnd"/>
+            <w:r>
+              <w:rPr>
+                <w:rFonts w:eastAsia="Times New Roman" w:cstheme="minorHAnsi"/>
+                <w:sz w:val="24"/>
+                <w:szCs w:val="24"/>
+              </w:rPr>
+              <w:t>, modules) - Learn to use Web APIs (local storage, fetch API)</w:t>
             </w:r>
           </w:p>
         </w:tc>
@@ -19841,7 +20177,25 @@
                 <w:sz w:val="24"/>
                 <w:szCs w:val="24"/>
               </w:rPr>
-              <w:t>- Refactor existing projects with ES6+ features - Build a project that interacts with a Web API (e.g., weather app using OpenWeather API)</w:t>
+              <w:t xml:space="preserve">- Refactor existing projects with ES6+ features - Build a project that interacts with a Web API (e.g., weather app using </w:t>
+            </w:r>
+            <w:proofErr w:type="spellStart"/>
+            <w:r>
+              <w:rPr>
+                <w:rFonts w:eastAsia="Times New Roman" w:cstheme="minorHAnsi"/>
+                <w:sz w:val="24"/>
+                <w:szCs w:val="24"/>
+              </w:rPr>
+              <w:t>OpenWeather</w:t>
+            </w:r>
+            <w:proofErr w:type="spellEnd"/>
+            <w:r>
+              <w:rPr>
+                <w:rFonts w:eastAsia="Times New Roman" w:cstheme="minorHAnsi"/>
+                <w:sz w:val="24"/>
+                <w:szCs w:val="24"/>
+              </w:rPr>
+              <w:t xml:space="preserve"> API)</w:t>
             </w:r>
           </w:p>
         </w:tc>
@@ -21887,7 +22241,25 @@
           <w:sz w:val="24"/>
           <w:szCs w:val="24"/>
         </w:rPr>
-        <w:t>: Typically, students use an Integrated Development Environment (IDE) like Code::Blocks, Visual Studio, or any other relevant programming tools provided by the department.</w:t>
+        <w:t xml:space="preserve">: Typically, students use an Integrated Development Environment (IDE) like </w:t>
+      </w:r>
+      <w:proofErr w:type="gramStart"/>
+      <w:r>
+        <w:rPr>
+          <w:rFonts w:ascii="Times New Roman" w:eastAsia="Times New Roman" w:hAnsi="Times New Roman" w:cs="Times New Roman"/>
+          <w:sz w:val="24"/>
+          <w:szCs w:val="24"/>
+        </w:rPr>
+        <w:t>Code::</w:t>
+      </w:r>
+      <w:proofErr w:type="gramEnd"/>
+      <w:r>
+        <w:rPr>
+          <w:rFonts w:ascii="Times New Roman" w:eastAsia="Times New Roman" w:hAnsi="Times New Roman" w:cs="Times New Roman"/>
+          <w:sz w:val="24"/>
+          <w:szCs w:val="24"/>
+        </w:rPr>
+        <w:t>Blocks, Visual Studio, or any other relevant programming tools provided by the department.</w:t>
       </w:r>
     </w:p>
     <w:p>
@@ -28086,13 +28458,23 @@
               </w:rPr>
               <w:t xml:space="preserve"> statements, </w:t>
             </w:r>
+            <w:proofErr w:type="gramStart"/>
             <w:r>
               <w:rPr>
                 <w:rFonts w:ascii="Courier New" w:eastAsia="Times New Roman" w:hAnsi="Courier New" w:cs="Courier New"/>
                 <w:sz w:val="20"/>
                 <w:szCs w:val="20"/>
               </w:rPr>
-              <w:t>main()</w:t>
+              <w:t>main(</w:t>
+            </w:r>
+            <w:proofErr w:type="gramEnd"/>
+            <w:r>
+              <w:rPr>
+                <w:rFonts w:ascii="Courier New" w:eastAsia="Times New Roman" w:hAnsi="Courier New" w:cs="Courier New"/>
+                <w:sz w:val="20"/>
+                <w:szCs w:val="20"/>
+              </w:rPr>
+              <w:t>)</w:t>
             </w:r>
             <w:r>
               <w:rPr>
@@ -28337,29 +28719,69 @@
               </w:rPr>
               <w:t xml:space="preserve">Introduction to basic input/output functions in C such as </w:t>
             </w:r>
+            <w:proofErr w:type="spellStart"/>
+            <w:proofErr w:type="gramStart"/>
             <w:r>
               <w:rPr>
                 <w:rFonts w:ascii="Courier New" w:eastAsia="Times New Roman" w:hAnsi="Courier New" w:cs="Courier New"/>
                 <w:sz w:val="20"/>
                 <w:szCs w:val="20"/>
               </w:rPr>
-              <w:t>printf()</w:t>
-            </w:r>
-            <w:r>
-              <w:rPr>
-                <w:rFonts w:ascii="Times New Roman" w:eastAsia="Times New Roman" w:hAnsi="Times New Roman" w:cs="Times New Roman"/>
-                <w:sz w:val="24"/>
-                <w:szCs w:val="24"/>
-              </w:rPr>
-              <w:t xml:space="preserve">, </w:t>
-            </w:r>
+              <w:t>printf</w:t>
+            </w:r>
+            <w:proofErr w:type="spellEnd"/>
             <w:r>
               <w:rPr>
                 <w:rFonts w:ascii="Courier New" w:eastAsia="Times New Roman" w:hAnsi="Courier New" w:cs="Courier New"/>
                 <w:sz w:val="20"/>
                 <w:szCs w:val="20"/>
               </w:rPr>
-              <w:t>scanf()</w:t>
+              <w:t>(</w:t>
+            </w:r>
+            <w:proofErr w:type="gramEnd"/>
+            <w:r>
+              <w:rPr>
+                <w:rFonts w:ascii="Courier New" w:eastAsia="Times New Roman" w:hAnsi="Courier New" w:cs="Courier New"/>
+                <w:sz w:val="20"/>
+                <w:szCs w:val="20"/>
+              </w:rPr>
+              <w:t>)</w:t>
+            </w:r>
+            <w:r>
+              <w:rPr>
+                <w:rFonts w:ascii="Times New Roman" w:eastAsia="Times New Roman" w:hAnsi="Times New Roman" w:cs="Times New Roman"/>
+                <w:sz w:val="24"/>
+                <w:szCs w:val="24"/>
+              </w:rPr>
+              <w:t xml:space="preserve">, </w:t>
+            </w:r>
+            <w:proofErr w:type="spellStart"/>
+            <w:proofErr w:type="gramStart"/>
+            <w:r>
+              <w:rPr>
+                <w:rFonts w:ascii="Courier New" w:eastAsia="Times New Roman" w:hAnsi="Courier New" w:cs="Courier New"/>
+                <w:sz w:val="20"/>
+                <w:szCs w:val="20"/>
+              </w:rPr>
+              <w:t>scanf</w:t>
+            </w:r>
+            <w:proofErr w:type="spellEnd"/>
+            <w:r>
+              <w:rPr>
+                <w:rFonts w:ascii="Courier New" w:eastAsia="Times New Roman" w:hAnsi="Courier New" w:cs="Courier New"/>
+                <w:sz w:val="20"/>
+                <w:szCs w:val="20"/>
+              </w:rPr>
+              <w:t>(</w:t>
+            </w:r>
+            <w:proofErr w:type="gramEnd"/>
+            <w:r>
+              <w:rPr>
+                <w:rFonts w:ascii="Courier New" w:eastAsia="Times New Roman" w:hAnsi="Courier New" w:cs="Courier New"/>
+                <w:sz w:val="20"/>
+                <w:szCs w:val="20"/>
+              </w:rPr>
+              <w:t>)</w:t>
             </w:r>
             <w:r>
               <w:rPr>
@@ -28588,13 +29010,23 @@
               </w:rPr>
               <w:t xml:space="preserve">Discussion on how the program flows from top to bottom, the role of the </w:t>
             </w:r>
+            <w:proofErr w:type="gramStart"/>
             <w:r>
               <w:rPr>
                 <w:rFonts w:ascii="Courier New" w:eastAsia="Times New Roman" w:hAnsi="Courier New" w:cs="Courier New"/>
                 <w:sz w:val="20"/>
                 <w:szCs w:val="20"/>
               </w:rPr>
-              <w:t>main()</w:t>
+              <w:t>main(</w:t>
+            </w:r>
+            <w:proofErr w:type="gramEnd"/>
+            <w:r>
+              <w:rPr>
+                <w:rFonts w:ascii="Courier New" w:eastAsia="Times New Roman" w:hAnsi="Courier New" w:cs="Courier New"/>
+                <w:sz w:val="20"/>
+                <w:szCs w:val="20"/>
+              </w:rPr>
+              <w:t>)</w:t>
             </w:r>
             <w:r>
               <w:rPr>
@@ -29155,6 +29587,7 @@
               </w:rPr>
               <w:t xml:space="preserve">Explanation of </w:t>
             </w:r>
+            <w:proofErr w:type="spellStart"/>
             <w:r>
               <w:rPr>
                 <w:rFonts w:ascii="Courier New" w:eastAsia="Times New Roman" w:hAnsi="Courier New" w:cs="Courier New"/>
@@ -29163,6 +29596,7 @@
               </w:rPr>
               <w:t>if</w:t>
             </w:r>
+            <w:proofErr w:type="spellEnd"/>
             <w:r>
               <w:rPr>
                 <w:rFonts w:ascii="Times New Roman" w:eastAsia="Times New Roman" w:hAnsi="Times New Roman" w:cs="Times New Roman"/>
@@ -29252,6 +29686,7 @@
               </w:rPr>
               <w:t>==</w:t>
             </w:r>
+            <w:proofErr w:type="gramStart"/>
             <w:r>
               <w:rPr>
                 <w:rFonts w:ascii="Times New Roman" w:eastAsia="Times New Roman" w:hAnsi="Times New Roman" w:cs="Times New Roman"/>
@@ -29266,7 +29701,16 @@
                 <w:sz w:val="20"/>
                 <w:szCs w:val="20"/>
               </w:rPr>
-              <w:t>!=</w:t>
+              <w:t>!</w:t>
+            </w:r>
+            <w:proofErr w:type="gramEnd"/>
+            <w:r>
+              <w:rPr>
+                <w:rFonts w:ascii="Courier New" w:eastAsia="Times New Roman" w:hAnsi="Courier New" w:cs="Courier New"/>
+                <w:sz w:val="20"/>
+                <w:szCs w:val="20"/>
+              </w:rPr>
+              <w:t>=</w:t>
             </w:r>
             <w:r>
               <w:rPr>
@@ -31224,15 +31668,43 @@
                 <w:sz w:val="20"/>
                 <w:szCs w:val="20"/>
               </w:rPr>
-              <w:t>int arr[5];</w:t>
-            </w:r>
-            <w:r>
-              <w:rPr>
-                <w:rFonts w:ascii="Times New Roman" w:eastAsia="Times New Roman" w:hAnsi="Times New Roman" w:cs="Times New Roman"/>
-                <w:sz w:val="24"/>
-                <w:szCs w:val="24"/>
-              </w:rPr>
-              <w:t>) and initializing at the time of declaration.</w:t>
+              <w:t xml:space="preserve">int </w:t>
+            </w:r>
+            <w:proofErr w:type="spellStart"/>
+            <w:proofErr w:type="gramStart"/>
+            <w:r>
+              <w:rPr>
+                <w:rFonts w:ascii="Courier New" w:eastAsia="Times New Roman" w:hAnsi="Courier New" w:cs="Courier New"/>
+                <w:sz w:val="20"/>
+                <w:szCs w:val="20"/>
+              </w:rPr>
+              <w:t>arr</w:t>
+            </w:r>
+            <w:proofErr w:type="spellEnd"/>
+            <w:r>
+              <w:rPr>
+                <w:rFonts w:ascii="Courier New" w:eastAsia="Times New Roman" w:hAnsi="Courier New" w:cs="Courier New"/>
+                <w:sz w:val="20"/>
+                <w:szCs w:val="20"/>
+              </w:rPr>
+              <w:t>[5];</w:t>
+            </w:r>
+            <w:r>
+              <w:rPr>
+                <w:rFonts w:ascii="Times New Roman" w:eastAsia="Times New Roman" w:hAnsi="Times New Roman" w:cs="Times New Roman"/>
+                <w:sz w:val="24"/>
+                <w:szCs w:val="24"/>
+              </w:rPr>
+              <w:t>)</w:t>
+            </w:r>
+            <w:proofErr w:type="gramEnd"/>
+            <w:r>
+              <w:rPr>
+                <w:rFonts w:ascii="Times New Roman" w:eastAsia="Times New Roman" w:hAnsi="Times New Roman" w:cs="Times New Roman"/>
+                <w:sz w:val="24"/>
+                <w:szCs w:val="24"/>
+              </w:rPr>
+              <w:t xml:space="preserve"> and initializing at the time of declaration.</w:t>
             </w:r>
           </w:p>
         </w:tc>
@@ -31348,13 +31820,33 @@
               </w:rPr>
               <w:t xml:space="preserve">Introduction to multidimensional arrays (e.g., 2D arrays). Explanation of how to declare, initialize, and access elements in a 2D array (e.g., </w:t>
             </w:r>
+            <w:proofErr w:type="spellStart"/>
+            <w:proofErr w:type="gramStart"/>
             <w:r>
               <w:rPr>
                 <w:rFonts w:ascii="Courier New" w:eastAsia="Times New Roman" w:hAnsi="Courier New" w:cs="Courier New"/>
                 <w:sz w:val="20"/>
                 <w:szCs w:val="20"/>
               </w:rPr>
-              <w:t>arr[2][3]</w:t>
+              <w:t>arr</w:t>
+            </w:r>
+            <w:proofErr w:type="spellEnd"/>
+            <w:r>
+              <w:rPr>
+                <w:rFonts w:ascii="Courier New" w:eastAsia="Times New Roman" w:hAnsi="Courier New" w:cs="Courier New"/>
+                <w:sz w:val="20"/>
+                <w:szCs w:val="20"/>
+              </w:rPr>
+              <w:t>[</w:t>
+            </w:r>
+            <w:proofErr w:type="gramEnd"/>
+            <w:r>
+              <w:rPr>
+                <w:rFonts w:ascii="Courier New" w:eastAsia="Times New Roman" w:hAnsi="Courier New" w:cs="Courier New"/>
+                <w:sz w:val="20"/>
+                <w:szCs w:val="20"/>
+              </w:rPr>
+              <w:t>2][3]</w:t>
             </w:r>
             <w:r>
               <w:rPr>

</xml_diff>

<commit_message>
personal library (ver-2) update-149
</commit_message>
<xml_diff>
--- a/resources/Courses/GPT/Courses.docx
+++ b/resources/Courses/GPT/Courses.docx
@@ -135,11 +135,7 @@
               <w:t xml:space="preserve">3 Hours </w:t>
             </w:r>
             <w:r>
-              <w:t>(</w:t>
-            </w:r>
-            <w:proofErr w:type="gramStart"/>
-            <w:r>
-              <w:t>Evening)</w:t>
+              <w:t>(Evening)</w:t>
             </w:r>
             <w:r>
               <w:t xml:space="preserve"> </w:t>
@@ -148,11 +144,7 @@
               <w:t xml:space="preserve"> </w:t>
             </w:r>
             <w:r>
-              <w:t>=</w:t>
-            </w:r>
-            <w:proofErr w:type="gramEnd"/>
-            <w:r>
-              <w:t xml:space="preserve"> 15 Hours</w:t>
+              <w:t>= 15 Hours</w:t>
             </w:r>
           </w:p>
         </w:tc>
@@ -269,15 +261,7 @@
           </w:tcPr>
           <w:p>
             <w:r>
-              <w:t xml:space="preserve">5 Days x 6 Hours (Full </w:t>
-            </w:r>
-            <w:proofErr w:type="gramStart"/>
-            <w:r>
-              <w:t>Day)  =</w:t>
-            </w:r>
-            <w:proofErr w:type="gramEnd"/>
-            <w:r>
-              <w:t xml:space="preserve"> 30 Hours</w:t>
+              <w:t>5 Days x 6 Hours (Full Day)  = 30 Hours</w:t>
             </w:r>
           </w:p>
         </w:tc>
@@ -314,17 +298,8 @@
                 <w:b/>
                 <w:bCs/>
               </w:rPr>
-              <w:t xml:space="preserve">Review and </w:t>
-            </w:r>
-            <w:proofErr w:type="gramStart"/>
-            <w:r>
-              <w:rPr>
-                <w:b/>
-                <w:bCs/>
-              </w:rPr>
-              <w:t>Test</w:t>
-            </w:r>
-            <w:proofErr w:type="gramEnd"/>
+              <w:t>Review and Test</w:t>
+            </w:r>
           </w:p>
         </w:tc>
         <w:tc>
@@ -340,18 +315,10 @@
               <w:t xml:space="preserve"> </w:t>
             </w:r>
             <w:r>
-              <w:t xml:space="preserve">(Full </w:t>
-            </w:r>
-            <w:proofErr w:type="gramStart"/>
-            <w:r>
-              <w:t xml:space="preserve">Day)  </w:t>
-            </w:r>
-            <w:r>
-              <w:t>=</w:t>
-            </w:r>
-            <w:proofErr w:type="gramEnd"/>
-            <w:r>
-              <w:t xml:space="preserve"> </w:t>
+              <w:t xml:space="preserve">(Full Day)  </w:t>
+            </w:r>
+            <w:r>
+              <w:t xml:space="preserve">= </w:t>
             </w:r>
             <w:r>
               <w:t>0</w:t>
@@ -419,18 +386,10 @@
               <w:t xml:space="preserve"> </w:t>
             </w:r>
             <w:r>
-              <w:t xml:space="preserve">(Full </w:t>
-            </w:r>
-            <w:proofErr w:type="gramStart"/>
-            <w:r>
-              <w:t xml:space="preserve">Day)  </w:t>
-            </w:r>
-            <w:r>
-              <w:t>=</w:t>
-            </w:r>
-            <w:proofErr w:type="gramEnd"/>
-            <w:r>
-              <w:t xml:space="preserve"> </w:t>
+              <w:t xml:space="preserve">(Full Day)  </w:t>
+            </w:r>
+            <w:r>
+              <w:t xml:space="preserve">= </w:t>
             </w:r>
             <w:r>
               <w:t>0</w:t>
@@ -494,15 +453,7 @@
           </w:tcPr>
           <w:p>
             <w:r>
-              <w:t xml:space="preserve">2 Days x 6 Hours (Full </w:t>
-            </w:r>
-            <w:proofErr w:type="gramStart"/>
-            <w:r>
-              <w:t>Day)  =</w:t>
-            </w:r>
-            <w:proofErr w:type="gramEnd"/>
-            <w:r>
-              <w:t xml:space="preserve"> 12 Hours</w:t>
+              <w:t>2 Days x 6 Hours (Full Day)  = 12 Hours</w:t>
             </w:r>
           </w:p>
         </w:tc>
@@ -544,7 +495,6 @@
         </w:rPr>
         <w:t xml:space="preserve">Additional </w:t>
       </w:r>
-      <w:proofErr w:type="gramStart"/>
       <w:r>
         <w:rPr>
           <w:b/>
@@ -555,7 +505,6 @@
         </w:rPr>
         <w:t>Resources:-</w:t>
       </w:r>
-      <w:proofErr w:type="gramEnd"/>
     </w:p>
     <w:p>
       <w:pPr>
@@ -621,9 +570,8 @@
           <w:szCs w:val="24"/>
           <w:u w:val="single"/>
         </w:rPr>
-        <w:t>Practice (5 Days of Evening Shift</w:t>
-      </w:r>
-      <w:proofErr w:type="gramStart"/>
+        <w:t>Practice (5 Days of Evening Shift)</w:t>
+      </w:r>
       <w:r>
         <w:rPr>
           <w:b/>
@@ -632,19 +580,8 @@
           <w:szCs w:val="24"/>
           <w:u w:val="single"/>
         </w:rPr>
-        <w:t>)</w:t>
-      </w:r>
-      <w:r>
-        <w:rPr>
-          <w:b/>
-          <w:bCs/>
-          <w:sz w:val="24"/>
-          <w:szCs w:val="24"/>
-          <w:u w:val="single"/>
-        </w:rPr>
         <w:t>:-</w:t>
       </w:r>
-      <w:proofErr w:type="gramEnd"/>
     </w:p>
     <w:p>
       <w:pPr>
@@ -730,9 +667,8 @@
           <w:szCs w:val="24"/>
           <w:u w:val="single"/>
         </w:rPr>
-        <w:t>(5 Days of Morning Shift</w:t>
-      </w:r>
-      <w:proofErr w:type="gramStart"/>
+        <w:t>(5 Days of Morning Shift)</w:t>
+      </w:r>
       <w:r>
         <w:rPr>
           <w:b/>
@@ -741,19 +677,8 @@
           <w:szCs w:val="24"/>
           <w:u w:val="single"/>
         </w:rPr>
-        <w:t>)</w:t>
-      </w:r>
-      <w:r>
-        <w:rPr>
-          <w:b/>
-          <w:bCs/>
-          <w:sz w:val="24"/>
-          <w:szCs w:val="24"/>
-          <w:u w:val="single"/>
-        </w:rPr>
         <w:t>:-</w:t>
       </w:r>
-      <w:proofErr w:type="gramEnd"/>
     </w:p>
     <w:p>
       <w:pPr>
@@ -802,9 +727,8 @@
           <w:szCs w:val="24"/>
           <w:u w:val="single"/>
         </w:rPr>
-        <w:t>(Off Days of Evening Shift</w:t>
-      </w:r>
-      <w:proofErr w:type="gramStart"/>
+        <w:t>(Off Days of Evening Shift)</w:t>
+      </w:r>
       <w:r>
         <w:rPr>
           <w:b/>
@@ -813,28 +737,7 @@
           <w:szCs w:val="24"/>
           <w:u w:val="single"/>
         </w:rPr>
-        <w:t>)</w:t>
-      </w:r>
-      <w:r>
-        <w:rPr>
-          <w:b/>
-          <w:bCs/>
-          <w:sz w:val="24"/>
-          <w:szCs w:val="24"/>
-          <w:u w:val="single"/>
-        </w:rPr>
-        <w:t>:-</w:t>
-      </w:r>
-      <w:proofErr w:type="gramEnd"/>
-      <w:r>
-        <w:rPr>
-          <w:b/>
-          <w:bCs/>
-          <w:sz w:val="24"/>
-          <w:szCs w:val="24"/>
-          <w:u w:val="single"/>
-        </w:rPr>
-        <w:t xml:space="preserve"> </w:t>
+        <w:t xml:space="preserve">:- </w:t>
       </w:r>
     </w:p>
     <w:p>
@@ -890,9 +793,8 @@
           <w:szCs w:val="24"/>
           <w:u w:val="single"/>
         </w:rPr>
-        <w:t>(Off Days of Morning Shift</w:t>
-      </w:r>
-      <w:proofErr w:type="gramStart"/>
+        <w:t>(Off Days of Morning Shift)</w:t>
+      </w:r>
       <w:r>
         <w:rPr>
           <w:b/>
@@ -901,19 +803,8 @@
           <w:szCs w:val="24"/>
           <w:u w:val="single"/>
         </w:rPr>
-        <w:t>)</w:t>
-      </w:r>
-      <w:r>
-        <w:rPr>
-          <w:b/>
-          <w:bCs/>
-          <w:sz w:val="24"/>
-          <w:szCs w:val="24"/>
-          <w:u w:val="single"/>
-        </w:rPr>
         <w:t>:-</w:t>
       </w:r>
-      <w:proofErr w:type="gramEnd"/>
     </w:p>
     <w:p>
       <w:pPr>
@@ -2702,19 +2593,8 @@
           <w:color w:val="C00000"/>
           <w:sz w:val="28"/>
         </w:rPr>
-        <w:t xml:space="preserve">Course </w:t>
-      </w:r>
-      <w:proofErr w:type="gramStart"/>
-      <w:r>
-        <w:rPr>
-          <w:b/>
-          <w:bCs/>
-          <w:color w:val="C00000"/>
-          <w:sz w:val="28"/>
-        </w:rPr>
-        <w:t>Outcomes:-</w:t>
-      </w:r>
-      <w:proofErr w:type="gramEnd"/>
+        <w:t>Course Outcomes:-</w:t>
+      </w:r>
     </w:p>
     <w:p>
       <w:pPr>
@@ -3705,7 +3585,7 @@
           </w:tcPr>
           <w:p>
             <w:r>
-              <w:t>Linux Operating and DevOps Tools</w:t>
+              <w:t>Linux, Cloud Computing, Virtualization and DevOps Tools</w:t>
             </w:r>
           </w:p>
         </w:tc>
@@ -3714,7 +3594,11 @@
             <w:tcW w:w="735" w:type="pct"/>
             <w:shd w:val="clear" w:color="auto" w:fill="E7E6E6" w:themeFill="background2"/>
           </w:tcPr>
-          <w:p/>
+          <w:p>
+            <w:r>
+              <w:t>T-H3 + S-H2</w:t>
+            </w:r>
+          </w:p>
         </w:tc>
         <w:tc>
           <w:tcPr>
@@ -3975,74 +3859,6 @@
           <w:p>
             <w:r>
               <w:t>02</w:t>
-            </w:r>
-          </w:p>
-        </w:tc>
-        <w:tc>
-          <w:tcPr>
-            <w:tcW w:w="2369" w:type="pct"/>
-            <w:shd w:val="clear" w:color="auto" w:fill="E7E6E6" w:themeFill="background2"/>
-          </w:tcPr>
-          <w:p>
-            <w:r>
-              <w:t xml:space="preserve">Cloud Computing and Virtualization </w:t>
-            </w:r>
-          </w:p>
-        </w:tc>
-        <w:tc>
-          <w:tcPr>
-            <w:tcW w:w="735" w:type="pct"/>
-            <w:shd w:val="clear" w:color="auto" w:fill="E7E6E6" w:themeFill="background2"/>
-          </w:tcPr>
-          <w:p>
-            <w:r>
-              <w:t>T-H3 + S-H2</w:t>
-            </w:r>
-          </w:p>
-        </w:tc>
-        <w:tc>
-          <w:tcPr>
-            <w:tcW w:w="371" w:type="pct"/>
-            <w:shd w:val="clear" w:color="auto" w:fill="E7E6E6" w:themeFill="background2"/>
-          </w:tcPr>
-          <w:p>
-            <w:r>
-              <w:t>16</w:t>
-            </w:r>
-          </w:p>
-        </w:tc>
-        <w:tc>
-          <w:tcPr>
-            <w:tcW w:w="559" w:type="pct"/>
-            <w:shd w:val="clear" w:color="auto" w:fill="E7E6E6" w:themeFill="background2"/>
-          </w:tcPr>
-          <w:p>
-            <w:r>
-              <w:t>257</w:t>
-            </w:r>
-          </w:p>
-        </w:tc>
-        <w:tc>
-          <w:tcPr>
-            <w:tcW w:w="444" w:type="pct"/>
-            <w:shd w:val="clear" w:color="auto" w:fill="E7E6E6" w:themeFill="background2"/>
-          </w:tcPr>
-          <w:p>
-            <w:r>
-              <w:t>558</w:t>
-            </w:r>
-          </w:p>
-        </w:tc>
-      </w:tr>
-      <w:tr>
-        <w:tc>
-          <w:tcPr>
-            <w:tcW w:w="522" w:type="pct"/>
-            <w:shd w:val="clear" w:color="auto" w:fill="E7E6E6" w:themeFill="background2"/>
-          </w:tcPr>
-          <w:p>
-            <w:r>
-              <w:t>03</w:t>
             </w:r>
           </w:p>
         </w:tc>
@@ -4297,19 +4113,8 @@
           <w:color w:val="C00000"/>
           <w:sz w:val="28"/>
         </w:rPr>
-        <w:t xml:space="preserve">Course </w:t>
-      </w:r>
-      <w:proofErr w:type="gramStart"/>
-      <w:r>
-        <w:rPr>
-          <w:b/>
-          <w:bCs/>
-          <w:color w:val="C00000"/>
-          <w:sz w:val="28"/>
-        </w:rPr>
-        <w:t>Outcomes:-</w:t>
-      </w:r>
-      <w:proofErr w:type="gramEnd"/>
+        <w:t>Course Outcomes:-</w:t>
+      </w:r>
     </w:p>
     <w:p>
       <w:pPr>
@@ -5881,19 +5686,8 @@
           <w:color w:val="C00000"/>
           <w:sz w:val="28"/>
         </w:rPr>
-        <w:t xml:space="preserve">Course </w:t>
-      </w:r>
-      <w:proofErr w:type="gramStart"/>
-      <w:r>
-        <w:rPr>
-          <w:b/>
-          <w:bCs/>
-          <w:color w:val="C00000"/>
-          <w:sz w:val="28"/>
-        </w:rPr>
-        <w:t>Outcomes:-</w:t>
-      </w:r>
-      <w:proofErr w:type="gramEnd"/>
+        <w:t>Course Outcomes:-</w:t>
+      </w:r>
     </w:p>
     <w:p>
       <w:pPr>
@@ -7019,15 +6813,7 @@
           </w:tcPr>
           <w:p>
             <w:r>
-              <w:t xml:space="preserve">Ordinary Differential </w:t>
-            </w:r>
-            <w:proofErr w:type="gramStart"/>
-            <w:r>
-              <w:t>Equation :</w:t>
-            </w:r>
-            <w:proofErr w:type="gramEnd"/>
-            <w:r>
-              <w:t xml:space="preserve"> Reference-1</w:t>
+              <w:t>Ordinary Differential Equation : Reference-1</w:t>
             </w:r>
           </w:p>
         </w:tc>
@@ -7091,15 +6877,7 @@
           </w:tcPr>
           <w:p>
             <w:r>
-              <w:t xml:space="preserve">Ordinary Differential </w:t>
-            </w:r>
-            <w:proofErr w:type="gramStart"/>
-            <w:r>
-              <w:t>Equation :</w:t>
-            </w:r>
-            <w:proofErr w:type="gramEnd"/>
-            <w:r>
-              <w:t xml:space="preserve"> Reference-1</w:t>
+              <w:t>Ordinary Differential Equation : Reference-1</w:t>
             </w:r>
           </w:p>
         </w:tc>
@@ -7272,19 +7050,8 @@
           <w:color w:val="C00000"/>
           <w:sz w:val="28"/>
         </w:rPr>
-        <w:t xml:space="preserve">Course </w:t>
-      </w:r>
-      <w:proofErr w:type="gramStart"/>
-      <w:r>
-        <w:rPr>
-          <w:b/>
-          <w:bCs/>
-          <w:color w:val="C00000"/>
-          <w:sz w:val="28"/>
-        </w:rPr>
-        <w:t>Outcomes:-</w:t>
-      </w:r>
-      <w:proofErr w:type="gramEnd"/>
+        <w:t>Course Outcomes:-</w:t>
+      </w:r>
     </w:p>
     <w:p>
       <w:pPr>
@@ -8720,19 +8487,8 @@
           <w:color w:val="C00000"/>
           <w:sz w:val="28"/>
         </w:rPr>
-        <w:t xml:space="preserve">Course </w:t>
-      </w:r>
-      <w:proofErr w:type="gramStart"/>
-      <w:r>
-        <w:rPr>
-          <w:b/>
-          <w:bCs/>
-          <w:color w:val="C00000"/>
-          <w:sz w:val="28"/>
-        </w:rPr>
-        <w:t>Outcomes:-</w:t>
-      </w:r>
-      <w:proofErr w:type="gramEnd"/>
+        <w:t>Course Outcomes:-</w:t>
+      </w:r>
     </w:p>
     <w:p>
       <w:pPr>
@@ -10027,19 +9783,8 @@
           <w:color w:val="C00000"/>
           <w:sz w:val="28"/>
         </w:rPr>
-        <w:t xml:space="preserve">Course </w:t>
-      </w:r>
-      <w:proofErr w:type="gramStart"/>
-      <w:r>
-        <w:rPr>
-          <w:b/>
-          <w:bCs/>
-          <w:color w:val="C00000"/>
-          <w:sz w:val="28"/>
-        </w:rPr>
-        <w:t>Outcomes:-</w:t>
-      </w:r>
-      <w:proofErr w:type="gramEnd"/>
+        <w:t>Course Outcomes:-</w:t>
+      </w:r>
     </w:p>
     <w:p>
       <w:pPr>
@@ -13338,15 +13083,7 @@
           </w:tcPr>
           <w:p>
             <w:r>
-              <w:t xml:space="preserve">Physics – </w:t>
-            </w:r>
-            <w:proofErr w:type="gramStart"/>
-            <w:r>
-              <w:t>2  (</w:t>
-            </w:r>
-            <w:proofErr w:type="gramEnd"/>
-            <w:r>
-              <w:t>Thermal)</w:t>
+              <w:t>Physics – 2  (Thermal)</w:t>
             </w:r>
           </w:p>
         </w:tc>
@@ -22241,25 +21978,7 @@
           <w:sz w:val="24"/>
           <w:szCs w:val="24"/>
         </w:rPr>
-        <w:t xml:space="preserve">: Typically, students use an Integrated Development Environment (IDE) like </w:t>
-      </w:r>
-      <w:proofErr w:type="gramStart"/>
-      <w:r>
-        <w:rPr>
-          <w:rFonts w:ascii="Times New Roman" w:eastAsia="Times New Roman" w:hAnsi="Times New Roman" w:cs="Times New Roman"/>
-          <w:sz w:val="24"/>
-          <w:szCs w:val="24"/>
-        </w:rPr>
-        <w:t>Code::</w:t>
-      </w:r>
-      <w:proofErr w:type="gramEnd"/>
-      <w:r>
-        <w:rPr>
-          <w:rFonts w:ascii="Times New Roman" w:eastAsia="Times New Roman" w:hAnsi="Times New Roman" w:cs="Times New Roman"/>
-          <w:sz w:val="24"/>
-          <w:szCs w:val="24"/>
-        </w:rPr>
-        <w:t>Blocks, Visual Studio, or any other relevant programming tools provided by the department.</w:t>
+        <w:t>: Typically, students use an Integrated Development Environment (IDE) like Code::Blocks, Visual Studio, or any other relevant programming tools provided by the department.</w:t>
       </w:r>
     </w:p>
     <w:p>
@@ -28458,23 +28177,13 @@
               </w:rPr>
               <w:t xml:space="preserve"> statements, </w:t>
             </w:r>
-            <w:proofErr w:type="gramStart"/>
             <w:r>
               <w:rPr>
                 <w:rFonts w:ascii="Courier New" w:eastAsia="Times New Roman" w:hAnsi="Courier New" w:cs="Courier New"/>
                 <w:sz w:val="20"/>
                 <w:szCs w:val="20"/>
               </w:rPr>
-              <w:t>main(</w:t>
-            </w:r>
-            <w:proofErr w:type="gramEnd"/>
-            <w:r>
-              <w:rPr>
-                <w:rFonts w:ascii="Courier New" w:eastAsia="Times New Roman" w:hAnsi="Courier New" w:cs="Courier New"/>
-                <w:sz w:val="20"/>
-                <w:szCs w:val="20"/>
-              </w:rPr>
-              <w:t>)</w:t>
+              <w:t>main()</w:t>
             </w:r>
             <w:r>
               <w:rPr>
@@ -28720,7 +28429,6 @@
               <w:t xml:space="preserve">Introduction to basic input/output functions in C such as </w:t>
             </w:r>
             <w:proofErr w:type="spellStart"/>
-            <w:proofErr w:type="gramStart"/>
             <w:r>
               <w:rPr>
                 <w:rFonts w:ascii="Courier New" w:eastAsia="Times New Roman" w:hAnsi="Courier New" w:cs="Courier New"/>
@@ -28736,52 +28444,33 @@
                 <w:sz w:val="20"/>
                 <w:szCs w:val="20"/>
               </w:rPr>
-              <w:t>(</w:t>
-            </w:r>
-            <w:proofErr w:type="gramEnd"/>
+              <w:t>()</w:t>
+            </w:r>
+            <w:r>
+              <w:rPr>
+                <w:rFonts w:ascii="Times New Roman" w:eastAsia="Times New Roman" w:hAnsi="Times New Roman" w:cs="Times New Roman"/>
+                <w:sz w:val="24"/>
+                <w:szCs w:val="24"/>
+              </w:rPr>
+              <w:t xml:space="preserve">, </w:t>
+            </w:r>
+            <w:proofErr w:type="spellStart"/>
             <w:r>
               <w:rPr>
                 <w:rFonts w:ascii="Courier New" w:eastAsia="Times New Roman" w:hAnsi="Courier New" w:cs="Courier New"/>
                 <w:sz w:val="20"/>
                 <w:szCs w:val="20"/>
               </w:rPr>
-              <w:t>)</w:t>
-            </w:r>
-            <w:r>
-              <w:rPr>
-                <w:rFonts w:ascii="Times New Roman" w:eastAsia="Times New Roman" w:hAnsi="Times New Roman" w:cs="Times New Roman"/>
-                <w:sz w:val="24"/>
-                <w:szCs w:val="24"/>
-              </w:rPr>
-              <w:t xml:space="preserve">, </w:t>
-            </w:r>
-            <w:proofErr w:type="spellStart"/>
-            <w:proofErr w:type="gramStart"/>
+              <w:t>scanf</w:t>
+            </w:r>
+            <w:proofErr w:type="spellEnd"/>
             <w:r>
               <w:rPr>
                 <w:rFonts w:ascii="Courier New" w:eastAsia="Times New Roman" w:hAnsi="Courier New" w:cs="Courier New"/>
                 <w:sz w:val="20"/>
                 <w:szCs w:val="20"/>
               </w:rPr>
-              <w:t>scanf</w:t>
-            </w:r>
-            <w:proofErr w:type="spellEnd"/>
-            <w:r>
-              <w:rPr>
-                <w:rFonts w:ascii="Courier New" w:eastAsia="Times New Roman" w:hAnsi="Courier New" w:cs="Courier New"/>
-                <w:sz w:val="20"/>
-                <w:szCs w:val="20"/>
-              </w:rPr>
-              <w:t>(</w:t>
-            </w:r>
-            <w:proofErr w:type="gramEnd"/>
-            <w:r>
-              <w:rPr>
-                <w:rFonts w:ascii="Courier New" w:eastAsia="Times New Roman" w:hAnsi="Courier New" w:cs="Courier New"/>
-                <w:sz w:val="20"/>
-                <w:szCs w:val="20"/>
-              </w:rPr>
-              <w:t>)</w:t>
+              <w:t>()</w:t>
             </w:r>
             <w:r>
               <w:rPr>
@@ -29010,23 +28699,13 @@
               </w:rPr>
               <w:t xml:space="preserve">Discussion on how the program flows from top to bottom, the role of the </w:t>
             </w:r>
-            <w:proofErr w:type="gramStart"/>
             <w:r>
               <w:rPr>
                 <w:rFonts w:ascii="Courier New" w:eastAsia="Times New Roman" w:hAnsi="Courier New" w:cs="Courier New"/>
                 <w:sz w:val="20"/>
                 <w:szCs w:val="20"/>
               </w:rPr>
-              <w:t>main(</w:t>
-            </w:r>
-            <w:proofErr w:type="gramEnd"/>
-            <w:r>
-              <w:rPr>
-                <w:rFonts w:ascii="Courier New" w:eastAsia="Times New Roman" w:hAnsi="Courier New" w:cs="Courier New"/>
-                <w:sz w:val="20"/>
-                <w:szCs w:val="20"/>
-              </w:rPr>
-              <w:t>)</w:t>
+              <w:t>main()</w:t>
             </w:r>
             <w:r>
               <w:rPr>
@@ -29686,7 +29365,6 @@
               </w:rPr>
               <w:t>==</w:t>
             </w:r>
-            <w:proofErr w:type="gramStart"/>
             <w:r>
               <w:rPr>
                 <w:rFonts w:ascii="Times New Roman" w:eastAsia="Times New Roman" w:hAnsi="Times New Roman" w:cs="Times New Roman"/>
@@ -29701,16 +29379,7 @@
                 <w:sz w:val="20"/>
                 <w:szCs w:val="20"/>
               </w:rPr>
-              <w:t>!</w:t>
-            </w:r>
-            <w:proofErr w:type="gramEnd"/>
-            <w:r>
-              <w:rPr>
-                <w:rFonts w:ascii="Courier New" w:eastAsia="Times New Roman" w:hAnsi="Courier New" w:cs="Courier New"/>
-                <w:sz w:val="20"/>
-                <w:szCs w:val="20"/>
-              </w:rPr>
-              <w:t>=</w:t>
+              <w:t>!=</w:t>
             </w:r>
             <w:r>
               <w:rPr>
@@ -31671,7 +31340,6 @@
               <w:t xml:space="preserve">int </w:t>
             </w:r>
             <w:proofErr w:type="spellStart"/>
-            <w:proofErr w:type="gramStart"/>
             <w:r>
               <w:rPr>
                 <w:rFonts w:ascii="Courier New" w:eastAsia="Times New Roman" w:hAnsi="Courier New" w:cs="Courier New"/>
@@ -31695,16 +31363,7 @@
                 <w:sz w:val="24"/>
                 <w:szCs w:val="24"/>
               </w:rPr>
-              <w:t>)</w:t>
-            </w:r>
-            <w:proofErr w:type="gramEnd"/>
-            <w:r>
-              <w:rPr>
-                <w:rFonts w:ascii="Times New Roman" w:eastAsia="Times New Roman" w:hAnsi="Times New Roman" w:cs="Times New Roman"/>
-                <w:sz w:val="24"/>
-                <w:szCs w:val="24"/>
-              </w:rPr>
-              <w:t xml:space="preserve"> and initializing at the time of declaration.</w:t>
+              <w:t>) and initializing at the time of declaration.</w:t>
             </w:r>
           </w:p>
         </w:tc>
@@ -31821,7 +31480,6 @@
               <w:t xml:space="preserve">Introduction to multidimensional arrays (e.g., 2D arrays). Explanation of how to declare, initialize, and access elements in a 2D array (e.g., </w:t>
             </w:r>
             <w:proofErr w:type="spellStart"/>
-            <w:proofErr w:type="gramStart"/>
             <w:r>
               <w:rPr>
                 <w:rFonts w:ascii="Courier New" w:eastAsia="Times New Roman" w:hAnsi="Courier New" w:cs="Courier New"/>
@@ -31837,16 +31495,7 @@
                 <w:sz w:val="20"/>
                 <w:szCs w:val="20"/>
               </w:rPr>
-              <w:t>[</w:t>
-            </w:r>
-            <w:proofErr w:type="gramEnd"/>
-            <w:r>
-              <w:rPr>
-                <w:rFonts w:ascii="Courier New" w:eastAsia="Times New Roman" w:hAnsi="Courier New" w:cs="Courier New"/>
-                <w:sz w:val="20"/>
-                <w:szCs w:val="20"/>
-              </w:rPr>
-              <w:t>2][3]</w:t>
+              <w:t>[2][3]</w:t>
             </w:r>
             <w:r>
               <w:rPr>

</xml_diff>

<commit_message>
personal library (ver-2) update-152
</commit_message>
<xml_diff>
--- a/resources/Courses/GPT/Courses.docx
+++ b/resources/Courses/GPT/Courses.docx
@@ -542,13 +542,8 @@
         <w:spacing w:after="0"/>
       </w:pPr>
       <w:r>
-        <w:t xml:space="preserve">Certification: MIT, Harvard, Oxford, Microsoft, Google, OpenAI, IBM, </w:t>
-      </w:r>
-      <w:proofErr w:type="spellStart"/>
-      <w:r>
-        <w:t>Etc</w:t>
-      </w:r>
-      <w:proofErr w:type="spellEnd"/>
+        <w:t>Certification: MIT, Harvard, Oxford, Microsoft, Google, OpenAI, IBM, Etc</w:t>
+      </w:r>
     </w:p>
     <w:p>
       <w:pPr>
@@ -3585,7 +3580,19 @@
           </w:tcPr>
           <w:p>
             <w:r>
-              <w:t>Linux, Cloud Computing, Virtualization and DevOps Tools</w:t>
+              <w:t xml:space="preserve">Linux, </w:t>
+            </w:r>
+            <w:r>
+              <w:t>Cloud Computing</w:t>
+            </w:r>
+            <w:r>
+              <w:t xml:space="preserve">, Build System, </w:t>
+            </w:r>
+            <w:r>
+              <w:t xml:space="preserve">Version Control and </w:t>
+            </w:r>
+            <w:r>
+              <w:t>DevOps Tools</w:t>
             </w:r>
           </w:p>
         </w:tc>
@@ -4197,7 +4204,7 @@
         <w:spacing w:after="0"/>
       </w:pPr>
       <w:r>
-        <w:t xml:space="preserve">Fundamental Software Development Life-Cycle </w:t>
+        <w:t xml:space="preserve">Application of Project Management   </w:t>
       </w:r>
     </w:p>
     <w:p>
@@ -4223,7 +4230,7 @@
         <w:spacing w:after="0"/>
       </w:pPr>
       <w:r>
-        <w:t xml:space="preserve">Application of Project Management   </w:t>
+        <w:t xml:space="preserve">Application of Software Testing   </w:t>
       </w:r>
     </w:p>
     <w:p>
@@ -4236,7 +4243,7 @@
         <w:spacing w:after="0"/>
       </w:pPr>
       <w:r>
-        <w:t xml:space="preserve">Application of DevOps Engineering </w:t>
+        <w:t xml:space="preserve">Fundamental Software Development Life-Cycle </w:t>
       </w:r>
     </w:p>
     <w:p>
@@ -4249,7 +4256,7 @@
         <w:spacing w:after="0"/>
       </w:pPr>
       <w:r>
-        <w:t xml:space="preserve">Application of Software Testing   </w:t>
+        <w:t xml:space="preserve">Application of DevOps Engineering </w:t>
       </w:r>
     </w:p>
     <w:p>
@@ -14510,15 +14517,7 @@
           </w:tcPr>
           <w:p>
             <w:r>
-              <w:t>API, Authentication (</w:t>
-            </w:r>
-            <w:proofErr w:type="spellStart"/>
-            <w:r>
-              <w:t>JWT|QAuth</w:t>
-            </w:r>
-            <w:proofErr w:type="spellEnd"/>
-            <w:r>
-              <w:t>) and Advanced JavaScript</w:t>
+              <w:t>API, Authentication (JWT|QAuth) and Advanced JavaScript</w:t>
             </w:r>
           </w:p>
         </w:tc>
@@ -14829,23 +14828,7 @@
           </w:tcPr>
           <w:p>
             <w:r>
-              <w:t>Test Framework (</w:t>
-            </w:r>
-            <w:proofErr w:type="spellStart"/>
-            <w:r>
-              <w:t>Cypress|Appium</w:t>
-            </w:r>
-            <w:proofErr w:type="spellEnd"/>
-            <w:r>
-              <w:t xml:space="preserve">), </w:t>
-            </w:r>
-            <w:proofErr w:type="spellStart"/>
-            <w:r>
-              <w:t>Perofrmance</w:t>
-            </w:r>
-            <w:proofErr w:type="spellEnd"/>
-            <w:r>
-              <w:t xml:space="preserve"> Testing </w:t>
+              <w:t xml:space="preserve">Test Framework (Cypress|Appium), Perofrmance Testing </w:t>
             </w:r>
           </w:p>
         </w:tc>
@@ -16694,13 +16677,8 @@
               </w:numPr>
               <w:ind w:left="211" w:hanging="240"/>
             </w:pPr>
-            <w:proofErr w:type="spellStart"/>
-            <w:r>
-              <w:t>FreeCodeCamp</w:t>
-            </w:r>
-            <w:proofErr w:type="spellEnd"/>
-            <w:r>
-              <w:t xml:space="preserve"> Web Dev Guide </w:t>
+            <w:r>
+              <w:t xml:space="preserve">FreeCodeCamp Web Dev Guide </w:t>
             </w:r>
           </w:p>
         </w:tc>
@@ -16922,15 +16900,7 @@
               <w:ind w:left="211" w:hanging="240"/>
             </w:pPr>
             <w:r>
-              <w:t xml:space="preserve">Frontend Mastery by </w:t>
-            </w:r>
-            <w:proofErr w:type="spellStart"/>
-            <w:r>
-              <w:t>Codecademy</w:t>
-            </w:r>
-            <w:proofErr w:type="spellEnd"/>
-            <w:r>
-              <w:t xml:space="preserve"> </w:t>
+              <w:t xml:space="preserve">Frontend Mastery by Codecademy </w:t>
             </w:r>
           </w:p>
         </w:tc>
@@ -17330,15 +17300,7 @@
               <w:ind w:left="211" w:hanging="240"/>
             </w:pPr>
             <w:r>
-              <w:t xml:space="preserve">Continuous Testing for DevOps Professionals by Katrina </w:t>
-            </w:r>
-            <w:proofErr w:type="spellStart"/>
-            <w:r>
-              <w:t>Clokie</w:t>
-            </w:r>
-            <w:proofErr w:type="spellEnd"/>
-            <w:r>
-              <w:t xml:space="preserve"> </w:t>
+              <w:t xml:space="preserve">Continuous Testing for DevOps Professionals by Katrina Clokie </w:t>
             </w:r>
           </w:p>
         </w:tc>
@@ -17668,23 +17630,7 @@
               <w:ind w:left="211" w:hanging="240"/>
             </w:pPr>
             <w:r>
-              <w:t>Mentorship Programs (</w:t>
-            </w:r>
-            <w:proofErr w:type="spellStart"/>
-            <w:r>
-              <w:t>linkedIn</w:t>
-            </w:r>
-            <w:proofErr w:type="spellEnd"/>
-            <w:r>
-              <w:t xml:space="preserve"> </w:t>
-            </w:r>
-            <w:proofErr w:type="spellStart"/>
-            <w:r>
-              <w:t>Learnig</w:t>
-            </w:r>
-            <w:proofErr w:type="spellEnd"/>
-            <w:r>
-              <w:t xml:space="preserve">) </w:t>
+              <w:t xml:space="preserve">Mentorship Programs (linkedIn Learnig) </w:t>
             </w:r>
           </w:p>
           <w:p>
@@ -19716,79 +19662,33 @@
                 <w:sz w:val="24"/>
                 <w:szCs w:val="24"/>
               </w:rPr>
-              <w:t xml:space="preserve">- Learn objects, arrays, and data structures - Asynchronous JavaScript (callbacks, promises, async/await) - Introduction to basic JavaScript libraries (e.g., </w:t>
-            </w:r>
-            <w:proofErr w:type="spellStart"/>
-            <w:r>
+              <w:t>- Learn objects, arrays, and data structures - Asynchronous JavaScript (callbacks, promises, async/await) - Introduction to basic JavaScript libraries (e.g., Lodash)</w:t>
+            </w:r>
+          </w:p>
+        </w:tc>
+        <w:tc>
+          <w:tcPr>
+            <w:tcW w:w="0" w:type="auto"/>
+            <w:vAlign w:val="center"/>
+            <w:hideMark/>
+          </w:tcPr>
+          <w:p>
+            <w:pPr>
+              <w:spacing w:after="0" w:line="240" w:lineRule="auto"/>
               <w:rPr>
                 <w:rFonts w:eastAsia="Times New Roman" w:cstheme="minorHAnsi"/>
                 <w:sz w:val="24"/>
                 <w:szCs w:val="24"/>
               </w:rPr>
-              <w:t>Lodash</w:t>
-            </w:r>
-            <w:proofErr w:type="spellEnd"/>
+            </w:pPr>
             <w:r>
               <w:rPr>
                 <w:rFonts w:eastAsia="Times New Roman" w:cstheme="minorHAnsi"/>
                 <w:sz w:val="24"/>
                 <w:szCs w:val="24"/>
               </w:rPr>
-              <w:t>)</w:t>
-            </w:r>
-          </w:p>
-        </w:tc>
-        <w:tc>
-          <w:tcPr>
-            <w:tcW w:w="0" w:type="auto"/>
-            <w:vAlign w:val="center"/>
-            <w:hideMark/>
-          </w:tcPr>
-          <w:p>
-            <w:pPr>
-              <w:spacing w:after="0" w:line="240" w:lineRule="auto"/>
-              <w:rPr>
-                <w:rFonts w:eastAsia="Times New Roman" w:cstheme="minorHAnsi"/>
-                <w:sz w:val="24"/>
-                <w:szCs w:val="24"/>
-              </w:rPr>
-            </w:pPr>
-            <w:r>
-              <w:rPr>
-                <w:rFonts w:eastAsia="Times New Roman" w:cstheme="minorHAnsi"/>
-                <w:sz w:val="24"/>
-                <w:szCs w:val="24"/>
-              </w:rPr>
-              <w:t xml:space="preserve">- Build a simple interactive app (e.g., to-do list) - Complete JavaScript practice exercises on platforms like </w:t>
-            </w:r>
-            <w:proofErr w:type="spellStart"/>
-            <w:r>
-              <w:rPr>
-                <w:rFonts w:eastAsia="Times New Roman" w:cstheme="minorHAnsi"/>
-                <w:sz w:val="24"/>
-                <w:szCs w:val="24"/>
-              </w:rPr>
-              <w:t>FreeCodeCamp</w:t>
-            </w:r>
-            <w:proofErr w:type="spellEnd"/>
-            <w:r>
-              <w:rPr>
-                <w:rFonts w:eastAsia="Times New Roman" w:cstheme="minorHAnsi"/>
-                <w:sz w:val="24"/>
-                <w:szCs w:val="24"/>
-              </w:rPr>
-              <w:t xml:space="preserve"> or </w:t>
-            </w:r>
-            <w:proofErr w:type="spellStart"/>
-            <w:r>
-              <w:rPr>
-                <w:rFonts w:eastAsia="Times New Roman" w:cstheme="minorHAnsi"/>
-                <w:sz w:val="24"/>
-                <w:szCs w:val="24"/>
-              </w:rPr>
-              <w:t>Codecademy</w:t>
-            </w:r>
-            <w:proofErr w:type="spellEnd"/>
+              <w:t>- Build a simple interactive app (e.g., to-do list) - Complete JavaScript practice exercises on platforms like FreeCodeCamp or Codecademy</w:t>
+            </w:r>
           </w:p>
         </w:tc>
       </w:tr>
@@ -19871,68 +19771,32 @@
                 <w:sz w:val="24"/>
                 <w:szCs w:val="24"/>
               </w:rPr>
-              <w:t xml:space="preserve">- Learn ES6+ features (arrow functions, </w:t>
-            </w:r>
-            <w:proofErr w:type="spellStart"/>
-            <w:r>
+              <w:t>- Learn ES6+ features (arrow functions, destructuring, modules) - Learn to use Web APIs (local storage, fetch API)</w:t>
+            </w:r>
+          </w:p>
+        </w:tc>
+        <w:tc>
+          <w:tcPr>
+            <w:tcW w:w="0" w:type="auto"/>
+            <w:vAlign w:val="center"/>
+            <w:hideMark/>
+          </w:tcPr>
+          <w:p>
+            <w:pPr>
+              <w:spacing w:after="0" w:line="240" w:lineRule="auto"/>
               <w:rPr>
                 <w:rFonts w:eastAsia="Times New Roman" w:cstheme="minorHAnsi"/>
                 <w:sz w:val="24"/>
                 <w:szCs w:val="24"/>
               </w:rPr>
-              <w:t>destructuring</w:t>
-            </w:r>
-            <w:proofErr w:type="spellEnd"/>
+            </w:pPr>
             <w:r>
               <w:rPr>
                 <w:rFonts w:eastAsia="Times New Roman" w:cstheme="minorHAnsi"/>
                 <w:sz w:val="24"/>
                 <w:szCs w:val="24"/>
               </w:rPr>
-              <w:t>, modules) - Learn to use Web APIs (local storage, fetch API)</w:t>
-            </w:r>
-          </w:p>
-        </w:tc>
-        <w:tc>
-          <w:tcPr>
-            <w:tcW w:w="0" w:type="auto"/>
-            <w:vAlign w:val="center"/>
-            <w:hideMark/>
-          </w:tcPr>
-          <w:p>
-            <w:pPr>
-              <w:spacing w:after="0" w:line="240" w:lineRule="auto"/>
-              <w:rPr>
-                <w:rFonts w:eastAsia="Times New Roman" w:cstheme="minorHAnsi"/>
-                <w:sz w:val="24"/>
-                <w:szCs w:val="24"/>
-              </w:rPr>
-            </w:pPr>
-            <w:r>
-              <w:rPr>
-                <w:rFonts w:eastAsia="Times New Roman" w:cstheme="minorHAnsi"/>
-                <w:sz w:val="24"/>
-                <w:szCs w:val="24"/>
-              </w:rPr>
-              <w:t xml:space="preserve">- Refactor existing projects with ES6+ features - Build a project that interacts with a Web API (e.g., weather app using </w:t>
-            </w:r>
-            <w:proofErr w:type="spellStart"/>
-            <w:r>
-              <w:rPr>
-                <w:rFonts w:eastAsia="Times New Roman" w:cstheme="minorHAnsi"/>
-                <w:sz w:val="24"/>
-                <w:szCs w:val="24"/>
-              </w:rPr>
-              <w:t>OpenWeather</w:t>
-            </w:r>
-            <w:proofErr w:type="spellEnd"/>
-            <w:r>
-              <w:rPr>
-                <w:rFonts w:eastAsia="Times New Roman" w:cstheme="minorHAnsi"/>
-                <w:sz w:val="24"/>
-                <w:szCs w:val="24"/>
-              </w:rPr>
-              <w:t xml:space="preserve"> API)</w:t>
+              <w:t>- Refactor existing projects with ES6+ features - Build a project that interacts with a Web API (e.g., weather app using OpenWeather API)</w:t>
             </w:r>
           </w:p>
         </w:tc>
@@ -28428,49 +28292,29 @@
               </w:rPr>
               <w:t xml:space="preserve">Introduction to basic input/output functions in C such as </w:t>
             </w:r>
-            <w:proofErr w:type="spellStart"/>
             <w:r>
               <w:rPr>
                 <w:rFonts w:ascii="Courier New" w:eastAsia="Times New Roman" w:hAnsi="Courier New" w:cs="Courier New"/>
                 <w:sz w:val="20"/>
                 <w:szCs w:val="20"/>
               </w:rPr>
-              <w:t>printf</w:t>
-            </w:r>
-            <w:proofErr w:type="spellEnd"/>
+              <w:t>printf()</w:t>
+            </w:r>
+            <w:r>
+              <w:rPr>
+                <w:rFonts w:ascii="Times New Roman" w:eastAsia="Times New Roman" w:hAnsi="Times New Roman" w:cs="Times New Roman"/>
+                <w:sz w:val="24"/>
+                <w:szCs w:val="24"/>
+              </w:rPr>
+              <w:t xml:space="preserve">, </w:t>
+            </w:r>
             <w:r>
               <w:rPr>
                 <w:rFonts w:ascii="Courier New" w:eastAsia="Times New Roman" w:hAnsi="Courier New" w:cs="Courier New"/>
                 <w:sz w:val="20"/>
                 <w:szCs w:val="20"/>
               </w:rPr>
-              <w:t>()</w:t>
-            </w:r>
-            <w:r>
-              <w:rPr>
-                <w:rFonts w:ascii="Times New Roman" w:eastAsia="Times New Roman" w:hAnsi="Times New Roman" w:cs="Times New Roman"/>
-                <w:sz w:val="24"/>
-                <w:szCs w:val="24"/>
-              </w:rPr>
-              <w:t xml:space="preserve">, </w:t>
-            </w:r>
-            <w:proofErr w:type="spellStart"/>
-            <w:r>
-              <w:rPr>
-                <w:rFonts w:ascii="Courier New" w:eastAsia="Times New Roman" w:hAnsi="Courier New" w:cs="Courier New"/>
-                <w:sz w:val="20"/>
-                <w:szCs w:val="20"/>
-              </w:rPr>
-              <w:t>scanf</w:t>
-            </w:r>
-            <w:proofErr w:type="spellEnd"/>
-            <w:r>
-              <w:rPr>
-                <w:rFonts w:ascii="Courier New" w:eastAsia="Times New Roman" w:hAnsi="Courier New" w:cs="Courier New"/>
-                <w:sz w:val="20"/>
-                <w:szCs w:val="20"/>
-              </w:rPr>
-              <w:t>()</w:t>
+              <w:t>scanf()</w:t>
             </w:r>
             <w:r>
               <w:rPr>
@@ -29266,7 +29110,6 @@
               </w:rPr>
               <w:t xml:space="preserve">Explanation of </w:t>
             </w:r>
-            <w:proofErr w:type="spellStart"/>
             <w:r>
               <w:rPr>
                 <w:rFonts w:ascii="Courier New" w:eastAsia="Times New Roman" w:hAnsi="Courier New" w:cs="Courier New"/>
@@ -29275,7 +29118,6 @@
               </w:rPr>
               <w:t>if</w:t>
             </w:r>
-            <w:proofErr w:type="spellEnd"/>
             <w:r>
               <w:rPr>
                 <w:rFonts w:ascii="Times New Roman" w:eastAsia="Times New Roman" w:hAnsi="Times New Roman" w:cs="Times New Roman"/>
@@ -31337,25 +31179,7 @@
                 <w:sz w:val="20"/>
                 <w:szCs w:val="20"/>
               </w:rPr>
-              <w:t xml:space="preserve">int </w:t>
-            </w:r>
-            <w:proofErr w:type="spellStart"/>
-            <w:r>
-              <w:rPr>
-                <w:rFonts w:ascii="Courier New" w:eastAsia="Times New Roman" w:hAnsi="Courier New" w:cs="Courier New"/>
-                <w:sz w:val="20"/>
-                <w:szCs w:val="20"/>
-              </w:rPr>
-              <w:t>arr</w:t>
-            </w:r>
-            <w:proofErr w:type="spellEnd"/>
-            <w:r>
-              <w:rPr>
-                <w:rFonts w:ascii="Courier New" w:eastAsia="Times New Roman" w:hAnsi="Courier New" w:cs="Courier New"/>
-                <w:sz w:val="20"/>
-                <w:szCs w:val="20"/>
-              </w:rPr>
-              <w:t>[5];</w:t>
+              <w:t>int arr[5];</w:t>
             </w:r>
             <w:r>
               <w:rPr>
@@ -31479,23 +31303,13 @@
               </w:rPr>
               <w:t xml:space="preserve">Introduction to multidimensional arrays (e.g., 2D arrays). Explanation of how to declare, initialize, and access elements in a 2D array (e.g., </w:t>
             </w:r>
-            <w:proofErr w:type="spellStart"/>
             <w:r>
               <w:rPr>
                 <w:rFonts w:ascii="Courier New" w:eastAsia="Times New Roman" w:hAnsi="Courier New" w:cs="Courier New"/>
                 <w:sz w:val="20"/>
                 <w:szCs w:val="20"/>
               </w:rPr>
-              <w:t>arr</w:t>
-            </w:r>
-            <w:proofErr w:type="spellEnd"/>
-            <w:r>
-              <w:rPr>
-                <w:rFonts w:ascii="Courier New" w:eastAsia="Times New Roman" w:hAnsi="Courier New" w:cs="Courier New"/>
-                <w:sz w:val="20"/>
-                <w:szCs w:val="20"/>
-              </w:rPr>
-              <w:t>[2][3]</w:t>
+              <w:t>arr[2][3]</w:t>
             </w:r>
             <w:r>
               <w:rPr>

</xml_diff>

<commit_message>
personal library (ver-2) update-154
</commit_message>
<xml_diff>
--- a/resources/Courses/GPT/Courses.docx
+++ b/resources/Courses/GPT/Courses.docx
@@ -3580,19 +3580,28 @@
           </w:tcPr>
           <w:p>
             <w:r>
-              <w:t xml:space="preserve">Linux, </w:t>
+              <w:t xml:space="preserve">Build System, </w:t>
+            </w:r>
+            <w:r>
+              <w:t>Version Control</w:t>
+            </w:r>
+            <w:r>
+              <w:t xml:space="preserve">, </w:t>
+            </w:r>
+            <w:r>
+              <w:t>DevOps Tools</w:t>
+            </w:r>
+            <w:r>
+              <w:t xml:space="preserve">, </w:t>
+            </w:r>
+            <w:r>
+              <w:t>Linux</w:t>
+            </w:r>
+            <w:r>
+              <w:t xml:space="preserve"> and </w:t>
             </w:r>
             <w:r>
               <w:t>Cloud Computing</w:t>
-            </w:r>
-            <w:r>
-              <w:t xml:space="preserve">, Build System, </w:t>
-            </w:r>
-            <w:r>
-              <w:t xml:space="preserve">Version Control and </w:t>
-            </w:r>
-            <w:r>
-              <w:t>DevOps Tools</w:t>
             </w:r>
           </w:p>
         </w:tc>

</xml_diff>